<commit_message>
Compact station design: 1S LiFePO4 32700 pack, 10 W panel, power-saving schedule
- Replace 12.8 V 12 Ah LiFePO4 + 12 V controller + buck with 4x 32700
  LiFePO4 cells (3.2 V 24 Ah) + 1S BMS, 1S LiFePO4 solar charger,
  6 V 10 W panel and 3.2->5 V boost; enclosure 200x120x75 mm
- Power-saving schedule (PM 1 min in 5, 1-min uploads): ~14.4 Wh/day,
  ~4.3 days without sun; updated diagrams, proposal, BOM and costing

Co-Authored-By: Claude Opus 5.5 <noreply@anthropic.com>
Claude-Session: https://claude.ai/code/session_0148MYiEDhLTPmdz34XuceJs
</commit_message>
<xml_diff>
--- a/docs/proposal/GINHAWA_Proposal_Revised.docx
+++ b/docs/proposal/GINHAWA_Proposal_Revised.docx
@@ -871,7 +871,7 @@
             <w:tab/>
           </w:r>
           <w:r>
-            <w:t>24</w:t>
+            <w:t>25</w:t>
           </w:r>
         </w:p>
         <w:p>
@@ -889,7 +889,7 @@
             <w:tab/>
           </w:r>
           <w:r>
-            <w:t>25</w:t>
+            <w:t>26</w:t>
           </w:r>
         </w:p>
         <w:p>
@@ -907,7 +907,7 @@
             <w:tab/>
           </w:r>
           <w:r>
-            <w:t>26</w:t>
+            <w:t>27</w:t>
           </w:r>
         </w:p>
         <w:p>
@@ -925,7 +925,7 @@
             <w:tab/>
           </w:r>
           <w:r>
-            <w:t>26</w:t>
+            <w:t>27</w:t>
           </w:r>
         </w:p>
         <w:p>
@@ -943,7 +943,7 @@
             <w:tab/>
           </w:r>
           <w:r>
-            <w:t>27</w:t>
+            <w:t>28</w:t>
           </w:r>
         </w:p>
         <w:p>
@@ -961,7 +961,7 @@
             <w:tab/>
           </w:r>
           <w:r>
-            <w:t>27</w:t>
+            <w:t>28</w:t>
           </w:r>
         </w:p>
         <w:p>
@@ -979,7 +979,7 @@
             <w:tab/>
           </w:r>
           <w:r>
-            <w:t>27</w:t>
+            <w:t>28</w:t>
           </w:r>
         </w:p>
         <w:p>
@@ -997,7 +997,7 @@
             <w:tab/>
           </w:r>
           <w:r>
-            <w:t>28</w:t>
+            <w:t>29</w:t>
           </w:r>
         </w:p>
         <w:p>
@@ -1015,7 +1015,7 @@
             <w:tab/>
           </w:r>
           <w:r>
-            <w:t>28</w:t>
+            <w:t>29</w:t>
           </w:r>
         </w:p>
         <w:p>
@@ -1033,7 +1033,7 @@
             <w:tab/>
           </w:r>
           <w:r>
-            <w:t>29</w:t>
+            <w:t>30</w:t>
           </w:r>
         </w:p>
         <w:p>
@@ -1051,7 +1051,7 @@
             <w:tab/>
           </w:r>
           <w:r>
-            <w:t>29</w:t>
+            <w:t>30</w:t>
           </w:r>
         </w:p>
         <w:p>
@@ -1069,7 +1069,7 @@
             <w:tab/>
           </w:r>
           <w:r>
-            <w:t>30</w:t>
+            <w:t>31</w:t>
           </w:r>
         </w:p>
         <w:p>
@@ -1087,7 +1087,7 @@
             <w:tab/>
           </w:r>
           <w:r>
-            <w:t>30</w:t>
+            <w:t>31</w:t>
           </w:r>
         </w:p>
         <w:p>
@@ -1105,7 +1105,7 @@
             <w:tab/>
           </w:r>
           <w:r>
-            <w:t>31</w:t>
+            <w:t>32</w:t>
           </w:r>
         </w:p>
         <w:p>
@@ -1123,7 +1123,7 @@
             <w:tab/>
           </w:r>
           <w:r>
-            <w:t>31</w:t>
+            <w:t>32</w:t>
           </w:r>
         </w:p>
         <w:p>
@@ -1141,7 +1141,7 @@
             <w:tab/>
           </w:r>
           <w:r>
-            <w:t>32</w:t>
+            <w:t>33</w:t>
           </w:r>
         </w:p>
         <w:p>
@@ -1159,7 +1159,7 @@
             <w:tab/>
           </w:r>
           <w:r>
-            <w:t>32</w:t>
+            <w:t>34</w:t>
           </w:r>
         </w:p>
         <w:p>
@@ -1177,7 +1177,7 @@
             <w:tab/>
           </w:r>
           <w:r>
-            <w:t>33</w:t>
+            <w:t>34</w:t>
           </w:r>
         </w:p>
         <w:p>
@@ -1195,7 +1195,7 @@
             <w:tab/>
           </w:r>
           <w:r>
-            <w:t>34</w:t>
+            <w:t>35</w:t>
           </w:r>
         </w:p>
         <w:p>
@@ -1213,7 +1213,7 @@
             <w:tab/>
           </w:r>
           <w:r>
-            <w:t>35</w:t>
+            <w:t>36</w:t>
           </w:r>
         </w:p>
         <w:p>
@@ -1231,7 +1231,7 @@
             <w:tab/>
           </w:r>
           <w:r>
-            <w:t>36</w:t>
+            <w:t>37</w:t>
           </w:r>
           <w:r>
             <w:fldChar w:fldCharType="end"/>
@@ -1430,7 +1430,7 @@
             <w:tab/>
           </w:r>
           <w:r>
-            <w:t>24</w:t>
+            <w:t>25</w:t>
           </w:r>
         </w:p>
         <w:p>
@@ -1448,7 +1448,7 @@
             <w:tab/>
           </w:r>
           <w:r>
-            <w:t>25</w:t>
+            <w:t>26</w:t>
           </w:r>
         </w:p>
         <w:p>
@@ -1466,7 +1466,7 @@
             <w:tab/>
           </w:r>
           <w:r>
-            <w:t>25</w:t>
+            <w:t>26</w:t>
           </w:r>
         </w:p>
         <w:p>
@@ -1484,7 +1484,7 @@
             <w:tab/>
           </w:r>
           <w:r>
-            <w:t>25</w:t>
+            <w:t>26</w:t>
           </w:r>
         </w:p>
         <w:p>
@@ -1502,7 +1502,7 @@
             <w:tab/>
           </w:r>
           <w:r>
-            <w:t>35</w:t>
+            <w:t>36</w:t>
           </w:r>
           <w:r>
             <w:fldChar w:fldCharType="end"/>
@@ -1575,7 +1575,7 @@
             <w:tab/>
           </w:r>
           <w:r>
-            <w:t>20</w:t>
+            <w:t>21</w:t>
           </w:r>
         </w:p>
         <w:p>
@@ -1629,7 +1629,7 @@
             <w:tab/>
           </w:r>
           <w:r>
-            <w:t>26</w:t>
+            <w:t>27</w:t>
           </w:r>
         </w:p>
         <w:p>
@@ -1647,7 +1647,7 @@
             <w:tab/>
           </w:r>
           <w:r>
-            <w:t>27</w:t>
+            <w:t>28</w:t>
           </w:r>
         </w:p>
         <w:p>
@@ -1665,7 +1665,7 @@
             <w:tab/>
           </w:r>
           <w:r>
-            <w:t>28</w:t>
+            <w:t>30</w:t>
           </w:r>
         </w:p>
         <w:p>
@@ -1683,7 +1683,7 @@
             <w:tab/>
           </w:r>
           <w:r>
-            <w:t>29</w:t>
+            <w:t>30</w:t>
           </w:r>
         </w:p>
         <w:p>
@@ -1701,7 +1701,7 @@
             <w:tab/>
           </w:r>
           <w:r>
-            <w:t>30</w:t>
+            <w:t>31</w:t>
           </w:r>
         </w:p>
         <w:p>
@@ -1719,7 +1719,7 @@
             <w:tab/>
           </w:r>
           <w:r>
-            <w:t>31</w:t>
+            <w:t>32</w:t>
           </w:r>
         </w:p>
         <w:p>
@@ -1737,7 +1737,7 @@
             <w:tab/>
           </w:r>
           <w:r>
-            <w:t>32</w:t>
+            <w:t>33</w:t>
           </w:r>
         </w:p>
         <w:p>
@@ -1755,7 +1755,7 @@
             <w:tab/>
           </w:r>
           <w:r>
-            <w:t>33</w:t>
+            <w:t>34</w:t>
           </w:r>
         </w:p>
         <w:p>
@@ -1773,7 +1773,7 @@
             <w:tab/>
           </w:r>
           <w:r>
-            <w:t>33</w:t>
+            <w:t>34</w:t>
           </w:r>
         </w:p>
         <w:p>
@@ -1791,7 +1791,7 @@
             <w:tab/>
           </w:r>
           <w:r>
-            <w:t>34</w:t>
+            <w:t>35</w:t>
           </w:r>
           <w:r>
             <w:fldChar w:fldCharType="end"/>
@@ -2183,7 +2183,7 @@
         <w:t xml:space="preserve">Design</w:t>
       </w:r>
       <w:r>
-        <w:t xml:space="preserve"> and develop a low-cost, solar-powered IoT monitoring station that uses an ESP32 microcontroller and a Sensirion SEN55 environmental sensor to measure PM1.0, PM2.5, PM4.0, PM10, VOC index, NOx index, temperature, and humidity in selected high-foot-traffic areas of Barangay Carmen.</w:t>
+        <w:t xml:space="preserve"> and develop a compact, low-cost, solar-powered IoT monitoring station that uses an ESP32 microcontroller and a Sensirion SEN55 environmental sensor to measure PM1.0, PM2.5, PM4.0, PM10, VOC index, NOx index, temperature, and humidity in selected high-foot-traffic areas of Barangay Carmen.</w:t>
       </w:r>
     </w:p>
     <w:p>
@@ -2325,7 +2325,7 @@
         <w:jc w:val="both"/>
       </w:pPr>
       <w:r>
-        <w:t xml:space="preserve">Each monitoring station uses a Sensirion SEN55 sensor module, a LilyGO T-SIM7600 board (ESP32 microcontroller with a 4G LTE and GPS modem), an INA219 power monitor, and a solar-charged 12.8 V LiFePO4 battery. Stations transmit data over Wi-Fi, falling back to 4G LTE when Wi-Fi is unavailable, to a backend built with Node.js and PostgreSQL. Users access the data through a mobile-first web application (Progressive Web App) that shows real-time readings, history, station locations on a map, and alerts.</w:t>
+        <w:t xml:space="preserve">Each monitoring station uses a Sensirion SEN55 sensor module, a LilyGO T-SIM7600 board (ESP32 microcontroller with a 4G LTE and GPS modem), an INA219 power monitor, and a compact solar-charged LiFePO4 battery pack, all in a small weatherproof unit. Stations transmit data over Wi-Fi, falling back to 4G LTE when Wi-Fi is unavailable, to a backend built with Node.js and PostgreSQL. Users access the data through a mobile-first web application (Progressive Web App) that shows real-time readings, history, station locations on a map, and alerts.</w:t>
       </w:r>
     </w:p>
     <w:p>
@@ -4547,7 +4547,7 @@
         <w:t xml:space="preserve">Monitoring stations</w:t>
       </w:r>
       <w:r>
-        <w:t xml:space="preserve"> are solar-powered devices installed at selected high-foot-traffic locations. Each station measures particulate matter (PM1.0, PM2.5, PM4.0, PM10), VOC and NOx indices, temperature, and humidity every second, averages them every 10 seconds, reads its GPS position and battery status, and sends the data to the server over Wi-Fi or 4G LTE. (2) The </w:t>
+        <w:t xml:space="preserve"> are solar-powered devices installed at selected high-foot-traffic locations. Each station measures VOC and NOx indices, temperature, and humidity every second and particulate matter (PM1.0, PM2.5, PM4.0, PM10) for one minute in every five minutes to save power. Every minute it averages the readings, adds its GPS position and battery status, and sends the data to the server over Wi-Fi or 4G LTE. (2) The </w:t>
       </w:r>
       <w:r>
         <w:rPr>
@@ -4654,7 +4654,7 @@
         <w:t xml:space="preserve">(A) Monitoring station:</w:t>
       </w:r>
       <w:r>
-        <w:t xml:space="preserve"> a 20 W solar panel charges a 12.8 V LiFePO4 battery through a charge controller; the battery is the primary power source and supplies the station day and night through a 12 V-to-5 V buck converter. The Sensirion SEN55 sensor connects to the LilyGO T-SIM7600 board (ESP32 with a SIM7600G-H LTE/GPS modem) over the I²C bus. </w:t>
+        <w:t xml:space="preserve"> a small 6 V, 10 W solar panel charges a compact LiFePO4 battery pack (four 32700 cells, 3.2 V) through a LiFePO4 solar charger; the battery is the primary power source and supplies the station day and night through a 3.2 V-to-5 V boost converter. The Sensirion SEN55 sensor connects to the LilyGO T-SIM7600 board (ESP32 with a SIM7600G-H LTE/GPS modem) over the I²C bus. </w:t>
       </w:r>
       <w:r>
         <w:rPr>
@@ -5229,7 +5229,7 @@
         <w:t xml:space="preserve">IP65 enclosure</w:t>
       </w:r>
       <w:r>
-        <w:t xml:space="preserve"> holds the charge controller, 5 A fuse, INA219 power monitor, LiFePO4 battery, buck converter, status LEDs, and the LilyGO T-SIM7600 board. The </w:t>
+        <w:t xml:space="preserve"> (200 × 120 × 75 mm) holds the solar charger, 5 A fuse, INA219 power monitor, LiFePO4 battery pack with its protection board (BMS), boost converter, status LEDs, and the LilyGO T-SIM7600 board. The </w:t>
       </w:r>
       <w:r>
         <w:rPr>
@@ -5239,7 +5239,7 @@
         <w:t xml:space="preserve">radiation shield</w:t>
       </w:r>
       <w:r>
-        <w:t xml:space="preserve"> holds the SEN55 sensor separately from the enclosure so that heat from the electronics and battery does not affect the readings and air can flow freely around the sensor. Power paths (12 V and 5 V), I²C data, UART, GPIO, and RF links are drawn in different line styles, as shown in the legend.</w:t>
+        <w:t xml:space="preserve"> holds the SEN55 sensor separately from the enclosure so that heat from the electronics and battery does not affect the readings and air can flow freely around the sensor. Power paths (3.2 V and 5 V), I²C data, UART, GPIO, and RF links are drawn in different line styles, as shown in the legend.</w:t>
       </w:r>
     </w:p>
     <w:p>
@@ -5316,7 +5316,7 @@
         <w:jc w:val="both"/>
       </w:pPr>
       <w:r>
-        <w:t xml:space="preserve">Figure 8 presents the circuit diagram drawn with standard electrical symbols and reference designators. PV1 connects to the PV input of the charge controller U1. The battery BT1 connects to U1's battery terminals through fuse F1 and the INA219 current-sense input (U4 VIN+ to VIN−), so the INA219 measures battery voltage and charge/discharge current. U1's load output feeds the buck converter U2, whose 5 V output (with bulk capacitor C2 to absorb LTE transmit current peaks) powers the LilyGO board U3 and the SEN55 (J1 pin 1). J1 pin 5 (SEL) is tied to ground to select I²C mode. The SEN55 and INA219 share the I²C bus on GPIO21 (SDA) and GPIO22 (SCL) with 4.7 kΩ pull-up resistors R3 and R4. Status LEDs D1 and D2 are driven from GPIO18 and GPIO19 through 220 Ω resistors. Table 2 lists the pin assignments.</w:t>
+        <w:t xml:space="preserve">Figure 8 presents the circuit diagram drawn with standard electrical symbols and reference designators. PV1 connects to the solar input of the 1S LiFePO4 charger U1. The battery pack BT1 (four 32700 cells in parallel with a protection board) connects to U1's battery terminals through fuse F1 and the INA219 current-sense input (U4 VIN+ to VIN−), so the INA219 measures battery voltage and charge/discharge current. U1's output feeds the boost converter U2, whose 5 V output (with bulk capacitor C2 to absorb LTE transmit current peaks) powers the LilyGO board U3 and the SEN55 (J1 pin 1). J1 pin 5 (SEL) is tied to ground to select I²C mode. The SEN55 and INA219 share the I²C bus on GPIO21 (SDA) and GPIO22 (SCL) with 4.7 kΩ pull-up resistors R3 and R4. Status LEDs D1 and D2 are driven from GPIO18 and GPIO19 through 220 Ω resistors. Table 2 lists the pin assignments.</w:t>
       </w:r>
     </w:p>
     <w:p>
@@ -6545,7 +6545,7 @@
         <w:jc w:val="both"/>
       </w:pPr>
       <w:r>
-        <w:t xml:space="preserve">Because each station must operate continuously outdoors, the power subsystem was sized from an estimated daily energy budget. Table 3 lists the estimated consumption under the worst case, in which the station uses 4G LTE all day.</w:t>
+        <w:t xml:space="preserve">Because each station must operate continuously outdoors while staying compact, the power subsystem was sized from an estimated daily energy budget. To reduce consumption, the SEN55 measures particulate matter for one minute in every five minutes and keeps its VOC, NOx, temperature, and humidity sensing running in its low-power mode the rest of the time; readings are uploaded once per minute, and the ESP32 and modem sleep between uploads. Table 3 lists the estimated consumption under the worst case, in which the station uses 4G LTE all day.</w:t>
       </w:r>
     </w:p>
     <w:p>
@@ -6750,7 +6750,7 @@
                 <w:sz w:val="22"/>
                 <w:szCs w:val="22"/>
               </w:rPr>
-              <w:t xml:space="preserve">Sensirion SEN55 (fan and laser running)</w:t>
+              <w:t xml:space="preserve">Sensirion SEN55 (PM 1 min in 5; gas/RH/T continuous)</w:t>
             </w:r>
           </w:p>
         </w:tc>
@@ -6781,7 +6781,7 @@
                 <w:sz w:val="22"/>
                 <w:szCs w:val="22"/>
               </w:rPr>
-              <w:t xml:space="preserve">0.35</w:t>
+              <w:t xml:space="preserve">0.10</w:t>
             </w:r>
           </w:p>
         </w:tc>
@@ -6843,7 +6843,7 @@
                 <w:sz w:val="22"/>
                 <w:szCs w:val="22"/>
               </w:rPr>
-              <w:t xml:space="preserve">8.4</w:t>
+              <w:t xml:space="preserve">2.4</w:t>
             </w:r>
           </w:p>
         </w:tc>
@@ -6879,7 +6879,7 @@
                 <w:sz w:val="22"/>
                 <w:szCs w:val="22"/>
               </w:rPr>
-              <w:t xml:space="preserve">ESP32 (active, Wi-Fi)</w:t>
+              <w:t xml:space="preserve">ESP32 (active during readings/uploads, light sleep otherwise)</w:t>
             </w:r>
           </w:p>
         </w:tc>
@@ -6910,7 +6910,7 @@
                 <w:sz w:val="22"/>
                 <w:szCs w:val="22"/>
               </w:rPr>
-              <w:t xml:space="preserve">0.40</w:t>
+              <w:t xml:space="preserve">0.15</w:t>
             </w:r>
           </w:p>
         </w:tc>
@@ -6972,7 +6972,7 @@
                 <w:sz w:val="22"/>
                 <w:szCs w:val="22"/>
               </w:rPr>
-              <w:t xml:space="preserve">9.6</w:t>
+              <w:t xml:space="preserve">3.6</w:t>
             </w:r>
           </w:p>
         </w:tc>
@@ -7008,7 +7008,7 @@
                 <w:sz w:val="22"/>
                 <w:szCs w:val="22"/>
               </w:rPr>
-              <w:t xml:space="preserve">SIM7600 LTE modem and GPS (average)</w:t>
+              <w:t xml:space="preserve">SIM7600 LTE modem and GPS (upload every minute)</w:t>
             </w:r>
           </w:p>
         </w:tc>
@@ -7039,7 +7039,7 @@
                 <w:sz w:val="22"/>
                 <w:szCs w:val="22"/>
               </w:rPr>
-              <w:t xml:space="preserve">0.40</w:t>
+              <w:t xml:space="preserve">0.25</w:t>
             </w:r>
           </w:p>
         </w:tc>
@@ -7101,7 +7101,7 @@
                 <w:sz w:val="22"/>
                 <w:szCs w:val="22"/>
               </w:rPr>
-              <w:t xml:space="preserve">9.6</w:t>
+              <w:t xml:space="preserve">6.0</w:t>
             </w:r>
           </w:p>
         </w:tc>
@@ -7168,7 +7168,7 @@
                 <w:sz w:val="22"/>
                 <w:szCs w:val="22"/>
               </w:rPr>
-              <w:t xml:space="preserve">0.05</w:t>
+              <w:t xml:space="preserve">0.02</w:t>
             </w:r>
           </w:p>
         </w:tc>
@@ -7230,7 +7230,7 @@
                 <w:sz w:val="22"/>
                 <w:szCs w:val="22"/>
               </w:rPr>
-              <w:t xml:space="preserve">1.2</w:t>
+              <w:t xml:space="preserve">0.5</w:t>
             </w:r>
           </w:p>
         </w:tc>
@@ -7266,7 +7266,7 @@
                 <w:sz w:val="22"/>
                 <w:szCs w:val="22"/>
               </w:rPr>
-              <w:t xml:space="preserve">Buck converter losses (≈10%)</w:t>
+              <w:t xml:space="preserve">Boost converter losses (≈15%)</w:t>
             </w:r>
           </w:p>
         </w:tc>
@@ -7359,7 +7359,7 @@
                 <w:sz w:val="22"/>
                 <w:szCs w:val="22"/>
               </w:rPr>
-              <w:t xml:space="preserve">2.9</w:t>
+              <w:t xml:space="preserve">1.9</w:t>
             </w:r>
           </w:p>
         </w:tc>
@@ -7430,7 +7430,7 @@
                 <w:sz w:val="22"/>
                 <w:szCs w:val="22"/>
               </w:rPr>
-              <w:t xml:space="preserve">≈1.3</w:t>
+              <w:t xml:space="preserve">≈0.6</w:t>
             </w:r>
           </w:p>
         </w:tc>
@@ -7487,7 +7487,7 @@
                 <w:sz w:val="22"/>
                 <w:szCs w:val="22"/>
               </w:rPr>
-              <w:t xml:space="preserve">≈31.7</w:t>
+              <w:t xml:space="preserve">≈14.4</w:t>
             </w:r>
           </w:p>
         </w:tc>
@@ -7512,17 +7512,17 @@
         <w:t xml:space="preserve">Battery sizing.</w:t>
       </w:r>
       <w:r>
-        <w:t xml:space="preserve"> A 12.8 V, 12 Ah LiFePO4 battery stores about 154 Wh. Using 80% depth of discharge (≈123 Wh usable), the station can run for about </w:t>
+        <w:t xml:space="preserve"> Four LiFePO4 32700 cells (6 Ah each) connected in parallel form a 3.2 V, 24 Ah pack that stores about 77 Wh. Using 80% depth of discharge (≈61 Wh usable), the station can run for about </w:t>
       </w:r>
       <w:r>
         <w:rPr>
           <w:b/>
           <w:bCs/>
         </w:rPr>
-        <w:t xml:space="preserve">3.9 days without sunlight</w:t>
-      </w:r>
-      <w:r>
-        <w:t xml:space="preserve"> (123 ÷ 31.7), which covers several consecutive cloudy or rainy days. LiFePO4 was chosen over lithium-ion for its heat tolerance and long cycle life.</w:t>
+        <w:t xml:space="preserve">4.3 days without sunlight</w:t>
+      </w:r>
+      <w:r>
+        <w:t xml:space="preserve"> (61 ÷ 14.4), which covers several consecutive cloudy or rainy days. The whole pack measures only about 130 × 70 × 32 mm and weighs about 0.6 kg, compared with about 1.5 kg for a 12.8 V 12 Ah battery block. LiFePO4 cells were chosen over lithium-ion for their heat tolerance, safety, and long cycle life, and a 1S protection board (BMS) guards against over-charge, over-discharge, and short circuit.</w:t>
       </w:r>
     </w:p>
     <w:p>
@@ -7539,17 +7539,17 @@
         <w:t xml:space="preserve">Solar sizing.</w:t>
       </w:r>
       <w:r>
-        <w:t xml:space="preserve"> With about 4.5 peak sun hours per day and a 75% derating for temperature, dust, and charging losses, a 20 W panel produces about 67.5 Wh per day (20 × 4.5 × 0.75), or about </w:t>
+        <w:t xml:space="preserve"> With about 4.5 peak sun hours per day and a 75% derating for temperature, dust, and charging losses, a 10 W panel produces about 33.8 Wh per day (10 × 4.5 × 0.75), or about </w:t>
       </w:r>
       <w:r>
         <w:rPr>
           <w:b/>
           <w:bCs/>
         </w:rPr>
-        <w:t xml:space="preserve">2.1 times</w:t>
-      </w:r>
-      <w:r>
-        <w:t xml:space="preserve"> the daily consumption, allowing the battery to recover after cloudy days. These values are design estimates; actual consumption and charging will be measured with the INA219 during testing and the sizing adjusted if necessary.</w:t>
+        <w:t xml:space="preserve">2.3 times</w:t>
+      </w:r>
+      <w:r>
+        <w:t xml:space="preserve"> the daily consumption, allowing the battery to recover after cloudy days. These values are design estimates; actual consumption and charging will be measured with the INA219 during testing and the sampling schedule or panel size adjusted if necessary.</w:t>
       </w:r>
     </w:p>
     <w:p>
@@ -7569,7 +7569,7 @@
         <w:jc w:val="both"/>
       </w:pPr>
       <w:r>
-        <w:t xml:space="preserve">The station is designed for outdoor exposure to rain, heat, and dust. The electronics and the sensor are housed separately so that the sensor receives unobstructed outside air while the electronics remain sealed. Table 4 lists the physical dimensions used for the 3D model.</w:t>
+        <w:t xml:space="preserve">The station is designed for outdoor exposure to rain, heat, and dust. The station is built as one compact unit: a small sealed enclosure for the electronics and battery, with the ventilated sensor shield mounted about 50 mm below it, so the sensor receives unobstructed outside air while the electronics remain sealed. Table 4 lists the physical dimensions used for the 3D model.</w:t>
       </w:r>
     </w:p>
     <w:p>
@@ -7868,7 +7868,7 @@
                 <w:sz w:val="22"/>
                 <w:szCs w:val="22"/>
               </w:rPr>
-              <w:t xml:space="preserve">Ø 150 mm × 180 mm (8 louvered plates)</w:t>
+              <w:t xml:space="preserve">Ø 110 mm × 140 mm (6 louvered plates)</w:t>
             </w:r>
           </w:p>
         </w:tc>
@@ -7899,7 +7899,7 @@
                 <w:sz w:val="22"/>
                 <w:szCs w:val="22"/>
               </w:rPr>
-              <w:t xml:space="preserve">ASA or PETG, white, UV-resistant</w:t>
+              <w:t xml:space="preserve">ASA or PETG, white, UV-resistant; mounted under the enclosure</w:t>
             </w:r>
           </w:p>
         </w:tc>
@@ -7966,7 +7966,7 @@
                 <w:sz w:val="22"/>
                 <w:szCs w:val="22"/>
               </w:rPr>
-              <w:t xml:space="preserve">300 × 250 × 130 mm</w:t>
+              <w:t xml:space="preserve">200 × 120 × 75 mm</w:t>
             </w:r>
           </w:p>
         </w:tc>
@@ -8033,7 +8033,7 @@
                 <w:sz w:val="22"/>
                 <w:szCs w:val="22"/>
               </w:rPr>
-              <w:t xml:space="preserve">LiFePO4 battery 12.8 V 12 Ah</w:t>
+              <w:t xml:space="preserve">LiFePO4 pack (4 × 32700 cells, 1S4P)</w:t>
             </w:r>
           </w:p>
         </w:tc>
@@ -8064,7 +8064,7 @@
                 <w:sz w:val="22"/>
                 <w:szCs w:val="22"/>
               </w:rPr>
-              <w:t xml:space="preserve">≈151 × 98 × 95 mm</w:t>
+              <w:t xml:space="preserve">≈130 × 70 × 32 mm (cells lying flat)</w:t>
             </w:r>
           </w:p>
         </w:tc>
@@ -8095,7 +8095,7 @@
                 <w:sz w:val="22"/>
                 <w:szCs w:val="22"/>
               </w:rPr>
-              <w:t xml:space="preserve">Placed at the bottom of the enclosure</w:t>
+              <w:t xml:space="preserve">Each cell Ø 32 × 70 mm; ≈0.6 kg total</w:t>
             </w:r>
           </w:p>
         </w:tc>
@@ -8237,7 +8237,7 @@
                 <w:sz w:val="22"/>
                 <w:szCs w:val="22"/>
               </w:rPr>
-              <w:t xml:space="preserve">Solar panel 20 W</w:t>
+              <w:t xml:space="preserve">Solar panel 6 V 10 W</w:t>
             </w:r>
           </w:p>
         </w:tc>
@@ -8314,7 +8314,7 @@
                 <w:sz w:val="22"/>
                 <w:szCs w:val="22"/>
               </w:rPr>
-              <w:t xml:space="preserve">Tilted ≈15° facing south</w:t>
+              <w:t xml:space="preserve">Mounted above the unit, tilted ≈15° facing south</w:t>
             </w:r>
           </w:p>
         </w:tc>
@@ -8448,7 +8448,7 @@
                 <w:sz w:val="22"/>
                 <w:szCs w:val="22"/>
               </w:rPr>
-              <w:t xml:space="preserve">Total station</w:t>
+              <w:t xml:space="preserve">Complete station (without panel)</w:t>
             </w:r>
           </w:p>
         </w:tc>
@@ -8478,48 +8478,47 @@
               <w:rPr>
                 <w:sz w:val="22"/>
                 <w:szCs w:val="22"/>
+              </w:rPr>
+              <w:t xml:space="preserve">≈200 × 120 × 265 mm</w:t>
+            </w:r>
+          </w:p>
+        </w:tc>
+        <w:tc>
+          <w:tcPr>
+            <w:tcW w:type="dxa" w:w="3040"/>
+            <w:tcBorders>
+              <w:top w:val="single" w:color="000000" w:sz="4"/>
+              <w:left w:val="single" w:color="000000" w:sz="4"/>
+              <w:bottom w:val="single" w:color="000000" w:sz="4"/>
+              <w:right w:val="single" w:color="000000" w:sz="4"/>
+            </w:tcBorders>
+            <w:tcMar>
+              <w:top w:type="dxa" w:w="60"/>
+              <w:left w:type="dxa" w:w="100"/>
+              <w:bottom w:type="dxa" w:w="60"/>
+              <w:right w:type="dxa" w:w="100"/>
+            </w:tcMar>
+            <w:vAlign w:val="center"/>
+          </w:tcPr>
+          <w:p>
+            <w:pPr>
+              <w:spacing w:after="0" w:line="260"/>
+              <w:jc w:val="left"/>
+            </w:pPr>
+            <w:r>
+              <w:rPr>
+                <w:sz w:val="22"/>
+                <w:szCs w:val="22"/>
+              </w:rPr>
+              <w:t xml:space="preserve">Enclosure + 50 mm gap + shield; ≈1.3 kg (estimate) </w:t>
+            </w:r>
+            <w:r>
+              <w:rPr>
+                <w:sz w:val="22"/>
+                <w:szCs w:val="22"/>
                 <w:highlight w:val="yellow"/>
               </w:rPr>
-              <w:t xml:space="preserve">[overall height × width × depth after assembly]</w:t>
-            </w:r>
-          </w:p>
-        </w:tc>
-        <w:tc>
-          <w:tcPr>
-            <w:tcW w:type="dxa" w:w="3040"/>
-            <w:tcBorders>
-              <w:top w:val="single" w:color="000000" w:sz="4"/>
-              <w:left w:val="single" w:color="000000" w:sz="4"/>
-              <w:bottom w:val="single" w:color="000000" w:sz="4"/>
-              <w:right w:val="single" w:color="000000" w:sz="4"/>
-            </w:tcBorders>
-            <w:tcMar>
-              <w:top w:type="dxa" w:w="60"/>
-              <w:left w:type="dxa" w:w="100"/>
-              <w:bottom w:type="dxa" w:w="60"/>
-              <w:right w:type="dxa" w:w="100"/>
-            </w:tcMar>
-            <w:vAlign w:val="center"/>
-          </w:tcPr>
-          <w:p>
-            <w:pPr>
-              <w:spacing w:after="0" w:line="260"/>
-              <w:jc w:val="left"/>
-            </w:pPr>
-            <w:r>
-              <w:rPr>
-                <w:sz w:val="22"/>
-                <w:szCs w:val="22"/>
-                <w:highlight w:val="yellow"/>
-              </w:rPr>
-              <w:t xml:space="preserve">[weight]</w:t>
-            </w:r>
-            <w:r>
-              <w:rPr>
-                <w:sz w:val="22"/>
-                <w:szCs w:val="22"/>
-              </w:rPr>
-              <w:t xml:space="preserve"> kg</w:t>
+              <w:t xml:space="preserve">[verify after assembly]</w:t>
             </w:r>
           </w:p>
         </w:tc>
@@ -8544,7 +8543,7 @@
         <w:t xml:space="preserve">Sensor placement.</w:t>
       </w:r>
       <w:r>
-        <w:t xml:space="preserve"> The SEN55 is mounted inside the radiation shield with its air inlet facing downward, keeping rain and direct sunlight out while air flows freely between the louvered plates. The shield is positioned away from the electronics enclosure, walls, and direct exhaust outlets, with open air on all sides, so that readings are not obstructed or biased by trapped heat. Stainless insect mesh covers the openings. Mounting the sensor at breathing height (1.5–3.0 m) captures the air that pedestrians actually breathe.</w:t>
+        <w:t xml:space="preserve"> The SEN55 is mounted inside the radiation shield with its air inlet facing downward, keeping rain and direct sunlight out while air flows freely between the louvered plates. The 50 mm gap keeps heat from the enclosure away from the sensor, and the unit is positioned away from walls and direct exhaust outlets, with open air on all sides, so that readings are not obstructed or biased by trapped heat. Stainless insect mesh covers the openings. Mounting the sensor at breathing height (1.5–3.0 m) captures the air that pedestrians actually breathe.</w:t>
       </w:r>
     </w:p>
     <w:p>
@@ -8561,7 +8560,7 @@
         <w:t xml:space="preserve">Waterproofing and heat protection.</w:t>
       </w:r>
       <w:r>
-        <w:t xml:space="preserve"> The electronics enclosure is IP65-rated, with cable glands for every wire, a pressure-equalizing breathable vent, and silica gel to prevent condensation. Circuit boards receive a conformal coating against humidity. The enclosure is light-colored to reflect heat and is mounted on the shaded side of the pole, as LiFePO4 batteries should be charged below about 45 °C. The radiation shield and mounting brackets are 3D-printed in UV-resistant material, which allows the design to be customized and replacement parts to be printed easily. </w:t>
+        <w:t xml:space="preserve"> The electronics enclosure is IP65-rated, with cable glands for every wire, a pressure-equalizing breathable vent, and silica gel to prevent condensation. Circuit boards receive a conformal coating against humidity. The enclosure is light-colored to reflect heat and the solar panel mounted above it shades the unit from direct midday sun, as LiFePO4 batteries should be charged below about 45 °C. The radiation shield and mounting brackets are 3D-printed in UV-resistant material, which allows the design to be customized and replacement parts to be printed easily. </w:t>
       </w:r>
       <w:r>
         <w:rPr>
@@ -8688,7 +8687,7 @@
         <w:jc w:val="both"/>
       </w:pPr>
       <w:r>
-        <w:t xml:space="preserve">Figure 9 illustrates the operating cycle of GINHAWA. On power-up, the station initializes its sensor, power monitor, and modem and connects through Wi-Fi, or through 4G LTE when Wi-Fi is unavailable. It reads the SEN55, INA219, and GPS every second and, every 10 seconds, averages the readings and adds a timestamp and location. If the network is connected, the data is sent by HTTPS to the server; otherwise it is stored in an offline buffer and sent on the next cycle. The server validates the station key and data, saves the reading to PostgreSQL, checks it against the alert thresholds, opens or updates an alert and notifies users when a threshold is exceeded, and pushes a live update to the application. The cycle then repeats continuously.</w:t>
+        <w:t xml:space="preserve">Figure 9 illustrates the operating cycle of GINHAWA. On power-up, the station initializes its sensor, power monitor, and modem and connects through Wi-Fi, or through 4G LTE when Wi-Fi is unavailable. It reads the VOC, NOx, temperature, and humidity every second, particulate matter for one minute in every five, and GPS every 15 minutes; every minute it averages the readings and adds a timestamp and location. If the network is connected, the data is sent by HTTPS to the server; otherwise it is stored in an offline buffer and sent on the next cycle. The server validates the station key and data, saves the reading to PostgreSQL, checks it against the alert thresholds, opens or updates an alert and notifies users when a threshold is exceeded, and pushes a live update to the application. The cycle then repeats continuously.</w:t>
       </w:r>
     </w:p>
     <w:p>
@@ -9492,7 +9491,7 @@
                 <w:sz w:val="22"/>
                 <w:szCs w:val="22"/>
               </w:rPr>
-              <w:t xml:space="preserve">20 W, 12 V class, monocrystalline</w:t>
+              <w:t xml:space="preserve">6 V, 10 W, monocrystalline</w:t>
             </w:r>
           </w:p>
         </w:tc>
@@ -9559,7 +9558,7 @@
                 <w:sz w:val="22"/>
                 <w:szCs w:val="22"/>
               </w:rPr>
-              <w:t xml:space="preserve">Solar charge controller</w:t>
+              <w:t xml:space="preserve">1S LiFePO4 solar charger module</w:t>
             </w:r>
           </w:p>
         </w:tc>
@@ -9590,7 +9589,7 @@
                 <w:sz w:val="22"/>
                 <w:szCs w:val="22"/>
               </w:rPr>
-              <w:t xml:space="preserve">12 V, 10 A, LiFePO4 profile, common-negative</w:t>
+              <w:t xml:space="preserve">3.6 V charge voltage, ≥2 A, solar input</w:t>
             </w:r>
           </w:p>
         </w:tc>
@@ -9621,7 +9620,7 @@
                 <w:sz w:val="22"/>
                 <w:szCs w:val="22"/>
               </w:rPr>
-              <w:t xml:space="preserve">Safe charging and load protection</w:t>
+              <w:t xml:space="preserve">Safe charging from the panel</w:t>
             </w:r>
           </w:p>
         </w:tc>
@@ -9657,7 +9656,7 @@
                 <w:sz w:val="22"/>
                 <w:szCs w:val="22"/>
               </w:rPr>
-              <w:t xml:space="preserve">LiFePO4 battery</w:t>
+              <w:t xml:space="preserve">LiFePO4 cells + protection board</w:t>
             </w:r>
           </w:p>
         </w:tc>
@@ -9688,7 +9687,7 @@
                 <w:sz w:val="22"/>
                 <w:szCs w:val="22"/>
               </w:rPr>
-              <w:t xml:space="preserve">12.8 V, 12 Ah (≈154 Wh)</w:t>
+              <w:t xml:space="preserve">4 × 32700 (3.2 V, 6 Ah each) in parallel = 24 Ah (≈77 Wh); 1S BMS</w:t>
             </w:r>
           </w:p>
         </w:tc>
@@ -9755,7 +9754,7 @@
                 <w:sz w:val="22"/>
                 <w:szCs w:val="22"/>
               </w:rPr>
-              <w:t xml:space="preserve">DC-DC buck converter</w:t>
+              <w:t xml:space="preserve">DC-DC boost converter</w:t>
             </w:r>
           </w:p>
         </w:tc>
@@ -9786,7 +9785,7 @@
                 <w:sz w:val="22"/>
                 <w:szCs w:val="22"/>
               </w:rPr>
-              <w:t xml:space="preserve">12 V → 5 V, 3 A, with 1000 µF capacitor</w:t>
+              <w:t xml:space="preserve">3.2 V → 5 V, 3 A, with 1000 µF capacitor</w:t>
             </w:r>
           </w:p>
         </w:tc>
@@ -10178,7 +10177,7 @@
                 <w:sz w:val="22"/>
                 <w:szCs w:val="22"/>
               </w:rPr>
-              <w:t xml:space="preserve">300 × 250 × 130 mm, vent, cable glands</w:t>
+              <w:t xml:space="preserve">200 × 120 × 75 mm, vent, cable glands</w:t>
             </w:r>
           </w:p>
         </w:tc>
@@ -10276,7 +10275,7 @@
                 <w:sz w:val="22"/>
                 <w:szCs w:val="22"/>
               </w:rPr>
-              <w:t xml:space="preserve">3D-printed ASA/PETG, Ø 150 mm</w:t>
+              <w:t xml:space="preserve">3D-printed ASA/PETG, Ø 110 mm</w:t>
             </w:r>
           </w:p>
         </w:tc>
@@ -11751,7 +11750,7 @@
         <w:jc w:val="both"/>
       </w:pPr>
       <w:r>
-        <w:t xml:space="preserve">Table 7 summarizes the testing and deployment schedule. During all phases, stations record readings continuously (24 hours a day) and send an averaged reading every 10 seconds; data are aggregated hourly for analysis, with particular attention to peak hours (6:00–9:00 AM, 11:00 AM–1:00 PM, and 4:00–7:00 PM).</w:t>
+        <w:t xml:space="preserve">Table 7 summarizes the testing and deployment schedule. During all phases, stations record readings continuously (24 hours a day) and send an averaged reading every minute; data are aggregated hourly for analysis, with particular attention to peak hours (6:00–9:00 AM, 11:00 AM–1:00 PM, and 4:00–7:00 PM).</w:t>
       </w:r>
     </w:p>
     <w:p>
@@ -17677,7 +17676,7 @@
                 <w:sz w:val="22"/>
                 <w:szCs w:val="22"/>
               </w:rPr>
-              <w:t xml:space="preserve">1. Acquisition of PM, VOC, NOx, temperature, and humidity readings from the SEN55 every second</w:t>
+              <w:t xml:space="preserve">1. Acquisition of VOC, NOx, temperature, and humidity every second and PM readings on the 5-minute schedule</w:t>
             </w:r>
           </w:p>
         </w:tc>
@@ -19901,7 +19900,7 @@
                 <w:sz w:val="22"/>
                 <w:szCs w:val="22"/>
               </w:rPr>
-              <w:t xml:space="preserve">Solar panel, 20 W</w:t>
+              <w:t xml:space="preserve">Solar panel, 6 V 10 W</w:t>
             </w:r>
           </w:p>
         </w:tc>
@@ -19932,7 +19931,7 @@
                 <w:sz w:val="22"/>
                 <w:szCs w:val="22"/>
               </w:rPr>
-              <w:t xml:space="preserve">₱800.00 – ₱1,500.00</w:t>
+              <w:t xml:space="preserve">₱500.00 – ₱900.00</w:t>
             </w:r>
           </w:p>
         </w:tc>
@@ -19992,7 +19991,7 @@
                 <w:sz w:val="22"/>
                 <w:szCs w:val="22"/>
               </w:rPr>
-              <w:t xml:space="preserve">Solar charge controller, 10 A</w:t>
+              <w:t xml:space="preserve">1S LiFePO4 solar charger module</w:t>
             </w:r>
           </w:p>
         </w:tc>
@@ -20023,7 +20022,7 @@
                 <w:sz w:val="22"/>
                 <w:szCs w:val="22"/>
               </w:rPr>
-              <w:t xml:space="preserve">₱300.00 – ₱1,500.00</w:t>
+              <w:t xml:space="preserve">₱150.00 – ₱400.00</w:t>
             </w:r>
           </w:p>
         </w:tc>
@@ -20083,7 +20082,7 @@
                 <w:sz w:val="22"/>
                 <w:szCs w:val="22"/>
               </w:rPr>
-              <w:t xml:space="preserve">LiFePO4 battery, 12.8 V 12 Ah</w:t>
+              <w:t xml:space="preserve">LiFePO4 32700 6 Ah cells (×4)</w:t>
             </w:r>
           </w:p>
         </w:tc>
@@ -20114,7 +20113,7 @@
                 <w:sz w:val="22"/>
                 <w:szCs w:val="22"/>
               </w:rPr>
-              <w:t xml:space="preserve">₱2,500.00 – ₱3,500.00</w:t>
+              <w:t xml:space="preserve">₱1,000.00 – ₱1,600.00</w:t>
             </w:r>
           </w:p>
         </w:tc>
@@ -20174,7 +20173,7 @@
                 <w:sz w:val="22"/>
                 <w:szCs w:val="22"/>
               </w:rPr>
-              <w:t xml:space="preserve">DC-DC buck converter, 12 V → 5 V 3 A</w:t>
+              <w:t xml:space="preserve">1S LiFePO4 protection board (BMS), cell holder, nickel strip</w:t>
             </w:r>
           </w:p>
         </w:tc>
@@ -20205,7 +20204,7 @@
                 <w:sz w:val="22"/>
                 <w:szCs w:val="22"/>
               </w:rPr>
-              <w:t xml:space="preserve">₱150.00 – ₱250.00</w:t>
+              <w:t xml:space="preserve">₱150.00 – ₱300.00</w:t>
             </w:r>
           </w:p>
         </w:tc>
@@ -20265,7 +20264,7 @@
                 <w:sz w:val="22"/>
                 <w:szCs w:val="22"/>
               </w:rPr>
-              <w:t xml:space="preserve">INA219 power monitor module</w:t>
+              <w:t xml:space="preserve">DC-DC boost converter, 3.2 V → 5 V 3 A</w:t>
             </w:r>
           </w:p>
         </w:tc>
@@ -20296,7 +20295,7 @@
                 <w:sz w:val="22"/>
                 <w:szCs w:val="22"/>
               </w:rPr>
-              <w:t xml:space="preserve">₱150.00 – ₱250.00</w:t>
+              <w:t xml:space="preserve">₱150.00 – ₱300.00</w:t>
             </w:r>
           </w:p>
         </w:tc>
@@ -20356,7 +20355,7 @@
                 <w:sz w:val="22"/>
                 <w:szCs w:val="22"/>
               </w:rPr>
-              <w:t xml:space="preserve">Fuse, wires, connectors, cable glands</w:t>
+              <w:t xml:space="preserve">INA219 power monitor module</w:t>
             </w:r>
           </w:p>
         </w:tc>
@@ -20387,7 +20386,7 @@
                 <w:sz w:val="22"/>
                 <w:szCs w:val="22"/>
               </w:rPr>
-              <w:t xml:space="preserve">₱300.00 – ₱500.00</w:t>
+              <w:t xml:space="preserve">₱150.00 – ₱250.00</w:t>
             </w:r>
           </w:p>
         </w:tc>
@@ -20447,7 +20446,7 @@
                 <w:sz w:val="22"/>
                 <w:szCs w:val="22"/>
               </w:rPr>
-              <w:t xml:space="preserve">LEDs, resistors, capacitor</w:t>
+              <w:t xml:space="preserve">Fuse, wires, connectors, cable glands</w:t>
             </w:r>
           </w:p>
         </w:tc>
@@ -20478,7 +20477,7 @@
                 <w:sz w:val="22"/>
                 <w:szCs w:val="22"/>
               </w:rPr>
-              <w:t xml:space="preserve">₱50.00 – ₱100.00</w:t>
+              <w:t xml:space="preserve">₱300.00 – ₱500.00</w:t>
             </w:r>
           </w:p>
         </w:tc>
@@ -20538,7 +20537,7 @@
                 <w:sz w:val="22"/>
                 <w:szCs w:val="22"/>
               </w:rPr>
-              <w:t xml:space="preserve">IP65 enclosure (300 × 250 × 130 mm)</w:t>
+              <w:t xml:space="preserve">LEDs, resistors, capacitor</w:t>
             </w:r>
           </w:p>
         </w:tc>
@@ -20569,7 +20568,7 @@
                 <w:sz w:val="22"/>
                 <w:szCs w:val="22"/>
               </w:rPr>
-              <w:t xml:space="preserve">₱600.00 – ₱1,200.00</w:t>
+              <w:t xml:space="preserve">₱50.00 – ₱100.00</w:t>
             </w:r>
           </w:p>
         </w:tc>
@@ -20629,7 +20628,7 @@
                 <w:sz w:val="22"/>
                 <w:szCs w:val="22"/>
               </w:rPr>
-              <w:t xml:space="preserve">3D-printed radiation shield and brackets</w:t>
+              <w:t xml:space="preserve">IP65 enclosure (200 × 120 × 75 mm)</w:t>
             </w:r>
           </w:p>
         </w:tc>
@@ -20660,7 +20659,7 @@
                 <w:sz w:val="22"/>
                 <w:szCs w:val="22"/>
               </w:rPr>
-              <w:t xml:space="preserve">₱400.00 – ₱1,000.00</w:t>
+              <w:t xml:space="preserve">₱350.00 – ₱700.00</w:t>
             </w:r>
           </w:p>
         </w:tc>
@@ -20720,7 +20719,7 @@
                 <w:sz w:val="22"/>
                 <w:szCs w:val="22"/>
               </w:rPr>
-              <w:t xml:space="preserve">Mounting hardware (clamps, U-bolts, screws)</w:t>
+              <w:t xml:space="preserve">3D-printed radiation shield and brackets</w:t>
             </w:r>
           </w:p>
         </w:tc>
@@ -20751,7 +20750,7 @@
                 <w:sz w:val="22"/>
                 <w:szCs w:val="22"/>
               </w:rPr>
-              <w:t xml:space="preserve">₱300.00 – ₱600.00</w:t>
+              <w:t xml:space="preserve">₱300.00 – ₱800.00</w:t>
             </w:r>
           </w:p>
         </w:tc>
@@ -20811,7 +20810,7 @@
                 <w:sz w:val="22"/>
                 <w:szCs w:val="22"/>
               </w:rPr>
-              <w:t xml:space="preserve">Prepaid SIM data (2 months)</w:t>
+              <w:t xml:space="preserve">Mounting hardware (clamps, U-bolts, screws)</w:t>
             </w:r>
           </w:p>
         </w:tc>
@@ -20842,7 +20841,7 @@
                 <w:sz w:val="22"/>
                 <w:szCs w:val="22"/>
               </w:rPr>
-              <w:t xml:space="preserve">₱600.00 – ₱1,000.00</w:t>
+              <w:t xml:space="preserve">₱300.00 – ₱600.00</w:t>
             </w:r>
           </w:p>
         </w:tc>
@@ -20902,7 +20901,7 @@
                 <w:sz w:val="22"/>
                 <w:szCs w:val="22"/>
               </w:rPr>
-              <w:t xml:space="preserve">Server hosting / VPS (optional, 2 months)</w:t>
+              <w:t xml:space="preserve">Prepaid SIM data (2 months)</w:t>
             </w:r>
           </w:p>
         </w:tc>
@@ -20933,7 +20932,7 @@
                 <w:sz w:val="22"/>
                 <w:szCs w:val="22"/>
               </w:rPr>
-              <w:t xml:space="preserve">₱0.00 – ₱1,200.00</w:t>
+              <w:t xml:space="preserve">₱600.00 – ₱1,000.00</w:t>
             </w:r>
           </w:p>
         </w:tc>
@@ -20990,6 +20989,97 @@
             </w:pPr>
             <w:r>
               <w:rPr>
+                <w:sz w:val="22"/>
+                <w:szCs w:val="22"/>
+              </w:rPr>
+              <w:t xml:space="preserve">Server hosting / VPS (optional, 2 months)</w:t>
+            </w:r>
+          </w:p>
+        </w:tc>
+        <w:tc>
+          <w:tcPr>
+            <w:tcW w:type="dxa" w:w="2800"/>
+            <w:tcBorders>
+              <w:top w:val="single" w:color="000000" w:sz="4"/>
+              <w:left w:val="single" w:color="000000" w:sz="4"/>
+              <w:bottom w:val="single" w:color="000000" w:sz="4"/>
+              <w:right w:val="single" w:color="000000" w:sz="4"/>
+            </w:tcBorders>
+            <w:tcMar>
+              <w:top w:type="dxa" w:w="60"/>
+              <w:left w:type="dxa" w:w="100"/>
+              <w:bottom w:type="dxa" w:w="60"/>
+              <w:right w:type="dxa" w:w="100"/>
+            </w:tcMar>
+            <w:vAlign w:val="center"/>
+          </w:tcPr>
+          <w:p>
+            <w:pPr>
+              <w:spacing w:after="0" w:line="260"/>
+              <w:jc w:val="left"/>
+            </w:pPr>
+            <w:r>
+              <w:rPr>
+                <w:sz w:val="22"/>
+                <w:szCs w:val="22"/>
+              </w:rPr>
+              <w:t xml:space="preserve">₱0.00 – ₱1,200.00</w:t>
+            </w:r>
+          </w:p>
+        </w:tc>
+      </w:tr>
+      <w:tr>
+        <w:trPr>
+          <w:cantSplit/>
+        </w:trPr>
+        <w:tc>
+          <w:tcPr>
+            <w:tcW w:type="dxa" w:w="1300"/>
+            <w:tcBorders>
+              <w:top w:val="single" w:color="000000" w:sz="4"/>
+              <w:left w:val="single" w:color="000000" w:sz="4"/>
+              <w:bottom w:val="single" w:color="000000" w:sz="4"/>
+              <w:right w:val="single" w:color="000000" w:sz="4"/>
+            </w:tcBorders>
+            <w:tcMar>
+              <w:top w:type="dxa" w:w="60"/>
+              <w:left w:type="dxa" w:w="100"/>
+              <w:bottom w:type="dxa" w:w="60"/>
+              <w:right w:type="dxa" w:w="100"/>
+            </w:tcMar>
+            <w:vAlign w:val="center"/>
+          </w:tcPr>
+          <w:p>
+            <w:pPr>
+              <w:spacing w:after="0" w:line="260"/>
+              <w:jc w:val="left"/>
+            </w:pPr>
+          </w:p>
+        </w:tc>
+        <w:tc>
+          <w:tcPr>
+            <w:tcW w:type="dxa" w:w="4540"/>
+            <w:tcBorders>
+              <w:top w:val="single" w:color="000000" w:sz="4"/>
+              <w:left w:val="single" w:color="000000" w:sz="4"/>
+              <w:bottom w:val="single" w:color="000000" w:sz="4"/>
+              <w:right w:val="single" w:color="000000" w:sz="4"/>
+            </w:tcBorders>
+            <w:tcMar>
+              <w:top w:type="dxa" w:w="60"/>
+              <w:left w:type="dxa" w:w="100"/>
+              <w:bottom w:type="dxa" w:w="60"/>
+              <w:right w:type="dxa" w:w="100"/>
+            </w:tcMar>
+            <w:vAlign w:val="center"/>
+          </w:tcPr>
+          <w:p>
+            <w:pPr>
+              <w:spacing w:after="0" w:line="260"/>
+              <w:jc w:val="left"/>
+            </w:pPr>
+            <w:r>
+              <w:rPr>
                 <w:b/>
                 <w:bCs/>
                 <w:sz w:val="22"/>
@@ -21028,7 +21118,7 @@
                 <w:sz w:val="22"/>
                 <w:szCs w:val="22"/>
               </w:rPr>
-              <w:t xml:space="preserve">₱11,050.00 – ₱19,400.00</w:t>
+              <w:t xml:space="preserve">₱8,900.00 – ₱15,450.00</w:t>
             </w:r>
           </w:p>
         </w:tc>
@@ -21046,7 +21136,7 @@
         <w:jc w:val="both"/>
       </w:pPr>
       <w:r>
-        <w:t xml:space="preserve">The total estimated cost of one station is ₱11,050.00 to ₱19,400.00, against an initial budget of ₱15,000.00. The lower-cost options (PWM charge controller and self-hosted server) keep one station within budget; additional stations for the pilot deployment will require </w:t>
+        <w:t xml:space="preserve">The total estimated cost of one station is ₱8,900.00 to ₱15,450.00, against an initial budget of ₱15,000.00. The compact design keeps one station within budget; additional stations for the pilot deployment will require </w:t>
       </w:r>
       <w:r>
         <w:rPr>

</xml_diff>

<commit_message>
Match app data to the compact station's power-saving schedule
- Carry the last PM measurement forward for up to 10 minutes, so the AQI
  stays continuous while PM is measured 1 minute in every 5
  (pm_recorded_at is exposed)
- Mark a station offline after 5 minutes without an upload
- Store battery voltage/current, network (wifi/lte) and GPS position
  (migration 003); add a Station status card to the station screen
- Plot only measured PM in the live chart
- Firmware and simulator use the duty-cycled schedule with 1-minute uploads
- Revise the proposal and Summary of Revisions for the app behavior
  and the new screenshots

Co-Authored-By: Claude Opus 5.5 <noreply@anthropic.com>
Claude-Session: https://claude.ai/code/session_0148MYiEDhLTPmdz34XuceJs
</commit_message>
<xml_diff>
--- a/docs/proposal/GINHAWA_Proposal_Revised.docx
+++ b/docs/proposal/GINHAWA_Proposal_Revised.docx
@@ -727,7 +727,7 @@
             <w:tab/>
           </w:r>
           <w:r>
-            <w:t>16</w:t>
+            <w:t>17</w:t>
           </w:r>
         </w:p>
         <w:p>
@@ -745,7 +745,7 @@
             <w:tab/>
           </w:r>
           <w:r>
-            <w:t>17</w:t>
+            <w:t>18</w:t>
           </w:r>
         </w:p>
         <w:p>
@@ -763,7 +763,7 @@
             <w:tab/>
           </w:r>
           <w:r>
-            <w:t>18</w:t>
+            <w:t>19</w:t>
           </w:r>
         </w:p>
         <w:p>
@@ -781,7 +781,7 @@
             <w:tab/>
           </w:r>
           <w:r>
-            <w:t>19</w:t>
+            <w:t>20</w:t>
           </w:r>
         </w:p>
         <w:p>
@@ -799,7 +799,7 @@
             <w:tab/>
           </w:r>
           <w:r>
-            <w:t>20</w:t>
+            <w:t>21</w:t>
           </w:r>
         </w:p>
         <w:p>
@@ -817,7 +817,7 @@
             <w:tab/>
           </w:r>
           <w:r>
-            <w:t>21</w:t>
+            <w:t>22</w:t>
           </w:r>
         </w:p>
         <w:p>
@@ -835,7 +835,7 @@
             <w:tab/>
           </w:r>
           <w:r>
-            <w:t>22</w:t>
+            <w:t>23</w:t>
           </w:r>
         </w:p>
         <w:p>
@@ -853,7 +853,7 @@
             <w:tab/>
           </w:r>
           <w:r>
-            <w:t>23</w:t>
+            <w:t>24</w:t>
           </w:r>
         </w:p>
         <w:p>
@@ -961,7 +961,7 @@
             <w:tab/>
           </w:r>
           <w:r>
-            <w:t>28</w:t>
+            <w:t>29</w:t>
           </w:r>
         </w:p>
         <w:p>
@@ -979,7 +979,7 @@
             <w:tab/>
           </w:r>
           <w:r>
-            <w:t>28</w:t>
+            <w:t>29</w:t>
           </w:r>
         </w:p>
         <w:p>
@@ -1015,7 +1015,7 @@
             <w:tab/>
           </w:r>
           <w:r>
-            <w:t>29</w:t>
+            <w:t>30</w:t>
           </w:r>
         </w:p>
         <w:p>
@@ -1087,7 +1087,7 @@
             <w:tab/>
           </w:r>
           <w:r>
-            <w:t>31</w:t>
+            <w:t>32</w:t>
           </w:r>
         </w:p>
         <w:p>
@@ -1213,7 +1213,7 @@
             <w:tab/>
           </w:r>
           <w:r>
-            <w:t>36</w:t>
+            <w:t>37</w:t>
           </w:r>
         </w:p>
         <w:p>
@@ -1231,7 +1231,7 @@
             <w:tab/>
           </w:r>
           <w:r>
-            <w:t>37</w:t>
+            <w:t>38</w:t>
           </w:r>
           <w:r>
             <w:fldChar w:fldCharType="end"/>
@@ -1340,7 +1340,7 @@
             <w:tab/>
           </w:r>
           <w:r>
-            <w:t>16</w:t>
+            <w:t>17</w:t>
           </w:r>
         </w:p>
         <w:p>
@@ -1358,7 +1358,7 @@
             <w:tab/>
           </w:r>
           <w:r>
-            <w:t>17</w:t>
+            <w:t>18</w:t>
           </w:r>
         </w:p>
         <w:p>
@@ -1376,7 +1376,7 @@
             <w:tab/>
           </w:r>
           <w:r>
-            <w:t>18</w:t>
+            <w:t>19</w:t>
           </w:r>
         </w:p>
         <w:p>
@@ -1394,7 +1394,7 @@
             <w:tab/>
           </w:r>
           <w:r>
-            <w:t>19</w:t>
+            <w:t>20</w:t>
           </w:r>
         </w:p>
         <w:p>
@@ -1412,7 +1412,7 @@
             <w:tab/>
           </w:r>
           <w:r>
-            <w:t>20</w:t>
+            <w:t>21</w:t>
           </w:r>
         </w:p>
         <w:p>
@@ -1502,7 +1502,7 @@
             <w:tab/>
           </w:r>
           <w:r>
-            <w:t>36</w:t>
+            <w:t>37</w:t>
           </w:r>
           <w:r>
             <w:fldChar w:fldCharType="end"/>
@@ -1593,7 +1593,7 @@
             <w:tab/>
           </w:r>
           <w:r>
-            <w:t>21</w:t>
+            <w:t>22</w:t>
           </w:r>
         </w:p>
         <w:p>
@@ -1611,7 +1611,7 @@
             <w:tab/>
           </w:r>
           <w:r>
-            <w:t>22</w:t>
+            <w:t>23</w:t>
           </w:r>
         </w:p>
         <w:p>
@@ -1719,7 +1719,7 @@
             <w:tab/>
           </w:r>
           <w:r>
-            <w:t>32</w:t>
+            <w:t>33</w:t>
           </w:r>
         </w:p>
         <w:p>
@@ -1773,7 +1773,7 @@
             <w:tab/>
           </w:r>
           <w:r>
-            <w:t>34</w:t>
+            <w:t>35</w:t>
           </w:r>
         </w:p>
         <w:p>
@@ -4557,7 +4557,7 @@
         <w:t xml:space="preserve">backend server</w:t>
       </w:r>
       <w:r>
-        <w:t xml:space="preserve"> authenticates each station by its secret key, stores the readings, computes the Air Quality Index, opens and resolves alerts, and pushes live updates to connected users. (3) The </w:t>
+        <w:t xml:space="preserve"> authenticates each station by its secret key, stores the readings, computes the Air Quality Index, opens and resolves alerts, and pushes live updates to connected users. Because particulate matter is measured only once every five minutes, the server keeps the most recent PM measurement as the current value for up to 10 minutes, so the AQI shown in the application stays continuous between measurements and never uses a value older than two measurement cycles; a station that has not uploaded for 5 minutes is shown as offline. (3) The </w:t>
       </w:r>
       <w:r>
         <w:rPr>
@@ -4567,7 +4567,7 @@
         <w:t xml:space="preserve">GINHAWA application</w:t>
       </w:r>
       <w:r>
-        <w:t xml:space="preserve"> is a mobile-first web application that shows every station on a map and list with its live AQI, history charts, health recommendations, and alerts. Developers (the monitoring personnel) use the same application to register stations, set alert thresholds, and monitor device status.</w:t>
+        <w:t xml:space="preserve"> is a mobile-first web application that shows every station on a map and list with its live AQI, history charts, health recommendations, alerts, and the status of each station (battery level, connection, location, and when particles were last measured). Developers (the monitoring personnel) use the same application to register stations, set alert thresholds, and monitor device status.</w:t>
       </w:r>
     </w:p>
     <w:p>
@@ -8687,7 +8687,7 @@
         <w:jc w:val="both"/>
       </w:pPr>
       <w:r>
-        <w:t xml:space="preserve">Figure 9 illustrates the operating cycle of GINHAWA. On power-up, the station initializes its sensor, power monitor, and modem and connects through Wi-Fi, or through 4G LTE when Wi-Fi is unavailable. It reads the VOC, NOx, temperature, and humidity every second, particulate matter for one minute in every five, and GPS every 15 minutes; every minute it averages the readings and adds a timestamp and location. If the network is connected, the data is sent by HTTPS to the server; otherwise it is stored in an offline buffer and sent on the next cycle. The server validates the station key and data, saves the reading to PostgreSQL, checks it against the alert thresholds, opens or updates an alert and notifies users when a threshold is exceeded, and pushes a live update to the application. The cycle then repeats continuously.</w:t>
+        <w:t xml:space="preserve">Figure 9 illustrates the operating cycle of GINHAWA. On power-up, the station initializes its sensor, power monitor, and modem and connects through Wi-Fi, or through 4G LTE when Wi-Fi is unavailable. It reads the VOC, NOx, temperature, and humidity every second, particulate matter for one minute in every five, and GPS every 15 minutes; every minute it averages the readings and adds a timestamp and location. Readings taken outside the particle window are sent without PM values rather than with estimated ones. If the network is connected, the data is sent by HTTPS to the server; otherwise it is stored in an offline buffer and sent on the next cycle. The server validates the station key and data, saves the reading to PostgreSQL, updates the station's location when a new GPS position is included, checks it against the alert thresholds, opens or updates an alert and notifies users when a threshold is exceeded, and pushes a live update to the application. The cycle then repeats continuously.</w:t>
       </w:r>
     </w:p>
     <w:p>
@@ -8956,7 +8956,17 @@
         <w:t xml:space="preserve">Station Details</w:t>
       </w:r>
       <w:r>
-        <w:t xml:space="preserve"> screen (Figure 11) shows the station's current AQI, main pollutant, temperature, humidity, the AQI color scale, health recommendations, the last 12 hours of hourly AQI, all readings with plain-language explanations, and history charts. The </w:t>
+        <w:t xml:space="preserve"> screen (Figure 11) shows the station's current AQI, main pollutant, temperature, humidity, the AQI color scale, health recommendations, the last 12 hours of hourly AQI, a </w:t>
+      </w:r>
+      <w:r>
+        <w:rPr>
+          <w:b/>
+          <w:bCs/>
+        </w:rPr>
+        <w:t xml:space="preserve">Station status</w:t>
+      </w:r>
+      <w:r>
+        <w:t xml:space="preserve"> card (battery percentage estimated from the LiFePO4 voltage, whether it is charging, Wi-Fi or 4G LTE connection and last upload, GPS location, and how long ago particles were last measured), all readings with plain-language explanations, and history charts. The live chart plots only particle values that were actually measured, and hourly and daily averages ignore the minutes without a PM measurement, so the schedule does not bias the results. The </w:t>
       </w:r>
       <w:r>
         <w:rPr>
@@ -8966,7 +8976,7 @@
         <w:t xml:space="preserve">Alerts</w:t>
       </w:r>
       <w:r>
-        <w:t xml:space="preserve"> screen (Figure 12) lists ongoing and past threshold exceedances, which users can acknowledge. Administrators additionally see the Add Station screen and station settings (thresholds, sensor keys, and deletion). The station map view and device status panel described in Sections 3.2.11 and 3.5 are part of the next development sprint. The application supports light, dark, and system themes.</w:t>
+        <w:t xml:space="preserve"> screen (Figure 12) lists ongoing and past threshold exceedances, which users can acknowledge. Administrators additionally see the Add Station screen and station settings (thresholds, sensor keys, and deletion). The station map view (Section 3.2.11) and the firmware for 4G LTE fallback and GPS positioning are part of the next development sprint; the server and application already store and display the station's network, battery, and location. The application supports light, dark, and system themes.</w:t>
       </w:r>
     </w:p>
     <w:p>
@@ -18264,7 +18274,7 @@
                 <w:sz w:val="22"/>
                 <w:szCs w:val="22"/>
               </w:rPr>
-              <w:t xml:space="preserve">8. Alert opened when a threshold is exceeded and resolved when air quality recovers</w:t>
+              <w:t xml:space="preserve">8. Current AQI remains available between particle measurements and a station is shown as offline after 5 minutes without data</w:t>
             </w:r>
           </w:p>
         </w:tc>
@@ -18348,7 +18358,91 @@
                 <w:sz w:val="22"/>
                 <w:szCs w:val="22"/>
               </w:rPr>
-              <w:t xml:space="preserve">9. No water ingress after the waterproofing test</w:t>
+              <w:t xml:space="preserve">9. Alert opened when a threshold is exceeded and resolved when air quality recovers</w:t>
+            </w:r>
+          </w:p>
+        </w:tc>
+        <w:tc>
+          <w:tcPr>
+            <w:tcW w:type="dxa" w:w="800"/>
+            <w:tcBorders>
+              <w:top w:val="single" w:color="000000" w:sz="4"/>
+              <w:left w:val="single" w:color="000000" w:sz="4"/>
+              <w:bottom w:val="single" w:color="000000" w:sz="4"/>
+              <w:right w:val="single" w:color="000000" w:sz="4"/>
+            </w:tcBorders>
+            <w:tcMar>
+              <w:top w:type="dxa" w:w="60"/>
+              <w:left w:type="dxa" w:w="100"/>
+              <w:bottom w:type="dxa" w:w="60"/>
+              <w:right w:type="dxa" w:w="100"/>
+            </w:tcMar>
+            <w:vAlign w:val="center"/>
+          </w:tcPr>
+          <w:p>
+            <w:pPr>
+              <w:spacing w:after="0" w:line="260"/>
+              <w:jc w:val="left"/>
+            </w:pPr>
+          </w:p>
+        </w:tc>
+        <w:tc>
+          <w:tcPr>
+            <w:tcW w:type="dxa" w:w="800"/>
+            <w:tcBorders>
+              <w:top w:val="single" w:color="000000" w:sz="4"/>
+              <w:left w:val="single" w:color="000000" w:sz="4"/>
+              <w:bottom w:val="single" w:color="000000" w:sz="4"/>
+              <w:right w:val="single" w:color="000000" w:sz="4"/>
+            </w:tcBorders>
+            <w:tcMar>
+              <w:top w:type="dxa" w:w="60"/>
+              <w:left w:type="dxa" w:w="100"/>
+              <w:bottom w:type="dxa" w:w="60"/>
+              <w:right w:type="dxa" w:w="100"/>
+            </w:tcMar>
+            <w:vAlign w:val="center"/>
+          </w:tcPr>
+          <w:p>
+            <w:pPr>
+              <w:spacing w:after="0" w:line="260"/>
+              <w:jc w:val="left"/>
+            </w:pPr>
+          </w:p>
+        </w:tc>
+      </w:tr>
+      <w:tr>
+        <w:trPr>
+          <w:cantSplit/>
+        </w:trPr>
+        <w:tc>
+          <w:tcPr>
+            <w:tcW w:type="dxa" w:w="7040"/>
+            <w:tcBorders>
+              <w:top w:val="single" w:color="000000" w:sz="4"/>
+              <w:left w:val="single" w:color="000000" w:sz="4"/>
+              <w:bottom w:val="single" w:color="000000" w:sz="4"/>
+              <w:right w:val="single" w:color="000000" w:sz="4"/>
+            </w:tcBorders>
+            <w:tcMar>
+              <w:top w:type="dxa" w:w="60"/>
+              <w:left w:type="dxa" w:w="100"/>
+              <w:bottom w:type="dxa" w:w="60"/>
+              <w:right w:type="dxa" w:w="100"/>
+            </w:tcMar>
+            <w:vAlign w:val="center"/>
+          </w:tcPr>
+          <w:p>
+            <w:pPr>
+              <w:spacing w:after="0" w:line="260"/>
+              <w:jc w:val="left"/>
+            </w:pPr>
+            <w:r>
+              <w:rPr>
+                <w:sz w:val="22"/>
+                <w:szCs w:val="22"/>
+              </w:rPr>
+              <w:t xml:space="preserve">10. No water ingress after the waterproofing test</w:t>
             </w:r>
           </w:p>
         </w:tc>
@@ -19266,7 +19360,7 @@
                 <w:sz w:val="22"/>
                 <w:szCs w:val="22"/>
               </w:rPr>
-              <w:t xml:space="preserve">9. Monitor device status: online/offline, battery, and connectivity (administrator)</w:t>
+              <w:t xml:space="preserve">9. View station status: online/offline, battery level, connection, location, and last particle measurement</w:t>
             </w:r>
           </w:p>
         </w:tc>

</xml_diff>

<commit_message>
Switch the station to the team's ESP32 DevKit and 18650 Li-ion cells
- Hardware: ESP32 DevKit V1 with separate A7670 LTE and ATGM336H GPS
  modules instead of the LilyGO T-SIM7600; 3x 18650 (1S3P, ~33 Wh),
  CN3791 charger, 6 V 6 W panel, 3.3 V buck-boost and 5 V boost,
  150 x 100 x 70 mm enclosure
- Firmware: Wi-Fi first with LTE fallback (A7670 HTTPS AT commands),
  GPS powered through a MOSFET for up to 90 s every 15 min, GPS time
  when NTP is unavailable
- App and simulator: Li-ion voltage curve for battery percentage
- Redraw the architecture, block and circuit diagrams and rewrite
  the circuit notes, README and the proposal: power budget, sizing,
  tables, costing and Summary of Revisions

Co-Authored-By: Claude Opus 5.5 <noreply@anthropic.com>
Claude-Session: https://claude.ai/code/session_0148MYiEDhLTPmdz34XuceJs
</commit_message>
<xml_diff>
--- a/docs/proposal/GINHAWA_Proposal_Revised.docx
+++ b/docs/proposal/GINHAWA_Proposal_Revised.docx
@@ -619,7 +619,7 @@
             <w:tab/>
           </w:r>
           <w:r>
-            <w:t>12</w:t>
+            <w:t>13</w:t>
           </w:r>
         </w:p>
         <w:p>
@@ -637,7 +637,7 @@
             <w:tab/>
           </w:r>
           <w:r>
-            <w:t>12</w:t>
+            <w:t>13</w:t>
           </w:r>
         </w:p>
         <w:p>
@@ -655,7 +655,7 @@
             <w:tab/>
           </w:r>
           <w:r>
-            <w:t>13</w:t>
+            <w:t>14</w:t>
           </w:r>
         </w:p>
         <w:p>
@@ -673,7 +673,7 @@
             <w:tab/>
           </w:r>
           <w:r>
-            <w:t>13</w:t>
+            <w:t>14</w:t>
           </w:r>
         </w:p>
         <w:p>
@@ -691,7 +691,7 @@
             <w:tab/>
           </w:r>
           <w:r>
-            <w:t>14</w:t>
+            <w:t>15</w:t>
           </w:r>
         </w:p>
         <w:p>
@@ -709,7 +709,7 @@
             <w:tab/>
           </w:r>
           <w:r>
-            <w:t>15</w:t>
+            <w:t>17</w:t>
           </w:r>
         </w:p>
         <w:p>
@@ -727,7 +727,7 @@
             <w:tab/>
           </w:r>
           <w:r>
-            <w:t>17</w:t>
+            <w:t>18</w:t>
           </w:r>
         </w:p>
         <w:p>
@@ -745,7 +745,7 @@
             <w:tab/>
           </w:r>
           <w:r>
-            <w:t>18</w:t>
+            <w:t>19</w:t>
           </w:r>
         </w:p>
         <w:p>
@@ -763,7 +763,7 @@
             <w:tab/>
           </w:r>
           <w:r>
-            <w:t>19</w:t>
+            <w:t>20</w:t>
           </w:r>
         </w:p>
         <w:p>
@@ -781,7 +781,7 @@
             <w:tab/>
           </w:r>
           <w:r>
-            <w:t>20</w:t>
+            <w:t>21</w:t>
           </w:r>
         </w:p>
         <w:p>
@@ -799,7 +799,7 @@
             <w:tab/>
           </w:r>
           <w:r>
-            <w:t>21</w:t>
+            <w:t>22</w:t>
           </w:r>
         </w:p>
         <w:p>
@@ -817,7 +817,7 @@
             <w:tab/>
           </w:r>
           <w:r>
-            <w:t>22</w:t>
+            <w:t>23</w:t>
           </w:r>
         </w:p>
         <w:p>
@@ -835,7 +835,7 @@
             <w:tab/>
           </w:r>
           <w:r>
-            <w:t>23</w:t>
+            <w:t>25</w:t>
           </w:r>
         </w:p>
         <w:p>
@@ -853,7 +853,7 @@
             <w:tab/>
           </w:r>
           <w:r>
-            <w:t>24</w:t>
+            <w:t>26</w:t>
           </w:r>
         </w:p>
         <w:p>
@@ -871,7 +871,7 @@
             <w:tab/>
           </w:r>
           <w:r>
-            <w:t>25</w:t>
+            <w:t>27</w:t>
           </w:r>
         </w:p>
         <w:p>
@@ -889,7 +889,7 @@
             <w:tab/>
           </w:r>
           <w:r>
-            <w:t>26</w:t>
+            <w:t>28</w:t>
           </w:r>
         </w:p>
         <w:p>
@@ -907,7 +907,7 @@
             <w:tab/>
           </w:r>
           <w:r>
-            <w:t>27</w:t>
+            <w:t>29</w:t>
           </w:r>
         </w:p>
         <w:p>
@@ -925,7 +925,7 @@
             <w:tab/>
           </w:r>
           <w:r>
-            <w:t>27</w:t>
+            <w:t>29</w:t>
           </w:r>
         </w:p>
         <w:p>
@@ -943,7 +943,7 @@
             <w:tab/>
           </w:r>
           <w:r>
-            <w:t>28</w:t>
+            <w:t>30</w:t>
           </w:r>
         </w:p>
         <w:p>
@@ -961,7 +961,7 @@
             <w:tab/>
           </w:r>
           <w:r>
-            <w:t>29</w:t>
+            <w:t>31</w:t>
           </w:r>
         </w:p>
         <w:p>
@@ -979,7 +979,7 @@
             <w:tab/>
           </w:r>
           <w:r>
-            <w:t>29</w:t>
+            <w:t>31</w:t>
           </w:r>
         </w:p>
         <w:p>
@@ -997,7 +997,7 @@
             <w:tab/>
           </w:r>
           <w:r>
-            <w:t>29</w:t>
+            <w:t>31</w:t>
           </w:r>
         </w:p>
         <w:p>
@@ -1015,7 +1015,7 @@
             <w:tab/>
           </w:r>
           <w:r>
-            <w:t>30</w:t>
+            <w:t>32</w:t>
           </w:r>
         </w:p>
         <w:p>
@@ -1033,7 +1033,7 @@
             <w:tab/>
           </w:r>
           <w:r>
-            <w:t>30</w:t>
+            <w:t>32</w:t>
           </w:r>
         </w:p>
         <w:p>
@@ -1051,7 +1051,7 @@
             <w:tab/>
           </w:r>
           <w:r>
-            <w:t>30</w:t>
+            <w:t>32</w:t>
           </w:r>
         </w:p>
         <w:p>
@@ -1069,7 +1069,7 @@
             <w:tab/>
           </w:r>
           <w:r>
-            <w:t>31</w:t>
+            <w:t>33</w:t>
           </w:r>
         </w:p>
         <w:p>
@@ -1087,7 +1087,7 @@
             <w:tab/>
           </w:r>
           <w:r>
-            <w:t>32</w:t>
+            <w:t>34</w:t>
           </w:r>
         </w:p>
         <w:p>
@@ -1105,7 +1105,7 @@
             <w:tab/>
           </w:r>
           <w:r>
-            <w:t>32</w:t>
+            <w:t>34</w:t>
           </w:r>
         </w:p>
         <w:p>
@@ -1123,7 +1123,7 @@
             <w:tab/>
           </w:r>
           <w:r>
-            <w:t>32</w:t>
+            <w:t>35</w:t>
           </w:r>
         </w:p>
         <w:p>
@@ -1141,7 +1141,7 @@
             <w:tab/>
           </w:r>
           <w:r>
-            <w:t>33</w:t>
+            <w:t>35</w:t>
           </w:r>
         </w:p>
         <w:p>
@@ -1159,7 +1159,7 @@
             <w:tab/>
           </w:r>
           <w:r>
-            <w:t>34</w:t>
+            <w:t>36</w:t>
           </w:r>
         </w:p>
         <w:p>
@@ -1177,7 +1177,7 @@
             <w:tab/>
           </w:r>
           <w:r>
-            <w:t>34</w:t>
+            <w:t>37</w:t>
           </w:r>
         </w:p>
         <w:p>
@@ -1195,7 +1195,7 @@
             <w:tab/>
           </w:r>
           <w:r>
-            <w:t>35</w:t>
+            <w:t>37</w:t>
           </w:r>
         </w:p>
         <w:p>
@@ -1213,7 +1213,7 @@
             <w:tab/>
           </w:r>
           <w:r>
-            <w:t>37</w:t>
+            <w:t>39</w:t>
           </w:r>
         </w:p>
         <w:p>
@@ -1231,7 +1231,7 @@
             <w:tab/>
           </w:r>
           <w:r>
-            <w:t>38</w:t>
+            <w:t>40</w:t>
           </w:r>
           <w:r>
             <w:fldChar w:fldCharType="end"/>
@@ -1286,7 +1286,7 @@
             <w:tab/>
           </w:r>
           <w:r>
-            <w:t>12</w:t>
+            <w:t>13</w:t>
           </w:r>
         </w:p>
         <w:p>
@@ -1304,7 +1304,7 @@
             <w:tab/>
           </w:r>
           <w:r>
-            <w:t>14</w:t>
+            <w:t>15</w:t>
           </w:r>
         </w:p>
         <w:p>
@@ -1322,7 +1322,7 @@
             <w:tab/>
           </w:r>
           <w:r>
-            <w:t>15</w:t>
+            <w:t>17</w:t>
           </w:r>
         </w:p>
         <w:p>
@@ -1340,7 +1340,7 @@
             <w:tab/>
           </w:r>
           <w:r>
-            <w:t>17</w:t>
+            <w:t>18</w:t>
           </w:r>
         </w:p>
         <w:p>
@@ -1358,7 +1358,7 @@
             <w:tab/>
           </w:r>
           <w:r>
-            <w:t>18</w:t>
+            <w:t>19</w:t>
           </w:r>
         </w:p>
         <w:p>
@@ -1376,7 +1376,7 @@
             <w:tab/>
           </w:r>
           <w:r>
-            <w:t>19</w:t>
+            <w:t>20</w:t>
           </w:r>
         </w:p>
         <w:p>
@@ -1394,7 +1394,7 @@
             <w:tab/>
           </w:r>
           <w:r>
-            <w:t>20</w:t>
+            <w:t>21</w:t>
           </w:r>
         </w:p>
         <w:p>
@@ -1412,7 +1412,7 @@
             <w:tab/>
           </w:r>
           <w:r>
-            <w:t>21</w:t>
+            <w:t>22</w:t>
           </w:r>
         </w:p>
         <w:p>
@@ -1430,7 +1430,7 @@
             <w:tab/>
           </w:r>
           <w:r>
-            <w:t>25</w:t>
+            <w:t>27</w:t>
           </w:r>
         </w:p>
         <w:p>
@@ -1448,7 +1448,7 @@
             <w:tab/>
           </w:r>
           <w:r>
-            <w:t>26</w:t>
+            <w:t>28</w:t>
           </w:r>
         </w:p>
         <w:p>
@@ -1466,7 +1466,7 @@
             <w:tab/>
           </w:r>
           <w:r>
-            <w:t>26</w:t>
+            <w:t>28</w:t>
           </w:r>
         </w:p>
         <w:p>
@@ -1484,7 +1484,7 @@
             <w:tab/>
           </w:r>
           <w:r>
-            <w:t>26</w:t>
+            <w:t>28</w:t>
           </w:r>
         </w:p>
         <w:p>
@@ -1502,7 +1502,7 @@
             <w:tab/>
           </w:r>
           <w:r>
-            <w:t>37</w:t>
+            <w:t>39</w:t>
           </w:r>
           <w:r>
             <w:fldChar w:fldCharType="end"/>
@@ -1575,7 +1575,7 @@
             <w:tab/>
           </w:r>
           <w:r>
-            <w:t>21</w:t>
+            <w:t>23</w:t>
           </w:r>
         </w:p>
         <w:p>
@@ -1587,13 +1587,13 @@
             <w:ind w:left="0"/>
           </w:pPr>
           <w:r>
-            <w:t xml:space="preserve">Table 3. Estimated Daily Power Budget of One Station (Worst Case, LTE)</w:t>
+            <w:t xml:space="preserve">Table 3. Estimated Daily Power Budget of One Station</w:t>
           </w:r>
           <w:r>
             <w:tab/>
           </w:r>
           <w:r>
-            <w:t>22</w:t>
+            <w:t>24</w:t>
           </w:r>
         </w:p>
         <w:p>
@@ -1611,7 +1611,7 @@
             <w:tab/>
           </w:r>
           <w:r>
-            <w:t>23</w:t>
+            <w:t>25</w:t>
           </w:r>
         </w:p>
         <w:p>
@@ -1629,7 +1629,7 @@
             <w:tab/>
           </w:r>
           <w:r>
-            <w:t>27</w:t>
+            <w:t>29</w:t>
           </w:r>
         </w:p>
         <w:p>
@@ -1647,7 +1647,7 @@
             <w:tab/>
           </w:r>
           <w:r>
-            <w:t>28</w:t>
+            <w:t>30</w:t>
           </w:r>
         </w:p>
         <w:p>
@@ -1665,7 +1665,7 @@
             <w:tab/>
           </w:r>
           <w:r>
-            <w:t>30</w:t>
+            <w:t>32</w:t>
           </w:r>
         </w:p>
         <w:p>
@@ -1683,7 +1683,7 @@
             <w:tab/>
           </w:r>
           <w:r>
-            <w:t>30</w:t>
+            <w:t>33</w:t>
           </w:r>
         </w:p>
         <w:p>
@@ -1701,7 +1701,7 @@
             <w:tab/>
           </w:r>
           <w:r>
-            <w:t>31</w:t>
+            <w:t>33</w:t>
           </w:r>
         </w:p>
         <w:p>
@@ -1719,7 +1719,7 @@
             <w:tab/>
           </w:r>
           <w:r>
-            <w:t>33</w:t>
+            <w:t>35</w:t>
           </w:r>
         </w:p>
         <w:p>
@@ -1737,7 +1737,7 @@
             <w:tab/>
           </w:r>
           <w:r>
-            <w:t>33</w:t>
+            <w:t>36</w:t>
           </w:r>
         </w:p>
         <w:p>
@@ -1755,7 +1755,7 @@
             <w:tab/>
           </w:r>
           <w:r>
-            <w:t>34</w:t>
+            <w:t>36</w:t>
           </w:r>
         </w:p>
         <w:p>
@@ -1773,7 +1773,7 @@
             <w:tab/>
           </w:r>
           <w:r>
-            <w:t>35</w:t>
+            <w:t>37</w:t>
           </w:r>
         </w:p>
         <w:p>
@@ -1791,7 +1791,7 @@
             <w:tab/>
           </w:r>
           <w:r>
-            <w:t>35</w:t>
+            <w:t>37</w:t>
           </w:r>
           <w:r>
             <w:fldChar w:fldCharType="end"/>
@@ -2325,7 +2325,7 @@
         <w:jc w:val="both"/>
       </w:pPr>
       <w:r>
-        <w:t xml:space="preserve">Each monitoring station uses a Sensirion SEN55 sensor module, a LilyGO T-SIM7600 board (ESP32 microcontroller with a 4G LTE and GPS modem), an INA219 power monitor, and a compact solar-charged LiFePO4 battery pack, all in a small weatherproof unit. Stations transmit data over Wi-Fi, falling back to 4G LTE when Wi-Fi is unavailable, to a backend built with Node.js and PostgreSQL. Users access the data through a mobile-first web application (Progressive Web App) that shows real-time readings, history, station locations on a map, and alerts.</w:t>
+        <w:t xml:space="preserve">Each monitoring station uses a Sensirion SEN55 sensor module, an ESP32 DevKit microcontroller with separate 4G LTE (A7670) and GPS modules, an INA219 power monitor, and a compact solar-charged lithium-ion battery pack (three 18650 cells), all in a small weatherproof unit. Stations transmit data over Wi-Fi, falling back to 4G LTE when Wi-Fi is unavailable, to a backend built with Node.js and PostgreSQL. Users access the data through a mobile-first web application (Progressive Web App) that shows real-time readings, history, station locations on a map, and alerts.</w:t>
       </w:r>
     </w:p>
     <w:p>
@@ -4241,7 +4241,7 @@
                 <w:sz w:val="22"/>
                 <w:szCs w:val="22"/>
               </w:rPr>
-              <w:t xml:space="preserve">Sensirion SEN55; ESP32 LilyGO T-SIM7600 (LTE + GPS); LiFePO4 + solar; HTTPS REST, WebSocket; Node.js, PostgreSQL; React PWA; Docker</w:t>
+              <w:t xml:space="preserve">Sensirion SEN55; ESP32 with A7670 LTE and GPS modules; 18650 Li-ion + solar; HTTPS REST, WebSocket; Node.js, PostgreSQL; React PWA; Docker</w:t>
             </w:r>
           </w:p>
         </w:tc>
@@ -4589,7 +4589,7 @@
       <w:r>
         <w:drawing>
           <wp:inline distT="0" distB="0" distL="0" distR="0">
-            <wp:extent cx="4754880" cy="6616201"/>
+            <wp:extent cx="4754880" cy="6617475"/>
             <wp:effectExtent t="0" r="0" b="0" l="0"/>
             <wp:docPr id="1" name="/var/tmp/gbuild/img/f2.png" descr="/var/tmp/gbuild/img/f2.png" title="/var/tmp/gbuild/img/f2.png"/>
             <wp:cNvGraphicFramePr>
@@ -4614,7 +4614,7 @@
                   <pic:spPr bwMode="auto">
                     <a:xfrm>
                       <a:off x="0" y="0"/>
-                      <a:ext cx="4754880" cy="6616201"/>
+                      <a:ext cx="4754880" cy="6617475"/>
                     </a:xfrm>
                     <a:prstGeom prst="rect">
                       <a:avLst/>
@@ -4654,7 +4654,7 @@
         <w:t xml:space="preserve">(A) Monitoring station:</w:t>
       </w:r>
       <w:r>
-        <w:t xml:space="preserve"> a small 6 V, 10 W solar panel charges a compact LiFePO4 battery pack (four 32700 cells, 3.2 V) through a LiFePO4 solar charger; the battery is the primary power source and supplies the station day and night through a 3.2 V-to-5 V boost converter. The Sensirion SEN55 sensor connects to the LilyGO T-SIM7600 board (ESP32 with a SIM7600G-H LTE/GPS modem) over the I²C bus. </w:t>
+        <w:t xml:space="preserve"> a small 6 V, 6 W solar panel charges a compact lithium-ion battery pack (three 18650 cells, 3.7 V) through a Li-ion solar charger; the battery is the primary power source and supplies the station day and night through a 3.3 V buck-boost converter and a 5 V boost converter. An ESP32 DevKit microcontroller reads the Sensirion SEN55 sensor over the I²C bus and controls a separate A7670 4G LTE module and a GPS module over serial (UART) connections. </w:t>
       </w:r>
       <w:r>
         <w:rPr>
@@ -5164,7 +5164,7 @@
       <w:r>
         <w:drawing>
           <wp:inline distT="0" distB="0" distL="0" distR="0">
-            <wp:extent cx="5120640" cy="5440003"/>
+            <wp:extent cx="5120640" cy="5711657"/>
             <wp:effectExtent t="0" r="0" b="0" l="0"/>
             <wp:docPr id="1" name="/var/tmp/gbuild/img/f7.png" descr="/var/tmp/gbuild/img/f7.png" title="/var/tmp/gbuild/img/f7.png"/>
             <wp:cNvGraphicFramePr>
@@ -5189,7 +5189,7 @@
                   <pic:spPr bwMode="auto">
                     <a:xfrm>
                       <a:off x="0" y="0"/>
-                      <a:ext cx="5120640" cy="5440003"/>
+                      <a:ext cx="5120640" cy="5711657"/>
                     </a:xfrm>
                     <a:prstGeom prst="rect">
                       <a:avLst/>
@@ -5219,7 +5219,7 @@
         <w:jc w:val="both"/>
       </w:pPr>
       <w:r>
-        <w:t xml:space="preserve">Figure 7 shows the hardware blocks of one monitoring station and how they are grouped physically. The solar panel and LTE/GNSS antennas are mounted outdoors. The </w:t>
+        <w:t xml:space="preserve">Figure 7 shows the hardware blocks of one monitoring station and how they are grouped physically. The solar panel and LTE antenna are mounted outdoors. The </w:t>
       </w:r>
       <w:r>
         <w:rPr>
@@ -5229,7 +5229,7 @@
         <w:t xml:space="preserve">IP65 enclosure</w:t>
       </w:r>
       <w:r>
-        <w:t xml:space="preserve"> (200 × 120 × 75 mm) holds the solar charger, 5 A fuse, INA219 power monitor, LiFePO4 battery pack with its protection board (BMS), boost converter, status LEDs, and the LilyGO T-SIM7600 board. The </w:t>
+        <w:t xml:space="preserve"> (150 × 100 × 70 mm) holds the CN3791 solar charger, 5 A fuse, INA219 power monitor, the 18650 battery pack with its protection board (BMS), the 3.3 V and 5 V converters, the ESP32 DevKit, the A7670 LTE module with its nano-SIM, the GPS module with its power switch, and the status LEDs. The </w:t>
       </w:r>
       <w:r>
         <w:rPr>
@@ -5239,7 +5239,7 @@
         <w:t xml:space="preserve">radiation shield</w:t>
       </w:r>
       <w:r>
-        <w:t xml:space="preserve"> holds the SEN55 sensor separately from the enclosure so that heat from the electronics and battery does not affect the readings and air can flow freely around the sensor. Power paths (3.2 V and 5 V), I²C data, UART, GPIO, and RF links are drawn in different line styles, as shown in the legend.</w:t>
+        <w:t xml:space="preserve"> holds the SEN55 sensor separately from the enclosure so that heat from the electronics and battery does not affect the readings and air can flow freely around the sensor. Power paths (3.7 V battery, 3.3 V and 5 V), I²C data, UART, GPIO, and RF links are drawn in different line styles, as shown in the legend.</w:t>
       </w:r>
     </w:p>
     <w:p>
@@ -5261,7 +5261,7 @@
       <w:r>
         <w:drawing>
           <wp:inline distT="0" distB="0" distL="0" distR="0">
-            <wp:extent cx="5486400" cy="3856924"/>
+            <wp:extent cx="5486400" cy="5115250"/>
             <wp:effectExtent t="0" r="0" b="0" l="0"/>
             <wp:docPr id="1" name="/var/tmp/gbuild/img/f8.png" descr="/var/tmp/gbuild/img/f8.png" title="/var/tmp/gbuild/img/f8.png"/>
             <wp:cNvGraphicFramePr>
@@ -5286,7 +5286,7 @@
                   <pic:spPr bwMode="auto">
                     <a:xfrm>
                       <a:off x="0" y="0"/>
-                      <a:ext cx="5486400" cy="3856924"/>
+                      <a:ext cx="5486400" cy="5115250"/>
                     </a:xfrm>
                     <a:prstGeom prst="rect">
                       <a:avLst/>
@@ -5316,7 +5316,7 @@
         <w:jc w:val="both"/>
       </w:pPr>
       <w:r>
-        <w:t xml:space="preserve">Figure 8 presents the circuit diagram drawn with standard electrical symbols and reference designators. PV1 connects to the solar input of the 1S LiFePO4 charger U1. The battery pack BT1 (four 32700 cells in parallel with a protection board) connects to U1's battery terminals through fuse F1 and the INA219 current-sense input (U4 VIN+ to VIN−), so the INA219 measures battery voltage and charge/discharge current. U1's output feeds the boost converter U2, whose 5 V output (with bulk capacitor C2 to absorb LTE transmit current peaks) powers the LilyGO board U3 and the SEN55 (J1 pin 1). J1 pin 5 (SEL) is tied to ground to select I²C mode. The SEN55 and INA219 share the I²C bus on GPIO21 (SDA) and GPIO22 (SCL) with 4.7 kΩ pull-up resistors R3 and R4. Status LEDs D1 and D2 are driven from GPIO18 and GPIO19 through 220 Ω resistors. Table 2 lists the pin assignments.</w:t>
+        <w:t xml:space="preserve">Figure 8 presents the circuit diagram drawn with standard electrical symbols and reference designators; net labels with the same name are connected. PV1 connects to the solar input of the CN3791 charger U1. The battery pack BT1 (three 18650 cells in parallel with a protection board) connects to U1's battery terminals through fuse F1 and the INA219 current-sense input (U4 VIN+ to VIN−), so the INA219 measures battery voltage and charge/discharge current. The charger side of F1 forms the battery rail VBAT (3.0–4.2 V), which feeds the buck-boost converter U2 (3.3 V for the ESP32, INA219, and GPS), the boost converter U5 (5 V for the SEN55), and the LTE module U6 directly, with bulk capacitor C2 absorbing its transmit current peaks. The ESP32 DevKit U3 is powered through its 3V3 pin. J1 pin 5 (SEL) is tied to ground to select I²C mode, and the SEN55 and INA219 share the I²C bus on GPIO21 (SDA) and GPIO22 (SCL) with 4.7 kΩ pull-up resistors R3 and R4. The GPS module U7 is powered through the P-channel MOSFET Q1, which the ESP32 switches on from GPIO27 only while it needs a position fix; R7 keeps it off during start-up. Status LEDs D1 and D2 are driven from GPIO18 and GPIO19 through 220 Ω resistors. Table 2 lists the pin assignments.</w:t>
       </w:r>
     </w:p>
     <w:p>
@@ -5345,9 +5345,9 @@
       </w:tblPr>
       <w:tblGrid>
         <w:gridCol w:w="1800"/>
-        <w:gridCol w:w="2600"/>
-        <w:gridCol w:w="1500"/>
-        <w:gridCol w:w="2740"/>
+        <w:gridCol w:w="2400"/>
+        <w:gridCol w:w="1900"/>
+        <w:gridCol w:w="2540"/>
       </w:tblGrid>
       <w:tr>
         <w:trPr>
@@ -5389,7 +5389,7 @@
         </w:tc>
         <w:tc>
           <w:tcPr>
-            <w:tcW w:type="dxa" w:w="2600"/>
+            <w:tcW w:type="dxa" w:w="2400"/>
             <w:tcBorders>
               <w:top w:val="single" w:color="000000" w:sz="4"/>
               <w:left w:val="single" w:color="000000" w:sz="4"/>
@@ -5423,7 +5423,7 @@
         </w:tc>
         <w:tc>
           <w:tcPr>
-            <w:tcW w:type="dxa" w:w="1500"/>
+            <w:tcW w:type="dxa" w:w="1900"/>
             <w:tcBorders>
               <w:top w:val="single" w:color="000000" w:sz="4"/>
               <w:left w:val="single" w:color="000000" w:sz="4"/>
@@ -5457,7 +5457,7 @@
         </w:tc>
         <w:tc>
           <w:tcPr>
-            <w:tcW w:type="dxa" w:w="2740"/>
+            <w:tcW w:type="dxa" w:w="2540"/>
             <w:tcBorders>
               <w:top w:val="single" w:color="000000" w:sz="4"/>
               <w:left w:val="single" w:color="000000" w:sz="4"/>
@@ -5527,7 +5527,7 @@
         </w:tc>
         <w:tc>
           <w:tcPr>
-            <w:tcW w:type="dxa" w:w="2600"/>
+            <w:tcW w:type="dxa" w:w="2400"/>
             <w:tcBorders>
               <w:top w:val="single" w:color="000000" w:sz="4"/>
               <w:left w:val="single" w:color="000000" w:sz="4"/>
@@ -5558,7 +5558,7 @@
         </w:tc>
         <w:tc>
           <w:tcPr>
-            <w:tcW w:type="dxa" w:w="1500"/>
+            <w:tcW w:type="dxa" w:w="1900"/>
             <w:tcBorders>
               <w:top w:val="single" w:color="000000" w:sz="4"/>
               <w:left w:val="single" w:color="000000" w:sz="4"/>
@@ -5589,7 +5589,7 @@
         </w:tc>
         <w:tc>
           <w:tcPr>
-            <w:tcW w:type="dxa" w:w="2740"/>
+            <w:tcW w:type="dxa" w:w="2540"/>
             <w:tcBorders>
               <w:top w:val="single" w:color="000000" w:sz="4"/>
               <w:left w:val="single" w:color="000000" w:sz="4"/>
@@ -5656,7 +5656,7 @@
         </w:tc>
         <w:tc>
           <w:tcPr>
-            <w:tcW w:type="dxa" w:w="2600"/>
+            <w:tcW w:type="dxa" w:w="2400"/>
             <w:tcBorders>
               <w:top w:val="single" w:color="000000" w:sz="4"/>
               <w:left w:val="single" w:color="000000" w:sz="4"/>
@@ -5687,7 +5687,7 @@
         </w:tc>
         <w:tc>
           <w:tcPr>
-            <w:tcW w:type="dxa" w:w="1500"/>
+            <w:tcW w:type="dxa" w:w="1900"/>
             <w:tcBorders>
               <w:top w:val="single" w:color="000000" w:sz="4"/>
               <w:left w:val="single" w:color="000000" w:sz="4"/>
@@ -5718,7 +5718,7 @@
         </w:tc>
         <w:tc>
           <w:tcPr>
-            <w:tcW w:type="dxa" w:w="2740"/>
+            <w:tcW w:type="dxa" w:w="2540"/>
             <w:tcBorders>
               <w:top w:val="single" w:color="000000" w:sz="4"/>
               <w:left w:val="single" w:color="000000" w:sz="4"/>
@@ -5785,7 +5785,7 @@
         </w:tc>
         <w:tc>
           <w:tcPr>
-            <w:tcW w:type="dxa" w:w="2600"/>
+            <w:tcW w:type="dxa" w:w="2400"/>
             <w:tcBorders>
               <w:top w:val="single" w:color="000000" w:sz="4"/>
               <w:left w:val="single" w:color="000000" w:sz="4"/>
@@ -5816,7 +5816,7 @@
         </w:tc>
         <w:tc>
           <w:tcPr>
-            <w:tcW w:type="dxa" w:w="1500"/>
+            <w:tcW w:type="dxa" w:w="1900"/>
             <w:tcBorders>
               <w:top w:val="single" w:color="000000" w:sz="4"/>
               <w:left w:val="single" w:color="000000" w:sz="4"/>
@@ -5847,7 +5847,7 @@
         </w:tc>
         <w:tc>
           <w:tcPr>
-            <w:tcW w:type="dxa" w:w="2740"/>
+            <w:tcW w:type="dxa" w:w="2540"/>
             <w:tcBorders>
               <w:top w:val="single" w:color="000000" w:sz="4"/>
               <w:left w:val="single" w:color="000000" w:sz="4"/>
@@ -5908,100 +5908,100 @@
                 <w:sz w:val="22"/>
                 <w:szCs w:val="22"/>
               </w:rPr>
-              <w:t xml:space="preserve">Status LED (red)</w:t>
-            </w:r>
-          </w:p>
-        </w:tc>
-        <w:tc>
-          <w:tcPr>
-            <w:tcW w:type="dxa" w:w="2600"/>
-            <w:tcBorders>
-              <w:top w:val="single" w:color="000000" w:sz="4"/>
-              <w:left w:val="single" w:color="000000" w:sz="4"/>
-              <w:bottom w:val="single" w:color="000000" w:sz="4"/>
-              <w:right w:val="single" w:color="000000" w:sz="4"/>
-            </w:tcBorders>
-            <w:tcMar>
-              <w:top w:type="dxa" w:w="60"/>
-              <w:left w:type="dxa" w:w="100"/>
-              <w:bottom w:type="dxa" w:w="60"/>
-              <w:right w:type="dxa" w:w="100"/>
-            </w:tcMar>
-            <w:vAlign w:val="center"/>
-          </w:tcPr>
-          <w:p>
-            <w:pPr>
-              <w:spacing w:after="0" w:line="260"/>
-              <w:jc w:val="left"/>
-            </w:pPr>
-            <w:r>
-              <w:rPr>
-                <w:sz w:val="22"/>
-                <w:szCs w:val="22"/>
-              </w:rPr>
-              <w:t xml:space="preserve">D1 via R5 220 Ω</w:t>
-            </w:r>
-          </w:p>
-        </w:tc>
-        <w:tc>
-          <w:tcPr>
-            <w:tcW w:type="dxa" w:w="1500"/>
-            <w:tcBorders>
-              <w:top w:val="single" w:color="000000" w:sz="4"/>
-              <w:left w:val="single" w:color="000000" w:sz="4"/>
-              <w:bottom w:val="single" w:color="000000" w:sz="4"/>
-              <w:right w:val="single" w:color="000000" w:sz="4"/>
-            </w:tcBorders>
-            <w:tcMar>
-              <w:top w:type="dxa" w:w="60"/>
-              <w:left w:type="dxa" w:w="100"/>
-              <w:bottom w:type="dxa" w:w="60"/>
-              <w:right w:type="dxa" w:w="100"/>
-            </w:tcMar>
-            <w:vAlign w:val="center"/>
-          </w:tcPr>
-          <w:p>
-            <w:pPr>
-              <w:spacing w:after="0" w:line="260"/>
-              <w:jc w:val="left"/>
-            </w:pPr>
-            <w:r>
-              <w:rPr>
-                <w:sz w:val="22"/>
-                <w:szCs w:val="22"/>
-              </w:rPr>
-              <w:t xml:space="preserve">GPIO18</w:t>
-            </w:r>
-          </w:p>
-        </w:tc>
-        <w:tc>
-          <w:tcPr>
-            <w:tcW w:type="dxa" w:w="2740"/>
-            <w:tcBorders>
-              <w:top w:val="single" w:color="000000" w:sz="4"/>
-              <w:left w:val="single" w:color="000000" w:sz="4"/>
-              <w:bottom w:val="single" w:color="000000" w:sz="4"/>
-              <w:right w:val="single" w:color="000000" w:sz="4"/>
-            </w:tcBorders>
-            <w:tcMar>
-              <w:top w:type="dxa" w:w="60"/>
-              <w:left w:type="dxa" w:w="100"/>
-              <w:bottom w:type="dxa" w:w="60"/>
-              <w:right w:type="dxa" w:w="100"/>
-            </w:tcMar>
-            <w:vAlign w:val="center"/>
-          </w:tcPr>
-          <w:p>
-            <w:pPr>
-              <w:spacing w:after="0" w:line="260"/>
-              <w:jc w:val="left"/>
-            </w:pPr>
-            <w:r>
-              <w:rPr>
-                <w:sz w:val="22"/>
-                <w:szCs w:val="22"/>
-              </w:rPr>
-              <w:t xml:space="preserve">On when air quality is poor</w:t>
+              <w:t xml:space="preserve">LTE UART</w:t>
+            </w:r>
+          </w:p>
+        </w:tc>
+        <w:tc>
+          <w:tcPr>
+            <w:tcW w:type="dxa" w:w="2400"/>
+            <w:tcBorders>
+              <w:top w:val="single" w:color="000000" w:sz="4"/>
+              <w:left w:val="single" w:color="000000" w:sz="4"/>
+              <w:bottom w:val="single" w:color="000000" w:sz="4"/>
+              <w:right w:val="single" w:color="000000" w:sz="4"/>
+            </w:tcBorders>
+            <w:tcMar>
+              <w:top w:type="dxa" w:w="60"/>
+              <w:left w:type="dxa" w:w="100"/>
+              <w:bottom w:type="dxa" w:w="60"/>
+              <w:right w:type="dxa" w:w="100"/>
+            </w:tcMar>
+            <w:vAlign w:val="center"/>
+          </w:tcPr>
+          <w:p>
+            <w:pPr>
+              <w:spacing w:after="0" w:line="260"/>
+              <w:jc w:val="left"/>
+            </w:pPr>
+            <w:r>
+              <w:rPr>
+                <w:sz w:val="22"/>
+                <w:szCs w:val="22"/>
+              </w:rPr>
+              <w:t xml:space="preserve">A7670 TXD / RXD</w:t>
+            </w:r>
+          </w:p>
+        </w:tc>
+        <w:tc>
+          <w:tcPr>
+            <w:tcW w:type="dxa" w:w="1900"/>
+            <w:tcBorders>
+              <w:top w:val="single" w:color="000000" w:sz="4"/>
+              <w:left w:val="single" w:color="000000" w:sz="4"/>
+              <w:bottom w:val="single" w:color="000000" w:sz="4"/>
+              <w:right w:val="single" w:color="000000" w:sz="4"/>
+            </w:tcBorders>
+            <w:tcMar>
+              <w:top w:type="dxa" w:w="60"/>
+              <w:left w:type="dxa" w:w="100"/>
+              <w:bottom w:type="dxa" w:w="60"/>
+              <w:right w:type="dxa" w:w="100"/>
+            </w:tcMar>
+            <w:vAlign w:val="center"/>
+          </w:tcPr>
+          <w:p>
+            <w:pPr>
+              <w:spacing w:after="0" w:line="260"/>
+              <w:jc w:val="left"/>
+            </w:pPr>
+            <w:r>
+              <w:rPr>
+                <w:sz w:val="22"/>
+                <w:szCs w:val="22"/>
+              </w:rPr>
+              <w:t xml:space="preserve">GPIO16 (RX2) / GPIO17 (TX2)</w:t>
+            </w:r>
+          </w:p>
+        </w:tc>
+        <w:tc>
+          <w:tcPr>
+            <w:tcW w:type="dxa" w:w="2540"/>
+            <w:tcBorders>
+              <w:top w:val="single" w:color="000000" w:sz="4"/>
+              <w:left w:val="single" w:color="000000" w:sz="4"/>
+              <w:bottom w:val="single" w:color="000000" w:sz="4"/>
+              <w:right w:val="single" w:color="000000" w:sz="4"/>
+            </w:tcBorders>
+            <w:tcMar>
+              <w:top w:type="dxa" w:w="60"/>
+              <w:left w:type="dxa" w:w="100"/>
+              <w:bottom w:type="dxa" w:w="60"/>
+              <w:right w:type="dxa" w:w="100"/>
+            </w:tcMar>
+            <w:vAlign w:val="center"/>
+          </w:tcPr>
+          <w:p>
+            <w:pPr>
+              <w:spacing w:after="0" w:line="260"/>
+              <w:jc w:val="left"/>
+            </w:pPr>
+            <w:r>
+              <w:rPr>
+                <w:sz w:val="22"/>
+                <w:szCs w:val="22"/>
+              </w:rPr>
+              <w:t xml:space="preserve">3.3 V logic breakout</w:t>
             </w:r>
           </w:p>
         </w:tc>
@@ -6037,100 +6037,100 @@
                 <w:sz w:val="22"/>
                 <w:szCs w:val="22"/>
               </w:rPr>
-              <w:t xml:space="preserve">Status LED (green)</w:t>
-            </w:r>
-          </w:p>
-        </w:tc>
-        <w:tc>
-          <w:tcPr>
-            <w:tcW w:type="dxa" w:w="2600"/>
-            <w:tcBorders>
-              <w:top w:val="single" w:color="000000" w:sz="4"/>
-              <w:left w:val="single" w:color="000000" w:sz="4"/>
-              <w:bottom w:val="single" w:color="000000" w:sz="4"/>
-              <w:right w:val="single" w:color="000000" w:sz="4"/>
-            </w:tcBorders>
-            <w:tcMar>
-              <w:top w:type="dxa" w:w="60"/>
-              <w:left w:type="dxa" w:w="100"/>
-              <w:bottom w:type="dxa" w:w="60"/>
-              <w:right w:type="dxa" w:w="100"/>
-            </w:tcMar>
-            <w:vAlign w:val="center"/>
-          </w:tcPr>
-          <w:p>
-            <w:pPr>
-              <w:spacing w:after="0" w:line="260"/>
-              <w:jc w:val="left"/>
-            </w:pPr>
-            <w:r>
-              <w:rPr>
-                <w:sz w:val="22"/>
-                <w:szCs w:val="22"/>
-              </w:rPr>
-              <w:t xml:space="preserve">D2 via R6 220 Ω</w:t>
-            </w:r>
-          </w:p>
-        </w:tc>
-        <w:tc>
-          <w:tcPr>
-            <w:tcW w:type="dxa" w:w="1500"/>
-            <w:tcBorders>
-              <w:top w:val="single" w:color="000000" w:sz="4"/>
-              <w:left w:val="single" w:color="000000" w:sz="4"/>
-              <w:bottom w:val="single" w:color="000000" w:sz="4"/>
-              <w:right w:val="single" w:color="000000" w:sz="4"/>
-            </w:tcBorders>
-            <w:tcMar>
-              <w:top w:type="dxa" w:w="60"/>
-              <w:left w:type="dxa" w:w="100"/>
-              <w:bottom w:type="dxa" w:w="60"/>
-              <w:right w:type="dxa" w:w="100"/>
-            </w:tcMar>
-            <w:vAlign w:val="center"/>
-          </w:tcPr>
-          <w:p>
-            <w:pPr>
-              <w:spacing w:after="0" w:line="260"/>
-              <w:jc w:val="left"/>
-            </w:pPr>
-            <w:r>
-              <w:rPr>
-                <w:sz w:val="22"/>
-                <w:szCs w:val="22"/>
-              </w:rPr>
-              <w:t xml:space="preserve">GPIO19</w:t>
-            </w:r>
-          </w:p>
-        </w:tc>
-        <w:tc>
-          <w:tcPr>
-            <w:tcW w:type="dxa" w:w="2740"/>
-            <w:tcBorders>
-              <w:top w:val="single" w:color="000000" w:sz="4"/>
-              <w:left w:val="single" w:color="000000" w:sz="4"/>
-              <w:bottom w:val="single" w:color="000000" w:sz="4"/>
-              <w:right w:val="single" w:color="000000" w:sz="4"/>
-            </w:tcBorders>
-            <w:tcMar>
-              <w:top w:type="dxa" w:w="60"/>
-              <w:left w:type="dxa" w:w="100"/>
-              <w:bottom w:type="dxa" w:w="60"/>
-              <w:right w:type="dxa" w:w="100"/>
-            </w:tcMar>
-            <w:vAlign w:val="center"/>
-          </w:tcPr>
-          <w:p>
-            <w:pPr>
-              <w:spacing w:after="0" w:line="260"/>
-              <w:jc w:val="left"/>
-            </w:pPr>
-            <w:r>
-              <w:rPr>
-                <w:sz w:val="22"/>
-                <w:szCs w:val="22"/>
-              </w:rPr>
-              <w:t xml:space="preserve">On when air quality is good</w:t>
+              <w:t xml:space="preserve">LTE power key</w:t>
+            </w:r>
+          </w:p>
+        </w:tc>
+        <w:tc>
+          <w:tcPr>
+            <w:tcW w:type="dxa" w:w="2400"/>
+            <w:tcBorders>
+              <w:top w:val="single" w:color="000000" w:sz="4"/>
+              <w:left w:val="single" w:color="000000" w:sz="4"/>
+              <w:bottom w:val="single" w:color="000000" w:sz="4"/>
+              <w:right w:val="single" w:color="000000" w:sz="4"/>
+            </w:tcBorders>
+            <w:tcMar>
+              <w:top w:type="dxa" w:w="60"/>
+              <w:left w:type="dxa" w:w="100"/>
+              <w:bottom w:type="dxa" w:w="60"/>
+              <w:right w:type="dxa" w:w="100"/>
+            </w:tcMar>
+            <w:vAlign w:val="center"/>
+          </w:tcPr>
+          <w:p>
+            <w:pPr>
+              <w:spacing w:after="0" w:line="260"/>
+              <w:jc w:val="left"/>
+            </w:pPr>
+            <w:r>
+              <w:rPr>
+                <w:sz w:val="22"/>
+                <w:szCs w:val="22"/>
+              </w:rPr>
+              <w:t xml:space="preserve">A7670 PWRKEY</w:t>
+            </w:r>
+          </w:p>
+        </w:tc>
+        <w:tc>
+          <w:tcPr>
+            <w:tcW w:type="dxa" w:w="1900"/>
+            <w:tcBorders>
+              <w:top w:val="single" w:color="000000" w:sz="4"/>
+              <w:left w:val="single" w:color="000000" w:sz="4"/>
+              <w:bottom w:val="single" w:color="000000" w:sz="4"/>
+              <w:right w:val="single" w:color="000000" w:sz="4"/>
+            </w:tcBorders>
+            <w:tcMar>
+              <w:top w:type="dxa" w:w="60"/>
+              <w:left w:type="dxa" w:w="100"/>
+              <w:bottom w:type="dxa" w:w="60"/>
+              <w:right w:type="dxa" w:w="100"/>
+            </w:tcMar>
+            <w:vAlign w:val="center"/>
+          </w:tcPr>
+          <w:p>
+            <w:pPr>
+              <w:spacing w:after="0" w:line="260"/>
+              <w:jc w:val="left"/>
+            </w:pPr>
+            <w:r>
+              <w:rPr>
+                <w:sz w:val="22"/>
+                <w:szCs w:val="22"/>
+              </w:rPr>
+              <w:t xml:space="preserve">GPIO4</w:t>
+            </w:r>
+          </w:p>
+        </w:tc>
+        <w:tc>
+          <w:tcPr>
+            <w:tcW w:type="dxa" w:w="2540"/>
+            <w:tcBorders>
+              <w:top w:val="single" w:color="000000" w:sz="4"/>
+              <w:left w:val="single" w:color="000000" w:sz="4"/>
+              <w:bottom w:val="single" w:color="000000" w:sz="4"/>
+              <w:right w:val="single" w:color="000000" w:sz="4"/>
+            </w:tcBorders>
+            <w:tcMar>
+              <w:top w:type="dxa" w:w="60"/>
+              <w:left w:type="dxa" w:w="100"/>
+              <w:bottom w:type="dxa" w:w="60"/>
+              <w:right w:type="dxa" w:w="100"/>
+            </w:tcMar>
+            <w:vAlign w:val="center"/>
+          </w:tcPr>
+          <w:p>
+            <w:pPr>
+              <w:spacing w:after="0" w:line="260"/>
+              <w:jc w:val="left"/>
+            </w:pPr>
+            <w:r>
+              <w:rPr>
+                <w:sz w:val="22"/>
+                <w:szCs w:val="22"/>
+              </w:rPr>
+              <w:t xml:space="preserve">Pulsed to switch the modem on</w:t>
             </w:r>
           </w:p>
         </w:tc>
@@ -6166,100 +6166,100 @@
                 <w:sz w:val="22"/>
                 <w:szCs w:val="22"/>
               </w:rPr>
-              <w:t xml:space="preserve">Modem UART</w:t>
-            </w:r>
-          </w:p>
-        </w:tc>
-        <w:tc>
-          <w:tcPr>
-            <w:tcW w:type="dxa" w:w="2600"/>
-            <w:tcBorders>
-              <w:top w:val="single" w:color="000000" w:sz="4"/>
-              <w:left w:val="single" w:color="000000" w:sz="4"/>
-              <w:bottom w:val="single" w:color="000000" w:sz="4"/>
-              <w:right w:val="single" w:color="000000" w:sz="4"/>
-            </w:tcBorders>
-            <w:tcMar>
-              <w:top w:type="dxa" w:w="60"/>
-              <w:left w:type="dxa" w:w="100"/>
-              <w:bottom w:type="dxa" w:w="60"/>
-              <w:right w:type="dxa" w:w="100"/>
-            </w:tcMar>
-            <w:vAlign w:val="center"/>
-          </w:tcPr>
-          <w:p>
-            <w:pPr>
-              <w:spacing w:after="0" w:line="260"/>
-              <w:jc w:val="left"/>
-            </w:pPr>
-            <w:r>
-              <w:rPr>
-                <w:sz w:val="22"/>
-                <w:szCs w:val="22"/>
-              </w:rPr>
-              <w:t xml:space="preserve">SIM7600 TX / RX</w:t>
-            </w:r>
-          </w:p>
-        </w:tc>
-        <w:tc>
-          <w:tcPr>
-            <w:tcW w:type="dxa" w:w="1500"/>
-            <w:tcBorders>
-              <w:top w:val="single" w:color="000000" w:sz="4"/>
-              <w:left w:val="single" w:color="000000" w:sz="4"/>
-              <w:bottom w:val="single" w:color="000000" w:sz="4"/>
-              <w:right w:val="single" w:color="000000" w:sz="4"/>
-            </w:tcBorders>
-            <w:tcMar>
-              <w:top w:type="dxa" w:w="60"/>
-              <w:left w:type="dxa" w:w="100"/>
-              <w:bottom w:type="dxa" w:w="60"/>
-              <w:right w:type="dxa" w:w="100"/>
-            </w:tcMar>
-            <w:vAlign w:val="center"/>
-          </w:tcPr>
-          <w:p>
-            <w:pPr>
-              <w:spacing w:after="0" w:line="260"/>
-              <w:jc w:val="left"/>
-            </w:pPr>
-            <w:r>
-              <w:rPr>
-                <w:sz w:val="22"/>
-                <w:szCs w:val="22"/>
-              </w:rPr>
-              <w:t xml:space="preserve">GPIO27 / GPIO26</w:t>
-            </w:r>
-          </w:p>
-        </w:tc>
-        <w:tc>
-          <w:tcPr>
-            <w:tcW w:type="dxa" w:w="2740"/>
-            <w:tcBorders>
-              <w:top w:val="single" w:color="000000" w:sz="4"/>
-              <w:left w:val="single" w:color="000000" w:sz="4"/>
-              <w:bottom w:val="single" w:color="000000" w:sz="4"/>
-              <w:right w:val="single" w:color="000000" w:sz="4"/>
-            </w:tcBorders>
-            <w:tcMar>
-              <w:top w:type="dxa" w:w="60"/>
-              <w:left w:type="dxa" w:w="100"/>
-              <w:bottom w:type="dxa" w:w="60"/>
-              <w:right w:type="dxa" w:w="100"/>
-            </w:tcMar>
-            <w:vAlign w:val="center"/>
-          </w:tcPr>
-          <w:p>
-            <w:pPr>
-              <w:spacing w:after="0" w:line="260"/>
-              <w:jc w:val="left"/>
-            </w:pPr>
-            <w:r>
-              <w:rPr>
-                <w:sz w:val="22"/>
-                <w:szCs w:val="22"/>
-              </w:rPr>
-              <w:t xml:space="preserve">Wired on the board</w:t>
+              <w:t xml:space="preserve">GPS UART</w:t>
+            </w:r>
+          </w:p>
+        </w:tc>
+        <w:tc>
+          <w:tcPr>
+            <w:tcW w:type="dxa" w:w="2400"/>
+            <w:tcBorders>
+              <w:top w:val="single" w:color="000000" w:sz="4"/>
+              <w:left w:val="single" w:color="000000" w:sz="4"/>
+              <w:bottom w:val="single" w:color="000000" w:sz="4"/>
+              <w:right w:val="single" w:color="000000" w:sz="4"/>
+            </w:tcBorders>
+            <w:tcMar>
+              <w:top w:type="dxa" w:w="60"/>
+              <w:left w:type="dxa" w:w="100"/>
+              <w:bottom w:type="dxa" w:w="60"/>
+              <w:right w:type="dxa" w:w="100"/>
+            </w:tcMar>
+            <w:vAlign w:val="center"/>
+          </w:tcPr>
+          <w:p>
+            <w:pPr>
+              <w:spacing w:after="0" w:line="260"/>
+              <w:jc w:val="left"/>
+            </w:pPr>
+            <w:r>
+              <w:rPr>
+                <w:sz w:val="22"/>
+                <w:szCs w:val="22"/>
+              </w:rPr>
+              <w:t xml:space="preserve">GPS TX / RX</w:t>
+            </w:r>
+          </w:p>
+        </w:tc>
+        <w:tc>
+          <w:tcPr>
+            <w:tcW w:type="dxa" w:w="1900"/>
+            <w:tcBorders>
+              <w:top w:val="single" w:color="000000" w:sz="4"/>
+              <w:left w:val="single" w:color="000000" w:sz="4"/>
+              <w:bottom w:val="single" w:color="000000" w:sz="4"/>
+              <w:right w:val="single" w:color="000000" w:sz="4"/>
+            </w:tcBorders>
+            <w:tcMar>
+              <w:top w:type="dxa" w:w="60"/>
+              <w:left w:type="dxa" w:w="100"/>
+              <w:bottom w:type="dxa" w:w="60"/>
+              <w:right w:type="dxa" w:w="100"/>
+            </w:tcMar>
+            <w:vAlign w:val="center"/>
+          </w:tcPr>
+          <w:p>
+            <w:pPr>
+              <w:spacing w:after="0" w:line="260"/>
+              <w:jc w:val="left"/>
+            </w:pPr>
+            <w:r>
+              <w:rPr>
+                <w:sz w:val="22"/>
+                <w:szCs w:val="22"/>
+              </w:rPr>
+              <w:t xml:space="preserve">GPIO25 (RX1) / GPIO26 (TX1)</w:t>
+            </w:r>
+          </w:p>
+        </w:tc>
+        <w:tc>
+          <w:tcPr>
+            <w:tcW w:type="dxa" w:w="2540"/>
+            <w:tcBorders>
+              <w:top w:val="single" w:color="000000" w:sz="4"/>
+              <w:left w:val="single" w:color="000000" w:sz="4"/>
+              <w:bottom w:val="single" w:color="000000" w:sz="4"/>
+              <w:right w:val="single" w:color="000000" w:sz="4"/>
+            </w:tcBorders>
+            <w:tcMar>
+              <w:top w:type="dxa" w:w="60"/>
+              <w:left w:type="dxa" w:w="100"/>
+              <w:bottom w:type="dxa" w:w="60"/>
+              <w:right w:type="dxa" w:w="100"/>
+            </w:tcMar>
+            <w:vAlign w:val="center"/>
+          </w:tcPr>
+          <w:p>
+            <w:pPr>
+              <w:spacing w:after="0" w:line="260"/>
+              <w:jc w:val="left"/>
+            </w:pPr>
+            <w:r>
+              <w:rPr>
+                <w:sz w:val="22"/>
+                <w:szCs w:val="22"/>
+              </w:rPr>
+              <w:t xml:space="preserve">9600 baud</w:t>
             </w:r>
           </w:p>
         </w:tc>
@@ -6295,100 +6295,100 @@
                 <w:sz w:val="22"/>
                 <w:szCs w:val="22"/>
               </w:rPr>
-              <w:t xml:space="preserve">Modem power key</w:t>
-            </w:r>
-          </w:p>
-        </w:tc>
-        <w:tc>
-          <w:tcPr>
-            <w:tcW w:type="dxa" w:w="2600"/>
-            <w:tcBorders>
-              <w:top w:val="single" w:color="000000" w:sz="4"/>
-              <w:left w:val="single" w:color="000000" w:sz="4"/>
-              <w:bottom w:val="single" w:color="000000" w:sz="4"/>
-              <w:right w:val="single" w:color="000000" w:sz="4"/>
-            </w:tcBorders>
-            <w:tcMar>
-              <w:top w:type="dxa" w:w="60"/>
-              <w:left w:type="dxa" w:w="100"/>
-              <w:bottom w:type="dxa" w:w="60"/>
-              <w:right w:type="dxa" w:w="100"/>
-            </w:tcMar>
-            <w:vAlign w:val="center"/>
-          </w:tcPr>
-          <w:p>
-            <w:pPr>
-              <w:spacing w:after="0" w:line="260"/>
-              <w:jc w:val="left"/>
-            </w:pPr>
-            <w:r>
-              <w:rPr>
-                <w:sz w:val="22"/>
-                <w:szCs w:val="22"/>
-              </w:rPr>
-              <w:t xml:space="preserve">SIM7600 PWRKEY</w:t>
-            </w:r>
-          </w:p>
-        </w:tc>
-        <w:tc>
-          <w:tcPr>
-            <w:tcW w:type="dxa" w:w="1500"/>
-            <w:tcBorders>
-              <w:top w:val="single" w:color="000000" w:sz="4"/>
-              <w:left w:val="single" w:color="000000" w:sz="4"/>
-              <w:bottom w:val="single" w:color="000000" w:sz="4"/>
-              <w:right w:val="single" w:color="000000" w:sz="4"/>
-            </w:tcBorders>
-            <w:tcMar>
-              <w:top w:type="dxa" w:w="60"/>
-              <w:left w:type="dxa" w:w="100"/>
-              <w:bottom w:type="dxa" w:w="60"/>
-              <w:right w:type="dxa" w:w="100"/>
-            </w:tcMar>
-            <w:vAlign w:val="center"/>
-          </w:tcPr>
-          <w:p>
-            <w:pPr>
-              <w:spacing w:after="0" w:line="260"/>
-              <w:jc w:val="left"/>
-            </w:pPr>
-            <w:r>
-              <w:rPr>
-                <w:sz w:val="22"/>
-                <w:szCs w:val="22"/>
-              </w:rPr>
-              <w:t xml:space="preserve">GPIO4</w:t>
-            </w:r>
-          </w:p>
-        </w:tc>
-        <w:tc>
-          <w:tcPr>
-            <w:tcW w:type="dxa" w:w="2740"/>
-            <w:tcBorders>
-              <w:top w:val="single" w:color="000000" w:sz="4"/>
-              <w:left w:val="single" w:color="000000" w:sz="4"/>
-              <w:bottom w:val="single" w:color="000000" w:sz="4"/>
-              <w:right w:val="single" w:color="000000" w:sz="4"/>
-            </w:tcBorders>
-            <w:tcMar>
-              <w:top w:type="dxa" w:w="60"/>
-              <w:left w:type="dxa" w:w="100"/>
-              <w:bottom w:type="dxa" w:w="60"/>
-              <w:right w:type="dxa" w:w="100"/>
-            </w:tcMar>
-            <w:vAlign w:val="center"/>
-          </w:tcPr>
-          <w:p>
-            <w:pPr>
-              <w:spacing w:after="0" w:line="260"/>
-              <w:jc w:val="left"/>
-            </w:pPr>
-            <w:r>
-              <w:rPr>
-                <w:sz w:val="22"/>
-                <w:szCs w:val="22"/>
-              </w:rPr>
-              <w:t xml:space="preserve">Wired on the board</w:t>
+              <w:t xml:space="preserve">GPS power</w:t>
+            </w:r>
+          </w:p>
+        </w:tc>
+        <w:tc>
+          <w:tcPr>
+            <w:tcW w:type="dxa" w:w="2400"/>
+            <w:tcBorders>
+              <w:top w:val="single" w:color="000000" w:sz="4"/>
+              <w:left w:val="single" w:color="000000" w:sz="4"/>
+              <w:bottom w:val="single" w:color="000000" w:sz="4"/>
+              <w:right w:val="single" w:color="000000" w:sz="4"/>
+            </w:tcBorders>
+            <w:tcMar>
+              <w:top w:type="dxa" w:w="60"/>
+              <w:left w:type="dxa" w:w="100"/>
+              <w:bottom w:type="dxa" w:w="60"/>
+              <w:right w:type="dxa" w:w="100"/>
+            </w:tcMar>
+            <w:vAlign w:val="center"/>
+          </w:tcPr>
+          <w:p>
+            <w:pPr>
+              <w:spacing w:after="0" w:line="260"/>
+              <w:jc w:val="left"/>
+            </w:pPr>
+            <w:r>
+              <w:rPr>
+                <w:sz w:val="22"/>
+                <w:szCs w:val="22"/>
+              </w:rPr>
+              <w:t xml:space="preserve">Q1 AO3401 gate</w:t>
+            </w:r>
+          </w:p>
+        </w:tc>
+        <w:tc>
+          <w:tcPr>
+            <w:tcW w:type="dxa" w:w="1900"/>
+            <w:tcBorders>
+              <w:top w:val="single" w:color="000000" w:sz="4"/>
+              <w:left w:val="single" w:color="000000" w:sz="4"/>
+              <w:bottom w:val="single" w:color="000000" w:sz="4"/>
+              <w:right w:val="single" w:color="000000" w:sz="4"/>
+            </w:tcBorders>
+            <w:tcMar>
+              <w:top w:type="dxa" w:w="60"/>
+              <w:left w:type="dxa" w:w="100"/>
+              <w:bottom w:type="dxa" w:w="60"/>
+              <w:right w:type="dxa" w:w="100"/>
+            </w:tcMar>
+            <w:vAlign w:val="center"/>
+          </w:tcPr>
+          <w:p>
+            <w:pPr>
+              <w:spacing w:after="0" w:line="260"/>
+              <w:jc w:val="left"/>
+            </w:pPr>
+            <w:r>
+              <w:rPr>
+                <w:sz w:val="22"/>
+                <w:szCs w:val="22"/>
+              </w:rPr>
+              <w:t xml:space="preserve">GPIO27</w:t>
+            </w:r>
+          </w:p>
+        </w:tc>
+        <w:tc>
+          <w:tcPr>
+            <w:tcW w:type="dxa" w:w="2540"/>
+            <w:tcBorders>
+              <w:top w:val="single" w:color="000000" w:sz="4"/>
+              <w:left w:val="single" w:color="000000" w:sz="4"/>
+              <w:bottom w:val="single" w:color="000000" w:sz="4"/>
+              <w:right w:val="single" w:color="000000" w:sz="4"/>
+            </w:tcBorders>
+            <w:tcMar>
+              <w:top w:type="dxa" w:w="60"/>
+              <w:left w:type="dxa" w:w="100"/>
+              <w:bottom w:type="dxa" w:w="60"/>
+              <w:right w:type="dxa" w:w="100"/>
+            </w:tcMar>
+            <w:vAlign w:val="center"/>
+          </w:tcPr>
+          <w:p>
+            <w:pPr>
+              <w:spacing w:after="0" w:line="260"/>
+              <w:jc w:val="left"/>
+            </w:pPr>
+            <w:r>
+              <w:rPr>
+                <w:sz w:val="22"/>
+                <w:szCs w:val="22"/>
+              </w:rPr>
+              <w:t xml:space="preserve">LOW = on; R7 10 kΩ pull-up</w:t>
             </w:r>
           </w:p>
         </w:tc>
@@ -6424,13 +6424,271 @@
                 <w:sz w:val="22"/>
                 <w:szCs w:val="22"/>
               </w:rPr>
+              <w:t xml:space="preserve">Status LED (red)</w:t>
+            </w:r>
+          </w:p>
+        </w:tc>
+        <w:tc>
+          <w:tcPr>
+            <w:tcW w:type="dxa" w:w="2400"/>
+            <w:tcBorders>
+              <w:top w:val="single" w:color="000000" w:sz="4"/>
+              <w:left w:val="single" w:color="000000" w:sz="4"/>
+              <w:bottom w:val="single" w:color="000000" w:sz="4"/>
+              <w:right w:val="single" w:color="000000" w:sz="4"/>
+            </w:tcBorders>
+            <w:tcMar>
+              <w:top w:type="dxa" w:w="60"/>
+              <w:left w:type="dxa" w:w="100"/>
+              <w:bottom w:type="dxa" w:w="60"/>
+              <w:right w:type="dxa" w:w="100"/>
+            </w:tcMar>
+            <w:vAlign w:val="center"/>
+          </w:tcPr>
+          <w:p>
+            <w:pPr>
+              <w:spacing w:after="0" w:line="260"/>
+              <w:jc w:val="left"/>
+            </w:pPr>
+            <w:r>
+              <w:rPr>
+                <w:sz w:val="22"/>
+                <w:szCs w:val="22"/>
+              </w:rPr>
+              <w:t xml:space="preserve">D1 via R5 220 Ω</w:t>
+            </w:r>
+          </w:p>
+        </w:tc>
+        <w:tc>
+          <w:tcPr>
+            <w:tcW w:type="dxa" w:w="1900"/>
+            <w:tcBorders>
+              <w:top w:val="single" w:color="000000" w:sz="4"/>
+              <w:left w:val="single" w:color="000000" w:sz="4"/>
+              <w:bottom w:val="single" w:color="000000" w:sz="4"/>
+              <w:right w:val="single" w:color="000000" w:sz="4"/>
+            </w:tcBorders>
+            <w:tcMar>
+              <w:top w:type="dxa" w:w="60"/>
+              <w:left w:type="dxa" w:w="100"/>
+              <w:bottom w:type="dxa" w:w="60"/>
+              <w:right w:type="dxa" w:w="100"/>
+            </w:tcMar>
+            <w:vAlign w:val="center"/>
+          </w:tcPr>
+          <w:p>
+            <w:pPr>
+              <w:spacing w:after="0" w:line="260"/>
+              <w:jc w:val="left"/>
+            </w:pPr>
+            <w:r>
+              <w:rPr>
+                <w:sz w:val="22"/>
+                <w:szCs w:val="22"/>
+              </w:rPr>
+              <w:t xml:space="preserve">GPIO18</w:t>
+            </w:r>
+          </w:p>
+        </w:tc>
+        <w:tc>
+          <w:tcPr>
+            <w:tcW w:type="dxa" w:w="2540"/>
+            <w:tcBorders>
+              <w:top w:val="single" w:color="000000" w:sz="4"/>
+              <w:left w:val="single" w:color="000000" w:sz="4"/>
+              <w:bottom w:val="single" w:color="000000" w:sz="4"/>
+              <w:right w:val="single" w:color="000000" w:sz="4"/>
+            </w:tcBorders>
+            <w:tcMar>
+              <w:top w:type="dxa" w:w="60"/>
+              <w:left w:type="dxa" w:w="100"/>
+              <w:bottom w:type="dxa" w:w="60"/>
+              <w:right w:type="dxa" w:w="100"/>
+            </w:tcMar>
+            <w:vAlign w:val="center"/>
+          </w:tcPr>
+          <w:p>
+            <w:pPr>
+              <w:spacing w:after="0" w:line="260"/>
+              <w:jc w:val="left"/>
+            </w:pPr>
+            <w:r>
+              <w:rPr>
+                <w:sz w:val="22"/>
+                <w:szCs w:val="22"/>
+              </w:rPr>
+              <w:t xml:space="preserve">On when air quality is poor</w:t>
+            </w:r>
+          </w:p>
+        </w:tc>
+      </w:tr>
+      <w:tr>
+        <w:trPr>
+          <w:cantSplit/>
+        </w:trPr>
+        <w:tc>
+          <w:tcPr>
+            <w:tcW w:type="dxa" w:w="1800"/>
+            <w:tcBorders>
+              <w:top w:val="single" w:color="000000" w:sz="4"/>
+              <w:left w:val="single" w:color="000000" w:sz="4"/>
+              <w:bottom w:val="single" w:color="000000" w:sz="4"/>
+              <w:right w:val="single" w:color="000000" w:sz="4"/>
+            </w:tcBorders>
+            <w:tcMar>
+              <w:top w:type="dxa" w:w="60"/>
+              <w:left w:type="dxa" w:w="100"/>
+              <w:bottom w:type="dxa" w:w="60"/>
+              <w:right w:type="dxa" w:w="100"/>
+            </w:tcMar>
+            <w:vAlign w:val="center"/>
+          </w:tcPr>
+          <w:p>
+            <w:pPr>
+              <w:spacing w:after="0" w:line="260"/>
+              <w:jc w:val="left"/>
+            </w:pPr>
+            <w:r>
+              <w:rPr>
+                <w:sz w:val="22"/>
+                <w:szCs w:val="22"/>
+              </w:rPr>
+              <w:t xml:space="preserve">Status LED (green)</w:t>
+            </w:r>
+          </w:p>
+        </w:tc>
+        <w:tc>
+          <w:tcPr>
+            <w:tcW w:type="dxa" w:w="2400"/>
+            <w:tcBorders>
+              <w:top w:val="single" w:color="000000" w:sz="4"/>
+              <w:left w:val="single" w:color="000000" w:sz="4"/>
+              <w:bottom w:val="single" w:color="000000" w:sz="4"/>
+              <w:right w:val="single" w:color="000000" w:sz="4"/>
+            </w:tcBorders>
+            <w:tcMar>
+              <w:top w:type="dxa" w:w="60"/>
+              <w:left w:type="dxa" w:w="100"/>
+              <w:bottom w:type="dxa" w:w="60"/>
+              <w:right w:type="dxa" w:w="100"/>
+            </w:tcMar>
+            <w:vAlign w:val="center"/>
+          </w:tcPr>
+          <w:p>
+            <w:pPr>
+              <w:spacing w:after="0" w:line="260"/>
+              <w:jc w:val="left"/>
+            </w:pPr>
+            <w:r>
+              <w:rPr>
+                <w:sz w:val="22"/>
+                <w:szCs w:val="22"/>
+              </w:rPr>
+              <w:t xml:space="preserve">D2 via R6 220 Ω</w:t>
+            </w:r>
+          </w:p>
+        </w:tc>
+        <w:tc>
+          <w:tcPr>
+            <w:tcW w:type="dxa" w:w="1900"/>
+            <w:tcBorders>
+              <w:top w:val="single" w:color="000000" w:sz="4"/>
+              <w:left w:val="single" w:color="000000" w:sz="4"/>
+              <w:bottom w:val="single" w:color="000000" w:sz="4"/>
+              <w:right w:val="single" w:color="000000" w:sz="4"/>
+            </w:tcBorders>
+            <w:tcMar>
+              <w:top w:type="dxa" w:w="60"/>
+              <w:left w:type="dxa" w:w="100"/>
+              <w:bottom w:type="dxa" w:w="60"/>
+              <w:right w:type="dxa" w:w="100"/>
+            </w:tcMar>
+            <w:vAlign w:val="center"/>
+          </w:tcPr>
+          <w:p>
+            <w:pPr>
+              <w:spacing w:after="0" w:line="260"/>
+              <w:jc w:val="left"/>
+            </w:pPr>
+            <w:r>
+              <w:rPr>
+                <w:sz w:val="22"/>
+                <w:szCs w:val="22"/>
+              </w:rPr>
+              <w:t xml:space="preserve">GPIO19</w:t>
+            </w:r>
+          </w:p>
+        </w:tc>
+        <w:tc>
+          <w:tcPr>
+            <w:tcW w:type="dxa" w:w="2540"/>
+            <w:tcBorders>
+              <w:top w:val="single" w:color="000000" w:sz="4"/>
+              <w:left w:val="single" w:color="000000" w:sz="4"/>
+              <w:bottom w:val="single" w:color="000000" w:sz="4"/>
+              <w:right w:val="single" w:color="000000" w:sz="4"/>
+            </w:tcBorders>
+            <w:tcMar>
+              <w:top w:type="dxa" w:w="60"/>
+              <w:left w:type="dxa" w:w="100"/>
+              <w:bottom w:type="dxa" w:w="60"/>
+              <w:right w:type="dxa" w:w="100"/>
+            </w:tcMar>
+            <w:vAlign w:val="center"/>
+          </w:tcPr>
+          <w:p>
+            <w:pPr>
+              <w:spacing w:after="0" w:line="260"/>
+              <w:jc w:val="left"/>
+            </w:pPr>
+            <w:r>
+              <w:rPr>
+                <w:sz w:val="22"/>
+                <w:szCs w:val="22"/>
+              </w:rPr>
+              <w:t xml:space="preserve">On when air quality is good</w:t>
+            </w:r>
+          </w:p>
+        </w:tc>
+      </w:tr>
+      <w:tr>
+        <w:trPr>
+          <w:cantSplit/>
+        </w:trPr>
+        <w:tc>
+          <w:tcPr>
+            <w:tcW w:type="dxa" w:w="1800"/>
+            <w:tcBorders>
+              <w:top w:val="single" w:color="000000" w:sz="4"/>
+              <w:left w:val="single" w:color="000000" w:sz="4"/>
+              <w:bottom w:val="single" w:color="000000" w:sz="4"/>
+              <w:right w:val="single" w:color="000000" w:sz="4"/>
+            </w:tcBorders>
+            <w:tcMar>
+              <w:top w:type="dxa" w:w="60"/>
+              <w:left w:type="dxa" w:w="100"/>
+              <w:bottom w:type="dxa" w:w="60"/>
+              <w:right w:type="dxa" w:w="100"/>
+            </w:tcMar>
+            <w:vAlign w:val="center"/>
+          </w:tcPr>
+          <w:p>
+            <w:pPr>
+              <w:spacing w:after="0" w:line="260"/>
+              <w:jc w:val="left"/>
+            </w:pPr>
+            <w:r>
+              <w:rPr>
+                <w:sz w:val="22"/>
+                <w:szCs w:val="22"/>
+              </w:rPr>
               <w:t xml:space="preserve">I²C addresses</w:t>
             </w:r>
           </w:p>
         </w:tc>
         <w:tc>
           <w:tcPr>
-            <w:tcW w:type="dxa" w:w="2600"/>
+            <w:tcW w:type="dxa" w:w="2400"/>
             <w:tcBorders>
               <w:top w:val="single" w:color="000000" w:sz="4"/>
               <w:left w:val="single" w:color="000000" w:sz="4"/>
@@ -6461,7 +6719,7 @@
         </w:tc>
         <w:tc>
           <w:tcPr>
-            <w:tcW w:type="dxa" w:w="1500"/>
+            <w:tcW w:type="dxa" w:w="1900"/>
             <w:tcBorders>
               <w:top w:val="single" w:color="000000" w:sz="4"/>
               <w:left w:val="single" w:color="000000" w:sz="4"/>
@@ -6492,7 +6750,7 @@
         </w:tc>
         <w:tc>
           <w:tcPr>
-            <w:tcW w:type="dxa" w:w="2740"/>
+            <w:tcW w:type="dxa" w:w="2540"/>
             <w:tcBorders>
               <w:top w:val="single" w:color="000000" w:sz="4"/>
               <w:left w:val="single" w:color="000000" w:sz="4"/>
@@ -6545,7 +6803,7 @@
         <w:jc w:val="both"/>
       </w:pPr>
       <w:r>
-        <w:t xml:space="preserve">Because each station must operate continuously outdoors while staying compact, the power subsystem was sized from an estimated daily energy budget. To reduce consumption, the SEN55 measures particulate matter for one minute in every five minutes and keeps its VOC, NOx, temperature, and humidity sensing running in its low-power mode the rest of the time; readings are uploaded once per minute, and the ESP32 and modem sleep between uploads. Table 3 lists the estimated consumption under the worst case, in which the station uses 4G LTE all day.</w:t>
+        <w:t xml:space="preserve">Because each station must operate continuously outdoors while staying compact, the power subsystem was sized from an estimated daily energy budget. To reduce consumption, the SEN55 measures particulate matter for one minute in every five minutes and keeps its VOC, NOx, temperature, and humidity sensing running in its low-power mode the rest of the time; readings are uploaded once per minute; the GPS module is switched on only for up to 90 seconds every 15 minutes; and the LTE module stays off while Wi-Fi is available. Table 3 lists the estimated consumption in normal operation (Wi-Fi) and in the worst case, in which Wi-Fi is unavailable and the station uses 4G LTE all day.</w:t>
       </w:r>
     </w:p>
     <w:p>
@@ -6556,7 +6814,7 @@
         <w:jc w:val="center"/>
       </w:pPr>
       <w:r>
-        <w:t xml:space="preserve">Table 3. Estimated Daily Power Budget of One Station (Worst Case, LTE)</w:t>
+        <w:t xml:space="preserve">Table 3. Estimated Daily Power Budget of One Station</w:t>
       </w:r>
     </w:p>
     <w:tbl>
@@ -6680,7 +6938,7 @@
                 <w:sz w:val="22"/>
                 <w:szCs w:val="22"/>
               </w:rPr>
-              <w:t xml:space="preserve">Hours / Day</w:t>
+              <w:t xml:space="preserve">Wi-Fi (Wh / day)</w:t>
             </w:r>
           </w:p>
         </w:tc>
@@ -6714,7 +6972,7 @@
                 <w:sz w:val="22"/>
                 <w:szCs w:val="22"/>
               </w:rPr>
-              <w:t xml:space="preserve">Energy (Wh / day)</w:t>
+              <w:t xml:space="preserve">LTE (Wh / day)</w:t>
             </w:r>
           </w:p>
         </w:tc>
@@ -6812,7 +7070,7 @@
                 <w:sz w:val="22"/>
                 <w:szCs w:val="22"/>
               </w:rPr>
-              <w:t xml:space="preserve">24</w:t>
+              <w:t xml:space="preserve">2.4</w:t>
             </w:r>
           </w:p>
         </w:tc>
@@ -6879,7 +7137,7 @@
                 <w:sz w:val="22"/>
                 <w:szCs w:val="22"/>
               </w:rPr>
-              <w:t xml:space="preserve">ESP32 (active during readings/uploads, light sleep otherwise)</w:t>
+              <w:t xml:space="preserve">ESP32 DevKit (sampling, uploads, light sleep)</w:t>
             </w:r>
           </w:p>
         </w:tc>
@@ -6941,7 +7199,7 @@
                 <w:sz w:val="22"/>
                 <w:szCs w:val="22"/>
               </w:rPr>
-              <w:t xml:space="preserve">24</w:t>
+              <w:t xml:space="preserve">3.6</w:t>
             </w:r>
           </w:p>
         </w:tc>
@@ -7008,7 +7266,7 @@
                 <w:sz w:val="22"/>
                 <w:szCs w:val="22"/>
               </w:rPr>
-              <w:t xml:space="preserve">SIM7600 LTE modem and GPS (upload every minute)</w:t>
+              <w:t xml:space="preserve">GPS module (up to 90 s every 15 min)</w:t>
             </w:r>
           </w:p>
         </w:tc>
@@ -7039,7 +7297,7 @@
                 <w:sz w:val="22"/>
                 <w:szCs w:val="22"/>
               </w:rPr>
-              <w:t xml:space="preserve">0.25</w:t>
+              <w:t xml:space="preserve">0.01</w:t>
             </w:r>
           </w:p>
         </w:tc>
@@ -7070,7 +7328,7 @@
                 <w:sz w:val="22"/>
                 <w:szCs w:val="22"/>
               </w:rPr>
-              <w:t xml:space="preserve">24</w:t>
+              <w:t xml:space="preserve">0.2</w:t>
             </w:r>
           </w:p>
         </w:tc>
@@ -7101,7 +7359,7 @@
                 <w:sz w:val="22"/>
                 <w:szCs w:val="22"/>
               </w:rPr>
-              <w:t xml:space="preserve">6.0</w:t>
+              <w:t xml:space="preserve">0.2</w:t>
             </w:r>
           </w:p>
         </w:tc>
@@ -7137,7 +7395,7 @@
                 <w:sz w:val="22"/>
                 <w:szCs w:val="22"/>
               </w:rPr>
-              <w:t xml:space="preserve">INA219, status LEDs</w:t>
+              <w:t xml:space="preserve">A7670 LTE module (idle, upload every minute)</w:t>
             </w:r>
           </w:p>
         </w:tc>
@@ -7168,7 +7426,7 @@
                 <w:sz w:val="22"/>
                 <w:szCs w:val="22"/>
               </w:rPr>
-              <w:t xml:space="preserve">0.02</w:t>
+              <w:t xml:space="preserve">0.17</w:t>
             </w:r>
           </w:p>
         </w:tc>
@@ -7199,7 +7457,7 @@
                 <w:sz w:val="22"/>
                 <w:szCs w:val="22"/>
               </w:rPr>
-              <w:t xml:space="preserve">24</w:t>
+              <w:t xml:space="preserve">—</w:t>
             </w:r>
           </w:p>
         </w:tc>
@@ -7230,7 +7488,7 @@
                 <w:sz w:val="22"/>
                 <w:szCs w:val="22"/>
               </w:rPr>
-              <w:t xml:space="preserve">0.5</w:t>
+              <w:t xml:space="preserve">4.1</w:t>
             </w:r>
           </w:p>
         </w:tc>
@@ -7266,7 +7524,7 @@
                 <w:sz w:val="22"/>
                 <w:szCs w:val="22"/>
               </w:rPr>
-              <w:t xml:space="preserve">Boost converter losses (≈15%)</w:t>
+              <w:t xml:space="preserve">INA219, status LEDs</w:t>
             </w:r>
           </w:p>
         </w:tc>
@@ -7297,7 +7555,7 @@
                 <w:sz w:val="22"/>
                 <w:szCs w:val="22"/>
               </w:rPr>
-              <w:t xml:space="preserve">—</w:t>
+              <w:t xml:space="preserve">0.02</w:t>
             </w:r>
           </w:p>
         </w:tc>
@@ -7328,7 +7586,7 @@
                 <w:sz w:val="22"/>
                 <w:szCs w:val="22"/>
               </w:rPr>
-              <w:t xml:space="preserve">—</w:t>
+              <w:t xml:space="preserve">0.5</w:t>
             </w:r>
           </w:p>
         </w:tc>
@@ -7359,7 +7617,7 @@
                 <w:sz w:val="22"/>
                 <w:szCs w:val="22"/>
               </w:rPr>
-              <w:t xml:space="preserve">1.9</w:t>
+              <w:t xml:space="preserve">0.5</w:t>
             </w:r>
           </w:p>
         </w:tc>
@@ -7392,6 +7650,135 @@
             </w:pPr>
             <w:r>
               <w:rPr>
+                <w:sz w:val="22"/>
+                <w:szCs w:val="22"/>
+              </w:rPr>
+              <w:t xml:space="preserve">Converter losses (≈12%)</w:t>
+            </w:r>
+          </w:p>
+        </w:tc>
+        <w:tc>
+          <w:tcPr>
+            <w:tcW w:type="dxa" w:w="1600"/>
+            <w:tcBorders>
+              <w:top w:val="single" w:color="000000" w:sz="4"/>
+              <w:left w:val="single" w:color="000000" w:sz="4"/>
+              <w:bottom w:val="single" w:color="000000" w:sz="4"/>
+              <w:right w:val="single" w:color="000000" w:sz="4"/>
+            </w:tcBorders>
+            <w:tcMar>
+              <w:top w:type="dxa" w:w="60"/>
+              <w:left w:type="dxa" w:w="100"/>
+              <w:bottom w:type="dxa" w:w="60"/>
+              <w:right w:type="dxa" w:w="100"/>
+            </w:tcMar>
+            <w:vAlign w:val="center"/>
+          </w:tcPr>
+          <w:p>
+            <w:pPr>
+              <w:spacing w:after="0" w:line="260"/>
+              <w:jc w:val="center"/>
+            </w:pPr>
+            <w:r>
+              <w:rPr>
+                <w:sz w:val="22"/>
+                <w:szCs w:val="22"/>
+              </w:rPr>
+              <w:t xml:space="preserve">—</w:t>
+            </w:r>
+          </w:p>
+        </w:tc>
+        <w:tc>
+          <w:tcPr>
+            <w:tcW w:type="dxa" w:w="1400"/>
+            <w:tcBorders>
+              <w:top w:val="single" w:color="000000" w:sz="4"/>
+              <w:left w:val="single" w:color="000000" w:sz="4"/>
+              <w:bottom w:val="single" w:color="000000" w:sz="4"/>
+              <w:right w:val="single" w:color="000000" w:sz="4"/>
+            </w:tcBorders>
+            <w:tcMar>
+              <w:top w:type="dxa" w:w="60"/>
+              <w:left w:type="dxa" w:w="100"/>
+              <w:bottom w:type="dxa" w:w="60"/>
+              <w:right w:type="dxa" w:w="100"/>
+            </w:tcMar>
+            <w:vAlign w:val="center"/>
+          </w:tcPr>
+          <w:p>
+            <w:pPr>
+              <w:spacing w:after="0" w:line="260"/>
+              <w:jc w:val="center"/>
+            </w:pPr>
+            <w:r>
+              <w:rPr>
+                <w:sz w:val="22"/>
+                <w:szCs w:val="22"/>
+              </w:rPr>
+              <w:t xml:space="preserve">0.8</w:t>
+            </w:r>
+          </w:p>
+        </w:tc>
+        <w:tc>
+          <w:tcPr>
+            <w:tcW w:type="dxa" w:w="1740"/>
+            <w:tcBorders>
+              <w:top w:val="single" w:color="000000" w:sz="4"/>
+              <w:left w:val="single" w:color="000000" w:sz="4"/>
+              <w:bottom w:val="single" w:color="000000" w:sz="4"/>
+              <w:right w:val="single" w:color="000000" w:sz="4"/>
+            </w:tcBorders>
+            <w:tcMar>
+              <w:top w:type="dxa" w:w="60"/>
+              <w:left w:type="dxa" w:w="100"/>
+              <w:bottom w:type="dxa" w:w="60"/>
+              <w:right w:type="dxa" w:w="100"/>
+            </w:tcMar>
+            <w:vAlign w:val="center"/>
+          </w:tcPr>
+          <w:p>
+            <w:pPr>
+              <w:spacing w:after="0" w:line="260"/>
+              <w:jc w:val="center"/>
+            </w:pPr>
+            <w:r>
+              <w:rPr>
+                <w:sz w:val="22"/>
+                <w:szCs w:val="22"/>
+              </w:rPr>
+              <w:t xml:space="preserve">0.8</w:t>
+            </w:r>
+          </w:p>
+        </w:tc>
+      </w:tr>
+      <w:tr>
+        <w:trPr>
+          <w:cantSplit/>
+        </w:trPr>
+        <w:tc>
+          <w:tcPr>
+            <w:tcW w:type="dxa" w:w="3900"/>
+            <w:tcBorders>
+              <w:top w:val="single" w:color="000000" w:sz="4"/>
+              <w:left w:val="single" w:color="000000" w:sz="4"/>
+              <w:bottom w:val="single" w:color="000000" w:sz="4"/>
+              <w:right w:val="single" w:color="000000" w:sz="4"/>
+            </w:tcBorders>
+            <w:tcMar>
+              <w:top w:type="dxa" w:w="60"/>
+              <w:left w:type="dxa" w:w="100"/>
+              <w:bottom w:type="dxa" w:w="60"/>
+              <w:right w:type="dxa" w:w="100"/>
+            </w:tcMar>
+            <w:vAlign w:val="center"/>
+          </w:tcPr>
+          <w:p>
+            <w:pPr>
+              <w:spacing w:after="0" w:line="260"/>
+              <w:jc w:val="left"/>
+            </w:pPr>
+            <w:r>
+              <w:rPr>
                 <w:b/>
                 <w:bCs/>
                 <w:sz w:val="22"/>
@@ -7430,37 +7817,13 @@
                 <w:sz w:val="22"/>
                 <w:szCs w:val="22"/>
               </w:rPr>
-              <w:t xml:space="preserve">≈0.6</w:t>
+              <w:t xml:space="preserve">≈0.31 / 0.48</w:t>
             </w:r>
           </w:p>
         </w:tc>
         <w:tc>
           <w:tcPr>
             <w:tcW w:type="dxa" w:w="1400"/>
-            <w:tcBorders>
-              <w:top w:val="single" w:color="000000" w:sz="4"/>
-              <w:left w:val="single" w:color="000000" w:sz="4"/>
-              <w:bottom w:val="single" w:color="000000" w:sz="4"/>
-              <w:right w:val="single" w:color="000000" w:sz="4"/>
-            </w:tcBorders>
-            <w:tcMar>
-              <w:top w:type="dxa" w:w="60"/>
-              <w:left w:type="dxa" w:w="100"/>
-              <w:bottom w:type="dxa" w:w="60"/>
-              <w:right w:type="dxa" w:w="100"/>
-            </w:tcMar>
-            <w:vAlign w:val="center"/>
-          </w:tcPr>
-          <w:p>
-            <w:pPr>
-              <w:spacing w:after="0" w:line="260"/>
-              <w:jc w:val="center"/>
-            </w:pPr>
-          </w:p>
-        </w:tc>
-        <w:tc>
-          <w:tcPr>
-            <w:tcW w:type="dxa" w:w="1740"/>
             <w:tcBorders>
               <w:top w:val="single" w:color="000000" w:sz="4"/>
               <w:left w:val="single" w:color="000000" w:sz="4"/>
@@ -7487,7 +7850,40 @@
                 <w:sz w:val="22"/>
                 <w:szCs w:val="22"/>
               </w:rPr>
-              <w:t xml:space="preserve">≈14.4</w:t>
+              <w:t xml:space="preserve">≈7.5</w:t>
+            </w:r>
+          </w:p>
+        </w:tc>
+        <w:tc>
+          <w:tcPr>
+            <w:tcW w:type="dxa" w:w="1740"/>
+            <w:tcBorders>
+              <w:top w:val="single" w:color="000000" w:sz="4"/>
+              <w:left w:val="single" w:color="000000" w:sz="4"/>
+              <w:bottom w:val="single" w:color="000000" w:sz="4"/>
+              <w:right w:val="single" w:color="000000" w:sz="4"/>
+            </w:tcBorders>
+            <w:tcMar>
+              <w:top w:type="dxa" w:w="60"/>
+              <w:left w:type="dxa" w:w="100"/>
+              <w:bottom w:type="dxa" w:w="60"/>
+              <w:right w:type="dxa" w:w="100"/>
+            </w:tcMar>
+            <w:vAlign w:val="center"/>
+          </w:tcPr>
+          <w:p>
+            <w:pPr>
+              <w:spacing w:after="0" w:line="260"/>
+              <w:jc w:val="center"/>
+            </w:pPr>
+            <w:r>
+              <w:rPr>
+                <w:b/>
+                <w:bCs/>
+                <w:sz w:val="22"/>
+                <w:szCs w:val="22"/>
+              </w:rPr>
+              <w:t xml:space="preserve">≈11.6</w:t>
             </w:r>
           </w:p>
         </w:tc>
@@ -7512,17 +7908,27 @@
         <w:t xml:space="preserve">Battery sizing.</w:t>
       </w:r>
       <w:r>
-        <w:t xml:space="preserve"> Four LiFePO4 32700 cells (6 Ah each) connected in parallel form a 3.2 V, 24 Ah pack that stores about 77 Wh. Using 80% depth of discharge (≈61 Wh usable), the station can run for about </w:t>
+        <w:t xml:space="preserve"> Three 18650 lithium-ion cells (3000 mAh each) connected in parallel form a 3.7 V, 9 Ah pack that stores about 33 Wh. Using 80% depth of discharge (≈26.6 Wh usable), the station can run for about </w:t>
       </w:r>
       <w:r>
         <w:rPr>
           <w:b/>
           <w:bCs/>
         </w:rPr>
-        <w:t xml:space="preserve">4.3 days without sunlight</w:t>
-      </w:r>
-      <w:r>
-        <w:t xml:space="preserve"> (61 ÷ 14.4), which covers several consecutive cloudy or rainy days. The whole pack measures only about 130 × 70 × 32 mm and weighs about 0.6 kg, compared with about 1.5 kg for a 12.8 V 12 Ah battery block. LiFePO4 cells were chosen over lithium-ion for their heat tolerance, safety, and long cycle life, and a 1S protection board (BMS) guards against over-charge, over-discharge, and short circuit.</w:t>
+        <w:t xml:space="preserve">3.5 days without sunlight</w:t>
+      </w:r>
+      <w:r>
+        <w:t xml:space="preserve"> on Wi-Fi (26.6 ÷ 7.5) and about </w:t>
+      </w:r>
+      <w:r>
+        <w:rPr>
+          <w:b/>
+          <w:bCs/>
+        </w:rPr>
+        <w:t xml:space="preserve">2.3 days</w:t>
+      </w:r>
+      <w:r>
+        <w:t xml:space="preserve"> in the worst case on LTE (26.6 ÷ 11.6), which covers consecutive cloudy or rainy days. The pack measures only about 78 × 60 × 21 mm in its holder and weighs about 0.15 kg, compared with about 0.6 kg for a LiFePO4 pack of 32700 cells. Cylindrical 18650 cells were chosen over soft pouch LiPo batteries because their steel cases tolerate outdoor heat better and do not swell, and a 1S protection board (BMS) guards against over-charge, over-discharge, and short circuit. Genuine cells of the same model and state of charge must be used in the pack.</w:t>
       </w:r>
     </w:p>
     <w:p>
@@ -7539,17 +7945,17 @@
         <w:t xml:space="preserve">Solar sizing.</w:t>
       </w:r>
       <w:r>
-        <w:t xml:space="preserve"> With about 4.5 peak sun hours per day and a 75% derating for temperature, dust, and charging losses, a 10 W panel produces about 33.8 Wh per day (10 × 4.5 × 0.75), or about </w:t>
+        <w:t xml:space="preserve"> With about 4.5 peak sun hours per day and a 75% derating for temperature, dust, and charging losses, a 6 W panel produces about 20.3 Wh per day (6 × 4.5 × 0.75), or about </w:t>
       </w:r>
       <w:r>
         <w:rPr>
           <w:b/>
           <w:bCs/>
         </w:rPr>
-        <w:t xml:space="preserve">2.3 times</w:t>
-      </w:r>
-      <w:r>
-        <w:t xml:space="preserve"> the daily consumption, allowing the battery to recover after cloudy days. These values are design estimates; actual consumption and charging will be measured with the INA219 during testing and the sampling schedule or panel size adjusted if necessary.</w:t>
+        <w:t xml:space="preserve">2.7 times</w:t>
+      </w:r>
+      <w:r>
+        <w:t xml:space="preserve"> the daily consumption on Wi-Fi and 1.75 times on LTE, allowing the battery to recover after cloudy days. These values are design estimates; actual consumption and charging will be measured with the INA219 during testing and the sampling schedule or panel size adjusted if necessary.</w:t>
       </w:r>
     </w:p>
     <w:p>
@@ -7966,7 +8372,7 @@
                 <w:sz w:val="22"/>
                 <w:szCs w:val="22"/>
               </w:rPr>
-              <w:t xml:space="preserve">200 × 120 × 75 mm</w:t>
+              <w:t xml:space="preserve">150 × 100 × 70 mm</w:t>
             </w:r>
           </w:p>
         </w:tc>
@@ -8033,7 +8439,7 @@
                 <w:sz w:val="22"/>
                 <w:szCs w:val="22"/>
               </w:rPr>
-              <w:t xml:space="preserve">LiFePO4 pack (4 × 32700 cells, 1S4P)</w:t>
+              <w:t xml:space="preserve">Li-ion pack (3 × 18650 cells, 1S3P)</w:t>
             </w:r>
           </w:p>
         </w:tc>
@@ -8064,7 +8470,7 @@
                 <w:sz w:val="22"/>
                 <w:szCs w:val="22"/>
               </w:rPr>
-              <w:t xml:space="preserve">≈130 × 70 × 32 mm (cells lying flat)</w:t>
+              <w:t xml:space="preserve">≈78 × 60 × 21 mm (3-cell holder)</w:t>
             </w:r>
           </w:p>
         </w:tc>
@@ -8095,7 +8501,7 @@
                 <w:sz w:val="22"/>
                 <w:szCs w:val="22"/>
               </w:rPr>
-              <w:t xml:space="preserve">Each cell Ø 32 × 70 mm; ≈0.6 kg total</w:t>
+              <w:t xml:space="preserve">Each cell Ø 18 × 65 mm; ≈0.15 kg total</w:t>
             </w:r>
           </w:p>
         </w:tc>
@@ -8131,7 +8537,7 @@
                 <w:sz w:val="22"/>
                 <w:szCs w:val="22"/>
               </w:rPr>
-              <w:t xml:space="preserve">LilyGO T-SIM7600 board</w:t>
+              <w:t xml:space="preserve">ESP32 DevKit V1</w:t>
             </w:r>
           </w:p>
         </w:tc>
@@ -8161,16 +8567,8 @@
               <w:rPr>
                 <w:sz w:val="22"/>
                 <w:szCs w:val="22"/>
-                <w:highlight w:val="yellow"/>
-              </w:rPr>
-              <w:t xml:space="preserve">[measure]</w:t>
-            </w:r>
-            <w:r>
-              <w:rPr>
-                <w:sz w:val="22"/>
-                <w:szCs w:val="22"/>
-              </w:rPr>
-              <w:t xml:space="preserve"> mm</w:t>
+              </w:rPr>
+              <w:t xml:space="preserve">≈55 × 28 × 13 mm</w:t>
             </w:r>
           </w:p>
         </w:tc>
@@ -8237,7 +8635,7 @@
                 <w:sz w:val="22"/>
                 <w:szCs w:val="22"/>
               </w:rPr>
-              <w:t xml:space="preserve">Solar panel 6 V 10 W</w:t>
+              <w:t xml:space="preserve">A7670 LTE and GPS modules</w:t>
             </w:r>
           </w:p>
         </w:tc>
@@ -8267,16 +8665,9 @@
               <w:rPr>
                 <w:sz w:val="22"/>
                 <w:szCs w:val="22"/>
-              </w:rPr>
-              <w:t xml:space="preserve">≈</w:t>
-            </w:r>
-            <w:r>
-              <w:rPr>
-                <w:sz w:val="22"/>
-                <w:szCs w:val="22"/>
                 <w:highlight w:val="yellow"/>
               </w:rPr>
-              <w:t xml:space="preserve">[confirm from supplier]</w:t>
+              <w:t xml:space="preserve">[measure]</w:t>
             </w:r>
             <w:r>
               <w:rPr>
@@ -8314,7 +8705,7 @@
                 <w:sz w:val="22"/>
                 <w:szCs w:val="22"/>
               </w:rPr>
-              <w:t xml:space="preserve">Mounted above the unit, tilted ≈15° facing south</w:t>
+              <w:t xml:space="preserve">Mounted beside the ESP32</w:t>
             </w:r>
           </w:p>
         </w:tc>
@@ -8350,7 +8741,7 @@
                 <w:sz w:val="22"/>
                 <w:szCs w:val="22"/>
               </w:rPr>
-              <w:t xml:space="preserve">Mounting height</w:t>
+              <w:t xml:space="preserve">Solar panel 6 V 6 W</w:t>
             </w:r>
           </w:p>
         </w:tc>
@@ -8381,7 +8772,22 @@
                 <w:sz w:val="22"/>
                 <w:szCs w:val="22"/>
               </w:rPr>
-              <w:t xml:space="preserve">1.5–3.0 m above ground</w:t>
+              <w:t xml:space="preserve">≈</w:t>
+            </w:r>
+            <w:r>
+              <w:rPr>
+                <w:sz w:val="22"/>
+                <w:szCs w:val="22"/>
+                <w:highlight w:val="yellow"/>
+              </w:rPr>
+              <w:t xml:space="preserve">[confirm from supplier]</w:t>
+            </w:r>
+            <w:r>
+              <w:rPr>
+                <w:sz w:val="22"/>
+                <w:szCs w:val="22"/>
+              </w:rPr>
+              <w:t xml:space="preserve"> mm</w:t>
             </w:r>
           </w:p>
         </w:tc>
@@ -8412,7 +8818,7 @@
                 <w:sz w:val="22"/>
                 <w:szCs w:val="22"/>
               </w:rPr>
-              <w:t xml:space="preserve">Breathing height of pedestrians</w:t>
+              <w:t xml:space="preserve">Mounted above the unit, tilted ≈15° facing south</w:t>
             </w:r>
           </w:p>
         </w:tc>
@@ -8448,6 +8854,104 @@
                 <w:sz w:val="22"/>
                 <w:szCs w:val="22"/>
               </w:rPr>
+              <w:t xml:space="preserve">Mounting height</w:t>
+            </w:r>
+          </w:p>
+        </w:tc>
+        <w:tc>
+          <w:tcPr>
+            <w:tcW w:type="dxa" w:w="2700"/>
+            <w:tcBorders>
+              <w:top w:val="single" w:color="000000" w:sz="4"/>
+              <w:left w:val="single" w:color="000000" w:sz="4"/>
+              <w:bottom w:val="single" w:color="000000" w:sz="4"/>
+              <w:right w:val="single" w:color="000000" w:sz="4"/>
+            </w:tcBorders>
+            <w:tcMar>
+              <w:top w:type="dxa" w:w="60"/>
+              <w:left w:type="dxa" w:w="100"/>
+              <w:bottom w:type="dxa" w:w="60"/>
+              <w:right w:type="dxa" w:w="100"/>
+            </w:tcMar>
+            <w:vAlign w:val="center"/>
+          </w:tcPr>
+          <w:p>
+            <w:pPr>
+              <w:spacing w:after="0" w:line="260"/>
+              <w:jc w:val="left"/>
+            </w:pPr>
+            <w:r>
+              <w:rPr>
+                <w:sz w:val="22"/>
+                <w:szCs w:val="22"/>
+              </w:rPr>
+              <w:t xml:space="preserve">1.5–3.0 m above ground</w:t>
+            </w:r>
+          </w:p>
+        </w:tc>
+        <w:tc>
+          <w:tcPr>
+            <w:tcW w:type="dxa" w:w="3040"/>
+            <w:tcBorders>
+              <w:top w:val="single" w:color="000000" w:sz="4"/>
+              <w:left w:val="single" w:color="000000" w:sz="4"/>
+              <w:bottom w:val="single" w:color="000000" w:sz="4"/>
+              <w:right w:val="single" w:color="000000" w:sz="4"/>
+            </w:tcBorders>
+            <w:tcMar>
+              <w:top w:type="dxa" w:w="60"/>
+              <w:left w:type="dxa" w:w="100"/>
+              <w:bottom w:type="dxa" w:w="60"/>
+              <w:right w:type="dxa" w:w="100"/>
+            </w:tcMar>
+            <w:vAlign w:val="center"/>
+          </w:tcPr>
+          <w:p>
+            <w:pPr>
+              <w:spacing w:after="0" w:line="260"/>
+              <w:jc w:val="left"/>
+            </w:pPr>
+            <w:r>
+              <w:rPr>
+                <w:sz w:val="22"/>
+                <w:szCs w:val="22"/>
+              </w:rPr>
+              <w:t xml:space="preserve">Breathing height of pedestrians</w:t>
+            </w:r>
+          </w:p>
+        </w:tc>
+      </w:tr>
+      <w:tr>
+        <w:trPr>
+          <w:cantSplit/>
+        </w:trPr>
+        <w:tc>
+          <w:tcPr>
+            <w:tcW w:type="dxa" w:w="2900"/>
+            <w:tcBorders>
+              <w:top w:val="single" w:color="000000" w:sz="4"/>
+              <w:left w:val="single" w:color="000000" w:sz="4"/>
+              <w:bottom w:val="single" w:color="000000" w:sz="4"/>
+              <w:right w:val="single" w:color="000000" w:sz="4"/>
+            </w:tcBorders>
+            <w:tcMar>
+              <w:top w:type="dxa" w:w="60"/>
+              <w:left w:type="dxa" w:w="100"/>
+              <w:bottom w:type="dxa" w:w="60"/>
+              <w:right w:type="dxa" w:w="100"/>
+            </w:tcMar>
+            <w:vAlign w:val="center"/>
+          </w:tcPr>
+          <w:p>
+            <w:pPr>
+              <w:spacing w:after="0" w:line="260"/>
+              <w:jc w:val="left"/>
+            </w:pPr>
+            <w:r>
+              <w:rPr>
+                <w:sz w:val="22"/>
+                <w:szCs w:val="22"/>
+              </w:rPr>
               <w:t xml:space="preserve">Complete station (without panel)</w:t>
             </w:r>
           </w:p>
@@ -8479,7 +8983,7 @@
                 <w:sz w:val="22"/>
                 <w:szCs w:val="22"/>
               </w:rPr>
-              <w:t xml:space="preserve">≈200 × 120 × 265 mm</w:t>
+              <w:t xml:space="preserve">≈150 × 110 × 260 mm</w:t>
             </w:r>
           </w:p>
         </w:tc>
@@ -8510,7 +9014,7 @@
                 <w:sz w:val="22"/>
                 <w:szCs w:val="22"/>
               </w:rPr>
-              <w:t xml:space="preserve">Enclosure + 50 mm gap + shield; ≈1.3 kg (estimate) </w:t>
+              <w:t xml:space="preserve">Enclosure + 50 mm gap + shield; ≈0.8 kg (estimate) </w:t>
             </w:r>
             <w:r>
               <w:rPr>
@@ -8560,7 +9064,7 @@
         <w:t xml:space="preserve">Waterproofing and heat protection.</w:t>
       </w:r>
       <w:r>
-        <w:t xml:space="preserve"> The electronics enclosure is IP65-rated, with cable glands for every wire, a pressure-equalizing breathable vent, and silica gel to prevent condensation. Circuit boards receive a conformal coating against humidity. The enclosure is light-colored to reflect heat and the solar panel mounted above it shades the unit from direct midday sun, as LiFePO4 batteries should be charged below about 45 °C. The radiation shield and mounting brackets are 3D-printed in UV-resistant material, which allows the design to be customized and replacement parts to be printed easily. </w:t>
+        <w:t xml:space="preserve"> The electronics enclosure is IP65-rated, with cable glands for every wire, a pressure-equalizing breathable vent, and silica gel to prevent condensation. Circuit boards receive a conformal coating against humidity. The enclosure is light-colored to reflect heat and the solar panel mounted above it shades the unit from direct midday sun, as lithium-ion cells should be charged below about 45 °C; the battery pack sits at the bottom of the enclosure, away from the lid that receives the most sun, and its temperature is checked during the heat test (Table 9). The radiation shield and mounting brackets are 3D-printed in UV-resistant material, which allows the design to be customized and replacement parts to be printed easily. </w:t>
       </w:r>
       <w:r>
         <w:rPr>
@@ -8593,7 +9097,7 @@
         <w:t xml:space="preserve">Location tracking.</w:t>
       </w:r>
       <w:r>
-        <w:t xml:space="preserve"> The SIM7600G-H modem on the LilyGO board includes a GNSS (GPS) receiver. Each station obtains a position fix at start-up and at regular intervals (every 15 minutes) and includes its latitude and longitude with its readings. The server updates the station's location and the time it was last updated, and the application places each station on a map (OpenStreetMap) as a marker colored by its current AQI level. If a station cannot obtain a GPS fix, for example when mounted under a roof, its last known location is kept and the administrator can set the location manually. Because the location comes from the device itself, relocating a station automatically updates its position on the map.</w:t>
+        <w:t xml:space="preserve"> Each station has a small GPS module (ATGM336H) connected to the ESP32. To save power, the ESP32 switches the module on through a MOSFET only when it needs a position: at start-up and every 15 minutes, for up to 90 seconds. When a fix is obtained, the station includes its latitude and longitude with its readings. The server updates the station's location and the time it was last updated, and the application places each station on a map (OpenStreetMap) as a marker colored by its current AQI level. If a station cannot obtain a GPS fix, for example when mounted under a roof, its last known location is kept and the administrator can set the location manually. Because the location comes from the device itself, relocating a station automatically updates its position on the map.</w:t>
       </w:r>
     </w:p>
     <w:p>
@@ -8966,7 +9470,7 @@
         <w:t xml:space="preserve">Station status</w:t>
       </w:r>
       <w:r>
-        <w:t xml:space="preserve"> card (battery percentage estimated from the LiFePO4 voltage, whether it is charging, Wi-Fi or 4G LTE connection and last upload, GPS location, and how long ago particles were last measured), all readings with plain-language explanations, and history charts. The live chart plots only particle values that were actually measured, and hourly and daily averages ignore the minutes without a PM measurement, so the schedule does not bias the results. The </w:t>
+        <w:t xml:space="preserve"> card (battery percentage estimated from the lithium-ion cell voltage, whether it is charging, Wi-Fi or 4G LTE connection and last upload, GPS location, and how long ago particles were last measured), all readings with plain-language explanations, and history charts. The live chart plots only particle values that were actually measured, and hourly and daily averages ignore the minutes without a PM measurement, so the schedule does not bias the results. The </w:t>
       </w:r>
       <w:r>
         <w:rPr>
@@ -8976,7 +9480,7 @@
         <w:t xml:space="preserve">Alerts</w:t>
       </w:r>
       <w:r>
-        <w:t xml:space="preserve"> screen (Figure 12) lists ongoing and past threshold exceedances, which users can acknowledge. Administrators additionally see the Add Station screen and station settings (thresholds, sensor keys, and deletion). The station map view (Section 3.2.11) and the firmware for 4G LTE fallback and GPS positioning are part of the next development sprint; the server and application already store and display the station's network, battery, and location. The application supports light, dark, and system themes.</w:t>
+        <w:t xml:space="preserve"> screen (Figure 12) lists ongoing and past threshold exceedances, which users can acknowledge. Administrators additionally see the Add Station screen and station settings (thresholds, sensor keys, and deletion). The firmware for 4G LTE fallback and GPS positioning has been written and will be bench-tested once the modules are purchased, and the station map view (Section 3.2.11) is part of the next development sprint; the server and application already store and display the station's network, battery, and location. The application supports light, dark, and system themes.</w:t>
       </w:r>
     </w:p>
     <w:p>
@@ -9274,7 +9778,7 @@
                 <w:sz w:val="22"/>
                 <w:szCs w:val="22"/>
               </w:rPr>
-              <w:t xml:space="preserve">LilyGO T-SIM7600G-H</w:t>
+              <w:t xml:space="preserve">ESP32 DevKit V1</w:t>
             </w:r>
           </w:p>
         </w:tc>
@@ -9305,7 +9809,7 @@
                 <w:sz w:val="22"/>
                 <w:szCs w:val="22"/>
               </w:rPr>
-              <w:t xml:space="preserve">ESP32-WROVER-E + SIMCom SIM7600G-H (4G LTE Cat-4, GNSS)</w:t>
+              <w:t xml:space="preserve">ESP32-WROOM-32, dual-core 240 MHz, Wi-Fi (already owned)</w:t>
             </w:r>
           </w:p>
         </w:tc>
@@ -9336,7 +9840,7 @@
                 <w:sz w:val="22"/>
                 <w:szCs w:val="22"/>
               </w:rPr>
-              <w:t xml:space="preserve">Microcontroller, Wi-Fi, LTE and GPS</w:t>
+              <w:t xml:space="preserve">Microcontroller and Wi-Fi</w:t>
             </w:r>
           </w:p>
         </w:tc>
@@ -9372,7 +9876,7 @@
                 <w:sz w:val="22"/>
                 <w:szCs w:val="22"/>
               </w:rPr>
-              <w:t xml:space="preserve">INA219 module</w:t>
+              <w:t xml:space="preserve">SIMCom A7670 LTE module</w:t>
             </w:r>
           </w:p>
         </w:tc>
@@ -9403,7 +9907,7 @@
                 <w:sz w:val="22"/>
                 <w:szCs w:val="22"/>
               </w:rPr>
-              <w:t xml:space="preserve">I²C voltage/current monitor (0x40)</w:t>
+              <w:t xml:space="preserve">4G LTE Cat-1 breakout, UART (3.3 V logic), nano-SIM slot</w:t>
             </w:r>
           </w:p>
         </w:tc>
@@ -9434,7 +9938,7 @@
                 <w:sz w:val="22"/>
                 <w:szCs w:val="22"/>
               </w:rPr>
-              <w:t xml:space="preserve">Battery voltage and current monitoring</w:t>
+              <w:t xml:space="preserve">LTE fallback connectivity</w:t>
             </w:r>
           </w:p>
         </w:tc>
@@ -9470,7 +9974,7 @@
                 <w:sz w:val="22"/>
                 <w:szCs w:val="22"/>
               </w:rPr>
-              <w:t xml:space="preserve">Solar panel</w:t>
+              <w:t xml:space="preserve">GPS module</w:t>
             </w:r>
           </w:p>
         </w:tc>
@@ -9501,7 +10005,7 @@
                 <w:sz w:val="22"/>
                 <w:szCs w:val="22"/>
               </w:rPr>
-              <w:t xml:space="preserve">6 V, 10 W, monocrystalline</w:t>
+              <w:t xml:space="preserve">ATGM336H (or u-blox NEO-M8N), UART 9600 baud, patch antenna</w:t>
             </w:r>
           </w:p>
         </w:tc>
@@ -9532,7 +10036,7 @@
                 <w:sz w:val="22"/>
                 <w:szCs w:val="22"/>
               </w:rPr>
-              <w:t xml:space="preserve">Recharges the battery</w:t>
+              <w:t xml:space="preserve">Station location</w:t>
             </w:r>
           </w:p>
         </w:tc>
@@ -9568,7 +10072,7 @@
                 <w:sz w:val="22"/>
                 <w:szCs w:val="22"/>
               </w:rPr>
-              <w:t xml:space="preserve">1S LiFePO4 solar charger module</w:t>
+              <w:t xml:space="preserve">P-channel MOSFET</w:t>
             </w:r>
           </w:p>
         </w:tc>
@@ -9599,7 +10103,7 @@
                 <w:sz w:val="22"/>
                 <w:szCs w:val="22"/>
               </w:rPr>
-              <w:t xml:space="preserve">3.6 V charge voltage, ≥2 A, solar input</w:t>
+              <w:t xml:space="preserve">AO3401 with 10 kΩ gate pull-up</w:t>
             </w:r>
           </w:p>
         </w:tc>
@@ -9630,7 +10134,7 @@
                 <w:sz w:val="22"/>
                 <w:szCs w:val="22"/>
               </w:rPr>
-              <w:t xml:space="preserve">Safe charging from the panel</w:t>
+              <w:t xml:space="preserve">Switches the GPS on and off</w:t>
             </w:r>
           </w:p>
         </w:tc>
@@ -9666,7 +10170,7 @@
                 <w:sz w:val="22"/>
                 <w:szCs w:val="22"/>
               </w:rPr>
-              <w:t xml:space="preserve">LiFePO4 cells + protection board</w:t>
+              <w:t xml:space="preserve">INA219 module</w:t>
             </w:r>
           </w:p>
         </w:tc>
@@ -9697,7 +10201,7 @@
                 <w:sz w:val="22"/>
                 <w:szCs w:val="22"/>
               </w:rPr>
-              <w:t xml:space="preserve">4 × 32700 (3.2 V, 6 Ah each) in parallel = 24 Ah (≈77 Wh); 1S BMS</w:t>
+              <w:t xml:space="preserve">I²C voltage/current monitor (0x40)</w:t>
             </w:r>
           </w:p>
         </w:tc>
@@ -9728,7 +10232,7 @@
                 <w:sz w:val="22"/>
                 <w:szCs w:val="22"/>
               </w:rPr>
-              <w:t xml:space="preserve">Primary power source</w:t>
+              <w:t xml:space="preserve">Battery voltage and current monitoring</w:t>
             </w:r>
           </w:p>
         </w:tc>
@@ -9764,7 +10268,7 @@
                 <w:sz w:val="22"/>
                 <w:szCs w:val="22"/>
               </w:rPr>
-              <w:t xml:space="preserve">DC-DC boost converter</w:t>
+              <w:t xml:space="preserve">Solar panel</w:t>
             </w:r>
           </w:p>
         </w:tc>
@@ -9795,7 +10299,7 @@
                 <w:sz w:val="22"/>
                 <w:szCs w:val="22"/>
               </w:rPr>
-              <w:t xml:space="preserve">3.2 V → 5 V, 3 A, with 1000 µF capacitor</w:t>
+              <w:t xml:space="preserve">6 V, 6 W, monocrystalline</w:t>
             </w:r>
           </w:p>
         </w:tc>
@@ -9826,7 +10330,7 @@
                 <w:sz w:val="22"/>
                 <w:szCs w:val="22"/>
               </w:rPr>
-              <w:t xml:space="preserve">Supplies the board and sensor</w:t>
+              <w:t xml:space="preserve">Recharges the battery</w:t>
             </w:r>
           </w:p>
         </w:tc>
@@ -9862,7 +10366,7 @@
                 <w:sz w:val="22"/>
                 <w:szCs w:val="22"/>
               </w:rPr>
-              <w:t xml:space="preserve">LTE and GNSS antennas</w:t>
+              <w:t xml:space="preserve">CN3791 solar charger module</w:t>
             </w:r>
           </w:p>
         </w:tc>
@@ -9893,7 +10397,7 @@
                 <w:sz w:val="22"/>
                 <w:szCs w:val="22"/>
               </w:rPr>
-              <w:t xml:space="preserve">External, SMA connectors</w:t>
+              <w:t xml:space="preserve">1-cell Li-ion, 4.2 V charge voltage, solar input</w:t>
             </w:r>
           </w:p>
         </w:tc>
@@ -9924,7 +10428,7 @@
                 <w:sz w:val="22"/>
                 <w:szCs w:val="22"/>
               </w:rPr>
-              <w:t xml:space="preserve">Cellular and GPS reception</w:t>
+              <w:t xml:space="preserve">Safe charging from the panel</w:t>
             </w:r>
           </w:p>
         </w:tc>
@@ -9960,7 +10464,7 @@
                 <w:sz w:val="22"/>
                 <w:szCs w:val="22"/>
               </w:rPr>
-              <w:t xml:space="preserve">Nano-SIM card</w:t>
+              <w:t xml:space="preserve">Li-ion cells + protection board</w:t>
             </w:r>
           </w:p>
         </w:tc>
@@ -9991,7 +10495,7 @@
                 <w:sz w:val="22"/>
                 <w:szCs w:val="22"/>
               </w:rPr>
-              <w:t xml:space="preserve">Registered prepaid (Globe or Smart) with data</w:t>
+              <w:t xml:space="preserve">3 × 18650 (3.7 V, 3000 mAh each) in parallel = 9 Ah (≈33 Wh); 1S BMS</w:t>
             </w:r>
           </w:p>
         </w:tc>
@@ -10022,7 +10526,7 @@
                 <w:sz w:val="22"/>
                 <w:szCs w:val="22"/>
               </w:rPr>
-              <w:t xml:space="preserve">LTE connectivity</w:t>
+              <w:t xml:space="preserve">Primary power source</w:t>
             </w:r>
           </w:p>
         </w:tc>
@@ -10058,7 +10562,7 @@
                 <w:sz w:val="22"/>
                 <w:szCs w:val="22"/>
               </w:rPr>
-              <w:t xml:space="preserve">Passive components</w:t>
+              <w:t xml:space="preserve">DC-DC converters</w:t>
             </w:r>
           </w:p>
         </w:tc>
@@ -10089,7 +10593,7 @@
                 <w:sz w:val="22"/>
                 <w:szCs w:val="22"/>
               </w:rPr>
-              <w:t xml:space="preserve">LEDs (red/green), 220 Ω and 4.7 kΩ resistors, 5 A fuse and holder</w:t>
+              <w:t xml:space="preserve">Buck-boost 3.3 V ≥1 A; boost 5 V (MT3608); 1000 µF capacitor at the LTE module</w:t>
             </w:r>
           </w:p>
         </w:tc>
@@ -10120,7 +10624,7 @@
                 <w:sz w:val="22"/>
                 <w:szCs w:val="22"/>
               </w:rPr>
-              <w:t xml:space="preserve">Status indication, I²C pull-ups, protection</w:t>
+              <w:t xml:space="preserve">Supply the ESP32, GPS, sensor, and modem</w:t>
             </w:r>
           </w:p>
         </w:tc>
@@ -10156,6 +10660,300 @@
                 <w:sz w:val="22"/>
                 <w:szCs w:val="22"/>
               </w:rPr>
+              <w:t xml:space="preserve">LTE antenna</w:t>
+            </w:r>
+          </w:p>
+        </w:tc>
+        <w:tc>
+          <w:tcPr>
+            <w:tcW w:type="dxa" w:w="3700"/>
+            <w:tcBorders>
+              <w:top w:val="single" w:color="000000" w:sz="4"/>
+              <w:left w:val="single" w:color="000000" w:sz="4"/>
+              <w:bottom w:val="single" w:color="000000" w:sz="4"/>
+              <w:right w:val="single" w:color="000000" w:sz="4"/>
+            </w:tcBorders>
+            <w:tcMar>
+              <w:top w:type="dxa" w:w="60"/>
+              <w:left w:type="dxa" w:w="100"/>
+              <w:bottom w:type="dxa" w:w="60"/>
+              <w:right w:type="dxa" w:w="100"/>
+            </w:tcMar>
+            <w:vAlign w:val="center"/>
+          </w:tcPr>
+          <w:p>
+            <w:pPr>
+              <w:spacing w:after="0" w:line="260"/>
+              <w:jc w:val="left"/>
+            </w:pPr>
+            <w:r>
+              <w:rPr>
+                <w:sz w:val="22"/>
+                <w:szCs w:val="22"/>
+              </w:rPr>
+              <w:t xml:space="preserve">External, SMA connector</w:t>
+            </w:r>
+          </w:p>
+        </w:tc>
+        <w:tc>
+          <w:tcPr>
+            <w:tcW w:type="dxa" w:w="2640"/>
+            <w:tcBorders>
+              <w:top w:val="single" w:color="000000" w:sz="4"/>
+              <w:left w:val="single" w:color="000000" w:sz="4"/>
+              <w:bottom w:val="single" w:color="000000" w:sz="4"/>
+              <w:right w:val="single" w:color="000000" w:sz="4"/>
+            </w:tcBorders>
+            <w:tcMar>
+              <w:top w:type="dxa" w:w="60"/>
+              <w:left w:type="dxa" w:w="100"/>
+              <w:bottom w:type="dxa" w:w="60"/>
+              <w:right w:type="dxa" w:w="100"/>
+            </w:tcMar>
+            <w:vAlign w:val="center"/>
+          </w:tcPr>
+          <w:p>
+            <w:pPr>
+              <w:spacing w:after="0" w:line="260"/>
+              <w:jc w:val="left"/>
+            </w:pPr>
+            <w:r>
+              <w:rPr>
+                <w:sz w:val="22"/>
+                <w:szCs w:val="22"/>
+              </w:rPr>
+              <w:t xml:space="preserve">Cellular reception</w:t>
+            </w:r>
+          </w:p>
+        </w:tc>
+      </w:tr>
+      <w:tr>
+        <w:trPr>
+          <w:cantSplit/>
+        </w:trPr>
+        <w:tc>
+          <w:tcPr>
+            <w:tcW w:type="dxa" w:w="2300"/>
+            <w:tcBorders>
+              <w:top w:val="single" w:color="000000" w:sz="4"/>
+              <w:left w:val="single" w:color="000000" w:sz="4"/>
+              <w:bottom w:val="single" w:color="000000" w:sz="4"/>
+              <w:right w:val="single" w:color="000000" w:sz="4"/>
+            </w:tcBorders>
+            <w:tcMar>
+              <w:top w:type="dxa" w:w="60"/>
+              <w:left w:type="dxa" w:w="100"/>
+              <w:bottom w:type="dxa" w:w="60"/>
+              <w:right w:type="dxa" w:w="100"/>
+            </w:tcMar>
+            <w:vAlign w:val="center"/>
+          </w:tcPr>
+          <w:p>
+            <w:pPr>
+              <w:spacing w:after="0" w:line="260"/>
+              <w:jc w:val="left"/>
+            </w:pPr>
+            <w:r>
+              <w:rPr>
+                <w:sz w:val="22"/>
+                <w:szCs w:val="22"/>
+              </w:rPr>
+              <w:t xml:space="preserve">Nano-SIM card</w:t>
+            </w:r>
+          </w:p>
+        </w:tc>
+        <w:tc>
+          <w:tcPr>
+            <w:tcW w:type="dxa" w:w="3700"/>
+            <w:tcBorders>
+              <w:top w:val="single" w:color="000000" w:sz="4"/>
+              <w:left w:val="single" w:color="000000" w:sz="4"/>
+              <w:bottom w:val="single" w:color="000000" w:sz="4"/>
+              <w:right w:val="single" w:color="000000" w:sz="4"/>
+            </w:tcBorders>
+            <w:tcMar>
+              <w:top w:type="dxa" w:w="60"/>
+              <w:left w:type="dxa" w:w="100"/>
+              <w:bottom w:type="dxa" w:w="60"/>
+              <w:right w:type="dxa" w:w="100"/>
+            </w:tcMar>
+            <w:vAlign w:val="center"/>
+          </w:tcPr>
+          <w:p>
+            <w:pPr>
+              <w:spacing w:after="0" w:line="260"/>
+              <w:jc w:val="left"/>
+            </w:pPr>
+            <w:r>
+              <w:rPr>
+                <w:sz w:val="22"/>
+                <w:szCs w:val="22"/>
+              </w:rPr>
+              <w:t xml:space="preserve">Registered prepaid (Globe or Smart) with data</w:t>
+            </w:r>
+          </w:p>
+        </w:tc>
+        <w:tc>
+          <w:tcPr>
+            <w:tcW w:type="dxa" w:w="2640"/>
+            <w:tcBorders>
+              <w:top w:val="single" w:color="000000" w:sz="4"/>
+              <w:left w:val="single" w:color="000000" w:sz="4"/>
+              <w:bottom w:val="single" w:color="000000" w:sz="4"/>
+              <w:right w:val="single" w:color="000000" w:sz="4"/>
+            </w:tcBorders>
+            <w:tcMar>
+              <w:top w:type="dxa" w:w="60"/>
+              <w:left w:type="dxa" w:w="100"/>
+              <w:bottom w:type="dxa" w:w="60"/>
+              <w:right w:type="dxa" w:w="100"/>
+            </w:tcMar>
+            <w:vAlign w:val="center"/>
+          </w:tcPr>
+          <w:p>
+            <w:pPr>
+              <w:spacing w:after="0" w:line="260"/>
+              <w:jc w:val="left"/>
+            </w:pPr>
+            <w:r>
+              <w:rPr>
+                <w:sz w:val="22"/>
+                <w:szCs w:val="22"/>
+              </w:rPr>
+              <w:t xml:space="preserve">LTE connectivity</w:t>
+            </w:r>
+          </w:p>
+        </w:tc>
+      </w:tr>
+      <w:tr>
+        <w:trPr>
+          <w:cantSplit/>
+        </w:trPr>
+        <w:tc>
+          <w:tcPr>
+            <w:tcW w:type="dxa" w:w="2300"/>
+            <w:tcBorders>
+              <w:top w:val="single" w:color="000000" w:sz="4"/>
+              <w:left w:val="single" w:color="000000" w:sz="4"/>
+              <w:bottom w:val="single" w:color="000000" w:sz="4"/>
+              <w:right w:val="single" w:color="000000" w:sz="4"/>
+            </w:tcBorders>
+            <w:tcMar>
+              <w:top w:type="dxa" w:w="60"/>
+              <w:left w:type="dxa" w:w="100"/>
+              <w:bottom w:type="dxa" w:w="60"/>
+              <w:right w:type="dxa" w:w="100"/>
+            </w:tcMar>
+            <w:vAlign w:val="center"/>
+          </w:tcPr>
+          <w:p>
+            <w:pPr>
+              <w:spacing w:after="0" w:line="260"/>
+              <w:jc w:val="left"/>
+            </w:pPr>
+            <w:r>
+              <w:rPr>
+                <w:sz w:val="22"/>
+                <w:szCs w:val="22"/>
+              </w:rPr>
+              <w:t xml:space="preserve">Passive components</w:t>
+            </w:r>
+          </w:p>
+        </w:tc>
+        <w:tc>
+          <w:tcPr>
+            <w:tcW w:type="dxa" w:w="3700"/>
+            <w:tcBorders>
+              <w:top w:val="single" w:color="000000" w:sz="4"/>
+              <w:left w:val="single" w:color="000000" w:sz="4"/>
+              <w:bottom w:val="single" w:color="000000" w:sz="4"/>
+              <w:right w:val="single" w:color="000000" w:sz="4"/>
+            </w:tcBorders>
+            <w:tcMar>
+              <w:top w:type="dxa" w:w="60"/>
+              <w:left w:type="dxa" w:w="100"/>
+              <w:bottom w:type="dxa" w:w="60"/>
+              <w:right w:type="dxa" w:w="100"/>
+            </w:tcMar>
+            <w:vAlign w:val="center"/>
+          </w:tcPr>
+          <w:p>
+            <w:pPr>
+              <w:spacing w:after="0" w:line="260"/>
+              <w:jc w:val="left"/>
+            </w:pPr>
+            <w:r>
+              <w:rPr>
+                <w:sz w:val="22"/>
+                <w:szCs w:val="22"/>
+              </w:rPr>
+              <w:t xml:space="preserve">LEDs (red/green), 220 Ω, 4.7 kΩ and 10 kΩ resistors, 5 A fuse and holder</w:t>
+            </w:r>
+          </w:p>
+        </w:tc>
+        <w:tc>
+          <w:tcPr>
+            <w:tcW w:type="dxa" w:w="2640"/>
+            <w:tcBorders>
+              <w:top w:val="single" w:color="000000" w:sz="4"/>
+              <w:left w:val="single" w:color="000000" w:sz="4"/>
+              <w:bottom w:val="single" w:color="000000" w:sz="4"/>
+              <w:right w:val="single" w:color="000000" w:sz="4"/>
+            </w:tcBorders>
+            <w:tcMar>
+              <w:top w:type="dxa" w:w="60"/>
+              <w:left w:type="dxa" w:w="100"/>
+              <w:bottom w:type="dxa" w:w="60"/>
+              <w:right w:type="dxa" w:w="100"/>
+            </w:tcMar>
+            <w:vAlign w:val="center"/>
+          </w:tcPr>
+          <w:p>
+            <w:pPr>
+              <w:spacing w:after="0" w:line="260"/>
+              <w:jc w:val="left"/>
+            </w:pPr>
+            <w:r>
+              <w:rPr>
+                <w:sz w:val="22"/>
+                <w:szCs w:val="22"/>
+              </w:rPr>
+              <w:t xml:space="preserve">Status indication, I²C pull-ups, protection</w:t>
+            </w:r>
+          </w:p>
+        </w:tc>
+      </w:tr>
+      <w:tr>
+        <w:trPr>
+          <w:cantSplit/>
+        </w:trPr>
+        <w:tc>
+          <w:tcPr>
+            <w:tcW w:type="dxa" w:w="2300"/>
+            <w:tcBorders>
+              <w:top w:val="single" w:color="000000" w:sz="4"/>
+              <w:left w:val="single" w:color="000000" w:sz="4"/>
+              <w:bottom w:val="single" w:color="000000" w:sz="4"/>
+              <w:right w:val="single" w:color="000000" w:sz="4"/>
+            </w:tcBorders>
+            <w:tcMar>
+              <w:top w:type="dxa" w:w="60"/>
+              <w:left w:type="dxa" w:w="100"/>
+              <w:bottom w:type="dxa" w:w="60"/>
+              <w:right w:type="dxa" w:w="100"/>
+            </w:tcMar>
+            <w:vAlign w:val="center"/>
+          </w:tcPr>
+          <w:p>
+            <w:pPr>
+              <w:spacing w:after="0" w:line="260"/>
+              <w:jc w:val="left"/>
+            </w:pPr>
+            <w:r>
+              <w:rPr>
+                <w:sz w:val="22"/>
+                <w:szCs w:val="22"/>
+              </w:rPr>
               <w:t xml:space="preserve">IP65 enclosure</w:t>
             </w:r>
           </w:p>
@@ -10187,7 +10985,7 @@
                 <w:sz w:val="22"/>
                 <w:szCs w:val="22"/>
               </w:rPr>
-              <w:t xml:space="preserve">200 × 120 × 75 mm, vent, cable glands</w:t>
+              <w:t xml:space="preserve">150 × 100 × 70 mm, vent, cable glands</w:t>
             </w:r>
           </w:p>
         </w:tc>
@@ -10742,7 +11540,7 @@
                 <w:sz w:val="22"/>
                 <w:szCs w:val="22"/>
               </w:rPr>
-              <w:t xml:space="preserve">Sensirion I2C SEN5X, ArduinoJson, TinyGSM libraries</w:t>
+              <w:t xml:space="preserve">Sensirion I2C SEN5X, Adafruit INA219, ArduinoJson, TinyGPSPlus libraries</w:t>
             </w:r>
           </w:p>
         </w:tc>
@@ -10773,7 +11571,7 @@
                 <w:sz w:val="22"/>
                 <w:szCs w:val="22"/>
               </w:rPr>
-              <w:t xml:space="preserve">Sensor driver, JSON encoding, LTE and GPS modem control</w:t>
+              <w:t xml:space="preserve">Sensor and power-monitor drivers, JSON encoding, GPS decoding (LTE uses the module's built-in HTTPS commands)</w:t>
             </w:r>
           </w:p>
         </w:tc>
@@ -13604,7 +14402,7 @@
                 <w:sz w:val="22"/>
                 <w:szCs w:val="22"/>
               </w:rPr>
-              <w:t xml:space="preserve">At least 72 hours of operation</w:t>
+              <w:t xml:space="preserve">At least 72 hours on Wi-Fi (48 hours on LTE)</w:t>
             </w:r>
           </w:p>
         </w:tc>
@@ -18106,7 +18904,7 @@
                 <w:sz w:val="22"/>
                 <w:szCs w:val="22"/>
               </w:rPr>
-              <w:t xml:space="preserve">6. Continuous operation on battery for at least 72 hours without sunlight</w:t>
+              <w:t xml:space="preserve">6. Continuous operation on battery without sunlight for at least 72 hours on Wi-Fi and 48 hours on LTE</w:t>
             </w:r>
           </w:p>
         </w:tc>
@@ -19812,7 +20610,7 @@
                 <w:sz w:val="22"/>
                 <w:szCs w:val="22"/>
               </w:rPr>
-              <w:t xml:space="preserve">LilyGO T-SIM7600G-H board</w:t>
+              <w:t xml:space="preserve">ESP32 DevKit V1 (already owned)</w:t>
             </w:r>
           </w:p>
         </w:tc>
@@ -19843,7 +20641,7 @@
                 <w:sz w:val="22"/>
                 <w:szCs w:val="22"/>
               </w:rPr>
-              <w:t xml:space="preserve">₱2,600.00 – ₱3,500.00</w:t>
+              <w:t xml:space="preserve">₱0.00 – ₱0.00</w:t>
             </w:r>
           </w:p>
         </w:tc>
@@ -19903,7 +20701,7 @@
                 <w:sz w:val="22"/>
                 <w:szCs w:val="22"/>
               </w:rPr>
-              <w:t xml:space="preserve">LTE and GNSS antennas</w:t>
+              <w:t xml:space="preserve">SIMCom A7670 4G LTE module (breakout)</w:t>
             </w:r>
           </w:p>
         </w:tc>
@@ -19934,7 +20732,7 @@
                 <w:sz w:val="22"/>
                 <w:szCs w:val="22"/>
               </w:rPr>
-              <w:t xml:space="preserve">₱300.00 – ₱500.00</w:t>
+              <w:t xml:space="preserve">₱1,200.00 – ₱1,800.00</w:t>
             </w:r>
           </w:p>
         </w:tc>
@@ -19994,7 +20792,7 @@
                 <w:sz w:val="22"/>
                 <w:szCs w:val="22"/>
               </w:rPr>
-              <w:t xml:space="preserve">Solar panel, 6 V 10 W</w:t>
+              <w:t xml:space="preserve">LTE antenna</w:t>
             </w:r>
           </w:p>
         </w:tc>
@@ -20025,7 +20823,7 @@
                 <w:sz w:val="22"/>
                 <w:szCs w:val="22"/>
               </w:rPr>
-              <w:t xml:space="preserve">₱500.00 – ₱900.00</w:t>
+              <w:t xml:space="preserve">₱150.00 – ₱300.00</w:t>
             </w:r>
           </w:p>
         </w:tc>
@@ -20085,7 +20883,7 @@
                 <w:sz w:val="22"/>
                 <w:szCs w:val="22"/>
               </w:rPr>
-              <w:t xml:space="preserve">1S LiFePO4 solar charger module</w:t>
+              <w:t xml:space="preserve">GPS module (ATGM336H) and AO3401 MOSFET</w:t>
             </w:r>
           </w:p>
         </w:tc>
@@ -20116,7 +20914,7 @@
                 <w:sz w:val="22"/>
                 <w:szCs w:val="22"/>
               </w:rPr>
-              <w:t xml:space="preserve">₱150.00 – ₱400.00</w:t>
+              <w:t xml:space="preserve">₱250.00 – ₱450.00</w:t>
             </w:r>
           </w:p>
         </w:tc>
@@ -20176,7 +20974,7 @@
                 <w:sz w:val="22"/>
                 <w:szCs w:val="22"/>
               </w:rPr>
-              <w:t xml:space="preserve">LiFePO4 32700 6 Ah cells (×4)</w:t>
+              <w:t xml:space="preserve">Solar panel, 6 V 6 W</w:t>
             </w:r>
           </w:p>
         </w:tc>
@@ -20207,7 +21005,7 @@
                 <w:sz w:val="22"/>
                 <w:szCs w:val="22"/>
               </w:rPr>
-              <w:t xml:space="preserve">₱1,000.00 – ₱1,600.00</w:t>
+              <w:t xml:space="preserve">₱350.00 – ₱700.00</w:t>
             </w:r>
           </w:p>
         </w:tc>
@@ -20267,7 +21065,7 @@
                 <w:sz w:val="22"/>
                 <w:szCs w:val="22"/>
               </w:rPr>
-              <w:t xml:space="preserve">1S LiFePO4 protection board (BMS), cell holder, nickel strip</w:t>
+              <w:t xml:space="preserve">CN3791 solar charger module</w:t>
             </w:r>
           </w:p>
         </w:tc>
@@ -20358,7 +21156,7 @@
                 <w:sz w:val="22"/>
                 <w:szCs w:val="22"/>
               </w:rPr>
-              <w:t xml:space="preserve">DC-DC boost converter, 3.2 V → 5 V 3 A</w:t>
+              <w:t xml:space="preserve">18650 Li-ion 3000 mAh cells (×3)</w:t>
             </w:r>
           </w:p>
         </w:tc>
@@ -20389,7 +21187,7 @@
                 <w:sz w:val="22"/>
                 <w:szCs w:val="22"/>
               </w:rPr>
-              <w:t xml:space="preserve">₱150.00 – ₱300.00</w:t>
+              <w:t xml:space="preserve">₱750.00 – ₱1,200.00</w:t>
             </w:r>
           </w:p>
         </w:tc>
@@ -20449,7 +21247,7 @@
                 <w:sz w:val="22"/>
                 <w:szCs w:val="22"/>
               </w:rPr>
-              <w:t xml:space="preserve">INA219 power monitor module</w:t>
+              <w:t xml:space="preserve">1S protection board (BMS), 3-cell holder, nickel strip</w:t>
             </w:r>
           </w:p>
         </w:tc>
@@ -20480,7 +21278,7 @@
                 <w:sz w:val="22"/>
                 <w:szCs w:val="22"/>
               </w:rPr>
-              <w:t xml:space="preserve">₱150.00 – ₱250.00</w:t>
+              <w:t xml:space="preserve">₱100.00 – ₱250.00</w:t>
             </w:r>
           </w:p>
         </w:tc>
@@ -20540,7 +21338,7 @@
                 <w:sz w:val="22"/>
                 <w:szCs w:val="22"/>
               </w:rPr>
-              <w:t xml:space="preserve">Fuse, wires, connectors, cable glands</w:t>
+              <w:t xml:space="preserve">3.3 V buck-boost and 5 V boost (MT3608) modules</w:t>
             </w:r>
           </w:p>
         </w:tc>
@@ -20571,7 +21369,7 @@
                 <w:sz w:val="22"/>
                 <w:szCs w:val="22"/>
               </w:rPr>
-              <w:t xml:space="preserve">₱300.00 – ₱500.00</w:t>
+              <w:t xml:space="preserve">₱200.00 – ₱470.00</w:t>
             </w:r>
           </w:p>
         </w:tc>
@@ -20631,7 +21429,7 @@
                 <w:sz w:val="22"/>
                 <w:szCs w:val="22"/>
               </w:rPr>
-              <w:t xml:space="preserve">LEDs, resistors, capacitor</w:t>
+              <w:t xml:space="preserve">INA219 power monitor module</w:t>
             </w:r>
           </w:p>
         </w:tc>
@@ -20662,7 +21460,7 @@
                 <w:sz w:val="22"/>
                 <w:szCs w:val="22"/>
               </w:rPr>
-              <w:t xml:space="preserve">₱50.00 – ₱100.00</w:t>
+              <w:t xml:space="preserve">₱150.00 – ₱250.00</w:t>
             </w:r>
           </w:p>
         </w:tc>
@@ -20722,7 +21520,7 @@
                 <w:sz w:val="22"/>
                 <w:szCs w:val="22"/>
               </w:rPr>
-              <w:t xml:space="preserve">IP65 enclosure (200 × 120 × 75 mm)</w:t>
+              <w:t xml:space="preserve">Fuse, wires, connectors, cable glands</w:t>
             </w:r>
           </w:p>
         </w:tc>
@@ -20753,7 +21551,7 @@
                 <w:sz w:val="22"/>
                 <w:szCs w:val="22"/>
               </w:rPr>
-              <w:t xml:space="preserve">₱350.00 – ₱700.00</w:t>
+              <w:t xml:space="preserve">₱300.00 – ₱500.00</w:t>
             </w:r>
           </w:p>
         </w:tc>
@@ -20813,7 +21611,7 @@
                 <w:sz w:val="22"/>
                 <w:szCs w:val="22"/>
               </w:rPr>
-              <w:t xml:space="preserve">3D-printed radiation shield and brackets</w:t>
+              <w:t xml:space="preserve">LEDs, resistors, capacitor</w:t>
             </w:r>
           </w:p>
         </w:tc>
@@ -20844,7 +21642,7 @@
                 <w:sz w:val="22"/>
                 <w:szCs w:val="22"/>
               </w:rPr>
-              <w:t xml:space="preserve">₱300.00 – ₱800.00</w:t>
+              <w:t xml:space="preserve">₱50.00 – ₱100.00</w:t>
             </w:r>
           </w:p>
         </w:tc>
@@ -20904,7 +21702,7 @@
                 <w:sz w:val="22"/>
                 <w:szCs w:val="22"/>
               </w:rPr>
-              <w:t xml:space="preserve">Mounting hardware (clamps, U-bolts, screws)</w:t>
+              <w:t xml:space="preserve">IP65 enclosure (150 × 100 × 70 mm)</w:t>
             </w:r>
           </w:p>
         </w:tc>
@@ -20935,7 +21733,7 @@
                 <w:sz w:val="22"/>
                 <w:szCs w:val="22"/>
               </w:rPr>
-              <w:t xml:space="preserve">₱300.00 – ₱600.00</w:t>
+              <w:t xml:space="preserve">₱250.00 – ₱550.00</w:t>
             </w:r>
           </w:p>
         </w:tc>
@@ -20995,7 +21793,7 @@
                 <w:sz w:val="22"/>
                 <w:szCs w:val="22"/>
               </w:rPr>
-              <w:t xml:space="preserve">Prepaid SIM data (2 months)</w:t>
+              <w:t xml:space="preserve">3D-printed radiation shield and brackets</w:t>
             </w:r>
           </w:p>
         </w:tc>
@@ -21026,7 +21824,7 @@
                 <w:sz w:val="22"/>
                 <w:szCs w:val="22"/>
               </w:rPr>
-              <w:t xml:space="preserve">₱600.00 – ₱1,000.00</w:t>
+              <w:t xml:space="preserve">₱300.00 – ₱800.00</w:t>
             </w:r>
           </w:p>
         </w:tc>
@@ -21086,7 +21884,7 @@
                 <w:sz w:val="22"/>
                 <w:szCs w:val="22"/>
               </w:rPr>
-              <w:t xml:space="preserve">Server hosting / VPS (optional, 2 months)</w:t>
+              <w:t xml:space="preserve">Mounting hardware (clamps, U-bolts, screws)</w:t>
             </w:r>
           </w:p>
         </w:tc>
@@ -21117,7 +21915,7 @@
                 <w:sz w:val="22"/>
                 <w:szCs w:val="22"/>
               </w:rPr>
-              <w:t xml:space="preserve">₱0.00 – ₱1,200.00</w:t>
+              <w:t xml:space="preserve">₱300.00 – ₱600.00</w:t>
             </w:r>
           </w:p>
         </w:tc>
@@ -21174,6 +21972,188 @@
             </w:pPr>
             <w:r>
               <w:rPr>
+                <w:sz w:val="22"/>
+                <w:szCs w:val="22"/>
+              </w:rPr>
+              <w:t xml:space="preserve">Prepaid SIM data (2 months)</w:t>
+            </w:r>
+          </w:p>
+        </w:tc>
+        <w:tc>
+          <w:tcPr>
+            <w:tcW w:type="dxa" w:w="2800"/>
+            <w:tcBorders>
+              <w:top w:val="single" w:color="000000" w:sz="4"/>
+              <w:left w:val="single" w:color="000000" w:sz="4"/>
+              <w:bottom w:val="single" w:color="000000" w:sz="4"/>
+              <w:right w:val="single" w:color="000000" w:sz="4"/>
+            </w:tcBorders>
+            <w:tcMar>
+              <w:top w:type="dxa" w:w="60"/>
+              <w:left w:type="dxa" w:w="100"/>
+              <w:bottom w:type="dxa" w:w="60"/>
+              <w:right w:type="dxa" w:w="100"/>
+            </w:tcMar>
+            <w:vAlign w:val="center"/>
+          </w:tcPr>
+          <w:p>
+            <w:pPr>
+              <w:spacing w:after="0" w:line="260"/>
+              <w:jc w:val="left"/>
+            </w:pPr>
+            <w:r>
+              <w:rPr>
+                <w:sz w:val="22"/>
+                <w:szCs w:val="22"/>
+              </w:rPr>
+              <w:t xml:space="preserve">₱600.00 – ₱1,000.00</w:t>
+            </w:r>
+          </w:p>
+        </w:tc>
+      </w:tr>
+      <w:tr>
+        <w:trPr>
+          <w:cantSplit/>
+        </w:trPr>
+        <w:tc>
+          <w:tcPr>
+            <w:tcW w:type="dxa" w:w="1300"/>
+            <w:tcBorders>
+              <w:top w:val="single" w:color="000000" w:sz="4"/>
+              <w:left w:val="single" w:color="000000" w:sz="4"/>
+              <w:bottom w:val="single" w:color="000000" w:sz="4"/>
+              <w:right w:val="single" w:color="000000" w:sz="4"/>
+            </w:tcBorders>
+            <w:tcMar>
+              <w:top w:type="dxa" w:w="60"/>
+              <w:left w:type="dxa" w:w="100"/>
+              <w:bottom w:type="dxa" w:w="60"/>
+              <w:right w:type="dxa" w:w="100"/>
+            </w:tcMar>
+            <w:vAlign w:val="center"/>
+          </w:tcPr>
+          <w:p>
+            <w:pPr>
+              <w:spacing w:after="0" w:line="260"/>
+              <w:jc w:val="left"/>
+            </w:pPr>
+          </w:p>
+        </w:tc>
+        <w:tc>
+          <w:tcPr>
+            <w:tcW w:type="dxa" w:w="4540"/>
+            <w:tcBorders>
+              <w:top w:val="single" w:color="000000" w:sz="4"/>
+              <w:left w:val="single" w:color="000000" w:sz="4"/>
+              <w:bottom w:val="single" w:color="000000" w:sz="4"/>
+              <w:right w:val="single" w:color="000000" w:sz="4"/>
+            </w:tcBorders>
+            <w:tcMar>
+              <w:top w:type="dxa" w:w="60"/>
+              <w:left w:type="dxa" w:w="100"/>
+              <w:bottom w:type="dxa" w:w="60"/>
+              <w:right w:type="dxa" w:w="100"/>
+            </w:tcMar>
+            <w:vAlign w:val="center"/>
+          </w:tcPr>
+          <w:p>
+            <w:pPr>
+              <w:spacing w:after="0" w:line="260"/>
+              <w:jc w:val="left"/>
+            </w:pPr>
+            <w:r>
+              <w:rPr>
+                <w:sz w:val="22"/>
+                <w:szCs w:val="22"/>
+              </w:rPr>
+              <w:t xml:space="preserve">Server hosting / VPS (optional, 2 months)</w:t>
+            </w:r>
+          </w:p>
+        </w:tc>
+        <w:tc>
+          <w:tcPr>
+            <w:tcW w:type="dxa" w:w="2800"/>
+            <w:tcBorders>
+              <w:top w:val="single" w:color="000000" w:sz="4"/>
+              <w:left w:val="single" w:color="000000" w:sz="4"/>
+              <w:bottom w:val="single" w:color="000000" w:sz="4"/>
+              <w:right w:val="single" w:color="000000" w:sz="4"/>
+            </w:tcBorders>
+            <w:tcMar>
+              <w:top w:type="dxa" w:w="60"/>
+              <w:left w:type="dxa" w:w="100"/>
+              <w:bottom w:type="dxa" w:w="60"/>
+              <w:right w:type="dxa" w:w="100"/>
+            </w:tcMar>
+            <w:vAlign w:val="center"/>
+          </w:tcPr>
+          <w:p>
+            <w:pPr>
+              <w:spacing w:after="0" w:line="260"/>
+              <w:jc w:val="left"/>
+            </w:pPr>
+            <w:r>
+              <w:rPr>
+                <w:sz w:val="22"/>
+                <w:szCs w:val="22"/>
+              </w:rPr>
+              <w:t xml:space="preserve">₱0.00 – ₱1,200.00</w:t>
+            </w:r>
+          </w:p>
+        </w:tc>
+      </w:tr>
+      <w:tr>
+        <w:trPr>
+          <w:cantSplit/>
+        </w:trPr>
+        <w:tc>
+          <w:tcPr>
+            <w:tcW w:type="dxa" w:w="1300"/>
+            <w:tcBorders>
+              <w:top w:val="single" w:color="000000" w:sz="4"/>
+              <w:left w:val="single" w:color="000000" w:sz="4"/>
+              <w:bottom w:val="single" w:color="000000" w:sz="4"/>
+              <w:right w:val="single" w:color="000000" w:sz="4"/>
+            </w:tcBorders>
+            <w:tcMar>
+              <w:top w:type="dxa" w:w="60"/>
+              <w:left w:type="dxa" w:w="100"/>
+              <w:bottom w:type="dxa" w:w="60"/>
+              <w:right w:type="dxa" w:w="100"/>
+            </w:tcMar>
+            <w:vAlign w:val="center"/>
+          </w:tcPr>
+          <w:p>
+            <w:pPr>
+              <w:spacing w:after="0" w:line="260"/>
+              <w:jc w:val="left"/>
+            </w:pPr>
+          </w:p>
+        </w:tc>
+        <w:tc>
+          <w:tcPr>
+            <w:tcW w:type="dxa" w:w="4540"/>
+            <w:tcBorders>
+              <w:top w:val="single" w:color="000000" w:sz="4"/>
+              <w:left w:val="single" w:color="000000" w:sz="4"/>
+              <w:bottom w:val="single" w:color="000000" w:sz="4"/>
+              <w:right w:val="single" w:color="000000" w:sz="4"/>
+            </w:tcBorders>
+            <w:tcMar>
+              <w:top w:type="dxa" w:w="60"/>
+              <w:left w:type="dxa" w:w="100"/>
+              <w:bottom w:type="dxa" w:w="60"/>
+              <w:right w:type="dxa" w:w="100"/>
+            </w:tcMar>
+            <w:vAlign w:val="center"/>
+          </w:tcPr>
+          <w:p>
+            <w:pPr>
+              <w:spacing w:after="0" w:line="260"/>
+              <w:jc w:val="left"/>
+            </w:pPr>
+            <w:r>
+              <w:rPr>
                 <w:b/>
                 <w:bCs/>
                 <w:sz w:val="22"/>
@@ -21212,7 +22192,7 @@
                 <w:sz w:val="22"/>
                 <w:szCs w:val="22"/>
               </w:rPr>
-              <w:t xml:space="preserve">₱8,900.00 – ₱15,450.00</w:t>
+              <w:t xml:space="preserve">₱7,100.00 – ₱13,270.00</w:t>
             </w:r>
           </w:p>
         </w:tc>
@@ -21230,7 +22210,7 @@
         <w:jc w:val="both"/>
       </w:pPr>
       <w:r>
-        <w:t xml:space="preserve">The total estimated cost of one station is ₱8,900.00 to ₱15,450.00, against an initial budget of ₱15,000.00. The compact design keeps one station within budget; additional stations for the pilot deployment will require </w:t>
+        <w:t xml:space="preserve">The total estimated cost of one station is ₱7,100.00 to ₱13,270.00, against an initial budget of ₱15,000.00. Reusing the team's ESP32 and using separate small LTE and GPS modules keeps one station well within budget; additional stations for the pilot deployment will require </w:t>
       </w:r>
       <w:r>
         <w:rPr>

</xml_diff>

<commit_message>
Proposal: new app screenshots (connect guide, add station, settings)
Co-Authored-By: Claude Opus 5.5 <noreply@anthropic.com>
Claude-Session: https://claude.ai/code/session_0148MYiEDhLTPmdz34XuceJs
</commit_message>
<xml_diff>
--- a/docs/proposal/GINHAWA_Proposal_Revised.docx
+++ b/docs/proposal/GINHAWA_Proposal_Revised.docx
@@ -907,7 +907,7 @@
             <w:tab/>
           </w:r>
           <w:r>
-            <w:t>29</w:t>
+            <w:t>30</w:t>
           </w:r>
         </w:p>
         <w:p>
@@ -925,7 +925,7 @@
             <w:tab/>
           </w:r>
           <w:r>
-            <w:t>29</w:t>
+            <w:t>30</w:t>
           </w:r>
         </w:p>
         <w:p>
@@ -943,7 +943,7 @@
             <w:tab/>
           </w:r>
           <w:r>
-            <w:t>30</w:t>
+            <w:t>31</w:t>
           </w:r>
         </w:p>
         <w:p>
@@ -961,7 +961,7 @@
             <w:tab/>
           </w:r>
           <w:r>
-            <w:t>31</w:t>
+            <w:t>32</w:t>
           </w:r>
         </w:p>
         <w:p>
@@ -979,7 +979,7 @@
             <w:tab/>
           </w:r>
           <w:r>
-            <w:t>31</w:t>
+            <w:t>32</w:t>
           </w:r>
         </w:p>
         <w:p>
@@ -997,7 +997,7 @@
             <w:tab/>
           </w:r>
           <w:r>
-            <w:t>31</w:t>
+            <w:t>32</w:t>
           </w:r>
         </w:p>
         <w:p>
@@ -1015,7 +1015,7 @@
             <w:tab/>
           </w:r>
           <w:r>
-            <w:t>32</w:t>
+            <w:t>33</w:t>
           </w:r>
         </w:p>
         <w:p>
@@ -1033,7 +1033,7 @@
             <w:tab/>
           </w:r>
           <w:r>
-            <w:t>32</w:t>
+            <w:t>33</w:t>
           </w:r>
         </w:p>
         <w:p>
@@ -1051,7 +1051,7 @@
             <w:tab/>
           </w:r>
           <w:r>
-            <w:t>32</w:t>
+            <w:t>33</w:t>
           </w:r>
         </w:p>
         <w:p>
@@ -1069,7 +1069,7 @@
             <w:tab/>
           </w:r>
           <w:r>
-            <w:t>33</w:t>
+            <w:t>34</w:t>
           </w:r>
         </w:p>
         <w:p>
@@ -1087,7 +1087,7 @@
             <w:tab/>
           </w:r>
           <w:r>
-            <w:t>34</w:t>
+            <w:t>35</w:t>
           </w:r>
         </w:p>
         <w:p>
@@ -1105,7 +1105,7 @@
             <w:tab/>
           </w:r>
           <w:r>
-            <w:t>34</w:t>
+            <w:t>35</w:t>
           </w:r>
         </w:p>
         <w:p>
@@ -1141,7 +1141,7 @@
             <w:tab/>
           </w:r>
           <w:r>
-            <w:t>35</w:t>
+            <w:t>36</w:t>
           </w:r>
         </w:p>
         <w:p>
@@ -1159,7 +1159,7 @@
             <w:tab/>
           </w:r>
           <w:r>
-            <w:t>36</w:t>
+            <w:t>37</w:t>
           </w:r>
         </w:p>
         <w:p>
@@ -1177,7 +1177,7 @@
             <w:tab/>
           </w:r>
           <w:r>
-            <w:t>37</w:t>
+            <w:t>38</w:t>
           </w:r>
         </w:p>
         <w:p>
@@ -1195,7 +1195,7 @@
             <w:tab/>
           </w:r>
           <w:r>
-            <w:t>37</w:t>
+            <w:t>38</w:t>
           </w:r>
         </w:p>
         <w:p>
@@ -1213,7 +1213,7 @@
             <w:tab/>
           </w:r>
           <w:r>
-            <w:t>39</w:t>
+            <w:t>40</w:t>
           </w:r>
         </w:p>
         <w:p>
@@ -1231,7 +1231,7 @@
             <w:tab/>
           </w:r>
           <w:r>
-            <w:t>40</w:t>
+            <w:t>41</w:t>
           </w:r>
           <w:r>
             <w:fldChar w:fldCharType="end"/>
@@ -1496,13 +1496,67 @@
             <w:ind w:left="0"/>
           </w:pPr>
           <w:r>
-            <w:t xml:space="preserve">Figure 13. Gantt Chart of Project Activities</w:t>
+            <w:t xml:space="preserve">Figure 13. Connect Sensor Guide</w:t>
           </w:r>
           <w:r>
             <w:tab/>
           </w:r>
           <w:r>
-            <w:t>39</w:t>
+            <w:t>29</w:t>
+          </w:r>
+        </w:p>
+        <w:p>
+          <w:pPr>
+            <w:tabs>
+              <w:tab w:val="right" w:leader="dot" w:pos="8640"/>
+            </w:tabs>
+            <w:spacing w:after="40" w:line="276" w:lineRule="auto"/>
+            <w:ind w:left="0"/>
+          </w:pPr>
+          <w:r>
+            <w:t xml:space="preserve">Figure 14. Add Station</w:t>
+          </w:r>
+          <w:r>
+            <w:tab/>
+          </w:r>
+          <w:r>
+            <w:t>29</w:t>
+          </w:r>
+        </w:p>
+        <w:p>
+          <w:pPr>
+            <w:tabs>
+              <w:tab w:val="right" w:leader="dot" w:pos="8640"/>
+            </w:tabs>
+            <w:spacing w:after="40" w:line="276" w:lineRule="auto"/>
+            <w:ind w:left="0"/>
+          </w:pPr>
+          <w:r>
+            <w:t xml:space="preserve">Figure 15. Station Settings</w:t>
+          </w:r>
+          <w:r>
+            <w:tab/>
+          </w:r>
+          <w:r>
+            <w:t>29</w:t>
+          </w:r>
+        </w:p>
+        <w:p>
+          <w:pPr>
+            <w:tabs>
+              <w:tab w:val="right" w:leader="dot" w:pos="8640"/>
+            </w:tabs>
+            <w:spacing w:after="40" w:line="276" w:lineRule="auto"/>
+            <w:ind w:left="0"/>
+          </w:pPr>
+          <w:r>
+            <w:t xml:space="preserve">Figure 16. Gantt Chart of Project Activities</w:t>
+          </w:r>
+          <w:r>
+            <w:tab/>
+          </w:r>
+          <w:r>
+            <w:t>40</w:t>
           </w:r>
           <w:r>
             <w:fldChar w:fldCharType="end"/>
@@ -1629,7 +1683,7 @@
             <w:tab/>
           </w:r>
           <w:r>
-            <w:t>29</w:t>
+            <w:t>30</w:t>
           </w:r>
         </w:p>
         <w:p>
@@ -1647,7 +1701,7 @@
             <w:tab/>
           </w:r>
           <w:r>
-            <w:t>30</w:t>
+            <w:t>31</w:t>
           </w:r>
         </w:p>
         <w:p>
@@ -1665,7 +1719,7 @@
             <w:tab/>
           </w:r>
           <w:r>
-            <w:t>32</w:t>
+            <w:t>33</w:t>
           </w:r>
         </w:p>
         <w:p>
@@ -1701,7 +1755,7 @@
             <w:tab/>
           </w:r>
           <w:r>
-            <w:t>33</w:t>
+            <w:t>34</w:t>
           </w:r>
         </w:p>
         <w:p>
@@ -1719,7 +1773,7 @@
             <w:tab/>
           </w:r>
           <w:r>
-            <w:t>35</w:t>
+            <w:t>36</w:t>
           </w:r>
         </w:p>
         <w:p>
@@ -1755,7 +1809,7 @@
             <w:tab/>
           </w:r>
           <w:r>
-            <w:t>36</w:t>
+            <w:t>37</w:t>
           </w:r>
         </w:p>
         <w:p>
@@ -1773,7 +1827,7 @@
             <w:tab/>
           </w:r>
           <w:r>
-            <w:t>37</w:t>
+            <w:t>38</w:t>
           </w:r>
         </w:p>
         <w:p>
@@ -1791,7 +1845,7 @@
             <w:tab/>
           </w:r>
           <w:r>
-            <w:t>37</w:t>
+            <w:t>38</w:t>
           </w:r>
           <w:r>
             <w:fldChar w:fldCharType="end"/>
@@ -9211,7 +9265,7 @@
         <w:jc w:val="both"/>
       </w:pPr>
       <w:r>
-        <w:t xml:space="preserve">The GINHAWA application is a mobile-first web application that can be installed on a phone's home screen. Figures 10 to 12 show the main screens, captured from the working prototype with simulated placeholder data.</w:t>
+        <w:t xml:space="preserve">The GINHAWA application is a mobile-first web application that can be installed on a phone's home screen. Figures 10 to 15 show the main screens, captured from the working prototype with simulated placeholder data.</w:t>
       </w:r>
     </w:p>
     <w:tbl>
@@ -9435,6 +9489,230 @@
     </w:tbl>
     <w:p>
       <w:pPr>
+        <w:spacing w:after="120"/>
+      </w:pPr>
+    </w:p>
+    <w:tbl>
+      <w:tblPr>
+        <w:tblW w:type="dxa" w:w="8640"/>
+        <w:tblBorders>
+          <w:top w:val="single" w:color="auto" w:sz="4"/>
+          <w:left w:val="single" w:color="auto" w:sz="4"/>
+          <w:bottom w:val="single" w:color="auto" w:sz="4"/>
+          <w:right w:val="single" w:color="auto" w:sz="4"/>
+          <w:insideH w:val="single" w:color="auto" w:sz="4"/>
+          <w:insideV w:val="single" w:color="auto" w:sz="4"/>
+        </w:tblBorders>
+        <w:tblLayout w:type="fixed"/>
+      </w:tblPr>
+      <w:tblGrid>
+        <w:gridCol w:w="2880"/>
+        <w:gridCol w:w="2880"/>
+        <w:gridCol w:w="2880"/>
+      </w:tblGrid>
+      <w:tr>
+        <w:tc>
+          <w:tcPr>
+            <w:tcW w:type="dxa" w:w="2880"/>
+            <w:tcBorders>
+              <w:top w:val="none" w:color="FFFFFF" w:sz="0"/>
+              <w:left w:val="none" w:color="FFFFFF" w:sz="0"/>
+              <w:bottom w:val="none" w:color="FFFFFF" w:sz="0"/>
+              <w:right w:val="none" w:color="FFFFFF" w:sz="0"/>
+            </w:tcBorders>
+          </w:tcPr>
+          <w:p>
+            <w:pPr>
+              <w:jc w:val="center"/>
+            </w:pPr>
+            <w:r>
+              <w:drawing>
+                <wp:inline distT="0" distB="0" distL="0" distR="0">
+                  <wp:extent cx="1691640" cy="3660882"/>
+                  <wp:effectExtent t="0" r="0" b="0" l="0"/>
+                  <wp:docPr id="1" name="/var/tmp/gbuild/img/ui4.png" descr="/var/tmp/gbuild/img/ui4.png" title="/var/tmp/gbuild/img/ui4.png"/>
+                  <wp:cNvGraphicFramePr>
+                    <a:graphicFrameLocks xmlns:a="http://schemas.openxmlformats.org/drawingml/2006/main" noChangeAspect="1"/>
+                  </wp:cNvGraphicFramePr>
+                  <a:graphic xmlns:a="http://schemas.openxmlformats.org/drawingml/2006/main">
+                    <a:graphicData uri="http://schemas.openxmlformats.org/drawingml/2006/picture">
+                      <pic:pic xmlns:pic="http://schemas.openxmlformats.org/drawingml/2006/picture">
+                        <pic:nvPicPr>
+                          <pic:cNvPr id="0" name="" descr=""/>
+                          <pic:cNvPicPr>
+                            <a:picLocks noChangeAspect="1" noChangeArrowheads="1"/>
+                          </pic:cNvPicPr>
+                        </pic:nvPicPr>
+                        <pic:blipFill>
+                          <a:blip r:embed="rId24" cstate="none"/>
+                          <a:srcRect/>
+                          <a:stretch>
+                            <a:fillRect/>
+                          </a:stretch>
+                        </pic:blipFill>
+                        <pic:spPr bwMode="auto">
+                          <a:xfrm>
+                            <a:off x="0" y="0"/>
+                            <a:ext cx="1691640" cy="3660882"/>
+                          </a:xfrm>
+                          <a:prstGeom prst="rect">
+                            <a:avLst/>
+                          </a:prstGeom>
+                        </pic:spPr>
+                      </pic:pic>
+                    </a:graphicData>
+                  </a:graphic>
+                </wp:inline>
+              </w:drawing>
+            </w:r>
+          </w:p>
+          <w:p>
+            <w:pPr>
+              <w:pStyle w:val="FigureCaption"/>
+              <w:spacing w:after="240" w:before="60"/>
+              <w:jc w:val="center"/>
+            </w:pPr>
+            <w:r>
+              <w:t xml:space="preserve">Figure 13. Connect Sensor Guide</w:t>
+            </w:r>
+          </w:p>
+        </w:tc>
+        <w:tc>
+          <w:tcPr>
+            <w:tcW w:type="dxa" w:w="2880"/>
+            <w:tcBorders>
+              <w:top w:val="none" w:color="FFFFFF" w:sz="0"/>
+              <w:left w:val="none" w:color="FFFFFF" w:sz="0"/>
+              <w:bottom w:val="none" w:color="FFFFFF" w:sz="0"/>
+              <w:right w:val="none" w:color="FFFFFF" w:sz="0"/>
+            </w:tcBorders>
+          </w:tcPr>
+          <w:p>
+            <w:pPr>
+              <w:jc w:val="center"/>
+            </w:pPr>
+            <w:r>
+              <w:drawing>
+                <wp:inline distT="0" distB="0" distL="0" distR="0">
+                  <wp:extent cx="1691640" cy="3660882"/>
+                  <wp:effectExtent t="0" r="0" b="0" l="0"/>
+                  <wp:docPr id="1" name="/var/tmp/gbuild/img/ui5.png" descr="/var/tmp/gbuild/img/ui5.png" title="/var/tmp/gbuild/img/ui5.png"/>
+                  <wp:cNvGraphicFramePr>
+                    <a:graphicFrameLocks xmlns:a="http://schemas.openxmlformats.org/drawingml/2006/main" noChangeAspect="1"/>
+                  </wp:cNvGraphicFramePr>
+                  <a:graphic xmlns:a="http://schemas.openxmlformats.org/drawingml/2006/main">
+                    <a:graphicData uri="http://schemas.openxmlformats.org/drawingml/2006/picture">
+                      <pic:pic xmlns:pic="http://schemas.openxmlformats.org/drawingml/2006/picture">
+                        <pic:nvPicPr>
+                          <pic:cNvPr id="0" name="" descr=""/>
+                          <pic:cNvPicPr>
+                            <a:picLocks noChangeAspect="1" noChangeArrowheads="1"/>
+                          </pic:cNvPicPr>
+                        </pic:nvPicPr>
+                        <pic:blipFill>
+                          <a:blip r:embed="rId25" cstate="none"/>
+                          <a:srcRect/>
+                          <a:stretch>
+                            <a:fillRect/>
+                          </a:stretch>
+                        </pic:blipFill>
+                        <pic:spPr bwMode="auto">
+                          <a:xfrm>
+                            <a:off x="0" y="0"/>
+                            <a:ext cx="1691640" cy="3660882"/>
+                          </a:xfrm>
+                          <a:prstGeom prst="rect">
+                            <a:avLst/>
+                          </a:prstGeom>
+                        </pic:spPr>
+                      </pic:pic>
+                    </a:graphicData>
+                  </a:graphic>
+                </wp:inline>
+              </w:drawing>
+            </w:r>
+          </w:p>
+          <w:p>
+            <w:pPr>
+              <w:pStyle w:val="FigureCaption"/>
+              <w:spacing w:after="240" w:before="60"/>
+              <w:jc w:val="center"/>
+            </w:pPr>
+            <w:r>
+              <w:t xml:space="preserve">Figure 14. Add Station</w:t>
+            </w:r>
+          </w:p>
+        </w:tc>
+        <w:tc>
+          <w:tcPr>
+            <w:tcW w:type="dxa" w:w="2880"/>
+            <w:tcBorders>
+              <w:top w:val="none" w:color="FFFFFF" w:sz="0"/>
+              <w:left w:val="none" w:color="FFFFFF" w:sz="0"/>
+              <w:bottom w:val="none" w:color="FFFFFF" w:sz="0"/>
+              <w:right w:val="none" w:color="FFFFFF" w:sz="0"/>
+            </w:tcBorders>
+          </w:tcPr>
+          <w:p>
+            <w:pPr>
+              <w:jc w:val="center"/>
+            </w:pPr>
+            <w:r>
+              <w:drawing>
+                <wp:inline distT="0" distB="0" distL="0" distR="0">
+                  <wp:extent cx="1691640" cy="3660882"/>
+                  <wp:effectExtent t="0" r="0" b="0" l="0"/>
+                  <wp:docPr id="1" name="/var/tmp/gbuild/img/ui6.png" descr="/var/tmp/gbuild/img/ui6.png" title="/var/tmp/gbuild/img/ui6.png"/>
+                  <wp:cNvGraphicFramePr>
+                    <a:graphicFrameLocks xmlns:a="http://schemas.openxmlformats.org/drawingml/2006/main" noChangeAspect="1"/>
+                  </wp:cNvGraphicFramePr>
+                  <a:graphic xmlns:a="http://schemas.openxmlformats.org/drawingml/2006/main">
+                    <a:graphicData uri="http://schemas.openxmlformats.org/drawingml/2006/picture">
+                      <pic:pic xmlns:pic="http://schemas.openxmlformats.org/drawingml/2006/picture">
+                        <pic:nvPicPr>
+                          <pic:cNvPr id="0" name="" descr=""/>
+                          <pic:cNvPicPr>
+                            <a:picLocks noChangeAspect="1" noChangeArrowheads="1"/>
+                          </pic:cNvPicPr>
+                        </pic:nvPicPr>
+                        <pic:blipFill>
+                          <a:blip r:embed="rId26" cstate="none"/>
+                          <a:srcRect/>
+                          <a:stretch>
+                            <a:fillRect/>
+                          </a:stretch>
+                        </pic:blipFill>
+                        <pic:spPr bwMode="auto">
+                          <a:xfrm>
+                            <a:off x="0" y="0"/>
+                            <a:ext cx="1691640" cy="3660882"/>
+                          </a:xfrm>
+                          <a:prstGeom prst="rect">
+                            <a:avLst/>
+                          </a:prstGeom>
+                        </pic:spPr>
+                      </pic:pic>
+                    </a:graphicData>
+                  </a:graphic>
+                </wp:inline>
+              </w:drawing>
+            </w:r>
+          </w:p>
+          <w:p>
+            <w:pPr>
+              <w:pStyle w:val="FigureCaption"/>
+              <w:spacing w:after="240" w:before="60"/>
+              <w:jc w:val="center"/>
+            </w:pPr>
+            <w:r>
+              <w:t xml:space="preserve">Figure 15. Station Settings</w:t>
+            </w:r>
+          </w:p>
+        </w:tc>
+      </w:tr>
+    </w:tbl>
+    <w:p>
+      <w:pPr>
         <w:spacing w:after="160" w:line="360"/>
         <w:ind w:firstLine="720"/>
         <w:jc w:val="both"/>
@@ -9450,7 +9728,7 @@
         <w:t xml:space="preserve">Stations Dashboard</w:t>
       </w:r>
       <w:r>
-        <w:t xml:space="preserve"> (Figure 10) summarizes the worst air quality right now, the number of stations online, and active alerts, followed by a searchable, sortable list of stations tinted by their AQI level. The </w:t>
+        <w:t xml:space="preserve"> (Figure 10) summarizes the worst air quality right now, the number of stations online, and active alerts, followed by a searchable, sortable list of stations tinted by their AQI level; a station whose sensor has not reported yet is marked "Sensor not connected yet" instead of showing empty values. The </w:t>
       </w:r>
       <w:r>
         <w:rPr>
@@ -9460,7 +9738,7 @@
         <w:t xml:space="preserve">Station Details</w:t>
       </w:r>
       <w:r>
-        <w:t xml:space="preserve"> screen (Figure 11) shows the station's current AQI, main pollutant, temperature, humidity, the AQI color scale, health recommendations, the last 12 hours of hourly AQI, a </w:t>
+        <w:t xml:space="preserve"> screen (Figure 11) shows the station's current AQI, main pollutant, temperature, humidity, the AQI color scale, a </w:t>
       </w:r>
       <w:r>
         <w:rPr>
@@ -9470,7 +9748,7 @@
         <w:t xml:space="preserve">Station status</w:t>
       </w:r>
       <w:r>
-        <w:t xml:space="preserve"> card (battery percentage estimated from the lithium-ion cell voltage, whether it is charging, Wi-Fi or 4G LTE connection and last upload, GPS location, and how long ago particles were last measured), all readings with plain-language explanations, and history charts. The live chart plots only particle values that were actually measured, and hourly and daily averages ignore the minutes without a PM measurement, so the schedule does not bias the results. The </w:t>
+        <w:t xml:space="preserve"> card (battery percentage estimated from the lithium-ion cell voltage, whether it is charging, Wi-Fi or 4G LTE connection and last upload, GPS location, and how long ago particles were last measured), health recommendations, the last 12 hours of hourly AQI, all readings with plain-language explanations, and history charts. The live chart plots only particle values that were actually measured, and hourly and daily averages ignore the minutes without a PM measurement, so the schedule does not bias the results. The </w:t>
       </w:r>
       <w:r>
         <w:rPr>
@@ -9480,7 +9758,47 @@
         <w:t xml:space="preserve">Alerts</w:t>
       </w:r>
       <w:r>
-        <w:t xml:space="preserve"> screen (Figure 12) lists ongoing and past threshold exceedances, which users can acknowledge. Administrators additionally see the Add Station screen and station settings (thresholds, sensor keys, and deletion). The firmware for 4G LTE fallback and GPS positioning has been written and will be bench-tested once the modules are purchased, and the station map view (Section 3.2.11) is part of the next development sprint; the server and application already store and display the station's network, battery, and location. The application supports light, dark, and system themes.</w:t>
+        <w:t xml:space="preserve"> screen (Figure 12) lists ongoing and past threshold exceedances, which users can acknowledge.</w:t>
+      </w:r>
+    </w:p>
+    <w:p>
+      <w:pPr>
+        <w:spacing w:after="160" w:line="360"/>
+        <w:ind w:firstLine="720"/>
+        <w:jc w:val="both"/>
+      </w:pPr>
+      <w:r>
+        <w:t xml:space="preserve">Administrators additionally see the screens in Figures 13 to 15. When a station has no readings yet, its page becomes a </w:t>
+      </w:r>
+      <w:r>
+        <w:rPr>
+          <w:b/>
+          <w:bCs/>
+        </w:rPr>
+        <w:t xml:space="preserve">Connect Sensor Guide</w:t>
+      </w:r>
+      <w:r>
+        <w:t xml:space="preserve"> (Figure 13) with three steps: generate the station's sensor key, flash the firmware, and power the station on. After the key is generated, the guide shows a ready-to-paste firmware configuration and two buttons that test the key from the browser before any hardware is involved: one only checks the key, and the other sends a sample reading so the station appears live. </w:t>
+      </w:r>
+      <w:r>
+        <w:rPr>
+          <w:b/>
+          <w:bCs/>
+        </w:rPr>
+        <w:t xml:space="preserve">Add Station</w:t>
+      </w:r>
+      <w:r>
+        <w:t xml:space="preserve"> (Figure 14) registers a new station by its location and landmark, and </w:t>
+      </w:r>
+      <w:r>
+        <w:rPr>
+          <w:b/>
+          <w:bCs/>
+        </w:rPr>
+        <w:t xml:space="preserve">Station Settings</w:t>
+      </w:r>
+      <w:r>
+        <w:t xml:space="preserve"> (Figure 15) edits the station, its alert thresholds for PM2.5, VOC, and NOx, and its sensor key. On computers, the navigation moves to a sidebar and stations are listed in two columns. The firmware for 4G LTE fallback and GPS positioning has been written and will be bench-tested once the modules are purchased, and the station map view (Section 3.2.11) is part of the next development sprint; the server and application already store and display the station's network, battery, and location. The application supports light, dark, and system themes.</w:t>
       </w:r>
     </w:p>
     <w:p>
@@ -22269,7 +22587,7 @@
                     </pic:cNvPicPr>
                   </pic:nvPicPr>
                   <pic:blipFill>
-                    <a:blip r:embed="rId24" cstate="none"/>
+                    <a:blip r:embed="rId27" cstate="none"/>
                     <a:srcRect/>
                     <a:stretch>
                       <a:fillRect/>
@@ -22298,7 +22616,7 @@
         <w:jc w:val="center"/>
       </w:pPr>
       <w:r>
-        <w:t xml:space="preserve">Figure 13. Gantt Chart of Project Activities</w:t>
+        <w:t xml:space="preserve">Figure 16. Gantt Chart of Project Activities</w:t>
       </w:r>
     </w:p>
     <w:p>
@@ -22308,7 +22626,7 @@
         <w:jc w:val="both"/>
       </w:pPr>
       <w:r>
-        <w:t xml:space="preserve">Figure 13 shows the schedule of project activities from requirements gathering in February 2026 to the final defense in December 2026, including the barangay coordination, laboratory and outdoor testing, and the 30-day pilot deployment added after the proposal defense. </w:t>
+        <w:t xml:space="preserve">Figure 16 shows the schedule of project activities from requirements gathering in February 2026 to the final defense in December 2026, including the barangay coordination, laboratory and outdoor testing, and the 30-day pilot deployment added after the proposal defense. </w:t>
       </w:r>
       <w:r>
         <w:rPr>

</xml_diff>

<commit_message>
Paper and diagrams: no accounts, self-adding stations, team admin
- ERD: USERS removed; STATIONS gains chip_id and name_from_gps;
  new BLOCKED_DEVICES
- Use case, context and Level 1 DFD: viewers need no account; the
  administrator signs in with the team passcode; process 1.0 becomes
  Register Station (hardware ID + team secret)
- Proposal text (overview, ERD, use case, context, DFD, scalability,
  UI, software, installation, ISO 25010 security, functionality tests),
  new screenshots (Figures 10-15) and Summary of Revisions
- Settings page: Team admin moved above Network

Co-Authored-By: Claude Opus 5.5 <noreply@anthropic.com>
Claude-Session: https://claude.ai/code/session_0148MYiEDhLTPmdz34XuceJs
</commit_message>
<xml_diff>
--- a/docs/proposal/GINHAWA_Proposal_Revised.docx
+++ b/docs/proposal/GINHAWA_Proposal_Revised.docx
@@ -691,7 +691,7 @@
             <w:tab/>
           </w:r>
           <w:r>
-            <w:t>15</w:t>
+            <w:t>16</w:t>
           </w:r>
         </w:p>
         <w:p>
@@ -817,7 +817,7 @@
             <w:tab/>
           </w:r>
           <w:r>
-            <w:t>23</w:t>
+            <w:t>24</w:t>
           </w:r>
         </w:p>
         <w:p>
@@ -1304,7 +1304,7 @@
             <w:tab/>
           </w:r>
           <w:r>
-            <w:t>15</w:t>
+            <w:t>16</w:t>
           </w:r>
         </w:p>
         <w:p>
@@ -1496,7 +1496,7 @@
             <w:ind w:left="0"/>
           </w:pPr>
           <w:r>
-            <w:t xml:space="preserve">Figure 13. Connect Sensor Guide</w:t>
+            <w:t xml:space="preserve">Figure 13. Settings and Team Admin</w:t>
           </w:r>
           <w:r>
             <w:tab/>
@@ -1514,7 +1514,7 @@
             <w:ind w:left="0"/>
           </w:pPr>
           <w:r>
-            <w:t xml:space="preserve">Figure 14. Add Station</w:t>
+            <w:t xml:space="preserve">Figure 14. Station Settings</w:t>
           </w:r>
           <w:r>
             <w:tab/>
@@ -1532,7 +1532,7 @@
             <w:ind w:left="0"/>
           </w:pPr>
           <w:r>
-            <w:t xml:space="preserve">Figure 15. Station Settings</w:t>
+            <w:t xml:space="preserve">Figure 15. New Station Added</w:t>
           </w:r>
           <w:r>
             <w:tab/>
@@ -2379,7 +2379,7 @@
         <w:jc w:val="both"/>
       </w:pPr>
       <w:r>
-        <w:t xml:space="preserve">Each monitoring station uses a Sensirion SEN55 sensor module, an ESP32 DevKit microcontroller with separate 4G LTE (A7670) and GPS modules, an INA219 power monitor, and a compact solar-charged lithium-ion battery pack (three 18650 cells), all in a small weatherproof unit. Stations transmit data over Wi-Fi, falling back to 4G LTE when Wi-Fi is unavailable, to a backend built with Node.js and PostgreSQL. Users access the data through a mobile-first web application (Progressive Web App) that shows real-time readings, history, station locations on a map, and alerts.</w:t>
+        <w:t xml:space="preserve">Each monitoring station uses a Sensirion SEN55 sensor module, an ESP32 DevKit microcontroller with separate 4G LTE (A7670) and GPS modules, an INA219 power monitor, and a compact solar-charged lithium-ion battery pack (three 18650 cells), all in a small weatherproof unit. Stations transmit data over Wi-Fi, falling back to 4G LTE when Wi-Fi is unavailable, to a backend built with Node.js and PostgreSQL. Users access the data without creating an account through a mobile-first web application (Progressive Web App) that shows real-time readings, history, station locations on a map, and alerts.</w:t>
       </w:r>
     </w:p>
     <w:p>
@@ -4611,7 +4611,7 @@
         <w:t xml:space="preserve">backend server</w:t>
       </w:r>
       <w:r>
-        <w:t xml:space="preserve"> authenticates each station by its secret key, stores the readings, computes the Air Quality Index, opens and resolves alerts, and pushes live updates to connected users. Because particulate matter is measured only once every five minutes, the server keeps the most recent PM measurement as the current value for up to 10 minutes, so the AQI shown in the application stays continuous between measurements and never uses a value older than two measurement cycles; a station that has not uploaded for 5 minutes is shown as offline. (3) The </w:t>
+        <w:t xml:space="preserve"> lets a new station add itself the first time it is switched on (it presents its hardware ID and a team secret built into the firmware and receives its own key, then is named after the barangay at its GPS position), authenticates each station by that key, stores the readings, computes the Air Quality Index, opens and resolves alerts, and pushes live updates to connected users. Because particulate matter is measured only once every five minutes, the server keeps the most recent PM measurement as the current value for up to 10 minutes, so the AQI shown in the application stays continuous between measurements and never uses a value older than two measurement cycles; a station that has not uploaded for 5 minutes is shown as offline. (3) The </w:t>
       </w:r>
       <w:r>
         <w:rPr>
@@ -4621,7 +4621,7 @@
         <w:t xml:space="preserve">GINHAWA application</w:t>
       </w:r>
       <w:r>
-        <w:t xml:space="preserve"> is a mobile-first web application that shows every station on a map and list with its live AQI, history charts, health recommendations, alerts, and the status of each station (battery level, connection, location, and when particles were last measured). Developers (the monitoring personnel) use the same application to register stations, set alert thresholds, and monitor device status.</w:t>
+        <w:t xml:space="preserve"> is a mobile-first web application that shows every station on a map and list with its live AQI, history charts, health recommendations, alerts, and the status of each station (battery level, connection, location, and when particles were last measured). The application needs no account: anyone can open it and see every station. The monitoring personnel sign in with a shared team passcode to rename stations, set alert thresholds, acknowledge alerts, and remove stations.</w:t>
       </w:r>
     </w:p>
     <w:p>
@@ -4728,7 +4728,7 @@
         <w:t xml:space="preserve">(C) Server:</w:t>
       </w:r>
       <w:r>
-        <w:t xml:space="preserve"> the backend runs in Docker containers: Caddy provides HTTPS and serves the application, Node.js with Express provides the REST API and WebSocket hub, and PostgreSQL stores users, stations, readings, and alerts. </w:t>
+        <w:t xml:space="preserve"> the backend runs in Docker containers: Caddy provides HTTPS and serves the application, Node.js with Express provides the REST API and WebSocket hub, and PostgreSQL stores stations, readings, alerts, and blocked devices. </w:t>
       </w:r>
       <w:r>
         <w:rPr>
@@ -4760,7 +4760,7 @@
       <w:r>
         <w:drawing>
           <wp:inline distT="0" distB="0" distL="0" distR="0">
-            <wp:extent cx="5120640" cy="4452197"/>
+            <wp:extent cx="5120640" cy="4134329"/>
             <wp:effectExtent t="0" r="0" b="0" l="0"/>
             <wp:docPr id="1" name="/var/tmp/gbuild/img/f3.png" descr="/var/tmp/gbuild/img/f3.png" title="/var/tmp/gbuild/img/f3.png"/>
             <wp:cNvGraphicFramePr>
@@ -4785,7 +4785,7 @@
                   <pic:spPr bwMode="auto">
                     <a:xfrm>
                       <a:off x="0" y="0"/>
-                      <a:ext cx="5120640" cy="4452197"/>
+                      <a:ext cx="5120640" cy="4134329"/>
                     </a:xfrm>
                     <a:prstGeom prst="rect">
                       <a:avLst/>
@@ -4822,20 +4822,10 @@
           <w:b/>
           <w:bCs/>
         </w:rPr>
-        <w:t xml:space="preserve">USERS</w:t>
-      </w:r>
-      <w:r>
-        <w:t xml:space="preserve"> stores registered accounts (email, name, and hashed password); user roles are assigned by the server from a configured list of developer emails. </w:t>
-      </w:r>
-      <w:r>
-        <w:rPr>
-          <w:b/>
-          <w:bCs/>
-        </w:rPr>
         <w:t xml:space="preserve">STATIONS</w:t>
       </w:r>
       <w:r>
-        <w:t xml:space="preserve"> stores each monitoring station: its name (location, e.g., Barangay Carmen), landmark, GPS latitude and longitude with the time the location was last updated, the hashed station key, per-station alert thresholds for PM2.5, VOC, and NOx, and the time the station was last seen. </w:t>
+        <w:t xml:space="preserve"> stores each monitoring station: the hardware ID of its ESP32 (recorded when the station adds itself), its name (location, e.g., Barangay Carmen) and landmark, whether the name still follows its GPS position, the GPS latitude and longitude with the time the location was last updated, the hashed station key, per-station alert thresholds for PM2.5, VOC, and NOx, and the time the station was last seen. </w:t>
       </w:r>
       <w:r>
         <w:rPr>
@@ -4855,7 +4845,17 @@
         <w:t xml:space="preserve">ALERTS</w:t>
       </w:r>
       <w:r>
-        <w:t xml:space="preserve"> records threshold exceedances with their peak value, start and resolution times, and acknowledgement. One user can add many stations, and each station records many readings and raises many alerts. Fields marked with † support the GPS location and battery monitoring features.</w:t>
+        <w:t xml:space="preserve"> records threshold exceedances with their peak value, start and resolution times, and acknowledgement. Each station records many readings and raises many alerts. </w:t>
+      </w:r>
+      <w:r>
+        <w:rPr>
+          <w:b/>
+          <w:bCs/>
+        </w:rPr>
+        <w:t xml:space="preserve">BLOCKED_DEVICES</w:t>
+      </w:r>
+      <w:r>
+        <w:t xml:space="preserve"> lists the hardware IDs of removed stations that may not add themselves again, such as lost or stolen devices. The database stores no user accounts, because viewing is public and the monitoring personnel sign in with a shared team passcode.</w:t>
       </w:r>
     </w:p>
     <w:p>
@@ -4877,7 +4877,7 @@
       <w:r>
         <w:drawing>
           <wp:inline distT="0" distB="0" distL="0" distR="0">
-            <wp:extent cx="4754880" cy="5342604"/>
+            <wp:extent cx="4754880" cy="5235918"/>
             <wp:effectExtent t="0" r="0" b="0" l="0"/>
             <wp:docPr id="1" name="/var/tmp/gbuild/img/f4.png" descr="/var/tmp/gbuild/img/f4.png" title="/var/tmp/gbuild/img/f4.png"/>
             <wp:cNvGraphicFramePr>
@@ -4902,7 +4902,7 @@
                   <pic:spPr bwMode="auto">
                     <a:xfrm>
                       <a:off x="0" y="0"/>
-                      <a:ext cx="4754880" cy="5342604"/>
+                      <a:ext cx="4754880" cy="5235918"/>
                     </a:xfrm>
                     <a:prstGeom prst="rect">
                       <a:avLst/>
@@ -4942,7 +4942,7 @@
         <w:t xml:space="preserve">General User</w:t>
       </w:r>
       <w:r>
-        <w:t xml:space="preserve"> represents commuters and pedestrians, barangay officials, and environmental staff. General users can log in or register, view the real-time AQI dashboard, view the station map, view station details and history, receive and acknowledge air quality alerts, and export data. The </w:t>
+        <w:t xml:space="preserve"> represents commuters and pedestrians, barangay officials, and environmental staff. General users need no account: they open the application and can view the real-time AQI dashboard, the station map, and station details and history, receive air quality alerts, and export data. The </w:t>
       </w:r>
       <w:r>
         <w:rPr>
@@ -4952,7 +4952,7 @@
         <w:t xml:space="preserve">Monitoring Personnel (Administrator)</w:t>
       </w:r>
       <w:r>
-        <w:t xml:space="preserve"> inherits all general-user use cases and additionally performs the administrative functions: adding, editing, and deleting stations; managing sensor keys; setting alert thresholds; monitoring device status (online/offline, battery, and connectivity); and receiving device error notifications.</w:t>
+        <w:t xml:space="preserve"> inherits all general-user use cases and, after signing in with the team passcode, renames stations and edits their landmarks, sets alert thresholds, acknowledges alerts, removes or blocks stations, monitors device status (online/offline, battery, and connectivity), and receives device error notifications. Adding a station is not a use case of any actor: a station adds itself when it is switched on.</w:t>
       </w:r>
     </w:p>
     <w:p>
@@ -4974,7 +4974,7 @@
       <w:r>
         <w:drawing>
           <wp:inline distT="0" distB="0" distL="0" distR="0">
-            <wp:extent cx="5303520" cy="3792546"/>
+            <wp:extent cx="5303520" cy="3792277"/>
             <wp:effectExtent t="0" r="0" b="0" l="0"/>
             <wp:docPr id="1" name="/var/tmp/gbuild/img/f5.png" descr="/var/tmp/gbuild/img/f5.png" title="/var/tmp/gbuild/img/f5.png"/>
             <wp:cNvGraphicFramePr>
@@ -4999,7 +4999,7 @@
                   <pic:spPr bwMode="auto">
                     <a:xfrm>
                       <a:off x="0" y="0"/>
-                      <a:ext cx="5303520" cy="3792546"/>
+                      <a:ext cx="5303520" cy="3792277"/>
                     </a:xfrm>
                     <a:prstGeom prst="rect">
                       <a:avLst/>
@@ -5039,7 +5039,7 @@
         <w:t xml:space="preserve">Monitoring Station</w:t>
       </w:r>
       <w:r>
-        <w:t xml:space="preserve"> sends sensor readings, GPS location, battery status, and its sensor key, and receives the current AQI level for its status LED. The </w:t>
+        <w:t xml:space="preserve"> sends its hardware ID and the team secret when it is first switched on, then its sensor readings, GPS location, and battery status, and receives its device key and the current AQI level for its status LED. The </w:t>
       </w:r>
       <w:r>
         <w:rPr>
@@ -5049,7 +5049,7 @@
         <w:t xml:space="preserve">General User</w:t>
       </w:r>
       <w:r>
-        <w:t xml:space="preserve"> sends login credentials, view requests, alert acknowledgements, and export requests, and receives real-time AQI, station map and details, alerts, and CSV data. The </w:t>
+        <w:t xml:space="preserve">, who needs no account, sends view and export requests and receives real-time AQI, the station map and details, alerts, and CSV data. The </w:t>
       </w:r>
       <w:r>
         <w:rPr>
@@ -5059,7 +5059,7 @@
         <w:t xml:space="preserve">Administrator</w:t>
       </w:r>
       <w:r>
-        <w:t xml:space="preserve"> sends station details, thresholds, and key rotation requests, and receives device status, error notifications, sensor keys, and reports.</w:t>
+        <w:t xml:space="preserve"> sends the team passcode, station names, thresholds, alert acknowledgements, and remove or block requests, and receives device status, error notifications, and reports.</w:t>
       </w:r>
     </w:p>
     <w:p>
@@ -5081,7 +5081,7 @@
       <w:r>
         <w:drawing>
           <wp:inline distT="0" distB="0" distL="0" distR="0">
-            <wp:extent cx="5486400" cy="4947030"/>
+            <wp:extent cx="5486400" cy="4617787"/>
             <wp:effectExtent t="0" r="0" b="0" l="0"/>
             <wp:docPr id="1" name="/var/tmp/gbuild/img/f6.png" descr="/var/tmp/gbuild/img/f6.png" title="/var/tmp/gbuild/img/f6.png"/>
             <wp:cNvGraphicFramePr>
@@ -5106,7 +5106,7 @@
                   <pic:spPr bwMode="auto">
                     <a:xfrm>
                       <a:off x="0" y="0"/>
-                      <a:ext cx="5486400" cy="4947030"/>
+                      <a:ext cx="5486400" cy="4617787"/>
                     </a:xfrm>
                     <a:prstGeom prst="rect">
                       <a:avLst/>
@@ -5136,17 +5136,17 @@
         <w:jc w:val="both"/>
       </w:pPr>
       <w:r>
-        <w:t xml:space="preserve">Figure 6 presents the Level 1 Data Flow Diagram, which decomposes the system into six processes and four data stores (D1 Users, D2 Stations, D3 Readings, D4 Alerts). </w:t>
+        <w:t xml:space="preserve">Figure 6 presents the Level 1 Data Flow Diagram, which decomposes the system into six processes and four data stores (D1 Blocked Devices, D2 Stations, D3 Readings, D4 Alerts). </w:t>
       </w:r>
       <w:r>
         <w:rPr>
           <w:b/>
           <w:bCs/>
         </w:rPr>
-        <w:t xml:space="preserve">Process 1.0 Authenticate User</w:t>
-      </w:r>
-      <w:r>
-        <w:t xml:space="preserve"> verifies credentials against D1. </w:t>
+        <w:t xml:space="preserve">Process 1.0 Register Station</w:t>
+      </w:r>
+      <w:r>
+        <w:t xml:space="preserve"> receives the hardware ID and team secret of a station that is switched on for the first time, checks that the device is not in D1, creates the station in D2, and returns the station's own device key. </w:t>
       </w:r>
       <w:r>
         <w:rPr>
@@ -5156,7 +5156,7 @@
         <w:t xml:space="preserve">Process 2.0 Manage Stations</w:t>
       </w:r>
       <w:r>
-        <w:t xml:space="preserve"> lets the administrator create or update stations and thresholds in D2 and returns the station's sensor key. </w:t>
+        <w:t xml:space="preserve"> lets the administrator, signed in with the team passcode, rename stations and change thresholds in D2, and remove stations or add their devices to D1. </w:t>
       </w:r>
       <w:r>
         <w:rPr>
@@ -5166,7 +5166,7 @@
         <w:t xml:space="preserve">Process 3.0 Receive and Validate Readings</w:t>
       </w:r>
       <w:r>
-        <w:t xml:space="preserve"> checks the station key against D2, validates the readings, updates the station's location and last-seen time, stores readings in D3, and returns the AQI level to the station. </w:t>
+        <w:t xml:space="preserve"> checks the device key against D2, validates the readings, updates the station's location, GPS-based name, and last-seen time, stores readings in D3, and returns the AQI level to the station. </w:t>
       </w:r>
       <w:r>
         <w:rPr>
@@ -9168,7 +9168,7 @@
         <w:t xml:space="preserve">Scalability.</w:t>
       </w:r>
       <w:r>
-        <w:t xml:space="preserve"> Adding a station does not require any code or server configuration. The administrator registers the new station in the application, which issues a unique secret key; the same firmware is flashed with that key, and when the station starts reporting it appears automatically on the map and station list for all users, with its location filled in by GPS. The database stores readings per station, the API accepts any number of stations, and live updates are broadcast to all connected users, so the system scales to additional stations in Barangay Carmen or other barangays.</w:t>
+        <w:t xml:space="preserve"> Adding a station requires no code, server configuration, or setup in the application. Every station is flashed with the same firmware, which contains the team secret. When a new station is switched on, it sends its ESP32 hardware ID and the team secret to the server, which creates the station and returns a unique key that the station keeps in its memory. Once the GPS has a fix, the server names the station after the barangay at that position using OpenStreetMap reverse geocoding (for example, Barangay Carmen), and two stations in the same barangay are numbered. The station then appears automatically on the map and station list for all users, and if it is moved, its location and name follow. The team can still rename a station, which keeps the typed name, and can remove a station or block a lost or stolen device so that it cannot add itself again. The database stores readings per station, the API accepts any number of stations, and live updates are broadcast to all connected users, so the system scales to additional stations in Barangay Carmen or other barangays.</w:t>
       </w:r>
     </w:p>
     <w:p>
@@ -9573,7 +9573,7 @@
               <w:jc w:val="center"/>
             </w:pPr>
             <w:r>
-              <w:t xml:space="preserve">Figure 13. Connect Sensor Guide</w:t>
+              <w:t xml:space="preserve">Figure 13. Settings and Team Admin</w:t>
             </w:r>
           </w:p>
         </w:tc>
@@ -9639,7 +9639,7 @@
               <w:jc w:val="center"/>
             </w:pPr>
             <w:r>
-              <w:t xml:space="preserve">Figure 14. Add Station</w:t>
+              <w:t xml:space="preserve">Figure 14. Station Settings</w:t>
             </w:r>
           </w:p>
         </w:tc>
@@ -9705,7 +9705,7 @@
               <w:jc w:val="center"/>
             </w:pPr>
             <w:r>
-              <w:t xml:space="preserve">Figure 15. Station Settings</w:t>
+              <w:t xml:space="preserve">Figure 15. New Station Added</w:t>
             </w:r>
           </w:p>
         </w:tc>
@@ -9718,7 +9718,7 @@
         <w:jc w:val="both"/>
       </w:pPr>
       <w:r>
-        <w:t xml:space="preserve">The </w:t>
+        <w:t xml:space="preserve">The application opens directly to the </w:t>
       </w:r>
       <w:r>
         <w:rPr>
@@ -9728,7 +9728,7 @@
         <w:t xml:space="preserve">Stations Dashboard</w:t>
       </w:r>
       <w:r>
-        <w:t xml:space="preserve"> (Figure 10) summarizes the worst air quality right now, the number of stations online, and active alerts, followed by a searchable, sortable list of stations tinted by their AQI level; a station whose sensor has not reported yet is marked "Sensor not connected yet" instead of showing empty values. The </w:t>
+        <w:t xml:space="preserve"> (Figure 10), without any sign-in. It summarizes the worst air quality right now, the number of stations online, and active alerts, followed by a searchable, sortable list of stations tinted by their AQI level; a station that has just added itself and not reported yet is marked "Just added" instead of showing empty values. The </w:t>
       </w:r>
       <w:r>
         <w:rPr>
@@ -9758,7 +9758,7 @@
         <w:t xml:space="preserve">Alerts</w:t>
       </w:r>
       <w:r>
-        <w:t xml:space="preserve"> screen (Figure 12) lists ongoing and past threshold exceedances, which users can acknowledge.</w:t>
+        <w:t xml:space="preserve"> screen (Figure 12) lists ongoing and past threshold exceedances.</w:t>
       </w:r>
     </w:p>
     <w:p>
@@ -9768,27 +9768,27 @@
         <w:jc w:val="both"/>
       </w:pPr>
       <w:r>
-        <w:t xml:space="preserve">Administrators additionally see the screens in Figures 13 to 15. When a station has no readings yet, its page becomes a </w:t>
+        <w:t xml:space="preserve">The </w:t>
       </w:r>
       <w:r>
         <w:rPr>
           <w:b/>
           <w:bCs/>
         </w:rPr>
-        <w:t xml:space="preserve">Connect Sensor Guide</w:t>
-      </w:r>
-      <w:r>
-        <w:t xml:space="preserve"> (Figure 13) with three steps: generate the station's sensor key, flash the firmware, and power the station on. After the key is generated, the guide shows a ready-to-paste firmware configuration and two buttons that test the key from the browser before any hardware is involved: one only checks the key, and the other sends a sample reading so the station appears live. </w:t>
+        <w:t xml:space="preserve">Settings</w:t>
+      </w:r>
+      <w:r>
+        <w:t xml:space="preserve"> screen (Figure 13) holds the appearance options (light, dark, or system theme) and the </w:t>
       </w:r>
       <w:r>
         <w:rPr>
           <w:b/>
           <w:bCs/>
         </w:rPr>
-        <w:t xml:space="preserve">Add Station</w:t>
-      </w:r>
-      <w:r>
-        <w:t xml:space="preserve"> (Figure 14) registers a new station by its location and landmark, and </w:t>
+        <w:t xml:space="preserve">Team admin</w:t>
+      </w:r>
+      <w:r>
+        <w:t xml:space="preserve"> sign-in, where the monitoring personnel enter the shared team passcode. Once signed in, each station shows a settings button and alerts show an Acknowledge button. </w:t>
       </w:r>
       <w:r>
         <w:rPr>
@@ -9798,7 +9798,17 @@
         <w:t xml:space="preserve">Station Settings</w:t>
       </w:r>
       <w:r>
-        <w:t xml:space="preserve"> (Figure 15) edits the station, its alert thresholds for PM2.5, VOC, and NOx, and its sensor key. On computers, the application keeps the same phone layout in a centered column, so it looks the same on every device. The firmware for 4G LTE fallback and GPS positioning has been written and will be bench-tested once the modules are purchased, and the station map view (Section 3.2.11) is part of the next development sprint; the server and application already store and display the station's network, battery, and location. The application supports light, dark, and system themes.</w:t>
+        <w:t xml:space="preserve"> (Figure 14) edits the station's name and landmark, turns naming from its GPS position on or off, sets its alert thresholds for PM2.5, VOC, and NOx, and removes the station or removes it and blocks its device. Figure 15 shows a </w:t>
+      </w:r>
+      <w:r>
+        <w:rPr>
+          <w:b/>
+          <w:bCs/>
+        </w:rPr>
+        <w:t xml:space="preserve">new station</w:t>
+      </w:r>
+      <w:r>
+        <w:t xml:space="preserve"> that has just added itself after being switched on, while it waits for its first reading. On computers, the application keeps the same phone layout in a centered column, so it looks the same on every device. The firmware for 4G LTE fallback and GPS positioning has been written and will be bench-tested once the modules are purchased, and the station map view (Section 3.2.11) is part of the next development sprint; the server and application already store and display the station's network, battery, and location.</w:t>
       </w:r>
     </w:p>
     <w:p>
@@ -12126,7 +12136,7 @@
                 <w:sz w:val="22"/>
                 <w:szCs w:val="22"/>
               </w:rPr>
-              <w:t xml:space="preserve">JSON Web Token (JWT) and bcrypt</w:t>
+              <w:t xml:space="preserve">JSON Web Token (JWT) and OpenStreetMap Nominatim</w:t>
             </w:r>
           </w:p>
         </w:tc>
@@ -12157,7 +12167,7 @@
                 <w:sz w:val="22"/>
                 <w:szCs w:val="22"/>
               </w:rPr>
-              <w:t xml:space="preserve">User authentication and password hashing</w:t>
+              <w:t xml:space="preserve">Team admin sign-in token; naming stations after their barangay from GPS position</w:t>
             </w:r>
           </w:p>
         </w:tc>
@@ -12786,7 +12796,7 @@
         <w:jc w:val="both"/>
       </w:pPr>
       <w:r>
-        <w:t xml:space="preserve">Register the station in the application to obtain its sensor key, and flash the firmware with the key and Wi-Fi credentials.</w:t>
+        <w:t xml:space="preserve">Flash the firmware with the team secret, server address, and Wi-Fi credentials; the station adds itself to the application when it is first switched on.</w:t>
       </w:r>
     </w:p>
     <w:p>
@@ -16648,7 +16658,7 @@
                 <w:sz w:val="22"/>
                 <w:szCs w:val="22"/>
               </w:rPr>
-              <w:t xml:space="preserve">8. Only authorized administrators can add or change stations, and each station uses its own secret key.</w:t>
+              <w:t xml:space="preserve">8. Only the team, signed in with the passcode, can change or remove stations; only devices with the team secret can add a station, and each station then uses its own secret key.</w:t>
             </w:r>
           </w:p>
         </w:tc>
@@ -19804,7 +19814,7 @@
                 <w:sz w:val="22"/>
                 <w:szCs w:val="22"/>
               </w:rPr>
-              <w:t xml:space="preserve">1. Account registration, login, and logout</w:t>
+              <w:t xml:space="preserve">1. Open the application and view all stations without an account</w:t>
             </w:r>
           </w:p>
         </w:tc>
@@ -19888,7 +19898,7 @@
                 <w:sz w:val="22"/>
                 <w:szCs w:val="22"/>
               </w:rPr>
-              <w:t xml:space="preserve">2. Role-based access for administrators and general users</w:t>
+              <w:t xml:space="preserve">2. Team admin sign-in with the passcode; management controls hidden from general users</w:t>
             </w:r>
           </w:p>
         </w:tc>
@@ -20224,7 +20234,7 @@
                 <w:sz w:val="22"/>
                 <w:szCs w:val="22"/>
               </w:rPr>
-              <w:t xml:space="preserve">6. Receive and acknowledge air quality alerts</w:t>
+              <w:t xml:space="preserve">6. Receive air quality alerts; acknowledge alerts (administrator)</w:t>
             </w:r>
           </w:p>
         </w:tc>
@@ -20308,7 +20318,7 @@
                 <w:sz w:val="22"/>
                 <w:szCs w:val="22"/>
               </w:rPr>
-              <w:t xml:space="preserve">7. Add, edit, and delete stations and rotate sensor keys (administrator)</w:t>
+              <w:t xml:space="preserve">7. A new station adds itself when switched on and is named from its GPS position; rename, remove, and block stations (administrator)</w:t>
             </w:r>
           </w:p>
         </w:tc>

</xml_diff>

<commit_message>
Gantt chart: February to November, portrait page like the rest of the paper
Co-Authored-By: Claude Opus 5.5 <noreply@anthropic.com>
Claude-Session: https://claude.ai/code/session_0148MYiEDhLTPmdz34XuceJs
</commit_message>
<xml_diff>
--- a/docs/proposal/GINHAWA_Proposal_Revised.docx
+++ b/docs/proposal/GINHAWA_Proposal_Revised.docx
@@ -46,7 +46,7 @@
                     </pic:cNvPicPr>
                   </pic:nvPicPr>
                   <pic:blipFill>
-                    <a:blip r:embed="rId11" cstate="none"/>
+                    <a:blip r:embed="rId10" cstate="none"/>
                     <a:srcRect/>
                     <a:stretch>
                       <a:fillRect/>
@@ -4365,7 +4365,7 @@
                     </pic:cNvPicPr>
                   </pic:nvPicPr>
                   <pic:blipFill>
-                    <a:blip r:embed="rId12" cstate="none"/>
+                    <a:blip r:embed="rId11" cstate="none"/>
                     <a:srcRect/>
                     <a:stretch>
                       <a:fillRect/>
@@ -4646,6 +4646,123 @@
             <wp:extent cx="4754880" cy="6617475"/>
             <wp:effectExtent t="0" r="0" b="0" l="0"/>
             <wp:docPr id="1" name="/var/tmp/gbuild/img/f2.png" descr="/var/tmp/gbuild/img/f2.png" title="/var/tmp/gbuild/img/f2.png"/>
+            <wp:cNvGraphicFramePr>
+              <a:graphicFrameLocks xmlns:a="http://schemas.openxmlformats.org/drawingml/2006/main" noChangeAspect="1"/>
+            </wp:cNvGraphicFramePr>
+            <a:graphic xmlns:a="http://schemas.openxmlformats.org/drawingml/2006/main">
+              <a:graphicData uri="http://schemas.openxmlformats.org/drawingml/2006/picture">
+                <pic:pic xmlns:pic="http://schemas.openxmlformats.org/drawingml/2006/picture">
+                  <pic:nvPicPr>
+                    <pic:cNvPr id="0" name="" descr=""/>
+                    <pic:cNvPicPr>
+                      <a:picLocks noChangeAspect="1" noChangeArrowheads="1"/>
+                    </pic:cNvPicPr>
+                  </pic:nvPicPr>
+                  <pic:blipFill>
+                    <a:blip r:embed="rId12" cstate="none"/>
+                    <a:srcRect/>
+                    <a:stretch>
+                      <a:fillRect/>
+                    </a:stretch>
+                  </pic:blipFill>
+                  <pic:spPr bwMode="auto">
+                    <a:xfrm>
+                      <a:off x="0" y="0"/>
+                      <a:ext cx="4754880" cy="6617475"/>
+                    </a:xfrm>
+                    <a:prstGeom prst="rect">
+                      <a:avLst/>
+                    </a:prstGeom>
+                  </pic:spPr>
+                </pic:pic>
+              </a:graphicData>
+            </a:graphic>
+          </wp:inline>
+        </w:drawing>
+      </w:r>
+    </w:p>
+    <w:p>
+      <w:pPr>
+        <w:pStyle w:val="FigureCaption"/>
+        <w:spacing w:after="240" w:before="60"/>
+        <w:jc w:val="center"/>
+      </w:pPr>
+      <w:r>
+        <w:t xml:space="preserve">Figure 2. System Architecture Diagram</w:t>
+      </w:r>
+    </w:p>
+    <w:p>
+      <w:pPr>
+        <w:spacing w:after="160" w:line="360"/>
+        <w:ind w:firstLine="720"/>
+        <w:jc w:val="both"/>
+      </w:pPr>
+      <w:r>
+        <w:t xml:space="preserve">Figure 2 shows the deployment architecture of GINHAWA in four layers. </w:t>
+      </w:r>
+      <w:r>
+        <w:rPr>
+          <w:b/>
+          <w:bCs/>
+        </w:rPr>
+        <w:t xml:space="preserve">(A) Monitoring station:</w:t>
+      </w:r>
+      <w:r>
+        <w:t xml:space="preserve"> a small 6 V, 6 W solar panel charges a compact lithium-ion battery pack (three 18650 cells, 3.7 V) through a Li-ion solar charger; the battery is the primary power source and supplies the station day and night through a 3.3 V buck-boost converter and a 5 V boost converter. An ESP32 DevKit microcontroller reads the Sensirion SEN55 sensor over the I²C bus and controls a separate A7670 4G LTE module and a GPS module over serial (UART) connections. </w:t>
+      </w:r>
+      <w:r>
+        <w:rPr>
+          <w:b/>
+          <w:bCs/>
+        </w:rPr>
+        <w:t xml:space="preserve">(B) Connectivity:</w:t>
+      </w:r>
+      <w:r>
+        <w:t xml:space="preserve"> the station uses Wi-Fi when available and automatically falls back to 4G LTE through a registered SIM; readings are sent as JSON over HTTPS to /api/v1/ingest. </w:t>
+      </w:r>
+      <w:r>
+        <w:rPr>
+          <w:b/>
+          <w:bCs/>
+        </w:rPr>
+        <w:t xml:space="preserve">(C) Server:</w:t>
+      </w:r>
+      <w:r>
+        <w:t xml:space="preserve"> the backend runs in Docker containers: Caddy provides HTTPS and serves the application, Node.js with Express provides the REST API and WebSocket hub, and PostgreSQL stores stations, readings, alerts, and blocked devices. </w:t>
+      </w:r>
+      <w:r>
+        <w:rPr>
+          <w:b/>
+          <w:bCs/>
+        </w:rPr>
+        <w:t xml:space="preserve">(D) Clients and users:</w:t>
+      </w:r>
+      <w:r>
+        <w:t xml:space="preserve"> the React application runs on phones (installable as a Progressive Web App) and web browsers, receiving data over HTTPS and live updates over secure WebSocket (WSS).</w:t>
+      </w:r>
+    </w:p>
+    <w:p>
+      <w:pPr>
+        <w:pStyle w:val="Heading3"/>
+        <w:keepNext/>
+        <w:spacing w:after="120" w:before="200"/>
+      </w:pPr>
+      <w:r>
+        <w:t xml:space="preserve">3.2.3 Database Design</w:t>
+      </w:r>
+    </w:p>
+    <w:p>
+      <w:pPr>
+        <w:keepNext/>
+        <w:spacing w:after="60" w:before="120"/>
+        <w:jc w:val="center"/>
+      </w:pPr>
+      <w:r>
+        <w:drawing>
+          <wp:inline distT="0" distB="0" distL="0" distR="0">
+            <wp:extent cx="5120640" cy="4134329"/>
+            <wp:effectExtent t="0" r="0" b="0" l="0"/>
+            <wp:docPr id="1" name="/var/tmp/gbuild/img/f3.png" descr="/var/tmp/gbuild/img/f3.png" title="/var/tmp/gbuild/img/f3.png"/>
             <wp:cNvGraphicFramePr>
               <a:graphicFrameLocks xmlns:a="http://schemas.openxmlformats.org/drawingml/2006/main" noChangeAspect="1"/>
             </wp:cNvGraphicFramePr>
@@ -4668,7 +4785,7 @@
                   <pic:spPr bwMode="auto">
                     <a:xfrm>
                       <a:off x="0" y="0"/>
-                      <a:ext cx="4754880" cy="6617475"/>
+                      <a:ext cx="5120640" cy="4134329"/>
                     </a:xfrm>
                     <a:prstGeom prst="rect">
                       <a:avLst/>
@@ -4688,7 +4805,7 @@
         <w:jc w:val="center"/>
       </w:pPr>
       <w:r>
-        <w:t xml:space="preserve">Figure 2. System Architecture Diagram</w:t>
+        <w:t xml:space="preserve">Figure 3. Entity Relationship Diagram</w:t>
       </w:r>
     </w:p>
     <w:p>
@@ -4698,47 +4815,47 @@
         <w:jc w:val="both"/>
       </w:pPr>
       <w:r>
-        <w:t xml:space="preserve">Figure 2 shows the deployment architecture of GINHAWA in four layers. </w:t>
+        <w:t xml:space="preserve">Figure 3 presents the Entity-Relationship Diagram of the GINHAWA database in crow's-foot notation. </w:t>
       </w:r>
       <w:r>
         <w:rPr>
           <w:b/>
           <w:bCs/>
         </w:rPr>
-        <w:t xml:space="preserve">(A) Monitoring station:</w:t>
-      </w:r>
-      <w:r>
-        <w:t xml:space="preserve"> a small 6 V, 6 W solar panel charges a compact lithium-ion battery pack (three 18650 cells, 3.7 V) through a Li-ion solar charger; the battery is the primary power source and supplies the station day and night through a 3.3 V buck-boost converter and a 5 V boost converter. An ESP32 DevKit microcontroller reads the Sensirion SEN55 sensor over the I²C bus and controls a separate A7670 4G LTE module and a GPS module over serial (UART) connections. </w:t>
+        <w:t xml:space="preserve">STATIONS</w:t>
+      </w:r>
+      <w:r>
+        <w:t xml:space="preserve"> stores each monitoring station: the hardware ID of its ESP32 (recorded when the station adds itself), its name (location, e.g., Barangay Carmen) and landmark, whether the name still follows its GPS position, the GPS latitude and longitude with the time the location was last updated, the hashed station key, per-station alert thresholds for PM2.5, VOC, and NOx, and the time the station was last seen. </w:t>
       </w:r>
       <w:r>
         <w:rPr>
           <w:b/>
           <w:bCs/>
         </w:rPr>
-        <w:t xml:space="preserve">(B) Connectivity:</w:t>
-      </w:r>
-      <w:r>
-        <w:t xml:space="preserve"> the station uses Wi-Fi when available and automatically falls back to 4G LTE through a registered SIM; readings are sent as JSON over HTTPS to /api/v1/ingest. </w:t>
+        <w:t xml:space="preserve">READINGS</w:t>
+      </w:r>
+      <w:r>
+        <w:t xml:space="preserve"> stores the time-series measurements of each station, including PM1.0–PM10, VOC and NOx indices, temperature, humidity, battery voltage and current, and the network used (Wi-Fi or LTE). </w:t>
       </w:r>
       <w:r>
         <w:rPr>
           <w:b/>
           <w:bCs/>
         </w:rPr>
-        <w:t xml:space="preserve">(C) Server:</w:t>
-      </w:r>
-      <w:r>
-        <w:t xml:space="preserve"> the backend runs in Docker containers: Caddy provides HTTPS and serves the application, Node.js with Express provides the REST API and WebSocket hub, and PostgreSQL stores stations, readings, alerts, and blocked devices. </w:t>
+        <w:t xml:space="preserve">ALERTS</w:t>
+      </w:r>
+      <w:r>
+        <w:t xml:space="preserve"> records threshold exceedances with their peak value, start and resolution times, and acknowledgement. Each station records many readings and raises many alerts. </w:t>
       </w:r>
       <w:r>
         <w:rPr>
           <w:b/>
           <w:bCs/>
         </w:rPr>
-        <w:t xml:space="preserve">(D) Clients and users:</w:t>
-      </w:r>
-      <w:r>
-        <w:t xml:space="preserve"> the React application runs on phones (installable as a Progressive Web App) and web browsers, receiving data over HTTPS and live updates over secure WebSocket (WSS).</w:t>
+        <w:t xml:space="preserve">BLOCKED_DEVICES</w:t>
+      </w:r>
+      <w:r>
+        <w:t xml:space="preserve"> lists the hardware IDs of removed stations that may not add themselves again, such as lost or stolen devices. The database stores no user accounts, because viewing is public and the monitoring personnel sign in with a shared team passcode.</w:t>
       </w:r>
     </w:p>
     <w:p>
@@ -4748,7 +4865,7 @@
         <w:spacing w:after="120" w:before="200"/>
       </w:pPr>
       <w:r>
-        <w:t xml:space="preserve">3.2.3 Database Design</w:t>
+        <w:t xml:space="preserve">3.2.4 Use Case Diagram</w:t>
       </w:r>
     </w:p>
     <w:p>
@@ -4760,9 +4877,9 @@
       <w:r>
         <w:drawing>
           <wp:inline distT="0" distB="0" distL="0" distR="0">
-            <wp:extent cx="5120640" cy="4134329"/>
+            <wp:extent cx="4754880" cy="5235918"/>
             <wp:effectExtent t="0" r="0" b="0" l="0"/>
-            <wp:docPr id="1" name="/var/tmp/gbuild/img/f3.png" descr="/var/tmp/gbuild/img/f3.png" title="/var/tmp/gbuild/img/f3.png"/>
+            <wp:docPr id="1" name="/var/tmp/gbuild/img/f4.png" descr="/var/tmp/gbuild/img/f4.png" title="/var/tmp/gbuild/img/f4.png"/>
             <wp:cNvGraphicFramePr>
               <a:graphicFrameLocks xmlns:a="http://schemas.openxmlformats.org/drawingml/2006/main" noChangeAspect="1"/>
             </wp:cNvGraphicFramePr>
@@ -4785,7 +4902,7 @@
                   <pic:spPr bwMode="auto">
                     <a:xfrm>
                       <a:off x="0" y="0"/>
-                      <a:ext cx="5120640" cy="4134329"/>
+                      <a:ext cx="4754880" cy="5235918"/>
                     </a:xfrm>
                     <a:prstGeom prst="rect">
                       <a:avLst/>
@@ -4805,7 +4922,7 @@
         <w:jc w:val="center"/>
       </w:pPr>
       <w:r>
-        <w:t xml:space="preserve">Figure 3. Entity Relationship Diagram</w:t>
+        <w:t xml:space="preserve">Figure 4. Use Case Diagram</w:t>
       </w:r>
     </w:p>
     <w:p>
@@ -4815,47 +4932,27 @@
         <w:jc w:val="both"/>
       </w:pPr>
       <w:r>
-        <w:t xml:space="preserve">Figure 3 presents the Entity-Relationship Diagram of the GINHAWA database in crow's-foot notation. </w:t>
+        <w:t xml:space="preserve">Figure 4 presents the Use Case Diagram of GINHAWA. Only people who directly use the system are shown as actors; hardware and software components such as the monitoring stations, sensors, and backend server are part of the system and are therefore not actors. The </w:t>
       </w:r>
       <w:r>
         <w:rPr>
           <w:b/>
           <w:bCs/>
         </w:rPr>
-        <w:t xml:space="preserve">STATIONS</w:t>
-      </w:r>
-      <w:r>
-        <w:t xml:space="preserve"> stores each monitoring station: the hardware ID of its ESP32 (recorded when the station adds itself), its name (location, e.g., Barangay Carmen) and landmark, whether the name still follows its GPS position, the GPS latitude and longitude with the time the location was last updated, the hashed station key, per-station alert thresholds for PM2.5, VOC, and NOx, and the time the station was last seen. </w:t>
+        <w:t xml:space="preserve">General User</w:t>
+      </w:r>
+      <w:r>
+        <w:t xml:space="preserve"> represents commuters and pedestrians, barangay officials, and environmental staff. General users need no account: they open the application and can view the real-time AQI dashboard, the station map, and station details and history, receive air quality alerts, and export data. The </w:t>
       </w:r>
       <w:r>
         <w:rPr>
           <w:b/>
           <w:bCs/>
         </w:rPr>
-        <w:t xml:space="preserve">READINGS</w:t>
-      </w:r>
-      <w:r>
-        <w:t xml:space="preserve"> stores the time-series measurements of each station, including PM1.0–PM10, VOC and NOx indices, temperature, humidity, battery voltage and current, and the network used (Wi-Fi or LTE). </w:t>
-      </w:r>
-      <w:r>
-        <w:rPr>
-          <w:b/>
-          <w:bCs/>
-        </w:rPr>
-        <w:t xml:space="preserve">ALERTS</w:t>
-      </w:r>
-      <w:r>
-        <w:t xml:space="preserve"> records threshold exceedances with their peak value, start and resolution times, and acknowledgement. Each station records many readings and raises many alerts. </w:t>
-      </w:r>
-      <w:r>
-        <w:rPr>
-          <w:b/>
-          <w:bCs/>
-        </w:rPr>
-        <w:t xml:space="preserve">BLOCKED_DEVICES</w:t>
-      </w:r>
-      <w:r>
-        <w:t xml:space="preserve"> lists the hardware IDs of removed stations that may not add themselves again, such as lost or stolen devices. The database stores no user accounts, because viewing is public and the monitoring personnel sign in with a shared team passcode.</w:t>
+        <w:t xml:space="preserve">Monitoring Personnel (Administrator)</w:t>
+      </w:r>
+      <w:r>
+        <w:t xml:space="preserve"> inherits all general-user use cases and, after signing in with the team passcode, renames stations and edits their landmarks, sets alert thresholds, acknowledges alerts, removes or blocks stations, monitors device status (online/offline, battery, and connectivity), and receives device error notifications. Adding a station is not a use case of any actor: a station adds itself when it is switched on.</w:t>
       </w:r>
     </w:p>
     <w:p>
@@ -4865,7 +4962,7 @@
         <w:spacing w:after="120" w:before="200"/>
       </w:pPr>
       <w:r>
-        <w:t xml:space="preserve">3.2.4 Use Case Diagram</w:t>
+        <w:t xml:space="preserve">3.2.5 Context Diagram</w:t>
       </w:r>
     </w:p>
     <w:p>
@@ -4877,9 +4974,9 @@
       <w:r>
         <w:drawing>
           <wp:inline distT="0" distB="0" distL="0" distR="0">
-            <wp:extent cx="4754880" cy="5235918"/>
+            <wp:extent cx="5303520" cy="3792277"/>
             <wp:effectExtent t="0" r="0" b="0" l="0"/>
-            <wp:docPr id="1" name="/var/tmp/gbuild/img/f4.png" descr="/var/tmp/gbuild/img/f4.png" title="/var/tmp/gbuild/img/f4.png"/>
+            <wp:docPr id="1" name="/var/tmp/gbuild/img/f5.png" descr="/var/tmp/gbuild/img/f5.png" title="/var/tmp/gbuild/img/f5.png"/>
             <wp:cNvGraphicFramePr>
               <a:graphicFrameLocks xmlns:a="http://schemas.openxmlformats.org/drawingml/2006/main" noChangeAspect="1"/>
             </wp:cNvGraphicFramePr>
@@ -4902,7 +4999,7 @@
                   <pic:spPr bwMode="auto">
                     <a:xfrm>
                       <a:off x="0" y="0"/>
-                      <a:ext cx="4754880" cy="5235918"/>
+                      <a:ext cx="5303520" cy="3792277"/>
                     </a:xfrm>
                     <a:prstGeom prst="rect">
                       <a:avLst/>
@@ -4922,7 +5019,7 @@
         <w:jc w:val="center"/>
       </w:pPr>
       <w:r>
-        <w:t xml:space="preserve">Figure 4. Use Case Diagram</w:t>
+        <w:t xml:space="preserve">Figure 5. Context Diagram</w:t>
       </w:r>
     </w:p>
     <w:p>
@@ -4932,7 +5029,17 @@
         <w:jc w:val="both"/>
       </w:pPr>
       <w:r>
-        <w:t xml:space="preserve">Figure 4 presents the Use Case Diagram of GINHAWA. Only people who directly use the system are shown as actors; hardware and software components such as the monitoring stations, sensors, and backend server are part of the system and are therefore not actors. The </w:t>
+        <w:t xml:space="preserve">Figure 5 presents the Context Diagram (Level 0 DFD) of GINHAWA, showing the system as a single process and its data exchanges with three external entities. The </w:t>
+      </w:r>
+      <w:r>
+        <w:rPr>
+          <w:b/>
+          <w:bCs/>
+        </w:rPr>
+        <w:t xml:space="preserve">Monitoring Station</w:t>
+      </w:r>
+      <w:r>
+        <w:t xml:space="preserve"> sends its hardware ID and the team secret when it is first switched on, then its sensor readings, GPS location, and battery status, and receives its device key and the current AQI level for its status LED. The </w:t>
       </w:r>
       <w:r>
         <w:rPr>
@@ -4942,17 +5049,17 @@
         <w:t xml:space="preserve">General User</w:t>
       </w:r>
       <w:r>
-        <w:t xml:space="preserve"> represents commuters and pedestrians, barangay officials, and environmental staff. General users need no account: they open the application and can view the real-time AQI dashboard, the station map, and station details and history, receive air quality alerts, and export data. The </w:t>
+        <w:t xml:space="preserve">, who needs no account, sends view and export requests and receives real-time AQI, the station map and details, alerts, and CSV data. The </w:t>
       </w:r>
       <w:r>
         <w:rPr>
           <w:b/>
           <w:bCs/>
         </w:rPr>
-        <w:t xml:space="preserve">Monitoring Personnel (Administrator)</w:t>
-      </w:r>
-      <w:r>
-        <w:t xml:space="preserve"> inherits all general-user use cases and, after signing in with the team passcode, renames stations and edits their landmarks, sets alert thresholds, acknowledges alerts, removes or blocks stations, monitors device status (online/offline, battery, and connectivity), and receives device error notifications. Adding a station is not a use case of any actor: a station adds itself when it is switched on.</w:t>
+        <w:t xml:space="preserve">Administrator</w:t>
+      </w:r>
+      <w:r>
+        <w:t xml:space="preserve"> sends the team passcode, station names, thresholds, alert acknowledgements, and remove or block requests, and receives device status, error notifications, and reports.</w:t>
       </w:r>
     </w:p>
     <w:p>
@@ -4962,7 +5069,7 @@
         <w:spacing w:after="120" w:before="200"/>
       </w:pPr>
       <w:r>
-        <w:t xml:space="preserve">3.2.5 Context Diagram</w:t>
+        <w:t xml:space="preserve">3.2.6 Data Flow Diagram</w:t>
       </w:r>
     </w:p>
     <w:p>
@@ -4974,9 +5081,9 @@
       <w:r>
         <w:drawing>
           <wp:inline distT="0" distB="0" distL="0" distR="0">
-            <wp:extent cx="5303520" cy="3792277"/>
+            <wp:extent cx="5486400" cy="4617787"/>
             <wp:effectExtent t="0" r="0" b="0" l="0"/>
-            <wp:docPr id="1" name="/var/tmp/gbuild/img/f5.png" descr="/var/tmp/gbuild/img/f5.png" title="/var/tmp/gbuild/img/f5.png"/>
+            <wp:docPr id="1" name="/var/tmp/gbuild/img/f6.png" descr="/var/tmp/gbuild/img/f6.png" title="/var/tmp/gbuild/img/f6.png"/>
             <wp:cNvGraphicFramePr>
               <a:graphicFrameLocks xmlns:a="http://schemas.openxmlformats.org/drawingml/2006/main" noChangeAspect="1"/>
             </wp:cNvGraphicFramePr>
@@ -4999,7 +5106,7 @@
                   <pic:spPr bwMode="auto">
                     <a:xfrm>
                       <a:off x="0" y="0"/>
-                      <a:ext cx="5303520" cy="3792277"/>
+                      <a:ext cx="5486400" cy="4617787"/>
                     </a:xfrm>
                     <a:prstGeom prst="rect">
                       <a:avLst/>
@@ -5019,7 +5126,7 @@
         <w:jc w:val="center"/>
       </w:pPr>
       <w:r>
-        <w:t xml:space="preserve">Figure 5. Context Diagram</w:t>
+        <w:t xml:space="preserve">Figure 6. Level 1 Data Flow Diagram</w:t>
       </w:r>
     </w:p>
     <w:p>
@@ -5029,37 +5136,67 @@
         <w:jc w:val="both"/>
       </w:pPr>
       <w:r>
-        <w:t xml:space="preserve">Figure 5 presents the Context Diagram (Level 0 DFD) of GINHAWA, showing the system as a single process and its data exchanges with three external entities. The </w:t>
+        <w:t xml:space="preserve">Figure 6 presents the Level 1 Data Flow Diagram, which decomposes the system into six processes and four data stores (D1 Blocked Devices, D2 Stations, D3 Readings, D4 Alerts). </w:t>
       </w:r>
       <w:r>
         <w:rPr>
           <w:b/>
           <w:bCs/>
         </w:rPr>
-        <w:t xml:space="preserve">Monitoring Station</w:t>
-      </w:r>
-      <w:r>
-        <w:t xml:space="preserve"> sends its hardware ID and the team secret when it is first switched on, then its sensor readings, GPS location, and battery status, and receives its device key and the current AQI level for its status LED. The </w:t>
+        <w:t xml:space="preserve">Process 1.0 Register Station</w:t>
+      </w:r>
+      <w:r>
+        <w:t xml:space="preserve"> receives the hardware ID and team secret of a station that is switched on for the first time, checks that the device is not in D1, creates the station in D2, and returns the station's own device key. </w:t>
       </w:r>
       <w:r>
         <w:rPr>
           <w:b/>
           <w:bCs/>
         </w:rPr>
-        <w:t xml:space="preserve">General User</w:t>
-      </w:r>
-      <w:r>
-        <w:t xml:space="preserve">, who needs no account, sends view and export requests and receives real-time AQI, the station map and details, alerts, and CSV data. The </w:t>
+        <w:t xml:space="preserve">Process 2.0 Manage Stations</w:t>
+      </w:r>
+      <w:r>
+        <w:t xml:space="preserve"> lets the administrator, signed in with the team passcode, rename stations and change thresholds in D2, and remove stations or add their devices to D1. </w:t>
       </w:r>
       <w:r>
         <w:rPr>
           <w:b/>
           <w:bCs/>
         </w:rPr>
-        <w:t xml:space="preserve">Administrator</w:t>
-      </w:r>
-      <w:r>
-        <w:t xml:space="preserve"> sends the team passcode, station names, thresholds, alert acknowledgements, and remove or block requests, and receives device status, error notifications, and reports.</w:t>
+        <w:t xml:space="preserve">Process 3.0 Receive and Validate Readings</w:t>
+      </w:r>
+      <w:r>
+        <w:t xml:space="preserve"> checks the device key against D2, validates the readings, updates the station's location, GPS-based name, and last-seen time, stores readings in D3, and returns the AQI level to the station. </w:t>
+      </w:r>
+      <w:r>
+        <w:rPr>
+          <w:b/>
+          <w:bCs/>
+        </w:rPr>
+        <w:t xml:space="preserve">Process 4.0 Evaluate AQI and Alerts</w:t>
+      </w:r>
+      <w:r>
+        <w:t xml:space="preserve"> compares new readings with the thresholds in D2, opens or resolves alerts in D4, and sends alert and device-error notifications. </w:t>
+      </w:r>
+      <w:r>
+        <w:rPr>
+          <w:b/>
+          <w:bCs/>
+        </w:rPr>
+        <w:t xml:space="preserve">Process 5.0 Display Live Monitoring and Map</w:t>
+      </w:r>
+      <w:r>
+        <w:t xml:space="preserve"> combines D2, D3, and D4 to deliver live AQI, the station map, and station details to users. </w:t>
+      </w:r>
+      <w:r>
+        <w:rPr>
+          <w:b/>
+          <w:bCs/>
+        </w:rPr>
+        <w:t xml:space="preserve">Process 6.0 Export Data and Reports</w:t>
+      </w:r>
+      <w:r>
+        <w:t xml:space="preserve"> retrieves history from D3 and returns CSV files.</w:t>
       </w:r>
     </w:p>
     <w:p>
@@ -5069,7 +5206,7 @@
         <w:spacing w:after="120" w:before="200"/>
       </w:pPr>
       <w:r>
-        <w:t xml:space="preserve">3.2.6 Data Flow Diagram</w:t>
+        <w:t xml:space="preserve">3.2.7 Hardware Block Diagram</w:t>
       </w:r>
     </w:p>
     <w:p>
@@ -5081,9 +5218,9 @@
       <w:r>
         <w:drawing>
           <wp:inline distT="0" distB="0" distL="0" distR="0">
-            <wp:extent cx="5486400" cy="4617787"/>
+            <wp:extent cx="5120640" cy="5711657"/>
             <wp:effectExtent t="0" r="0" b="0" l="0"/>
-            <wp:docPr id="1" name="/var/tmp/gbuild/img/f6.png" descr="/var/tmp/gbuild/img/f6.png" title="/var/tmp/gbuild/img/f6.png"/>
+            <wp:docPr id="1" name="/var/tmp/gbuild/img/f7.png" descr="/var/tmp/gbuild/img/f7.png" title="/var/tmp/gbuild/img/f7.png"/>
             <wp:cNvGraphicFramePr>
               <a:graphicFrameLocks xmlns:a="http://schemas.openxmlformats.org/drawingml/2006/main" noChangeAspect="1"/>
             </wp:cNvGraphicFramePr>
@@ -5106,143 +5243,6 @@
                   <pic:spPr bwMode="auto">
                     <a:xfrm>
                       <a:off x="0" y="0"/>
-                      <a:ext cx="5486400" cy="4617787"/>
-                    </a:xfrm>
-                    <a:prstGeom prst="rect">
-                      <a:avLst/>
-                    </a:prstGeom>
-                  </pic:spPr>
-                </pic:pic>
-              </a:graphicData>
-            </a:graphic>
-          </wp:inline>
-        </w:drawing>
-      </w:r>
-    </w:p>
-    <w:p>
-      <w:pPr>
-        <w:pStyle w:val="FigureCaption"/>
-        <w:spacing w:after="240" w:before="60"/>
-        <w:jc w:val="center"/>
-      </w:pPr>
-      <w:r>
-        <w:t xml:space="preserve">Figure 6. Level 1 Data Flow Diagram</w:t>
-      </w:r>
-    </w:p>
-    <w:p>
-      <w:pPr>
-        <w:spacing w:after="160" w:line="360"/>
-        <w:ind w:firstLine="720"/>
-        <w:jc w:val="both"/>
-      </w:pPr>
-      <w:r>
-        <w:t xml:space="preserve">Figure 6 presents the Level 1 Data Flow Diagram, which decomposes the system into six processes and four data stores (D1 Blocked Devices, D2 Stations, D3 Readings, D4 Alerts). </w:t>
-      </w:r>
-      <w:r>
-        <w:rPr>
-          <w:b/>
-          <w:bCs/>
-        </w:rPr>
-        <w:t xml:space="preserve">Process 1.0 Register Station</w:t>
-      </w:r>
-      <w:r>
-        <w:t xml:space="preserve"> receives the hardware ID and team secret of a station that is switched on for the first time, checks that the device is not in D1, creates the station in D2, and returns the station's own device key. </w:t>
-      </w:r>
-      <w:r>
-        <w:rPr>
-          <w:b/>
-          <w:bCs/>
-        </w:rPr>
-        <w:t xml:space="preserve">Process 2.0 Manage Stations</w:t>
-      </w:r>
-      <w:r>
-        <w:t xml:space="preserve"> lets the administrator, signed in with the team passcode, rename stations and change thresholds in D2, and remove stations or add their devices to D1. </w:t>
-      </w:r>
-      <w:r>
-        <w:rPr>
-          <w:b/>
-          <w:bCs/>
-        </w:rPr>
-        <w:t xml:space="preserve">Process 3.0 Receive and Validate Readings</w:t>
-      </w:r>
-      <w:r>
-        <w:t xml:space="preserve"> checks the device key against D2, validates the readings, updates the station's location, GPS-based name, and last-seen time, stores readings in D3, and returns the AQI level to the station. </w:t>
-      </w:r>
-      <w:r>
-        <w:rPr>
-          <w:b/>
-          <w:bCs/>
-        </w:rPr>
-        <w:t xml:space="preserve">Process 4.0 Evaluate AQI and Alerts</w:t>
-      </w:r>
-      <w:r>
-        <w:t xml:space="preserve"> compares new readings with the thresholds in D2, opens or resolves alerts in D4, and sends alert and device-error notifications. </w:t>
-      </w:r>
-      <w:r>
-        <w:rPr>
-          <w:b/>
-          <w:bCs/>
-        </w:rPr>
-        <w:t xml:space="preserve">Process 5.0 Display Live Monitoring and Map</w:t>
-      </w:r>
-      <w:r>
-        <w:t xml:space="preserve"> combines D2, D3, and D4 to deliver live AQI, the station map, and station details to users. </w:t>
-      </w:r>
-      <w:r>
-        <w:rPr>
-          <w:b/>
-          <w:bCs/>
-        </w:rPr>
-        <w:t xml:space="preserve">Process 6.0 Export Data and Reports</w:t>
-      </w:r>
-      <w:r>
-        <w:t xml:space="preserve"> retrieves history from D3 and returns CSV files.</w:t>
-      </w:r>
-    </w:p>
-    <w:p>
-      <w:pPr>
-        <w:pStyle w:val="Heading3"/>
-        <w:keepNext/>
-        <w:spacing w:after="120" w:before="200"/>
-      </w:pPr>
-      <w:r>
-        <w:t xml:space="preserve">3.2.7 Hardware Block Diagram</w:t>
-      </w:r>
-    </w:p>
-    <w:p>
-      <w:pPr>
-        <w:keepNext/>
-        <w:spacing w:after="60" w:before="120"/>
-        <w:jc w:val="center"/>
-      </w:pPr>
-      <w:r>
-        <w:drawing>
-          <wp:inline distT="0" distB="0" distL="0" distR="0">
-            <wp:extent cx="5120640" cy="5711657"/>
-            <wp:effectExtent t="0" r="0" b="0" l="0"/>
-            <wp:docPr id="1" name="/var/tmp/gbuild/img/f7.png" descr="/var/tmp/gbuild/img/f7.png" title="/var/tmp/gbuild/img/f7.png"/>
-            <wp:cNvGraphicFramePr>
-              <a:graphicFrameLocks xmlns:a="http://schemas.openxmlformats.org/drawingml/2006/main" noChangeAspect="1"/>
-            </wp:cNvGraphicFramePr>
-            <a:graphic xmlns:a="http://schemas.openxmlformats.org/drawingml/2006/main">
-              <a:graphicData uri="http://schemas.openxmlformats.org/drawingml/2006/picture">
-                <pic:pic xmlns:pic="http://schemas.openxmlformats.org/drawingml/2006/picture">
-                  <pic:nvPicPr>
-                    <pic:cNvPr id="0" name="" descr=""/>
-                    <pic:cNvPicPr>
-                      <a:picLocks noChangeAspect="1" noChangeArrowheads="1"/>
-                    </pic:cNvPicPr>
-                  </pic:nvPicPr>
-                  <pic:blipFill>
-                    <a:blip r:embed="rId18" cstate="none"/>
-                    <a:srcRect/>
-                    <a:stretch>
-                      <a:fillRect/>
-                    </a:stretch>
-                  </pic:blipFill>
-                  <pic:spPr bwMode="auto">
-                    <a:xfrm>
-                      <a:off x="0" y="0"/>
                       <a:ext cx="5120640" cy="5711657"/>
                     </a:xfrm>
                     <a:prstGeom prst="rect">
@@ -5331,7 +5331,7 @@
                     </pic:cNvPicPr>
                   </pic:nvPicPr>
                   <pic:blipFill>
-                    <a:blip r:embed="rId19" cstate="none"/>
+                    <a:blip r:embed="rId18" cstate="none"/>
                     <a:srcRect/>
                     <a:stretch>
                       <a:fillRect/>
@@ -9206,7 +9206,7 @@
                     </pic:cNvPicPr>
                   </pic:nvPicPr>
                   <pic:blipFill>
-                    <a:blip r:embed="rId20" cstate="none"/>
+                    <a:blip r:embed="rId19" cstate="none"/>
                     <a:srcRect/>
                     <a:stretch>
                       <a:fillRect/>
@@ -9307,6 +9307,72 @@
                   <wp:extent cx="1691640" cy="3660882"/>
                   <wp:effectExtent t="0" r="0" b="0" l="0"/>
                   <wp:docPr id="1" name="/var/tmp/gbuild/img/ui1.png" descr="/var/tmp/gbuild/img/ui1.png" title="/var/tmp/gbuild/img/ui1.png"/>
+                  <wp:cNvGraphicFramePr>
+                    <a:graphicFrameLocks xmlns:a="http://schemas.openxmlformats.org/drawingml/2006/main" noChangeAspect="1"/>
+                  </wp:cNvGraphicFramePr>
+                  <a:graphic xmlns:a="http://schemas.openxmlformats.org/drawingml/2006/main">
+                    <a:graphicData uri="http://schemas.openxmlformats.org/drawingml/2006/picture">
+                      <pic:pic xmlns:pic="http://schemas.openxmlformats.org/drawingml/2006/picture">
+                        <pic:nvPicPr>
+                          <pic:cNvPr id="0" name="" descr=""/>
+                          <pic:cNvPicPr>
+                            <a:picLocks noChangeAspect="1" noChangeArrowheads="1"/>
+                          </pic:cNvPicPr>
+                        </pic:nvPicPr>
+                        <pic:blipFill>
+                          <a:blip r:embed="rId20" cstate="none"/>
+                          <a:srcRect/>
+                          <a:stretch>
+                            <a:fillRect/>
+                          </a:stretch>
+                        </pic:blipFill>
+                        <pic:spPr bwMode="auto">
+                          <a:xfrm>
+                            <a:off x="0" y="0"/>
+                            <a:ext cx="1691640" cy="3660882"/>
+                          </a:xfrm>
+                          <a:prstGeom prst="rect">
+                            <a:avLst/>
+                          </a:prstGeom>
+                        </pic:spPr>
+                      </pic:pic>
+                    </a:graphicData>
+                  </a:graphic>
+                </wp:inline>
+              </w:drawing>
+            </w:r>
+          </w:p>
+          <w:p>
+            <w:pPr>
+              <w:pStyle w:val="FigureCaption"/>
+              <w:spacing w:after="240" w:before="60"/>
+              <w:jc w:val="center"/>
+            </w:pPr>
+            <w:r>
+              <w:t xml:space="preserve">Figure 10. Stations Dashboard</w:t>
+            </w:r>
+          </w:p>
+        </w:tc>
+        <w:tc>
+          <w:tcPr>
+            <w:tcW w:type="dxa" w:w="2880"/>
+            <w:tcBorders>
+              <w:top w:val="none" w:color="FFFFFF" w:sz="0"/>
+              <w:left w:val="none" w:color="FFFFFF" w:sz="0"/>
+              <w:bottom w:val="none" w:color="FFFFFF" w:sz="0"/>
+              <w:right w:val="none" w:color="FFFFFF" w:sz="0"/>
+            </w:tcBorders>
+          </w:tcPr>
+          <w:p>
+            <w:pPr>
+              <w:jc w:val="center"/>
+            </w:pPr>
+            <w:r>
+              <w:drawing>
+                <wp:inline distT="0" distB="0" distL="0" distR="0">
+                  <wp:extent cx="1691640" cy="3660882"/>
+                  <wp:effectExtent t="0" r="0" b="0" l="0"/>
+                  <wp:docPr id="1" name="/var/tmp/gbuild/img/ui2.png" descr="/var/tmp/gbuild/img/ui2.png" title="/var/tmp/gbuild/img/ui2.png"/>
                   <wp:cNvGraphicFramePr>
                     <a:graphicFrameLocks xmlns:a="http://schemas.openxmlformats.org/drawingml/2006/main" noChangeAspect="1"/>
                   </wp:cNvGraphicFramePr>
@@ -9349,7 +9415,7 @@
               <w:jc w:val="center"/>
             </w:pPr>
             <w:r>
-              <w:t xml:space="preserve">Figure 10. Stations Dashboard</w:t>
+              <w:t xml:space="preserve">Figure 11. Station Details</w:t>
             </w:r>
           </w:p>
         </w:tc>
@@ -9372,7 +9438,7 @@
                 <wp:inline distT="0" distB="0" distL="0" distR="0">
                   <wp:extent cx="1691640" cy="3660882"/>
                   <wp:effectExtent t="0" r="0" b="0" l="0"/>
-                  <wp:docPr id="1" name="/var/tmp/gbuild/img/ui2.png" descr="/var/tmp/gbuild/img/ui2.png" title="/var/tmp/gbuild/img/ui2.png"/>
+                  <wp:docPr id="1" name="/var/tmp/gbuild/img/ui3.png" descr="/var/tmp/gbuild/img/ui3.png" title="/var/tmp/gbuild/img/ui3.png"/>
                   <wp:cNvGraphicFramePr>
                     <a:graphicFrameLocks xmlns:a="http://schemas.openxmlformats.org/drawingml/2006/main" noChangeAspect="1"/>
                   </wp:cNvGraphicFramePr>
@@ -9415,10 +9481,36 @@
               <w:jc w:val="center"/>
             </w:pPr>
             <w:r>
-              <w:t xml:space="preserve">Figure 11. Station Details</w:t>
-            </w:r>
-          </w:p>
-        </w:tc>
+              <w:t xml:space="preserve">Figure 12. Alerts</w:t>
+            </w:r>
+          </w:p>
+        </w:tc>
+      </w:tr>
+    </w:tbl>
+    <w:p>
+      <w:pPr>
+        <w:spacing w:after="120"/>
+      </w:pPr>
+    </w:p>
+    <w:tbl>
+      <w:tblPr>
+        <w:tblW w:type="dxa" w:w="8640"/>
+        <w:tblBorders>
+          <w:top w:val="single" w:color="auto" w:sz="4"/>
+          <w:left w:val="single" w:color="auto" w:sz="4"/>
+          <w:bottom w:val="single" w:color="auto" w:sz="4"/>
+          <w:right w:val="single" w:color="auto" w:sz="4"/>
+          <w:insideH w:val="single" w:color="auto" w:sz="4"/>
+          <w:insideV w:val="single" w:color="auto" w:sz="4"/>
+        </w:tblBorders>
+        <w:tblLayout w:type="fixed"/>
+      </w:tblPr>
+      <w:tblGrid>
+        <w:gridCol w:w="2880"/>
+        <w:gridCol w:w="2880"/>
+        <w:gridCol w:w="2880"/>
+      </w:tblGrid>
+      <w:tr>
         <w:tc>
           <w:tcPr>
             <w:tcW w:type="dxa" w:w="2880"/>
@@ -9438,7 +9530,7 @@
                 <wp:inline distT="0" distB="0" distL="0" distR="0">
                   <wp:extent cx="1691640" cy="3660882"/>
                   <wp:effectExtent t="0" r="0" b="0" l="0"/>
-                  <wp:docPr id="1" name="/var/tmp/gbuild/img/ui3.png" descr="/var/tmp/gbuild/img/ui3.png" title="/var/tmp/gbuild/img/ui3.png"/>
+                  <wp:docPr id="1" name="/var/tmp/gbuild/img/ui4.png" descr="/var/tmp/gbuild/img/ui4.png" title="/var/tmp/gbuild/img/ui4.png"/>
                   <wp:cNvGraphicFramePr>
                     <a:graphicFrameLocks xmlns:a="http://schemas.openxmlformats.org/drawingml/2006/main" noChangeAspect="1"/>
                   </wp:cNvGraphicFramePr>
@@ -9481,36 +9573,10 @@
               <w:jc w:val="center"/>
             </w:pPr>
             <w:r>
-              <w:t xml:space="preserve">Figure 12. Alerts</w:t>
-            </w:r>
-          </w:p>
-        </w:tc>
-      </w:tr>
-    </w:tbl>
-    <w:p>
-      <w:pPr>
-        <w:spacing w:after="120"/>
-      </w:pPr>
-    </w:p>
-    <w:tbl>
-      <w:tblPr>
-        <w:tblW w:type="dxa" w:w="8640"/>
-        <w:tblBorders>
-          <w:top w:val="single" w:color="auto" w:sz="4"/>
-          <w:left w:val="single" w:color="auto" w:sz="4"/>
-          <w:bottom w:val="single" w:color="auto" w:sz="4"/>
-          <w:right w:val="single" w:color="auto" w:sz="4"/>
-          <w:insideH w:val="single" w:color="auto" w:sz="4"/>
-          <w:insideV w:val="single" w:color="auto" w:sz="4"/>
-        </w:tblBorders>
-        <w:tblLayout w:type="fixed"/>
-      </w:tblPr>
-      <w:tblGrid>
-        <w:gridCol w:w="2880"/>
-        <w:gridCol w:w="2880"/>
-        <w:gridCol w:w="2880"/>
-      </w:tblGrid>
-      <w:tr>
+              <w:t xml:space="preserve">Figure 13. Settings and Team Admin</w:t>
+            </w:r>
+          </w:p>
+        </w:tc>
         <w:tc>
           <w:tcPr>
             <w:tcW w:type="dxa" w:w="2880"/>
@@ -9530,7 +9596,7 @@
                 <wp:inline distT="0" distB="0" distL="0" distR="0">
                   <wp:extent cx="1691640" cy="3660882"/>
                   <wp:effectExtent t="0" r="0" b="0" l="0"/>
-                  <wp:docPr id="1" name="/var/tmp/gbuild/img/ui4.png" descr="/var/tmp/gbuild/img/ui4.png" title="/var/tmp/gbuild/img/ui4.png"/>
+                  <wp:docPr id="1" name="/var/tmp/gbuild/img/ui5.png" descr="/var/tmp/gbuild/img/ui5.png" title="/var/tmp/gbuild/img/ui5.png"/>
                   <wp:cNvGraphicFramePr>
                     <a:graphicFrameLocks xmlns:a="http://schemas.openxmlformats.org/drawingml/2006/main" noChangeAspect="1"/>
                   </wp:cNvGraphicFramePr>
@@ -9573,7 +9639,7 @@
               <w:jc w:val="center"/>
             </w:pPr>
             <w:r>
-              <w:t xml:space="preserve">Figure 13. Settings and Team Admin</w:t>
+              <w:t xml:space="preserve">Figure 14. Station Settings</w:t>
             </w:r>
           </w:p>
         </w:tc>
@@ -9596,7 +9662,7 @@
                 <wp:inline distT="0" distB="0" distL="0" distR="0">
                   <wp:extent cx="1691640" cy="3660882"/>
                   <wp:effectExtent t="0" r="0" b="0" l="0"/>
-                  <wp:docPr id="1" name="/var/tmp/gbuild/img/ui5.png" descr="/var/tmp/gbuild/img/ui5.png" title="/var/tmp/gbuild/img/ui5.png"/>
+                  <wp:docPr id="1" name="/var/tmp/gbuild/img/ui6.png" descr="/var/tmp/gbuild/img/ui6.png" title="/var/tmp/gbuild/img/ui6.png"/>
                   <wp:cNvGraphicFramePr>
                     <a:graphicFrameLocks xmlns:a="http://schemas.openxmlformats.org/drawingml/2006/main" noChangeAspect="1"/>
                   </wp:cNvGraphicFramePr>
@@ -9639,72 +9705,6 @@
               <w:jc w:val="center"/>
             </w:pPr>
             <w:r>
-              <w:t xml:space="preserve">Figure 14. Station Settings</w:t>
-            </w:r>
-          </w:p>
-        </w:tc>
-        <w:tc>
-          <w:tcPr>
-            <w:tcW w:type="dxa" w:w="2880"/>
-            <w:tcBorders>
-              <w:top w:val="none" w:color="FFFFFF" w:sz="0"/>
-              <w:left w:val="none" w:color="FFFFFF" w:sz="0"/>
-              <w:bottom w:val="none" w:color="FFFFFF" w:sz="0"/>
-              <w:right w:val="none" w:color="FFFFFF" w:sz="0"/>
-            </w:tcBorders>
-          </w:tcPr>
-          <w:p>
-            <w:pPr>
-              <w:jc w:val="center"/>
-            </w:pPr>
-            <w:r>
-              <w:drawing>
-                <wp:inline distT="0" distB="0" distL="0" distR="0">
-                  <wp:extent cx="1691640" cy="3660882"/>
-                  <wp:effectExtent t="0" r="0" b="0" l="0"/>
-                  <wp:docPr id="1" name="/var/tmp/gbuild/img/ui6.png" descr="/var/tmp/gbuild/img/ui6.png" title="/var/tmp/gbuild/img/ui6.png"/>
-                  <wp:cNvGraphicFramePr>
-                    <a:graphicFrameLocks xmlns:a="http://schemas.openxmlformats.org/drawingml/2006/main" noChangeAspect="1"/>
-                  </wp:cNvGraphicFramePr>
-                  <a:graphic xmlns:a="http://schemas.openxmlformats.org/drawingml/2006/main">
-                    <a:graphicData uri="http://schemas.openxmlformats.org/drawingml/2006/picture">
-                      <pic:pic xmlns:pic="http://schemas.openxmlformats.org/drawingml/2006/picture">
-                        <pic:nvPicPr>
-                          <pic:cNvPr id="0" name="" descr=""/>
-                          <pic:cNvPicPr>
-                            <a:picLocks noChangeAspect="1" noChangeArrowheads="1"/>
-                          </pic:cNvPicPr>
-                        </pic:nvPicPr>
-                        <pic:blipFill>
-                          <a:blip r:embed="rId26" cstate="none"/>
-                          <a:srcRect/>
-                          <a:stretch>
-                            <a:fillRect/>
-                          </a:stretch>
-                        </pic:blipFill>
-                        <pic:spPr bwMode="auto">
-                          <a:xfrm>
-                            <a:off x="0" y="0"/>
-                            <a:ext cx="1691640" cy="3660882"/>
-                          </a:xfrm>
-                          <a:prstGeom prst="rect">
-                            <a:avLst/>
-                          </a:prstGeom>
-                        </pic:spPr>
-                      </pic:pic>
-                    </a:graphicData>
-                  </a:graphic>
-                </wp:inline>
-              </w:drawing>
-            </w:r>
-          </w:p>
-          <w:p>
-            <w:pPr>
-              <w:pStyle w:val="FigureCaption"/>
-              <w:spacing w:after="240" w:before="60"/>
-              <w:jc w:val="center"/>
-            </w:pPr>
-            <w:r>
               <w:t xml:space="preserve">Figure 15. New Station Added</w:t>
             </w:r>
           </w:p>
@@ -22552,18 +22552,6 @@
     </w:p>
     <w:p>
       <w:pPr>
-        <w:sectPr>
-          <w:footerReference w:type="default" r:id="rId8"/>
-          <w:type w:val="nextPage"/>
-          <w:pgSz w:w="12240" w:h="15840" w:orient="portrait"/>
-          <w:pgMar w:top="1440" w:right="1440" w:bottom="1440" w:left="2160" w:header="708" w:footer="708" w:gutter="0"/>
-          <w:pgNumType w:start="1" w:fmt="decimal"/>
-          <w:docGrid w:linePitch="360"/>
-        </w:sectPr>
-      </w:pPr>
-    </w:p>
-    <w:p>
-      <w:pPr>
         <w:pStyle w:val="Heading2"/>
         <w:keepNext/>
         <w:spacing w:after="120" w:before="240"/>
@@ -22581,7 +22569,7 @@
       <w:r>
         <w:drawing>
           <wp:inline distT="0" distB="0" distL="0" distR="0">
-            <wp:extent cx="7772400" cy="2853581"/>
+            <wp:extent cx="5486400" cy="3957138"/>
             <wp:effectExtent t="0" r="0" b="0" l="0"/>
             <wp:docPr id="1" name="/var/tmp/gbuild/img/gantt_new.png" descr="/var/tmp/gbuild/img/gantt_new.png" title="/var/tmp/gbuild/img/gantt_new.png"/>
             <wp:cNvGraphicFramePr>
@@ -22597,7 +22585,7 @@
                     </pic:cNvPicPr>
                   </pic:nvPicPr>
                   <pic:blipFill>
-                    <a:blip r:embed="rId27" cstate="none"/>
+                    <a:blip r:embed="rId26" cstate="none"/>
                     <a:srcRect/>
                     <a:stretch>
                       <a:fillRect/>
@@ -22606,7 +22594,7 @@
                   <pic:spPr bwMode="auto">
                     <a:xfrm>
                       <a:off x="0" y="0"/>
-                      <a:ext cx="7772400" cy="2853581"/>
+                      <a:ext cx="5486400" cy="3957138"/>
                     </a:xfrm>
                     <a:prstGeom prst="rect">
                       <a:avLst/>
@@ -22636,7 +22624,7 @@
         <w:jc w:val="both"/>
       </w:pPr>
       <w:r>
-        <w:t xml:space="preserve">Figure 16 shows the schedule of project activities from requirements gathering in February 2026 to the final defense in December 2026, including the barangay coordination, laboratory and outdoor testing, and the 30-day pilot deployment added after the proposal defense. </w:t>
+        <w:t xml:space="preserve">Figure 16 shows the schedule of project activities from requirements gathering in February 2026 to the final defense in November 2026, including the barangay coordination, laboratory and outdoor testing, and the 30-day pilot deployment added after the proposal defense. </w:t>
       </w:r>
       <w:r>
         <w:rPr>
@@ -22648,11 +22636,11 @@
     <w:p>
       <w:pPr>
         <w:sectPr>
-          <w:footerReference w:type="default" r:id="rId9"/>
+          <w:footerReference w:type="default" r:id="rId8"/>
           <w:type w:val="nextPage"/>
-          <w:pgSz w:w="15840" w:h="12240" w:orient="landscape"/>
-          <w:pgMar w:top="1440" w:right="1440" w:bottom="1440" w:left="1440" w:header="708" w:footer="708" w:gutter="0"/>
-          <w:pgNumType/>
+          <w:pgSz w:w="12240" w:h="15840" w:orient="portrait"/>
+          <w:pgMar w:top="1440" w:right="1440" w:bottom="1440" w:left="2160" w:header="708" w:footer="708" w:gutter="0"/>
+          <w:pgNumType w:start="1" w:fmt="decimal"/>
           <w:docGrid w:linePitch="360"/>
         </w:sectPr>
       </w:pPr>
@@ -23018,7 +23006,7 @@
       </w:r>
     </w:p>
     <w:sectPr>
-      <w:footerReference w:type="default" r:id="rId10"/>
+      <w:footerReference w:type="default" r:id="rId9"/>
       <w:type w:val="nextPage"/>
       <w:pgSz w:w="12240" w:h="15840" w:orient="portrait"/>
       <w:pgMar w:top="1440" w:right="1440" w:bottom="1440" w:left="2160" w:header="708" w:footer="708" w:gutter="0"/>
@@ -23103,22 +23091,6 @@
 </file>
 
 <file path=word/footer3.xml><?xml version="1.0" encoding="utf-8"?>
-<w:ftr xmlns:wpc="http://schemas.microsoft.com/office/word/2010/wordprocessingCanvas" xmlns:mc="http://schemas.openxmlformats.org/markup-compatibility/2006" xmlns:o="urn:schemas-microsoft-com:office:office" xmlns:r="http://schemas.openxmlformats.org/officeDocument/2006/relationships" xmlns:m="http://schemas.openxmlformats.org/officeDocument/2006/math" xmlns:v="urn:schemas-microsoft-com:vml" xmlns:wp14="http://schemas.microsoft.com/office/word/2010/wordprocessingDrawing" xmlns:wp="http://schemas.openxmlformats.org/drawingml/2006/wordprocessingDrawing" xmlns:w10="urn:schemas-microsoft-com:office:word" xmlns:w="http://schemas.openxmlformats.org/wordprocessingml/2006/main" xmlns:w14="http://schemas.microsoft.com/office/word/2010/wordml" xmlns:w15="http://schemas.microsoft.com/office/word/2012/wordml" xmlns:wpg="http://schemas.microsoft.com/office/word/2010/wordprocessingGroup" xmlns:wpi="http://schemas.microsoft.com/office/word/2010/wordprocessingInk" xmlns:wne="http://schemas.microsoft.com/office/word/2006/wordml" xmlns:wps="http://schemas.microsoft.com/office/word/2010/wordprocessingShape">
-  <w:p>
-    <w:pPr>
-      <w:jc w:val="center"/>
-    </w:pPr>
-    <w:r>
-      <w:fldChar w:fldCharType="begin"/>
-      <w:instrText xml:space="preserve">PAGE</w:instrText>
-      <w:fldChar w:fldCharType="separate"/>
-      <w:fldChar w:fldCharType="end"/>
-    </w:r>
-  </w:p>
-</w:ftr>
-</file>
-
-<file path=word/footer4.xml><?xml version="1.0" encoding="utf-8"?>
 <w:ftr xmlns:wpc="http://schemas.microsoft.com/office/word/2010/wordprocessingCanvas" xmlns:mc="http://schemas.openxmlformats.org/markup-compatibility/2006" xmlns:o="urn:schemas-microsoft-com:office:office" xmlns:r="http://schemas.openxmlformats.org/officeDocument/2006/relationships" xmlns:m="http://schemas.openxmlformats.org/officeDocument/2006/math" xmlns:v="urn:schemas-microsoft-com:vml" xmlns:wp14="http://schemas.microsoft.com/office/word/2010/wordprocessingDrawing" xmlns:wp="http://schemas.openxmlformats.org/drawingml/2006/wordprocessingDrawing" xmlns:w10="urn:schemas-microsoft-com:office:word" xmlns:w="http://schemas.openxmlformats.org/wordprocessingml/2006/main" xmlns:w14="http://schemas.microsoft.com/office/word/2010/wordml" xmlns:w15="http://schemas.microsoft.com/office/word/2012/wordml" xmlns:wpg="http://schemas.microsoft.com/office/word/2010/wordprocessingGroup" xmlns:wpi="http://schemas.microsoft.com/office/word/2010/wordprocessingInk" xmlns:wne="http://schemas.microsoft.com/office/word/2006/wordml" xmlns:wps="http://schemas.microsoft.com/office/word/2010/wordprocessingShape">
   <w:p>
     <w:pPr>

</xml_diff>

<commit_message>
Small admin login: link in Settings opens a separate login screen
Settings no longer shows a passcode box. A small "Admin login" link at
the bottom opens /admin, where the team enters the shared passcode;
after logging in, Settings shows an Admin section with Log out.
Proposal, use case diagram, Summary of Revisions and README updated
(Figures 13-15: Settings, Admin Login, Station Settings).

Co-Authored-By: Claude Opus 5.5 <noreply@anthropic.com>
Claude-Session: https://claude.ai/code/session_0148MYiEDhLTPmdz34XuceJs
</commit_message>
<xml_diff>
--- a/docs/proposal/GINHAWA_Proposal_Revised.docx
+++ b/docs/proposal/GINHAWA_Proposal_Revised.docx
@@ -1123,7 +1123,7 @@
             <w:tab/>
           </w:r>
           <w:r>
-            <w:t>35</w:t>
+            <w:t>36</w:t>
           </w:r>
         </w:p>
         <w:p>
@@ -1496,7 +1496,7 @@
             <w:ind w:left="0"/>
           </w:pPr>
           <w:r>
-            <w:t xml:space="preserve">Figure 13. Settings and Team Admin</w:t>
+            <w:t xml:space="preserve">Figure 13. Settings</w:t>
           </w:r>
           <w:r>
             <w:tab/>
@@ -1514,7 +1514,7 @@
             <w:ind w:left="0"/>
           </w:pPr>
           <w:r>
-            <w:t xml:space="preserve">Figure 14. Station Settings</w:t>
+            <w:t xml:space="preserve">Figure 14. Admin Login</w:t>
           </w:r>
           <w:r>
             <w:tab/>
@@ -1532,7 +1532,7 @@
             <w:ind w:left="0"/>
           </w:pPr>
           <w:r>
-            <w:t xml:space="preserve">Figure 15. New Station Added</w:t>
+            <w:t xml:space="preserve">Figure 15. Station Settings</w:t>
           </w:r>
           <w:r>
             <w:tab/>
@@ -1737,7 +1737,7 @@
             <w:tab/>
           </w:r>
           <w:r>
-            <w:t>33</w:t>
+            <w:t>34</w:t>
           </w:r>
         </w:p>
         <w:p>
@@ -1791,7 +1791,7 @@
             <w:tab/>
           </w:r>
           <w:r>
-            <w:t>36</w:t>
+            <w:t>37</w:t>
           </w:r>
         </w:p>
         <w:p>
@@ -4621,7 +4621,7 @@
         <w:t xml:space="preserve">GINHAWA application</w:t>
       </w:r>
       <w:r>
-        <w:t xml:space="preserve"> is a mobile-first web application that shows every station on a map and list with its live AQI, history charts, health recommendations, alerts, and the status of each station (battery level, connection, location, and when particles were last measured). The application needs no account: anyone can open it and see every station. The monitoring personnel sign in with a shared team passcode to rename stations, set alert thresholds, acknowledge alerts, and remove stations.</w:t>
+        <w:t xml:space="preserve"> is a mobile-first web application that shows every station on a map and list with its live AQI, history charts, health recommendations, alerts, and the status of each station (battery level, connection, location, and when particles were last measured). The application needs no account: anyone can open it and see every station. A small Admin login option lets the monitoring personnel log in with a shared team passcode to rename stations, set alert thresholds, acknowledge alerts, and remove stations.</w:t>
       </w:r>
     </w:p>
     <w:p>
@@ -4855,7 +4855,7 @@
         <w:t xml:space="preserve">BLOCKED_DEVICES</w:t>
       </w:r>
       <w:r>
-        <w:t xml:space="preserve"> lists the hardware IDs of removed stations that may not add themselves again, such as lost or stolen devices. The database stores no user accounts, because viewing is public and the monitoring personnel sign in with a shared team passcode.</w:t>
+        <w:t xml:space="preserve"> lists the hardware IDs of removed stations that may not add themselves again, such as lost or stolen devices. The database stores no user accounts, because viewing is public and the monitoring personnel log in as admin with a shared team passcode.</w:t>
       </w:r>
     </w:p>
     <w:p>
@@ -4952,7 +4952,7 @@
         <w:t xml:space="preserve">Monitoring Personnel (Administrator)</w:t>
       </w:r>
       <w:r>
-        <w:t xml:space="preserve"> inherits all general-user use cases and, after signing in with the team passcode, renames stations and edits their landmarks, sets alert thresholds, acknowledges alerts, removes or blocks stations, monitors device status (online/offline, battery, and connectivity), and receives device error notifications. Adding a station is not a use case of any actor: a station adds itself when it is switched on.</w:t>
+        <w:t xml:space="preserve"> inherits all general-user use cases and, after logging in as admin with the team passcode, renames stations and edits their landmarks, sets alert thresholds, acknowledges alerts, removes or blocks stations, monitors device status (online/offline, battery, and connectivity), and receives device error notifications. Adding a station is not a use case of any actor: a station adds itself when it is switched on.</w:t>
       </w:r>
     </w:p>
     <w:p>
@@ -5156,7 +5156,7 @@
         <w:t xml:space="preserve">Process 2.0 Manage Stations</w:t>
       </w:r>
       <w:r>
-        <w:t xml:space="preserve"> lets the administrator, signed in with the team passcode, rename stations and change thresholds in D2, and remove stations or add their devices to D1. </w:t>
+        <w:t xml:space="preserve"> lets the administrator, logged in with the team passcode, rename stations and change thresholds in D2, and remove stations or add their devices to D1. </w:t>
       </w:r>
       <w:r>
         <w:rPr>
@@ -9573,7 +9573,7 @@
               <w:jc w:val="center"/>
             </w:pPr>
             <w:r>
-              <w:t xml:space="preserve">Figure 13. Settings and Team Admin</w:t>
+              <w:t xml:space="preserve">Figure 13. Settings</w:t>
             </w:r>
           </w:p>
         </w:tc>
@@ -9639,7 +9639,7 @@
               <w:jc w:val="center"/>
             </w:pPr>
             <w:r>
-              <w:t xml:space="preserve">Figure 14. Station Settings</w:t>
+              <w:t xml:space="preserve">Figure 14. Admin Login</w:t>
             </w:r>
           </w:p>
         </w:tc>
@@ -9705,7 +9705,7 @@
               <w:jc w:val="center"/>
             </w:pPr>
             <w:r>
-              <w:t xml:space="preserve">Figure 15. New Station Added</w:t>
+              <w:t xml:space="preserve">Figure 15. Station Settings</w:t>
             </w:r>
           </w:p>
         </w:tc>
@@ -9778,17 +9778,27 @@
         <w:t xml:space="preserve">Settings</w:t>
       </w:r>
       <w:r>
-        <w:t xml:space="preserve"> screen (Figure 13) holds the appearance options (light, dark, or system theme) and the </w:t>
+        <w:t xml:space="preserve"> screen (Figure 13) holds the appearance options (light, dark, or system theme), network information, and an explanation of the readings, with only a small </w:t>
       </w:r>
       <w:r>
         <w:rPr>
           <w:b/>
           <w:bCs/>
         </w:rPr>
-        <w:t xml:space="preserve">Team admin</w:t>
-      </w:r>
-      <w:r>
-        <w:t xml:space="preserve"> sign-in, where the monitoring personnel enter the shared team passcode. Once signed in, each station shows a settings button and alerts show an Acknowledge button. </w:t>
+        <w:t xml:space="preserve">Admin login</w:t>
+      </w:r>
+      <w:r>
+        <w:t xml:space="preserve"> link at the bottom, so general users never see a password field. The link opens the </w:t>
+      </w:r>
+      <w:r>
+        <w:rPr>
+          <w:b/>
+          <w:bCs/>
+        </w:rPr>
+        <w:t xml:space="preserve">Admin Login</w:t>
+      </w:r>
+      <w:r>
+        <w:t xml:space="preserve"> screen (Figure 14), where the monitoring personnel enter the shared team passcode. Once logged in, the Settings screen shows that the admin is logged in with a Log out button, each station shows a settings button, and alerts show an Acknowledge button. </w:t>
       </w:r>
       <w:r>
         <w:rPr>
@@ -9798,17 +9808,7 @@
         <w:t xml:space="preserve">Station Settings</w:t>
       </w:r>
       <w:r>
-        <w:t xml:space="preserve"> (Figure 14) edits the station's name and landmark, turns naming from its GPS position on or off, sets its alert thresholds for PM2.5, VOC, and NOx, and removes the station or removes it and blocks its device. Figure 15 shows a </w:t>
-      </w:r>
-      <w:r>
-        <w:rPr>
-          <w:b/>
-          <w:bCs/>
-        </w:rPr>
-        <w:t xml:space="preserve">new station</w:t>
-      </w:r>
-      <w:r>
-        <w:t xml:space="preserve"> that has just added itself after being switched on, while it waits for its first reading. On computers, the application keeps the same phone layout in a centered column, so it looks the same on every device. The firmware for 4G LTE fallback and GPS positioning has been written and will be bench-tested once the modules are purchased, and the station map view (Section 3.2.11) is part of the next development sprint; the server and application already store and display the station's network, battery, and location.</w:t>
+        <w:t xml:space="preserve"> (Figure 15) edits the station's name and landmark, turns naming from its GPS position on or off, sets its alert thresholds for PM2.5, VOC, and NOx, and removes the station or removes it and blocks its device. A station that has just added itself after being switched on appears in the list as "Just added" and shows a short "Waiting for the first reading" message until its first upload. On computers, the application keeps the same phone layout in a centered column, so it looks the same on every device. The firmware for 4G LTE fallback and GPS positioning has been written and will be bench-tested once the modules are purchased, and the station map view (Section 3.2.11) is part of the next development sprint; the server and application already store and display the station's network, battery, and location.</w:t>
       </w:r>
     </w:p>
     <w:p>
@@ -12167,7 +12167,7 @@
                 <w:sz w:val="22"/>
                 <w:szCs w:val="22"/>
               </w:rPr>
-              <w:t xml:space="preserve">Team admin sign-in token; naming stations after their barangay from GPS position</w:t>
+              <w:t xml:space="preserve">Admin login token; naming stations after their barangay from GPS position</w:t>
             </w:r>
           </w:p>
         </w:tc>
@@ -16658,7 +16658,7 @@
                 <w:sz w:val="22"/>
                 <w:szCs w:val="22"/>
               </w:rPr>
-              <w:t xml:space="preserve">8. Only the team, signed in with the passcode, can change or remove stations; only devices with the team secret can add a station, and each station then uses its own secret key.</w:t>
+              <w:t xml:space="preserve">8. Only the team, logged in as admin with the passcode, can change or remove stations; only devices with the team secret can add a station, and each station then uses its own secret key.</w:t>
             </w:r>
           </w:p>
         </w:tc>
@@ -19898,7 +19898,7 @@
                 <w:sz w:val="22"/>
                 <w:szCs w:val="22"/>
               </w:rPr>
-              <w:t xml:space="preserve">2. Team admin sign-in with the passcode; management controls hidden from general users</w:t>
+              <w:t xml:space="preserve">2. Admin login with the team passcode from the small link in Settings; management controls hidden from general users</w:t>
             </w:r>
           </w:p>
         </w:tc>

</xml_diff>

<commit_message>
Use the A7670SA's built-in GNSS for GPS; no status LEDs
- Firmware: GPS now comes from the A7670SA (AT+CGNSSPWR / AT+CGPSINFO),
  switched on for up to 2 min every 15 min and only above 3.5 V; the
  separate GPS module, MOSFET and TinyGPSPlus are gone; LEDs default off
- Circuit, block, architecture and context diagrams; circuit notes and
  parts list match the purchased parts (TPS63802, MT3608, Samsung 30Q,
  1S 10A BMS, 16/18/22 AWG wiring, PG7 glands)
- Proposal: hardware, pin, power budget (8.1 / 12.2 Wh/day), sizing,
  location tracking, software and costing (P7,300-13,930); Summary of
  Revisions; README; simulator load; shopping list in docs/

Co-Authored-By: Claude Opus 5.5 <noreply@anthropic.com>
Claude-Session: https://claude.ai/code/session_0148MYiEDhLTPmdz34XuceJs
</commit_message>
<xml_diff>
--- a/docs/proposal/GINHAWA_Proposal_Revised.docx
+++ b/docs/proposal/GINHAWA_Proposal_Revised.docx
@@ -817,7 +817,7 @@
             <w:tab/>
           </w:r>
           <w:r>
-            <w:t>24</w:t>
+            <w:t>23</w:t>
           </w:r>
         </w:p>
         <w:p>
@@ -2379,7 +2379,7 @@
         <w:jc w:val="both"/>
       </w:pPr>
       <w:r>
-        <w:t xml:space="preserve">Each monitoring station uses a Sensirion SEN55 sensor module, an ESP32 DevKit microcontroller with separate 4G LTE (A7670) and GPS modules, an INA219 power monitor, and a compact solar-charged lithium-ion battery pack (three 18650 cells), all in a small weatherproof unit. Stations transmit data over Wi-Fi, falling back to 4G LTE when Wi-Fi is unavailable, to a backend built with Node.js and PostgreSQL. Users access the data without creating an account through a mobile-first web application (Progressive Web App) that shows real-time readings, history, station locations on a map, and alerts.</w:t>
+        <w:t xml:space="preserve">Each monitoring station uses a Sensirion SEN55 sensor module, an ESP32 DevKit microcontroller with an A7670SA module that provides both 4G LTE and GNSS (GPS), an INA219 power monitor, and a compact solar-charged lithium-ion battery pack (three 18650 cells), all in a small weatherproof unit. Stations transmit data over Wi-Fi, falling back to 4G LTE when Wi-Fi is unavailable, to a backend built with Node.js and PostgreSQL. Users access the data without creating an account through a mobile-first web application (Progressive Web App) that shows real-time readings, history, station locations on a map, and alerts.</w:t>
       </w:r>
     </w:p>
     <w:p>
@@ -4295,7 +4295,7 @@
                 <w:sz w:val="22"/>
                 <w:szCs w:val="22"/>
               </w:rPr>
-              <w:t xml:space="preserve">Sensirion SEN55; ESP32 with A7670 LTE and GPS modules; 18650 Li-ion + solar; HTTPS REST, WebSocket; Node.js, PostgreSQL; React PWA; Docker</w:t>
+              <w:t xml:space="preserve">Sensirion SEN55; ESP32 with A7670SA LTE + GNSS module; 18650 Li-ion + solar; HTTPS REST, WebSocket; Node.js, PostgreSQL; React PWA; Docker</w:t>
             </w:r>
           </w:p>
         </w:tc>
@@ -4708,7 +4708,7 @@
         <w:t xml:space="preserve">(A) Monitoring station:</w:t>
       </w:r>
       <w:r>
-        <w:t xml:space="preserve"> a small 6 V, 6 W solar panel charges a compact lithium-ion battery pack (three 18650 cells, 3.7 V) through a Li-ion solar charger; the battery is the primary power source and supplies the station day and night through a 3.3 V buck-boost converter and a 5 V boost converter. An ESP32 DevKit microcontroller reads the Sensirion SEN55 sensor over the I²C bus and controls a separate A7670 4G LTE module and a GPS module over serial (UART) connections. </w:t>
+        <w:t xml:space="preserve"> a small 6 V, 6 W solar panel charges a compact lithium-ion battery pack (three 18650 cells, 3.7 V) through a Li-ion solar charger; the battery is the primary power source and supplies the station day and night through a 3.3 V buck-boost converter and a 5 V boost converter. An ESP32 DevKit microcontroller reads the Sensirion SEN55 sensor over the I²C bus and controls an A7670SA module, which provides both 4G LTE and GNSS (GPS) positioning, over a serial (UART) connection. </w:t>
       </w:r>
       <w:r>
         <w:rPr>
@@ -5039,7 +5039,7 @@
         <w:t xml:space="preserve">Monitoring Station</w:t>
       </w:r>
       <w:r>
-        <w:t xml:space="preserve"> sends its hardware ID and the team secret when it is first switched on, then its sensor readings, GPS location, and battery status, and receives its device key and the current AQI level for its status LED. The </w:t>
+        <w:t xml:space="preserve"> sends its hardware ID and the team secret when it is first switched on, then its sensor readings, GPS location, and battery status, and receives its device key and the current AQI level. The </w:t>
       </w:r>
       <w:r>
         <w:rPr>
@@ -5218,7 +5218,7 @@
       <w:r>
         <w:drawing>
           <wp:inline distT="0" distB="0" distL="0" distR="0">
-            <wp:extent cx="5120640" cy="5711657"/>
+            <wp:extent cx="5120640" cy="5772689"/>
             <wp:effectExtent t="0" r="0" b="0" l="0"/>
             <wp:docPr id="1" name="/var/tmp/gbuild/img/f7.png" descr="/var/tmp/gbuild/img/f7.png" title="/var/tmp/gbuild/img/f7.png"/>
             <wp:cNvGraphicFramePr>
@@ -5243,7 +5243,7 @@
                   <pic:spPr bwMode="auto">
                     <a:xfrm>
                       <a:off x="0" y="0"/>
-                      <a:ext cx="5120640" cy="5711657"/>
+                      <a:ext cx="5120640" cy="5772689"/>
                     </a:xfrm>
                     <a:prstGeom prst="rect">
                       <a:avLst/>
@@ -5273,7 +5273,7 @@
         <w:jc w:val="both"/>
       </w:pPr>
       <w:r>
-        <w:t xml:space="preserve">Figure 7 shows the hardware blocks of one monitoring station and how they are grouped physically. The solar panel and LTE antenna are mounted outdoors. The </w:t>
+        <w:t xml:space="preserve">Figure 7 shows the hardware blocks of one monitoring station and how they are grouped physically. The solar panel and the LTE and GNSS antennas are mounted outdoors. The </w:t>
       </w:r>
       <w:r>
         <w:rPr>
@@ -5283,7 +5283,7 @@
         <w:t xml:space="preserve">IP65 enclosure</w:t>
       </w:r>
       <w:r>
-        <w:t xml:space="preserve"> (150 × 100 × 70 mm) holds the CN3791 solar charger, 5 A fuse, INA219 power monitor, the 18650 battery pack with its protection board (BMS), the 3.3 V and 5 V converters, the ESP32 DevKit, the A7670 LTE module with its nano-SIM, the GPS module with its power switch, and the status LEDs. The </w:t>
+        <w:t xml:space="preserve"> (150 × 100 × 70 mm) holds the CN3791 solar charger, 5 A fuse, INA219 power monitor, the 18650 battery pack with its protection board (BMS), the 3.3 V and 5 V converters, the ESP32 DevKit, and the A7670SA LTE and GNSS module with its nano-SIM. The station has no status LEDs; its status is shown in the application. The </w:t>
       </w:r>
       <w:r>
         <w:rPr>
@@ -5293,7 +5293,7 @@
         <w:t xml:space="preserve">radiation shield</w:t>
       </w:r>
       <w:r>
-        <w:t xml:space="preserve"> holds the SEN55 sensor separately from the enclosure so that heat from the electronics and battery does not affect the readings and air can flow freely around the sensor. Power paths (3.7 V battery, 3.3 V and 5 V), I²C data, UART, GPIO, and RF links are drawn in different line styles, as shown in the legend.</w:t>
+        <w:t xml:space="preserve"> holds the SEN55 sensor separately from the enclosure so that heat from the electronics and battery does not affect the readings and air can flow freely around the sensor. Power paths (3.7 V battery, 3.3 V and 5 V), I²C data, UART, and RF links are drawn in different line styles, as shown in the legend.</w:t>
       </w:r>
     </w:p>
     <w:p>
@@ -5370,7 +5370,7 @@
         <w:jc w:val="both"/>
       </w:pPr>
       <w:r>
-        <w:t xml:space="preserve">Figure 8 presents the circuit diagram drawn with standard electrical symbols and reference designators; net labels with the same name are connected. PV1 connects to the solar input of the CN3791 charger U1. The battery pack BT1 (three 18650 cells in parallel with a protection board) connects to U1's battery terminals through fuse F1 and the INA219 current-sense input (U4 VIN+ to VIN−), so the INA219 measures battery voltage and charge/discharge current. The charger side of F1 forms the battery rail VBAT (3.0–4.2 V), which feeds the buck-boost converter U2 (3.3 V for the ESP32, INA219, and GPS), the boost converter U5 (5 V for the SEN55), and the LTE module U6 directly, with bulk capacitor C2 absorbing its transmit current peaks. The ESP32 DevKit U3 is powered through its 3V3 pin. J1 pin 5 (SEL) is tied to ground to select I²C mode, and the SEN55 and INA219 share the I²C bus on GPIO21 (SDA) and GPIO22 (SCL) with 4.7 kΩ pull-up resistors R3 and R4. The GPS module U7 is powered through the P-channel MOSFET Q1, which the ESP32 switches on from GPIO27 only while it needs a position fix; R7 keeps it off during start-up. Status LEDs D1 and D2 are driven from GPIO18 and GPIO19 through 220 Ω resistors. Table 2 lists the pin assignments.</w:t>
+        <w:t xml:space="preserve">Figure 8 presents the circuit diagram drawn with standard electrical symbols and reference designators; net labels with the same name are connected. PV1 connects to the solar input of the CN3791 charger U1. The battery pack BT1 (three 18650 cells in parallel with a protection board) connects to U1's battery terminals through fuse F1 and the INA219 current-sense input (U4 VIN+ to VIN−), so the INA219 measures battery voltage and charge/discharge current. The charger side of F1 forms the battery rail VBAT (3.0–4.2 V), which feeds the buck-boost converter U2 (TPS63802, 3.3 V for the ESP32 and INA219), the boost converter U5 (MT3608, 5 V for the SEN55), and the A7670SA module U6 directly, with bulk capacitor C2 absorbing its transmit current peaks. The ESP32 DevKit U3 is powered through its 3V3 pin. J1 pin 5 (SEL) is tied to ground to select I²C mode, and the SEN55 and INA219 share the I²C bus on GPIO21 (SDA) and GPIO22 (SCL) with 4.7 kΩ pull-up resistors R3 and R4. U6 connects to the ESP32 over UART2 (GPIO16 and GPIO17) and is switched on with its power key from GPIO4; its LTE antenna (ANT1) and GNSS antenna (ANT2) connect to its MAIN and GNSS connectors, so the same module provides both the LTE fallback and the station's GPS position. Table 2 lists the pin assignments.</w:t>
       </w:r>
     </w:p>
     <w:p>
@@ -5993,7 +5993,7 @@
                 <w:sz w:val="22"/>
                 <w:szCs w:val="22"/>
               </w:rPr>
-              <w:t xml:space="preserve">A7670 TXD / RXD</w:t>
+              <w:t xml:space="preserve">A7670SA TXD / RXD</w:t>
             </w:r>
           </w:p>
         </w:tc>
@@ -6122,7 +6122,7 @@
                 <w:sz w:val="22"/>
                 <w:szCs w:val="22"/>
               </w:rPr>
-              <w:t xml:space="preserve">A7670 PWRKEY</w:t>
+              <w:t xml:space="preserve">A7670SA PWRKEY</w:t>
             </w:r>
           </w:p>
         </w:tc>
@@ -6184,7 +6184,7 @@
                 <w:sz w:val="22"/>
                 <w:szCs w:val="22"/>
               </w:rPr>
-              <w:t xml:space="preserve">Pulsed to switch the modem on</w:t>
+              <w:t xml:space="preserve">Pulsed to switch the module on</w:t>
             </w:r>
           </w:p>
         </w:tc>
@@ -6220,7 +6220,7 @@
                 <w:sz w:val="22"/>
                 <w:szCs w:val="22"/>
               </w:rPr>
-              <w:t xml:space="preserve">GPS UART</w:t>
+              <w:t xml:space="preserve">GNSS (GPS)</w:t>
             </w:r>
           </w:p>
         </w:tc>
@@ -6251,7 +6251,7 @@
                 <w:sz w:val="22"/>
                 <w:szCs w:val="22"/>
               </w:rPr>
-              <w:t xml:space="preserve">GPS TX / RX</w:t>
+              <w:t xml:space="preserve">A7670SA GNSS receiver</w:t>
             </w:r>
           </w:p>
         </w:tc>
@@ -6282,7 +6282,7 @@
                 <w:sz w:val="22"/>
                 <w:szCs w:val="22"/>
               </w:rPr>
-              <w:t xml:space="preserve">GPIO25 (RX1) / GPIO26 (TX1)</w:t>
+              <w:t xml:space="preserve">via GPIO16 / GPIO17</w:t>
             </w:r>
           </w:p>
         </w:tc>
@@ -6313,7 +6313,7 @@
                 <w:sz w:val="22"/>
                 <w:szCs w:val="22"/>
               </w:rPr>
-              <w:t xml:space="preserve">9600 baud</w:t>
+              <w:t xml:space="preserve">Same UART as LTE; GNSS antenna on the module</w:t>
             </w:r>
           </w:p>
         </w:tc>
@@ -6349,393 +6349,6 @@
                 <w:sz w:val="22"/>
                 <w:szCs w:val="22"/>
               </w:rPr>
-              <w:t xml:space="preserve">GPS power</w:t>
-            </w:r>
-          </w:p>
-        </w:tc>
-        <w:tc>
-          <w:tcPr>
-            <w:tcW w:type="dxa" w:w="2400"/>
-            <w:tcBorders>
-              <w:top w:val="single" w:color="000000" w:sz="4"/>
-              <w:left w:val="single" w:color="000000" w:sz="4"/>
-              <w:bottom w:val="single" w:color="000000" w:sz="4"/>
-              <w:right w:val="single" w:color="000000" w:sz="4"/>
-            </w:tcBorders>
-            <w:tcMar>
-              <w:top w:type="dxa" w:w="60"/>
-              <w:left w:type="dxa" w:w="100"/>
-              <w:bottom w:type="dxa" w:w="60"/>
-              <w:right w:type="dxa" w:w="100"/>
-            </w:tcMar>
-            <w:vAlign w:val="center"/>
-          </w:tcPr>
-          <w:p>
-            <w:pPr>
-              <w:spacing w:after="0" w:line="260"/>
-              <w:jc w:val="left"/>
-            </w:pPr>
-            <w:r>
-              <w:rPr>
-                <w:sz w:val="22"/>
-                <w:szCs w:val="22"/>
-              </w:rPr>
-              <w:t xml:space="preserve">Q1 AO3401 gate</w:t>
-            </w:r>
-          </w:p>
-        </w:tc>
-        <w:tc>
-          <w:tcPr>
-            <w:tcW w:type="dxa" w:w="1900"/>
-            <w:tcBorders>
-              <w:top w:val="single" w:color="000000" w:sz="4"/>
-              <w:left w:val="single" w:color="000000" w:sz="4"/>
-              <w:bottom w:val="single" w:color="000000" w:sz="4"/>
-              <w:right w:val="single" w:color="000000" w:sz="4"/>
-            </w:tcBorders>
-            <w:tcMar>
-              <w:top w:type="dxa" w:w="60"/>
-              <w:left w:type="dxa" w:w="100"/>
-              <w:bottom w:type="dxa" w:w="60"/>
-              <w:right w:type="dxa" w:w="100"/>
-            </w:tcMar>
-            <w:vAlign w:val="center"/>
-          </w:tcPr>
-          <w:p>
-            <w:pPr>
-              <w:spacing w:after="0" w:line="260"/>
-              <w:jc w:val="left"/>
-            </w:pPr>
-            <w:r>
-              <w:rPr>
-                <w:sz w:val="22"/>
-                <w:szCs w:val="22"/>
-              </w:rPr>
-              <w:t xml:space="preserve">GPIO27</w:t>
-            </w:r>
-          </w:p>
-        </w:tc>
-        <w:tc>
-          <w:tcPr>
-            <w:tcW w:type="dxa" w:w="2540"/>
-            <w:tcBorders>
-              <w:top w:val="single" w:color="000000" w:sz="4"/>
-              <w:left w:val="single" w:color="000000" w:sz="4"/>
-              <w:bottom w:val="single" w:color="000000" w:sz="4"/>
-              <w:right w:val="single" w:color="000000" w:sz="4"/>
-            </w:tcBorders>
-            <w:tcMar>
-              <w:top w:type="dxa" w:w="60"/>
-              <w:left w:type="dxa" w:w="100"/>
-              <w:bottom w:type="dxa" w:w="60"/>
-              <w:right w:type="dxa" w:w="100"/>
-            </w:tcMar>
-            <w:vAlign w:val="center"/>
-          </w:tcPr>
-          <w:p>
-            <w:pPr>
-              <w:spacing w:after="0" w:line="260"/>
-              <w:jc w:val="left"/>
-            </w:pPr>
-            <w:r>
-              <w:rPr>
-                <w:sz w:val="22"/>
-                <w:szCs w:val="22"/>
-              </w:rPr>
-              <w:t xml:space="preserve">LOW = on; R7 10 kΩ pull-up</w:t>
-            </w:r>
-          </w:p>
-        </w:tc>
-      </w:tr>
-      <w:tr>
-        <w:trPr>
-          <w:cantSplit/>
-        </w:trPr>
-        <w:tc>
-          <w:tcPr>
-            <w:tcW w:type="dxa" w:w="1800"/>
-            <w:tcBorders>
-              <w:top w:val="single" w:color="000000" w:sz="4"/>
-              <w:left w:val="single" w:color="000000" w:sz="4"/>
-              <w:bottom w:val="single" w:color="000000" w:sz="4"/>
-              <w:right w:val="single" w:color="000000" w:sz="4"/>
-            </w:tcBorders>
-            <w:tcMar>
-              <w:top w:type="dxa" w:w="60"/>
-              <w:left w:type="dxa" w:w="100"/>
-              <w:bottom w:type="dxa" w:w="60"/>
-              <w:right w:type="dxa" w:w="100"/>
-            </w:tcMar>
-            <w:vAlign w:val="center"/>
-          </w:tcPr>
-          <w:p>
-            <w:pPr>
-              <w:spacing w:after="0" w:line="260"/>
-              <w:jc w:val="left"/>
-            </w:pPr>
-            <w:r>
-              <w:rPr>
-                <w:sz w:val="22"/>
-                <w:szCs w:val="22"/>
-              </w:rPr>
-              <w:t xml:space="preserve">Status LED (red)</w:t>
-            </w:r>
-          </w:p>
-        </w:tc>
-        <w:tc>
-          <w:tcPr>
-            <w:tcW w:type="dxa" w:w="2400"/>
-            <w:tcBorders>
-              <w:top w:val="single" w:color="000000" w:sz="4"/>
-              <w:left w:val="single" w:color="000000" w:sz="4"/>
-              <w:bottom w:val="single" w:color="000000" w:sz="4"/>
-              <w:right w:val="single" w:color="000000" w:sz="4"/>
-            </w:tcBorders>
-            <w:tcMar>
-              <w:top w:type="dxa" w:w="60"/>
-              <w:left w:type="dxa" w:w="100"/>
-              <w:bottom w:type="dxa" w:w="60"/>
-              <w:right w:type="dxa" w:w="100"/>
-            </w:tcMar>
-            <w:vAlign w:val="center"/>
-          </w:tcPr>
-          <w:p>
-            <w:pPr>
-              <w:spacing w:after="0" w:line="260"/>
-              <w:jc w:val="left"/>
-            </w:pPr>
-            <w:r>
-              <w:rPr>
-                <w:sz w:val="22"/>
-                <w:szCs w:val="22"/>
-              </w:rPr>
-              <w:t xml:space="preserve">D1 via R5 220 Ω</w:t>
-            </w:r>
-          </w:p>
-        </w:tc>
-        <w:tc>
-          <w:tcPr>
-            <w:tcW w:type="dxa" w:w="1900"/>
-            <w:tcBorders>
-              <w:top w:val="single" w:color="000000" w:sz="4"/>
-              <w:left w:val="single" w:color="000000" w:sz="4"/>
-              <w:bottom w:val="single" w:color="000000" w:sz="4"/>
-              <w:right w:val="single" w:color="000000" w:sz="4"/>
-            </w:tcBorders>
-            <w:tcMar>
-              <w:top w:type="dxa" w:w="60"/>
-              <w:left w:type="dxa" w:w="100"/>
-              <w:bottom w:type="dxa" w:w="60"/>
-              <w:right w:type="dxa" w:w="100"/>
-            </w:tcMar>
-            <w:vAlign w:val="center"/>
-          </w:tcPr>
-          <w:p>
-            <w:pPr>
-              <w:spacing w:after="0" w:line="260"/>
-              <w:jc w:val="left"/>
-            </w:pPr>
-            <w:r>
-              <w:rPr>
-                <w:sz w:val="22"/>
-                <w:szCs w:val="22"/>
-              </w:rPr>
-              <w:t xml:space="preserve">GPIO18</w:t>
-            </w:r>
-          </w:p>
-        </w:tc>
-        <w:tc>
-          <w:tcPr>
-            <w:tcW w:type="dxa" w:w="2540"/>
-            <w:tcBorders>
-              <w:top w:val="single" w:color="000000" w:sz="4"/>
-              <w:left w:val="single" w:color="000000" w:sz="4"/>
-              <w:bottom w:val="single" w:color="000000" w:sz="4"/>
-              <w:right w:val="single" w:color="000000" w:sz="4"/>
-            </w:tcBorders>
-            <w:tcMar>
-              <w:top w:type="dxa" w:w="60"/>
-              <w:left w:type="dxa" w:w="100"/>
-              <w:bottom w:type="dxa" w:w="60"/>
-              <w:right w:type="dxa" w:w="100"/>
-            </w:tcMar>
-            <w:vAlign w:val="center"/>
-          </w:tcPr>
-          <w:p>
-            <w:pPr>
-              <w:spacing w:after="0" w:line="260"/>
-              <w:jc w:val="left"/>
-            </w:pPr>
-            <w:r>
-              <w:rPr>
-                <w:sz w:val="22"/>
-                <w:szCs w:val="22"/>
-              </w:rPr>
-              <w:t xml:space="preserve">On when air quality is poor</w:t>
-            </w:r>
-          </w:p>
-        </w:tc>
-      </w:tr>
-      <w:tr>
-        <w:trPr>
-          <w:cantSplit/>
-        </w:trPr>
-        <w:tc>
-          <w:tcPr>
-            <w:tcW w:type="dxa" w:w="1800"/>
-            <w:tcBorders>
-              <w:top w:val="single" w:color="000000" w:sz="4"/>
-              <w:left w:val="single" w:color="000000" w:sz="4"/>
-              <w:bottom w:val="single" w:color="000000" w:sz="4"/>
-              <w:right w:val="single" w:color="000000" w:sz="4"/>
-            </w:tcBorders>
-            <w:tcMar>
-              <w:top w:type="dxa" w:w="60"/>
-              <w:left w:type="dxa" w:w="100"/>
-              <w:bottom w:type="dxa" w:w="60"/>
-              <w:right w:type="dxa" w:w="100"/>
-            </w:tcMar>
-            <w:vAlign w:val="center"/>
-          </w:tcPr>
-          <w:p>
-            <w:pPr>
-              <w:spacing w:after="0" w:line="260"/>
-              <w:jc w:val="left"/>
-            </w:pPr>
-            <w:r>
-              <w:rPr>
-                <w:sz w:val="22"/>
-                <w:szCs w:val="22"/>
-              </w:rPr>
-              <w:t xml:space="preserve">Status LED (green)</w:t>
-            </w:r>
-          </w:p>
-        </w:tc>
-        <w:tc>
-          <w:tcPr>
-            <w:tcW w:type="dxa" w:w="2400"/>
-            <w:tcBorders>
-              <w:top w:val="single" w:color="000000" w:sz="4"/>
-              <w:left w:val="single" w:color="000000" w:sz="4"/>
-              <w:bottom w:val="single" w:color="000000" w:sz="4"/>
-              <w:right w:val="single" w:color="000000" w:sz="4"/>
-            </w:tcBorders>
-            <w:tcMar>
-              <w:top w:type="dxa" w:w="60"/>
-              <w:left w:type="dxa" w:w="100"/>
-              <w:bottom w:type="dxa" w:w="60"/>
-              <w:right w:type="dxa" w:w="100"/>
-            </w:tcMar>
-            <w:vAlign w:val="center"/>
-          </w:tcPr>
-          <w:p>
-            <w:pPr>
-              <w:spacing w:after="0" w:line="260"/>
-              <w:jc w:val="left"/>
-            </w:pPr>
-            <w:r>
-              <w:rPr>
-                <w:sz w:val="22"/>
-                <w:szCs w:val="22"/>
-              </w:rPr>
-              <w:t xml:space="preserve">D2 via R6 220 Ω</w:t>
-            </w:r>
-          </w:p>
-        </w:tc>
-        <w:tc>
-          <w:tcPr>
-            <w:tcW w:type="dxa" w:w="1900"/>
-            <w:tcBorders>
-              <w:top w:val="single" w:color="000000" w:sz="4"/>
-              <w:left w:val="single" w:color="000000" w:sz="4"/>
-              <w:bottom w:val="single" w:color="000000" w:sz="4"/>
-              <w:right w:val="single" w:color="000000" w:sz="4"/>
-            </w:tcBorders>
-            <w:tcMar>
-              <w:top w:type="dxa" w:w="60"/>
-              <w:left w:type="dxa" w:w="100"/>
-              <w:bottom w:type="dxa" w:w="60"/>
-              <w:right w:type="dxa" w:w="100"/>
-            </w:tcMar>
-            <w:vAlign w:val="center"/>
-          </w:tcPr>
-          <w:p>
-            <w:pPr>
-              <w:spacing w:after="0" w:line="260"/>
-              <w:jc w:val="left"/>
-            </w:pPr>
-            <w:r>
-              <w:rPr>
-                <w:sz w:val="22"/>
-                <w:szCs w:val="22"/>
-              </w:rPr>
-              <w:t xml:space="preserve">GPIO19</w:t>
-            </w:r>
-          </w:p>
-        </w:tc>
-        <w:tc>
-          <w:tcPr>
-            <w:tcW w:type="dxa" w:w="2540"/>
-            <w:tcBorders>
-              <w:top w:val="single" w:color="000000" w:sz="4"/>
-              <w:left w:val="single" w:color="000000" w:sz="4"/>
-              <w:bottom w:val="single" w:color="000000" w:sz="4"/>
-              <w:right w:val="single" w:color="000000" w:sz="4"/>
-            </w:tcBorders>
-            <w:tcMar>
-              <w:top w:type="dxa" w:w="60"/>
-              <w:left w:type="dxa" w:w="100"/>
-              <w:bottom w:type="dxa" w:w="60"/>
-              <w:right w:type="dxa" w:w="100"/>
-            </w:tcMar>
-            <w:vAlign w:val="center"/>
-          </w:tcPr>
-          <w:p>
-            <w:pPr>
-              <w:spacing w:after="0" w:line="260"/>
-              <w:jc w:val="left"/>
-            </w:pPr>
-            <w:r>
-              <w:rPr>
-                <w:sz w:val="22"/>
-                <w:szCs w:val="22"/>
-              </w:rPr>
-              <w:t xml:space="preserve">On when air quality is good</w:t>
-            </w:r>
-          </w:p>
-        </w:tc>
-      </w:tr>
-      <w:tr>
-        <w:trPr>
-          <w:cantSplit/>
-        </w:trPr>
-        <w:tc>
-          <w:tcPr>
-            <w:tcW w:type="dxa" w:w="1800"/>
-            <w:tcBorders>
-              <w:top w:val="single" w:color="000000" w:sz="4"/>
-              <w:left w:val="single" w:color="000000" w:sz="4"/>
-              <w:bottom w:val="single" w:color="000000" w:sz="4"/>
-              <w:right w:val="single" w:color="000000" w:sz="4"/>
-            </w:tcBorders>
-            <w:tcMar>
-              <w:top w:type="dxa" w:w="60"/>
-              <w:left w:type="dxa" w:w="100"/>
-              <w:bottom w:type="dxa" w:w="60"/>
-              <w:right w:type="dxa" w:w="100"/>
-            </w:tcMar>
-            <w:vAlign w:val="center"/>
-          </w:tcPr>
-          <w:p>
-            <w:pPr>
-              <w:spacing w:after="0" w:line="260"/>
-              <w:jc w:val="left"/>
-            </w:pPr>
-            <w:r>
-              <w:rPr>
-                <w:sz w:val="22"/>
-                <w:szCs w:val="22"/>
-              </w:rPr>
               <w:t xml:space="preserve">I²C addresses</w:t>
             </w:r>
           </w:p>
@@ -6857,7 +6470,7 @@
         <w:jc w:val="both"/>
       </w:pPr>
       <w:r>
-        <w:t xml:space="preserve">Because each station must operate continuously outdoors while staying compact, the power subsystem was sized from an estimated daily energy budget. To reduce consumption, the SEN55 measures particulate matter for one minute in every five minutes and keeps its VOC, NOx, temperature, and humidity sensing running in its low-power mode the rest of the time; readings are uploaded once per minute; the GPS module is switched on only for up to 90 seconds every 15 minutes; and the LTE module stays off while Wi-Fi is available. Table 3 lists the estimated consumption in normal operation (Wi-Fi) and in the worst case, in which Wi-Fi is unavailable and the station uses 4G LTE all day.</w:t>
+        <w:t xml:space="preserve">Because each station must operate continuously outdoors while staying compact, the power subsystem was sized from an estimated daily energy budget. To reduce consumption, the SEN55 measures particulate matter for one minute in every five minutes and keeps its VOC, NOx, temperature, and humidity sensing running in its low-power mode the rest of the time; readings are uploaded once per minute; the A7670SA module and its GNSS receiver are switched on only for up to two minutes every 15 minutes to obtain a GPS position; and LTE is used for uploads only when Wi-Fi is unavailable. Table 3 lists the estimated consumption in normal operation (Wi-Fi) and in the worst case, in which Wi-Fi is unavailable and the station uses 4G LTE all day.</w:t>
       </w:r>
     </w:p>
     <w:p>
@@ -7320,7 +6933,7 @@
                 <w:sz w:val="22"/>
                 <w:szCs w:val="22"/>
               </w:rPr>
-              <w:t xml:space="preserve">GPS module (up to 90 s every 15 min)</w:t>
+              <w:t xml:space="preserve">A7670SA GNSS for GPS (up to 2 min every 15 min)</w:t>
             </w:r>
           </w:p>
         </w:tc>
@@ -7351,7 +6964,7 @@
                 <w:sz w:val="22"/>
                 <w:szCs w:val="22"/>
               </w:rPr>
-              <w:t xml:space="preserve">0.01</w:t>
+              <w:t xml:space="preserve">0.03</w:t>
             </w:r>
           </w:p>
         </w:tc>
@@ -7382,7 +6995,7 @@
                 <w:sz w:val="22"/>
                 <w:szCs w:val="22"/>
               </w:rPr>
-              <w:t xml:space="preserve">0.2</w:t>
+              <w:t xml:space="preserve">0.7</w:t>
             </w:r>
           </w:p>
         </w:tc>
@@ -7413,7 +7026,7 @@
                 <w:sz w:val="22"/>
                 <w:szCs w:val="22"/>
               </w:rPr>
-              <w:t xml:space="preserve">0.2</w:t>
+              <w:t xml:space="preserve">0.7</w:t>
             </w:r>
           </w:p>
         </w:tc>
@@ -7449,7 +7062,7 @@
                 <w:sz w:val="22"/>
                 <w:szCs w:val="22"/>
               </w:rPr>
-              <w:t xml:space="preserve">A7670 LTE module (idle, upload every minute)</w:t>
+              <w:t xml:space="preserve">A7670SA LTE (idle, upload every minute)</w:t>
             </w:r>
           </w:p>
         </w:tc>
@@ -7578,7 +7191,7 @@
                 <w:sz w:val="22"/>
                 <w:szCs w:val="22"/>
               </w:rPr>
-              <w:t xml:space="preserve">INA219, status LEDs</w:t>
+              <w:t xml:space="preserve">INA219 power monitor</w:t>
             </w:r>
           </w:p>
         </w:tc>
@@ -7769,7 +7382,7 @@
                 <w:sz w:val="22"/>
                 <w:szCs w:val="22"/>
               </w:rPr>
-              <w:t xml:space="preserve">0.8</w:t>
+              <w:t xml:space="preserve">0.9</w:t>
             </w:r>
           </w:p>
         </w:tc>
@@ -7800,7 +7413,7 @@
                 <w:sz w:val="22"/>
                 <w:szCs w:val="22"/>
               </w:rPr>
-              <w:t xml:space="preserve">0.8</w:t>
+              <w:t xml:space="preserve">0.9</w:t>
             </w:r>
           </w:p>
         </w:tc>
@@ -7871,7 +7484,7 @@
                 <w:sz w:val="22"/>
                 <w:szCs w:val="22"/>
               </w:rPr>
-              <w:t xml:space="preserve">≈0.31 / 0.48</w:t>
+              <w:t xml:space="preserve">≈0.34 / 0.51</w:t>
             </w:r>
           </w:p>
         </w:tc>
@@ -7904,7 +7517,7 @@
                 <w:sz w:val="22"/>
                 <w:szCs w:val="22"/>
               </w:rPr>
-              <w:t xml:space="preserve">≈7.5</w:t>
+              <w:t xml:space="preserve">≈8.1</w:t>
             </w:r>
           </w:p>
         </w:tc>
@@ -7937,7 +7550,7 @@
                 <w:sz w:val="22"/>
                 <w:szCs w:val="22"/>
               </w:rPr>
-              <w:t xml:space="preserve">≈11.6</w:t>
+              <w:t xml:space="preserve">≈12.2</w:t>
             </w:r>
           </w:p>
         </w:tc>
@@ -7962,27 +7575,27 @@
         <w:t xml:space="preserve">Battery sizing.</w:t>
       </w:r>
       <w:r>
-        <w:t xml:space="preserve"> Three 18650 lithium-ion cells (3000 mAh each) connected in parallel form a 3.7 V, 9 Ah pack that stores about 33 Wh. Using 80% depth of discharge (≈26.6 Wh usable), the station can run for about </w:t>
+        <w:t xml:space="preserve"> Three Samsung INR18650-30Q lithium-ion cells (3000 mAh each) connected in parallel in a cell holder form a 3.7 V, 9 Ah pack that stores about 33 Wh. Using 80% depth of discharge (≈26.6 Wh usable), the station can run for about </w:t>
       </w:r>
       <w:r>
         <w:rPr>
           <w:b/>
           <w:bCs/>
         </w:rPr>
-        <w:t xml:space="preserve">3.5 days without sunlight</w:t>
-      </w:r>
-      <w:r>
-        <w:t xml:space="preserve"> on Wi-Fi (26.6 ÷ 7.5) and about </w:t>
+        <w:t xml:space="preserve">3.3 days without sunlight</w:t>
+      </w:r>
+      <w:r>
+        <w:t xml:space="preserve"> on Wi-Fi (26.6 ÷ 8.1) and about </w:t>
       </w:r>
       <w:r>
         <w:rPr>
           <w:b/>
           <w:bCs/>
         </w:rPr>
-        <w:t xml:space="preserve">2.3 days</w:t>
-      </w:r>
-      <w:r>
-        <w:t xml:space="preserve"> in the worst case on LTE (26.6 ÷ 11.6), which covers consecutive cloudy or rainy days. The pack measures only about 78 × 60 × 21 mm in its holder and weighs about 0.15 kg, compared with about 0.6 kg for a LiFePO4 pack of 32700 cells. Cylindrical 18650 cells were chosen over soft pouch LiPo batteries because their steel cases tolerate outdoor heat better and do not swell, and a 1S protection board (BMS) guards against over-charge, over-discharge, and short circuit. Genuine cells of the same model and state of charge must be used in the pack.</w:t>
+        <w:t xml:space="preserve">2.2 days</w:t>
+      </w:r>
+      <w:r>
+        <w:t xml:space="preserve"> in the worst case on LTE (26.6 ÷ 12.2), which covers consecutive cloudy or rainy days. The pack measures only about 78 × 60 × 21 mm in its holder and weighs about 0.15 kg, compared with about 0.6 kg for a LiFePO4 pack of 32700 cells. Cylindrical 18650 cells were chosen over soft pouch LiPo batteries because their steel cases tolerate outdoor heat better and do not swell, and a 1S protection board (BMS) guards against over-charge, over-discharge, and short circuit. Genuine cells of the same model and state of charge must be used in the pack.</w:t>
       </w:r>
     </w:p>
     <w:p>
@@ -8006,10 +7619,10 @@
           <w:b/>
           <w:bCs/>
         </w:rPr>
-        <w:t xml:space="preserve">2.7 times</w:t>
-      </w:r>
-      <w:r>
-        <w:t xml:space="preserve"> the daily consumption on Wi-Fi and 1.75 times on LTE, allowing the battery to recover after cloudy days. These values are design estimates; actual consumption and charging will be measured with the INA219 during testing and the sampling schedule or panel size adjusted if necessary.</w:t>
+        <w:t xml:space="preserve">2.5 times</w:t>
+      </w:r>
+      <w:r>
+        <w:t xml:space="preserve"> the daily consumption on Wi-Fi and 1.7 times on LTE, allowing the battery to recover after cloudy days. These values are design estimates; actual consumption and charging will be measured with the INA219 during testing and the sampling schedule or panel size adjusted if necessary.</w:t>
       </w:r>
     </w:p>
     <w:p>
@@ -8689,7 +8302,7 @@
                 <w:sz w:val="22"/>
                 <w:szCs w:val="22"/>
               </w:rPr>
-              <w:t xml:space="preserve">A7670 LTE and GPS modules</w:t>
+              <w:t xml:space="preserve">A7670SA LTE and GNSS module (breakout)</w:t>
             </w:r>
           </w:p>
         </w:tc>
@@ -9151,7 +8764,7 @@
         <w:t xml:space="preserve">Location tracking.</w:t>
       </w:r>
       <w:r>
-        <w:t xml:space="preserve"> Each station has a small GPS module (ATGM336H) connected to the ESP32. To save power, the ESP32 switches the module on through a MOSFET only when it needs a position: at start-up and every 15 minutes, for up to 90 seconds. When a fix is obtained, the station includes its latitude and longitude with its readings. The server updates the station's location and the time it was last updated, and the application places each station on a map (OpenStreetMap) as a marker colored by its current AQI level. If a station cannot obtain a GPS fix, for example when mounted under a roof, its last known location is kept and the administrator can set the location manually. Because the location comes from the device itself, relocating a station automatically updates its position on the map.</w:t>
+        <w:t xml:space="preserve"> Each station obtains its position from the GNSS (GPS) receiver built into its A7670SA LTE module, so no separate GPS module is needed. To save power, the ESP32 switches the module and its GNSS receiver on only when it needs a position: at start-up and every 15 minutes, for up to two minutes. When a fix is obtained, the station includes its latitude and longitude with its readings. The server updates the station's location and the time it was last updated, and the application places each station on a map (OpenStreetMap) as a marker colored by its current AQI level. If a station cannot obtain a GPS fix, for example when mounted under a roof, its last known location is kept and the administrator can set the location manually. Because the location comes from the device itself, relocating a station automatically updates its position on the map.</w:t>
       </w:r>
     </w:p>
     <w:p>
@@ -10204,7 +9817,7 @@
                 <w:sz w:val="22"/>
                 <w:szCs w:val="22"/>
               </w:rPr>
-              <w:t xml:space="preserve">SIMCom A7670 LTE module</w:t>
+              <w:t xml:space="preserve">SIMCom A7670SA module</w:t>
             </w:r>
           </w:p>
         </w:tc>
@@ -10235,7 +9848,7 @@
                 <w:sz w:val="22"/>
                 <w:szCs w:val="22"/>
               </w:rPr>
-              <w:t xml:space="preserve">4G LTE Cat-1 breakout, UART (3.3 V logic), nano-SIM slot</w:t>
+              <w:t xml:space="preserve">4G LTE Cat-1 + GNSS (GPS) breakout, UART (3.3 V logic), nano-SIM slot</w:t>
             </w:r>
           </w:p>
         </w:tc>
@@ -10266,7 +9879,7 @@
                 <w:sz w:val="22"/>
                 <w:szCs w:val="22"/>
               </w:rPr>
-              <w:t xml:space="preserve">LTE fallback connectivity</w:t>
+              <w:t xml:space="preserve">LTE fallback connectivity and station location</w:t>
             </w:r>
           </w:p>
         </w:tc>
@@ -10302,7 +9915,7 @@
                 <w:sz w:val="22"/>
                 <w:szCs w:val="22"/>
               </w:rPr>
-              <w:t xml:space="preserve">GPS module</w:t>
+              <w:t xml:space="preserve">INA219 module</w:t>
             </w:r>
           </w:p>
         </w:tc>
@@ -10333,7 +9946,7 @@
                 <w:sz w:val="22"/>
                 <w:szCs w:val="22"/>
               </w:rPr>
-              <w:t xml:space="preserve">ATGM336H (or u-blox NEO-M8N), UART 9600 baud, patch antenna</w:t>
+              <w:t xml:space="preserve">I²C voltage/current monitor (0x40)</w:t>
             </w:r>
           </w:p>
         </w:tc>
@@ -10364,7 +9977,7 @@
                 <w:sz w:val="22"/>
                 <w:szCs w:val="22"/>
               </w:rPr>
-              <w:t xml:space="preserve">Station location</w:t>
+              <w:t xml:space="preserve">Battery voltage and current monitoring</w:t>
             </w:r>
           </w:p>
         </w:tc>
@@ -10400,7 +10013,7 @@
                 <w:sz w:val="22"/>
                 <w:szCs w:val="22"/>
               </w:rPr>
-              <w:t xml:space="preserve">P-channel MOSFET</w:t>
+              <w:t xml:space="preserve">Solar panel</w:t>
             </w:r>
           </w:p>
         </w:tc>
@@ -10431,7 +10044,7 @@
                 <w:sz w:val="22"/>
                 <w:szCs w:val="22"/>
               </w:rPr>
-              <w:t xml:space="preserve">AO3401 with 10 kΩ gate pull-up</w:t>
+              <w:t xml:space="preserve">6 V, 6 W, monocrystalline</w:t>
             </w:r>
           </w:p>
         </w:tc>
@@ -10462,7 +10075,7 @@
                 <w:sz w:val="22"/>
                 <w:szCs w:val="22"/>
               </w:rPr>
-              <w:t xml:space="preserve">Switches the GPS on and off</w:t>
+              <w:t xml:space="preserve">Recharges the battery</w:t>
             </w:r>
           </w:p>
         </w:tc>
@@ -10498,7 +10111,7 @@
                 <w:sz w:val="22"/>
                 <w:szCs w:val="22"/>
               </w:rPr>
-              <w:t xml:space="preserve">INA219 module</w:t>
+              <w:t xml:space="preserve">CN3791 solar charger module</w:t>
             </w:r>
           </w:p>
         </w:tc>
@@ -10529,7 +10142,7 @@
                 <w:sz w:val="22"/>
                 <w:szCs w:val="22"/>
               </w:rPr>
-              <w:t xml:space="preserve">I²C voltage/current monitor (0x40)</w:t>
+              <w:t xml:space="preserve">1-cell Li-ion, 4.2 V charge voltage, for a 6 V panel</w:t>
             </w:r>
           </w:p>
         </w:tc>
@@ -10560,7 +10173,7 @@
                 <w:sz w:val="22"/>
                 <w:szCs w:val="22"/>
               </w:rPr>
-              <w:t xml:space="preserve">Battery voltage and current monitoring</w:t>
+              <w:t xml:space="preserve">Safe charging from the panel</w:t>
             </w:r>
           </w:p>
         </w:tc>
@@ -10596,7 +10209,7 @@
                 <w:sz w:val="22"/>
                 <w:szCs w:val="22"/>
               </w:rPr>
-              <w:t xml:space="preserve">Solar panel</w:t>
+              <w:t xml:space="preserve">Li-ion cells + protection board</w:t>
             </w:r>
           </w:p>
         </w:tc>
@@ -10627,7 +10240,7 @@
                 <w:sz w:val="22"/>
                 <w:szCs w:val="22"/>
               </w:rPr>
-              <w:t xml:space="preserve">6 V, 6 W, monocrystalline</w:t>
+              <w:t xml:space="preserve">3 × Samsung INR18650-30Q (3.7 V, 3000 mAh each) in a parallel holder = 9 Ah (≈33 Wh); 1S 10 A BMS</w:t>
             </w:r>
           </w:p>
         </w:tc>
@@ -10658,7 +10271,7 @@
                 <w:sz w:val="22"/>
                 <w:szCs w:val="22"/>
               </w:rPr>
-              <w:t xml:space="preserve">Recharges the battery</w:t>
+              <w:t xml:space="preserve">Primary power source</w:t>
             </w:r>
           </w:p>
         </w:tc>
@@ -10694,7 +10307,7 @@
                 <w:sz w:val="22"/>
                 <w:szCs w:val="22"/>
               </w:rPr>
-              <w:t xml:space="preserve">CN3791 solar charger module</w:t>
+              <w:t xml:space="preserve">DC-DC converters</w:t>
             </w:r>
           </w:p>
         </w:tc>
@@ -10725,7 +10338,7 @@
                 <w:sz w:val="22"/>
                 <w:szCs w:val="22"/>
               </w:rPr>
-              <w:t xml:space="preserve">1-cell Li-ion, 4.2 V charge voltage, solar input</w:t>
+              <w:t xml:space="preserve">TPS63802 buck-boost 3.3 V; MT3608 boost set to 5 V; 1000 µF low-ESR capacitor at the A7670SA</w:t>
             </w:r>
           </w:p>
         </w:tc>
@@ -10756,7 +10369,7 @@
                 <w:sz w:val="22"/>
                 <w:szCs w:val="22"/>
               </w:rPr>
-              <w:t xml:space="preserve">Safe charging from the panel</w:t>
+              <w:t xml:space="preserve">Supply the ESP32, sensor, and modem</w:t>
             </w:r>
           </w:p>
         </w:tc>
@@ -10792,7 +10405,7 @@
                 <w:sz w:val="22"/>
                 <w:szCs w:val="22"/>
               </w:rPr>
-              <w:t xml:space="preserve">Li-ion cells + protection board</w:t>
+              <w:t xml:space="preserve">LTE and GNSS antennas</w:t>
             </w:r>
           </w:p>
         </w:tc>
@@ -10823,7 +10436,7 @@
                 <w:sz w:val="22"/>
                 <w:szCs w:val="22"/>
               </w:rPr>
-              <w:t xml:space="preserve">3 × 18650 (3.7 V, 3000 mAh each) in parallel = 9 Ah (≈33 Wh); 1S BMS</w:t>
+              <w:t xml:space="preserve">External, one for LTE (MAIN) and one for GNSS</w:t>
             </w:r>
           </w:p>
         </w:tc>
@@ -10854,7 +10467,7 @@
                 <w:sz w:val="22"/>
                 <w:szCs w:val="22"/>
               </w:rPr>
-              <w:t xml:space="preserve">Primary power source</w:t>
+              <w:t xml:space="preserve">Cellular and GPS reception</w:t>
             </w:r>
           </w:p>
         </w:tc>
@@ -10890,7 +10503,7 @@
                 <w:sz w:val="22"/>
                 <w:szCs w:val="22"/>
               </w:rPr>
-              <w:t xml:space="preserve">DC-DC converters</w:t>
+              <w:t xml:space="preserve">Nano-SIM card</w:t>
             </w:r>
           </w:p>
         </w:tc>
@@ -10921,7 +10534,7 @@
                 <w:sz w:val="22"/>
                 <w:szCs w:val="22"/>
               </w:rPr>
-              <w:t xml:space="preserve">Buck-boost 3.3 V ≥1 A; boost 5 V (MT3608); 1000 µF capacitor at the LTE module</w:t>
+              <w:t xml:space="preserve">Registered prepaid (Globe or Smart) with data</w:t>
             </w:r>
           </w:p>
         </w:tc>
@@ -10952,7 +10565,7 @@
                 <w:sz w:val="22"/>
                 <w:szCs w:val="22"/>
               </w:rPr>
-              <w:t xml:space="preserve">Supply the ESP32, GPS, sensor, and modem</w:t>
+              <w:t xml:space="preserve">LTE connectivity</w:t>
             </w:r>
           </w:p>
         </w:tc>
@@ -10988,7 +10601,7 @@
                 <w:sz w:val="22"/>
                 <w:szCs w:val="22"/>
               </w:rPr>
-              <w:t xml:space="preserve">LTE antenna</w:t>
+              <w:t xml:space="preserve">Passive components and wiring</w:t>
             </w:r>
           </w:p>
         </w:tc>
@@ -11019,7 +10632,7 @@
                 <w:sz w:val="22"/>
                 <w:szCs w:val="22"/>
               </w:rPr>
-              <w:t xml:space="preserve">External, SMA connector</w:t>
+              <w:t xml:space="preserve">4.7 kΩ I²C pull-up resistors; 5 A blade fuse in a 16 AWG waterproof inline holder; 18 AWG and 22 AWG silicone wire</w:t>
             </w:r>
           </w:p>
         </w:tc>
@@ -11050,7 +10663,7 @@
                 <w:sz w:val="22"/>
                 <w:szCs w:val="22"/>
               </w:rPr>
-              <w:t xml:space="preserve">Cellular reception</w:t>
+              <w:t xml:space="preserve">I²C pull-ups, protection, power and signal wiring</w:t>
             </w:r>
           </w:p>
         </w:tc>
@@ -11086,7 +10699,7 @@
                 <w:sz w:val="22"/>
                 <w:szCs w:val="22"/>
               </w:rPr>
-              <w:t xml:space="preserve">Nano-SIM card</w:t>
+              <w:t xml:space="preserve">IP65 enclosure</w:t>
             </w:r>
           </w:p>
         </w:tc>
@@ -11117,203 +10730,7 @@
                 <w:sz w:val="22"/>
                 <w:szCs w:val="22"/>
               </w:rPr>
-              <w:t xml:space="preserve">Registered prepaid (Globe or Smart) with data</w:t>
-            </w:r>
-          </w:p>
-        </w:tc>
-        <w:tc>
-          <w:tcPr>
-            <w:tcW w:type="dxa" w:w="2640"/>
-            <w:tcBorders>
-              <w:top w:val="single" w:color="000000" w:sz="4"/>
-              <w:left w:val="single" w:color="000000" w:sz="4"/>
-              <w:bottom w:val="single" w:color="000000" w:sz="4"/>
-              <w:right w:val="single" w:color="000000" w:sz="4"/>
-            </w:tcBorders>
-            <w:tcMar>
-              <w:top w:type="dxa" w:w="60"/>
-              <w:left w:type="dxa" w:w="100"/>
-              <w:bottom w:type="dxa" w:w="60"/>
-              <w:right w:type="dxa" w:w="100"/>
-            </w:tcMar>
-            <w:vAlign w:val="center"/>
-          </w:tcPr>
-          <w:p>
-            <w:pPr>
-              <w:spacing w:after="0" w:line="260"/>
-              <w:jc w:val="left"/>
-            </w:pPr>
-            <w:r>
-              <w:rPr>
-                <w:sz w:val="22"/>
-                <w:szCs w:val="22"/>
-              </w:rPr>
-              <w:t xml:space="preserve">LTE connectivity</w:t>
-            </w:r>
-          </w:p>
-        </w:tc>
-      </w:tr>
-      <w:tr>
-        <w:trPr>
-          <w:cantSplit/>
-        </w:trPr>
-        <w:tc>
-          <w:tcPr>
-            <w:tcW w:type="dxa" w:w="2300"/>
-            <w:tcBorders>
-              <w:top w:val="single" w:color="000000" w:sz="4"/>
-              <w:left w:val="single" w:color="000000" w:sz="4"/>
-              <w:bottom w:val="single" w:color="000000" w:sz="4"/>
-              <w:right w:val="single" w:color="000000" w:sz="4"/>
-            </w:tcBorders>
-            <w:tcMar>
-              <w:top w:type="dxa" w:w="60"/>
-              <w:left w:type="dxa" w:w="100"/>
-              <w:bottom w:type="dxa" w:w="60"/>
-              <w:right w:type="dxa" w:w="100"/>
-            </w:tcMar>
-            <w:vAlign w:val="center"/>
-          </w:tcPr>
-          <w:p>
-            <w:pPr>
-              <w:spacing w:after="0" w:line="260"/>
-              <w:jc w:val="left"/>
-            </w:pPr>
-            <w:r>
-              <w:rPr>
-                <w:sz w:val="22"/>
-                <w:szCs w:val="22"/>
-              </w:rPr>
-              <w:t xml:space="preserve">Passive components</w:t>
-            </w:r>
-          </w:p>
-        </w:tc>
-        <w:tc>
-          <w:tcPr>
-            <w:tcW w:type="dxa" w:w="3700"/>
-            <w:tcBorders>
-              <w:top w:val="single" w:color="000000" w:sz="4"/>
-              <w:left w:val="single" w:color="000000" w:sz="4"/>
-              <w:bottom w:val="single" w:color="000000" w:sz="4"/>
-              <w:right w:val="single" w:color="000000" w:sz="4"/>
-            </w:tcBorders>
-            <w:tcMar>
-              <w:top w:type="dxa" w:w="60"/>
-              <w:left w:type="dxa" w:w="100"/>
-              <w:bottom w:type="dxa" w:w="60"/>
-              <w:right w:type="dxa" w:w="100"/>
-            </w:tcMar>
-            <w:vAlign w:val="center"/>
-          </w:tcPr>
-          <w:p>
-            <w:pPr>
-              <w:spacing w:after="0" w:line="260"/>
-              <w:jc w:val="left"/>
-            </w:pPr>
-            <w:r>
-              <w:rPr>
-                <w:sz w:val="22"/>
-                <w:szCs w:val="22"/>
-              </w:rPr>
-              <w:t xml:space="preserve">LEDs (red/green), 220 Ω, 4.7 kΩ and 10 kΩ resistors, 5 A fuse and holder</w:t>
-            </w:r>
-          </w:p>
-        </w:tc>
-        <w:tc>
-          <w:tcPr>
-            <w:tcW w:type="dxa" w:w="2640"/>
-            <w:tcBorders>
-              <w:top w:val="single" w:color="000000" w:sz="4"/>
-              <w:left w:val="single" w:color="000000" w:sz="4"/>
-              <w:bottom w:val="single" w:color="000000" w:sz="4"/>
-              <w:right w:val="single" w:color="000000" w:sz="4"/>
-            </w:tcBorders>
-            <w:tcMar>
-              <w:top w:type="dxa" w:w="60"/>
-              <w:left w:type="dxa" w:w="100"/>
-              <w:bottom w:type="dxa" w:w="60"/>
-              <w:right w:type="dxa" w:w="100"/>
-            </w:tcMar>
-            <w:vAlign w:val="center"/>
-          </w:tcPr>
-          <w:p>
-            <w:pPr>
-              <w:spacing w:after="0" w:line="260"/>
-              <w:jc w:val="left"/>
-            </w:pPr>
-            <w:r>
-              <w:rPr>
-                <w:sz w:val="22"/>
-                <w:szCs w:val="22"/>
-              </w:rPr>
-              <w:t xml:space="preserve">Status indication, I²C pull-ups, protection</w:t>
-            </w:r>
-          </w:p>
-        </w:tc>
-      </w:tr>
-      <w:tr>
-        <w:trPr>
-          <w:cantSplit/>
-        </w:trPr>
-        <w:tc>
-          <w:tcPr>
-            <w:tcW w:type="dxa" w:w="2300"/>
-            <w:tcBorders>
-              <w:top w:val="single" w:color="000000" w:sz="4"/>
-              <w:left w:val="single" w:color="000000" w:sz="4"/>
-              <w:bottom w:val="single" w:color="000000" w:sz="4"/>
-              <w:right w:val="single" w:color="000000" w:sz="4"/>
-            </w:tcBorders>
-            <w:tcMar>
-              <w:top w:type="dxa" w:w="60"/>
-              <w:left w:type="dxa" w:w="100"/>
-              <w:bottom w:type="dxa" w:w="60"/>
-              <w:right w:type="dxa" w:w="100"/>
-            </w:tcMar>
-            <w:vAlign w:val="center"/>
-          </w:tcPr>
-          <w:p>
-            <w:pPr>
-              <w:spacing w:after="0" w:line="260"/>
-              <w:jc w:val="left"/>
-            </w:pPr>
-            <w:r>
-              <w:rPr>
-                <w:sz w:val="22"/>
-                <w:szCs w:val="22"/>
-              </w:rPr>
-              <w:t xml:space="preserve">IP65 enclosure</w:t>
-            </w:r>
-          </w:p>
-        </w:tc>
-        <w:tc>
-          <w:tcPr>
-            <w:tcW w:type="dxa" w:w="3700"/>
-            <w:tcBorders>
-              <w:top w:val="single" w:color="000000" w:sz="4"/>
-              <w:left w:val="single" w:color="000000" w:sz="4"/>
-              <w:bottom w:val="single" w:color="000000" w:sz="4"/>
-              <w:right w:val="single" w:color="000000" w:sz="4"/>
-            </w:tcBorders>
-            <w:tcMar>
-              <w:top w:type="dxa" w:w="60"/>
-              <w:left w:type="dxa" w:w="100"/>
-              <w:bottom w:type="dxa" w:w="60"/>
-              <w:right w:type="dxa" w:w="100"/>
-            </w:tcMar>
-            <w:vAlign w:val="center"/>
-          </w:tcPr>
-          <w:p>
-            <w:pPr>
-              <w:spacing w:after="0" w:line="260"/>
-              <w:jc w:val="left"/>
-            </w:pPr>
-            <w:r>
-              <w:rPr>
-                <w:sz w:val="22"/>
-                <w:szCs w:val="22"/>
-              </w:rPr>
-              <w:t xml:space="preserve">150 × 100 × 70 mm, vent, cable glands</w:t>
+              <w:t xml:space="preserve">150 × 100 × 70 mm, PG7 cable glands and breather vent</w:t>
             </w:r>
           </w:p>
         </w:tc>
@@ -11868,7 +11285,7 @@
                 <w:sz w:val="22"/>
                 <w:szCs w:val="22"/>
               </w:rPr>
-              <w:t xml:space="preserve">Sensirion I2C SEN5X, Adafruit INA219, ArduinoJson, TinyGPSPlus libraries</w:t>
+              <w:t xml:space="preserve">Sensirion I2C SEN5X, Adafruit INA219, ArduinoJson libraries</w:t>
             </w:r>
           </w:p>
         </w:tc>
@@ -11899,7 +11316,7 @@
                 <w:sz w:val="22"/>
                 <w:szCs w:val="22"/>
               </w:rPr>
-              <w:t xml:space="preserve">Sensor and power-monitor drivers, JSON encoding, GPS decoding (LTE uses the module's built-in HTTPS commands)</w:t>
+              <w:t xml:space="preserve">Sensor and power-monitor drivers and JSON encoding (LTE uploads and GPS use the A7670SA module's built-in commands)</w:t>
             </w:r>
           </w:p>
         </w:tc>
@@ -21029,7 +20446,7 @@
                 <w:sz w:val="22"/>
                 <w:szCs w:val="22"/>
               </w:rPr>
-              <w:t xml:space="preserve">SIMCom A7670 4G LTE module (breakout)</w:t>
+              <w:t xml:space="preserve">SIMCom A7670SA 4G LTE + GNSS module (breakout)</w:t>
             </w:r>
           </w:p>
         </w:tc>
@@ -21060,7 +20477,7 @@
                 <w:sz w:val="22"/>
                 <w:szCs w:val="22"/>
               </w:rPr>
-              <w:t xml:space="preserve">₱1,200.00 – ₱1,800.00</w:t>
+              <w:t xml:space="preserve">₱1,300.00 – ₱2,000.00</w:t>
             </w:r>
           </w:p>
         </w:tc>
@@ -21120,7 +20537,7 @@
                 <w:sz w:val="22"/>
                 <w:szCs w:val="22"/>
               </w:rPr>
-              <w:t xml:space="preserve">LTE antenna</w:t>
+              <w:t xml:space="preserve">LTE and GNSS antennas (set)</w:t>
             </w:r>
           </w:p>
         </w:tc>
@@ -21151,7 +20568,7 @@
                 <w:sz w:val="22"/>
                 <w:szCs w:val="22"/>
               </w:rPr>
-              <w:t xml:space="preserve">₱150.00 – ₱300.00</w:t>
+              <w:t xml:space="preserve">₱200.00 – ₱400.00</w:t>
             </w:r>
           </w:p>
         </w:tc>
@@ -21211,7 +20628,7 @@
                 <w:sz w:val="22"/>
                 <w:szCs w:val="22"/>
               </w:rPr>
-              <w:t xml:space="preserve">GPS module (ATGM336H) and AO3401 MOSFET</w:t>
+              <w:t xml:space="preserve">Solar panel, 6 V 6 W monocrystalline</w:t>
             </w:r>
           </w:p>
         </w:tc>
@@ -21242,7 +20659,7 @@
                 <w:sz w:val="22"/>
                 <w:szCs w:val="22"/>
               </w:rPr>
-              <w:t xml:space="preserve">₱250.00 – ₱450.00</w:t>
+              <w:t xml:space="preserve">₱350.00 – ₱700.00</w:t>
             </w:r>
           </w:p>
         </w:tc>
@@ -21302,7 +20719,7 @@
                 <w:sz w:val="22"/>
                 <w:szCs w:val="22"/>
               </w:rPr>
-              <w:t xml:space="preserve">Solar panel, 6 V 6 W</w:t>
+              <w:t xml:space="preserve">CN3791 solar charger module</w:t>
             </w:r>
           </w:p>
         </w:tc>
@@ -21333,7 +20750,7 @@
                 <w:sz w:val="22"/>
                 <w:szCs w:val="22"/>
               </w:rPr>
-              <w:t xml:space="preserve">₱350.00 – ₱700.00</w:t>
+              <w:t xml:space="preserve">₱150.00 – ₱300.00</w:t>
             </w:r>
           </w:p>
         </w:tc>
@@ -21393,7 +20810,7 @@
                 <w:sz w:val="22"/>
                 <w:szCs w:val="22"/>
               </w:rPr>
-              <w:t xml:space="preserve">CN3791 solar charger module</w:t>
+              <w:t xml:space="preserve">Samsung INR18650-30Q 3000 mAh cells (×3)</w:t>
             </w:r>
           </w:p>
         </w:tc>
@@ -21424,7 +20841,7 @@
                 <w:sz w:val="22"/>
                 <w:szCs w:val="22"/>
               </w:rPr>
-              <w:t xml:space="preserve">₱150.00 – ₱300.00</w:t>
+              <w:t xml:space="preserve">₱750.00 – ₱1,200.00</w:t>
             </w:r>
           </w:p>
         </w:tc>
@@ -21484,7 +20901,7 @@
                 <w:sz w:val="22"/>
                 <w:szCs w:val="22"/>
               </w:rPr>
-              <w:t xml:space="preserve">18650 Li-ion 3000 mAh cells (×3)</w:t>
+              <w:t xml:space="preserve">1S 10 A BMS and 3-cell parallel holder</w:t>
             </w:r>
           </w:p>
         </w:tc>
@@ -21515,7 +20932,7 @@
                 <w:sz w:val="22"/>
                 <w:szCs w:val="22"/>
               </w:rPr>
-              <w:t xml:space="preserve">₱750.00 – ₱1,200.00</w:t>
+              <w:t xml:space="preserve">₱80.00 – ₱200.00</w:t>
             </w:r>
           </w:p>
         </w:tc>
@@ -21575,7 +20992,7 @@
                 <w:sz w:val="22"/>
                 <w:szCs w:val="22"/>
               </w:rPr>
-              <w:t xml:space="preserve">1S protection board (BMS), 3-cell holder, nickel strip</w:t>
+              <w:t xml:space="preserve">TPS63802 buck-boost and MT3608 boost modules</w:t>
             </w:r>
           </w:p>
         </w:tc>
@@ -21606,7 +21023,7 @@
                 <w:sz w:val="22"/>
                 <w:szCs w:val="22"/>
               </w:rPr>
-              <w:t xml:space="preserve">₱100.00 – ₱250.00</w:t>
+              <w:t xml:space="preserve">₱190.00 – ₱380.00</w:t>
             </w:r>
           </w:p>
         </w:tc>
@@ -21666,7 +21083,7 @@
                 <w:sz w:val="22"/>
                 <w:szCs w:val="22"/>
               </w:rPr>
-              <w:t xml:space="preserve">3.3 V buck-boost and 5 V boost (MT3608) modules</w:t>
+              <w:t xml:space="preserve">INA219 power monitor module</w:t>
             </w:r>
           </w:p>
         </w:tc>
@@ -21697,7 +21114,7 @@
                 <w:sz w:val="22"/>
                 <w:szCs w:val="22"/>
               </w:rPr>
-              <w:t xml:space="preserve">₱200.00 – ₱470.00</w:t>
+              <w:t xml:space="preserve">₱150.00 – ₱250.00</w:t>
             </w:r>
           </w:p>
         </w:tc>
@@ -21757,7 +21174,7 @@
                 <w:sz w:val="22"/>
                 <w:szCs w:val="22"/>
               </w:rPr>
-              <w:t xml:space="preserve">INA219 power monitor module</w:t>
+              <w:t xml:space="preserve">5 A blade fuse, 16 AWG waterproof inline holder</w:t>
             </w:r>
           </w:p>
         </w:tc>
@@ -21788,7 +21205,7 @@
                 <w:sz w:val="22"/>
                 <w:szCs w:val="22"/>
               </w:rPr>
-              <w:t xml:space="preserve">₱150.00 – ₱250.00</w:t>
+              <w:t xml:space="preserve">₱60.00 – ₱150.00</w:t>
             </w:r>
           </w:p>
         </w:tc>
@@ -21848,7 +21265,7 @@
                 <w:sz w:val="22"/>
                 <w:szCs w:val="22"/>
               </w:rPr>
-              <w:t xml:space="preserve">Fuse, wires, connectors, cable glands</w:t>
+              <w:t xml:space="preserve">18 AWG and 22 AWG silicone wire, SEN5x JST cable</w:t>
             </w:r>
           </w:p>
         </w:tc>
@@ -21879,7 +21296,7 @@
                 <w:sz w:val="22"/>
                 <w:szCs w:val="22"/>
               </w:rPr>
-              <w:t xml:space="preserve">₱300.00 – ₱500.00</w:t>
+              <w:t xml:space="preserve">₱370.00 – ₱800.00</w:t>
             </w:r>
           </w:p>
         </w:tc>
@@ -21939,7 +21356,7 @@
                 <w:sz w:val="22"/>
                 <w:szCs w:val="22"/>
               </w:rPr>
-              <w:t xml:space="preserve">LEDs, resistors, capacitor</w:t>
+              <w:t xml:space="preserve">Resistors, capacitor, perfboard, headers, standoffs</w:t>
             </w:r>
           </w:p>
         </w:tc>
@@ -21970,7 +21387,7 @@
                 <w:sz w:val="22"/>
                 <w:szCs w:val="22"/>
               </w:rPr>
-              <w:t xml:space="preserve">₱50.00 – ₱100.00</w:t>
+              <w:t xml:space="preserve">₱150.00 – ₱350.00</w:t>
             </w:r>
           </w:p>
         </w:tc>
@@ -22030,7 +21447,7 @@
                 <w:sz w:val="22"/>
                 <w:szCs w:val="22"/>
               </w:rPr>
-              <w:t xml:space="preserve">IP65 enclosure (150 × 100 × 70 mm)</w:t>
+              <w:t xml:space="preserve">PG7 cable glands (×4) and breather vent</w:t>
             </w:r>
           </w:p>
         </w:tc>
@@ -22061,7 +21478,7 @@
                 <w:sz w:val="22"/>
                 <w:szCs w:val="22"/>
               </w:rPr>
-              <w:t xml:space="preserve">₱250.00 – ₱550.00</w:t>
+              <w:t xml:space="preserve">₱100.00 – ₱250.00</w:t>
             </w:r>
           </w:p>
         </w:tc>
@@ -22121,7 +21538,7 @@
                 <w:sz w:val="22"/>
                 <w:szCs w:val="22"/>
               </w:rPr>
-              <w:t xml:space="preserve">3D-printed radiation shield and brackets</w:t>
+              <w:t xml:space="preserve">IP65 enclosure (150 × 100 × 70 mm)</w:t>
             </w:r>
           </w:p>
         </w:tc>
@@ -22152,7 +21569,7 @@
                 <w:sz w:val="22"/>
                 <w:szCs w:val="22"/>
               </w:rPr>
-              <w:t xml:space="preserve">₱300.00 – ₱800.00</w:t>
+              <w:t xml:space="preserve">₱250.00 – ₱550.00</w:t>
             </w:r>
           </w:p>
         </w:tc>
@@ -22212,7 +21629,7 @@
                 <w:sz w:val="22"/>
                 <w:szCs w:val="22"/>
               </w:rPr>
-              <w:t xml:space="preserve">Mounting hardware (clamps, U-bolts, screws)</w:t>
+              <w:t xml:space="preserve">3D-printed radiation shield and brackets</w:t>
             </w:r>
           </w:p>
         </w:tc>
@@ -22243,7 +21660,7 @@
                 <w:sz w:val="22"/>
                 <w:szCs w:val="22"/>
               </w:rPr>
-              <w:t xml:space="preserve">₱300.00 – ₱600.00</w:t>
+              <w:t xml:space="preserve">₱300.00 – ₱800.00</w:t>
             </w:r>
           </w:p>
         </w:tc>
@@ -22303,7 +21720,7 @@
                 <w:sz w:val="22"/>
                 <w:szCs w:val="22"/>
               </w:rPr>
-              <w:t xml:space="preserve">Prepaid SIM data (2 months)</w:t>
+              <w:t xml:space="preserve">Mounting hardware (clamps, U-bolts, screws)</w:t>
             </w:r>
           </w:p>
         </w:tc>
@@ -22334,7 +21751,7 @@
                 <w:sz w:val="22"/>
                 <w:szCs w:val="22"/>
               </w:rPr>
-              <w:t xml:space="preserve">₱600.00 – ₱1,000.00</w:t>
+              <w:t xml:space="preserve">₱300.00 – ₱600.00</w:t>
             </w:r>
           </w:p>
         </w:tc>
@@ -22394,7 +21811,7 @@
                 <w:sz w:val="22"/>
                 <w:szCs w:val="22"/>
               </w:rPr>
-              <w:t xml:space="preserve">Server hosting / VPS (optional, 2 months)</w:t>
+              <w:t xml:space="preserve">Prepaid SIM data (2 months)</w:t>
             </w:r>
           </w:p>
         </w:tc>
@@ -22425,7 +21842,7 @@
                 <w:sz w:val="22"/>
                 <w:szCs w:val="22"/>
               </w:rPr>
-              <w:t xml:space="preserve">₱0.00 – ₱1,200.00</w:t>
+              <w:t xml:space="preserve">₱600.00 – ₱1,000.00</w:t>
             </w:r>
           </w:p>
         </w:tc>
@@ -22482,6 +21899,97 @@
             </w:pPr>
             <w:r>
               <w:rPr>
+                <w:sz w:val="22"/>
+                <w:szCs w:val="22"/>
+              </w:rPr>
+              <w:t xml:space="preserve">Server hosting / VPS (optional, 2 months)</w:t>
+            </w:r>
+          </w:p>
+        </w:tc>
+        <w:tc>
+          <w:tcPr>
+            <w:tcW w:type="dxa" w:w="2800"/>
+            <w:tcBorders>
+              <w:top w:val="single" w:color="000000" w:sz="4"/>
+              <w:left w:val="single" w:color="000000" w:sz="4"/>
+              <w:bottom w:val="single" w:color="000000" w:sz="4"/>
+              <w:right w:val="single" w:color="000000" w:sz="4"/>
+            </w:tcBorders>
+            <w:tcMar>
+              <w:top w:type="dxa" w:w="60"/>
+              <w:left w:type="dxa" w:w="100"/>
+              <w:bottom w:type="dxa" w:w="60"/>
+              <w:right w:type="dxa" w:w="100"/>
+            </w:tcMar>
+            <w:vAlign w:val="center"/>
+          </w:tcPr>
+          <w:p>
+            <w:pPr>
+              <w:spacing w:after="0" w:line="260"/>
+              <w:jc w:val="left"/>
+            </w:pPr>
+            <w:r>
+              <w:rPr>
+                <w:sz w:val="22"/>
+                <w:szCs w:val="22"/>
+              </w:rPr>
+              <w:t xml:space="preserve">₱0.00 – ₱1,200.00</w:t>
+            </w:r>
+          </w:p>
+        </w:tc>
+      </w:tr>
+      <w:tr>
+        <w:trPr>
+          <w:cantSplit/>
+        </w:trPr>
+        <w:tc>
+          <w:tcPr>
+            <w:tcW w:type="dxa" w:w="1300"/>
+            <w:tcBorders>
+              <w:top w:val="single" w:color="000000" w:sz="4"/>
+              <w:left w:val="single" w:color="000000" w:sz="4"/>
+              <w:bottom w:val="single" w:color="000000" w:sz="4"/>
+              <w:right w:val="single" w:color="000000" w:sz="4"/>
+            </w:tcBorders>
+            <w:tcMar>
+              <w:top w:type="dxa" w:w="60"/>
+              <w:left w:type="dxa" w:w="100"/>
+              <w:bottom w:type="dxa" w:w="60"/>
+              <w:right w:type="dxa" w:w="100"/>
+            </w:tcMar>
+            <w:vAlign w:val="center"/>
+          </w:tcPr>
+          <w:p>
+            <w:pPr>
+              <w:spacing w:after="0" w:line="260"/>
+              <w:jc w:val="left"/>
+            </w:pPr>
+          </w:p>
+        </w:tc>
+        <w:tc>
+          <w:tcPr>
+            <w:tcW w:type="dxa" w:w="4540"/>
+            <w:tcBorders>
+              <w:top w:val="single" w:color="000000" w:sz="4"/>
+              <w:left w:val="single" w:color="000000" w:sz="4"/>
+              <w:bottom w:val="single" w:color="000000" w:sz="4"/>
+              <w:right w:val="single" w:color="000000" w:sz="4"/>
+            </w:tcBorders>
+            <w:tcMar>
+              <w:top w:type="dxa" w:w="60"/>
+              <w:left w:type="dxa" w:w="100"/>
+              <w:bottom w:type="dxa" w:w="60"/>
+              <w:right w:type="dxa" w:w="100"/>
+            </w:tcMar>
+            <w:vAlign w:val="center"/>
+          </w:tcPr>
+          <w:p>
+            <w:pPr>
+              <w:spacing w:after="0" w:line="260"/>
+              <w:jc w:val="left"/>
+            </w:pPr>
+            <w:r>
+              <w:rPr>
                 <w:b/>
                 <w:bCs/>
                 <w:sz w:val="22"/>
@@ -22520,7 +22028,7 @@
                 <w:sz w:val="22"/>
                 <w:szCs w:val="22"/>
               </w:rPr>
-              <w:t xml:space="preserve">₱7,100.00 – ₱13,270.00</w:t>
+              <w:t xml:space="preserve">₱7,300.00 – ₱13,930.00</w:t>
             </w:r>
           </w:p>
         </w:tc>
@@ -22538,7 +22046,7 @@
         <w:jc w:val="both"/>
       </w:pPr>
       <w:r>
-        <w:t xml:space="preserve">The total estimated cost of one station is ₱7,100.00 to ₱13,270.00, against an initial budget of ₱15,000.00. Reusing the team's ESP32 and using separate small LTE and GPS modules keeps one station well within budget; additional stations for the pilot deployment will require </w:t>
+        <w:t xml:space="preserve">The total estimated cost of one station is ₱7,300.00 to ₱13,930.00, against an initial budget of ₱15,000.00. Reusing the team's ESP32 and using one A7670SA module for both LTE and GPS keeps one station well within budget; additional stations for the pilot deployment will require </w:t>
       </w:r>
       <w:r>
         <w:rPr>

</xml_diff>